<commit_message>
Refactor notebook and paper builders for improved clarity and functionality
- Updated the `build_notebook` function to reflect the final course paper structure, ensuring all calculations are sourced from formal result files.
- Removed outdated code related to notebook execution and streamlined the notebook creation process.
- Enhanced the `build_paper` function by integrating new metrics from text model evaluations and improving the structure of validation results.
- Adjusted PDF generation to include a cover page and refined formatting for better readability.
- Updated lexicon building to clarify the limitations of sentence-level sentiment accuracy.
- Improved section repair logic to handle local paths more robustly.
</commit_message>
<xml_diff>
--- a/paper/课程论文_提交版.docx
+++ b/paper/课程论文_提交版.docx
@@ -1283,7 +1283,7 @@
           <w:b w:val="0"/>
           <w:sz w:val="21"/>
         </w:rPr>
-        <w:t>本文基于中国人民银行货币政策执行报告和公开金融市场数据，研究央行沟通文本与短期市场反应之间的经验关系。正式样本锁定为2006年第1季度至2025年第4季度，2026年第1季度仅保留在文本数据库中而不进入正式估计。核心主检验以政策指引章节扩展窗口TF-IDF创新度解释报告发布后五个交易日股票实际波动率，创新度早期样本系数为0.7466，HC3 p值为0.0258，2019年后总效应为0.2910。债券探索以跨拟合政策语调和收益率曲线斜率为核心，未预期语调主系数为0.9542，p值为0.4210。人工标注验证覆盖240句，字符TF-IDF与LinearSVC提供独立文本测量检验。全文强调可复现的数据处理、文本特征工程、分组交叉验证和金融事件研究，不把方向一致解释为统计显著。</w:t>
+        <w:t>本文基于中国人民银行货币政策执行报告和公开金融市场数据，研究央行沟通文本与短期市场反应之间的经验关系。正式样本锁定为2006年第1季度至2025年第4季度，2026年第1季度仅保留在文本数据库中而不进入正式估计。核心主检验以政策指引章节扩展窗口TF-IDF创新度解释报告发布后五个交易日股票实际波动率，创新度早期样本系数为0.7466，HC3 p值为0.0258，2019年后总效应为0.2910。原词典语调构造的未预期政策指标在收益率曲线斜率模型中的系数为0.9542，p值为0.4210；进一步使用按报告交叉拟合的监督政策语调后，政策相关句均值系数为0.4744，p值为0.9079，未获得稳定债券市场证据。人工标注验证覆盖240句，字符TF-IDF与LinearSVC提供独立文本测量检验。全文强调可复现的数据处理、文本特征工程、分组交叉验证和金融事件研究，不把方向一致解释为统计显著。</w:t>
       </w:r>
     </w:p>
     <w:p>
@@ -1366,7 +1366,7 @@
           <w:b w:val="0"/>
           <w:sz w:val="18"/>
         </w:rPr>
-        <w:t>This paper studies how textual features in the People's Bank of China's Monetary Policy Implementation Reports relate to short-window financial market responses. The formal empirical sample is locked at 2006Q1–2025Q4. The main stock-market model uses expanding TF-IDF novelty in the policy-guidance section to explain post-release realized volatility. The main bond-market model uses unexpected policy tone to explain yield-curve slope changes. A manual annotation validation of 240 sentences reveals systematic limitations of lexicon-based methods at the sentence level, while document-level aggregated indicators remain informative for regression analysis.</w:t>
+        <w:t>This paper studies how textual features in the People's Bank of China's Monetary Policy Implementation Reports relate to short-window financial market responses. The formal empirical sample is locked at 2006Q1–2025Q4. The main stock-market model uses expanding TF-IDF novelty in the policy-guidance section to explain post-release realized volatility. The main bond-market model uses unexpected policy tone to explain yield-curve slope changes. A manual annotation validation of 240 sentences reveals systematic limitations of lexicon-based methods at the sentence level, and document-level policy-tone measures do not yield robust bond-market evidence across alternative specifications.</w:t>
       </w:r>
     </w:p>
     <w:p>
@@ -1632,7 +1632,7 @@
           <w:b w:val="0"/>
           <w:sz w:val="21"/>
         </w:rPr>
-        <w:t>监督验证采用按报告分组的交叉验证，而不是随机句子切分。央行报告中有大量模板化表达，如果相似句子同时出现在训练集和测试集，模型看似准确，实则只是在识别固定句式。按报告分组以后，测试折中的句子来自未见过的报告，指标更接近未来季度应用场景。近重复文本合并折号进一步降低公式化表述造成的泄漏。</w:t>
+        <w:t>字符TF-IDF+LinearSVC的按报告分组交叉验证显示，情感Accuracy为0.8958、Macro-F1为0.7993；政策四分类Accuracy为0.8583、Macro-F1为0.6804；条件三分类Accuracy为0.7879、Macro-F1为0.7301；主题硬分类Accuracy为0.7208、Macro-F1为0.3329。</w:t>
       </w:r>
     </w:p>
     <w:p>
@@ -1646,7 +1646,7 @@
           <w:b w:val="0"/>
           <w:sz w:val="21"/>
         </w:rPr>
-        <w:t>学习曲线的作用不是证明当前人工标签已经充分，而是说明继续增加标签的边际收益和薄弱类别。若训练比例提高后Macro-F1仍然波动，说明类别稀疏和句式相似性仍在限制泛化；若准确率上升但少数类别召回率低，说明模型主要学到了多数类。本文据此把人工验证定位为测量可靠性检查，而不是用监督模型替代全部文本指标。</w:t>
+        <w:t>监督验证采用按报告分组的交叉验证，而不是随机句子切分。央行报告中有大量模板化表达，如果相似句子同时出现在训练集和测试集，模型看似准确，实则只是在识别固定句式。按报告分组以后，测试折中的句子来自未见过的报告，指标更接近未来季度应用场景。近重复文本合并折号进一步降低公式化表述造成的泄漏。</w:t>
       </w:r>
     </w:p>
     <w:p>
@@ -1660,6 +1660,34 @@
           <w:b w:val="0"/>
           <w:sz w:val="21"/>
         </w:rPr>
+        <w:t>主题硬分类的Macro-F1明显低于情感和政策方向任务，因此主题模块不作为监督分类核心结果。正式研究使用连续主题关注度描述增长、通胀、风险、汇率、金融稳定和房地产等语境变化，避免把稀疏主题标签误写成稳定分类器。</w:t>
+      </w:r>
+    </w:p>
+    <w:p>
+      <w:pPr>
+        <w:spacing w:line="360" w:lineRule="exact" w:before="0" w:after="0"/>
+        <w:ind w:firstLine="420"/>
+      </w:pPr>
+      <w:r>
+        <w:rPr>
+          <w:rFonts w:ascii="Times New Roman" w:hAnsi="Times New Roman" w:eastAsia="宋体"/>
+          <w:b w:val="0"/>
+          <w:sz w:val="21"/>
+        </w:rPr>
+        <w:t>学习曲线的作用不是证明当前人工标签已经充分，而是说明继续增加标签的边际收益和薄弱类别。若训练比例提高后Macro-F1仍然波动，说明类别稀疏和句式相似性仍在限制泛化；若准确率上升但少数类别召回率低，说明模型主要学到了多数类。本文据此把人工验证定位为测量可靠性检查，而不是用监督模型替代全部文本指标。</w:t>
+      </w:r>
+    </w:p>
+    <w:p>
+      <w:pPr>
+        <w:spacing w:line="360" w:lineRule="exact" w:before="0" w:after="0"/>
+        <w:ind w:firstLine="420"/>
+      </w:pPr>
+      <w:r>
+        <w:rPr>
+          <w:rFonts w:ascii="Times New Roman" w:hAnsi="Times New Roman" w:eastAsia="宋体"/>
+          <w:b w:val="0"/>
+          <w:sz w:val="21"/>
+        </w:rPr>
         <w:t>分组交叉验证同时按报告和近重复句子合并折号，防止同一报告或高度公式化表述跨折泄漏。学习曲线表明，240句人工样本已经足以暴露词典和轻量监督模型的主要误差来源，但对少数类别的稳定识别仍然受样本量限制。后续若增加标注，应优先补充hawkish、negative和房地产主题句，而不是为追求显著性改动已有标签。</w:t>
       </w:r>
     </w:p>
@@ -1674,7 +1702,7 @@
           <w:b/>
           <w:sz w:val="18"/>
         </w:rPr>
-        <w:t>表1  文本测量验证结果</w:t>
+        <w:t>表1  文本测量模型比较</w:t>
       </w:r>
     </w:p>
     <w:tbl>
@@ -1692,14 +1720,18 @@
         </w:tblBorders>
       </w:tblPr>
       <w:tblGrid>
-        <w:gridCol w:w="2767"/>
-        <w:gridCol w:w="2767"/>
-        <w:gridCol w:w="2767"/>
+        <w:gridCol w:w="1186"/>
+        <w:gridCol w:w="1186"/>
+        <w:gridCol w:w="1186"/>
+        <w:gridCol w:w="1186"/>
+        <w:gridCol w:w="1186"/>
+        <w:gridCol w:w="1186"/>
+        <w:gridCol w:w="1186"/>
       </w:tblGrid>
       <w:tr>
         <w:tc>
           <w:tcPr>
-            <w:tcW w:type="dxa" w:w="2767"/>
+            <w:tcW w:type="dxa" w:w="1186"/>
             <w:tcBorders>
               <w:bottom w:val="single" w:sz="6" w:space="0" w:color="000000"/>
               <w:left w:val="single" w:sz="4" w:space="0" w:color="999999"/>
@@ -1721,13 +1753,13 @@
                 <w:b/>
                 <w:sz w:val="16"/>
               </w:rPr>
-              <w:t>task</w:t>
-            </w:r>
-          </w:p>
-        </w:tc>
-        <w:tc>
-          <w:tcPr>
-            <w:tcW w:type="dxa" w:w="2767"/>
+              <w:t>method</w:t>
+            </w:r>
+          </w:p>
+        </w:tc>
+        <w:tc>
+          <w:tcPr>
+            <w:tcW w:type="dxa" w:w="1186"/>
             <w:tcBorders>
               <w:bottom w:val="single" w:sz="6" w:space="0" w:color="000000"/>
               <w:left w:val="single" w:sz="4" w:space="0" w:color="999999"/>
@@ -1749,13 +1781,13 @@
                 <w:b/>
                 <w:sz w:val="16"/>
               </w:rPr>
-              <w:t>accuracy</w:t>
-            </w:r>
-          </w:p>
-        </w:tc>
-        <w:tc>
-          <w:tcPr>
-            <w:tcW w:type="dxa" w:w="2767"/>
+              <w:t>sentiment_acc</w:t>
+            </w:r>
+          </w:p>
+        </w:tc>
+        <w:tc>
+          <w:tcPr>
+            <w:tcW w:type="dxa" w:w="1186"/>
             <w:tcBorders>
               <w:bottom w:val="single" w:sz="6" w:space="0" w:color="000000"/>
               <w:left w:val="single" w:sz="4" w:space="0" w:color="999999"/>
@@ -1777,7 +1809,119 @@
                 <w:b/>
                 <w:sz w:val="16"/>
               </w:rPr>
-              <w:t>macro_f1</w:t>
+              <w:t>sentiment_f1</w:t>
+            </w:r>
+          </w:p>
+        </w:tc>
+        <w:tc>
+          <w:tcPr>
+            <w:tcW w:type="dxa" w:w="1186"/>
+            <w:tcBorders>
+              <w:bottom w:val="single" w:sz="6" w:space="0" w:color="000000"/>
+              <w:left w:val="single" w:sz="4" w:space="0" w:color="999999"/>
+              <w:right w:val="single" w:sz="4" w:space="0" w:color="999999"/>
+              <w:top w:val="none" w:sz="0" w:space="0" w:color="auto"/>
+            </w:tcBorders>
+            <w:shd w:val="clear" w:color="auto" w:fill="F2F2F2"/>
+          </w:tcPr>
+          <w:p>
+            <w:pPr>
+              <w:spacing w:line="280" w:lineRule="exact" w:before="40" w:after="40"/>
+              <w:ind w:firstLine="0"/>
+              <w:jc w:val="center"/>
+            </w:pPr>
+            <w:r/>
+            <w:r>
+              <w:rPr>
+                <w:rFonts w:ascii="Times New Roman" w:hAnsi="Times New Roman" w:eastAsia="宋体"/>
+                <w:b/>
+                <w:sz w:val="16"/>
+              </w:rPr>
+              <w:t>policy_acc</w:t>
+            </w:r>
+          </w:p>
+        </w:tc>
+        <w:tc>
+          <w:tcPr>
+            <w:tcW w:type="dxa" w:w="1186"/>
+            <w:tcBorders>
+              <w:bottom w:val="single" w:sz="6" w:space="0" w:color="000000"/>
+              <w:left w:val="single" w:sz="4" w:space="0" w:color="999999"/>
+              <w:right w:val="single" w:sz="4" w:space="0" w:color="999999"/>
+              <w:top w:val="none" w:sz="0" w:space="0" w:color="auto"/>
+            </w:tcBorders>
+            <w:shd w:val="clear" w:color="auto" w:fill="F2F2F2"/>
+          </w:tcPr>
+          <w:p>
+            <w:pPr>
+              <w:spacing w:line="280" w:lineRule="exact" w:before="40" w:after="40"/>
+              <w:ind w:firstLine="0"/>
+              <w:jc w:val="center"/>
+            </w:pPr>
+            <w:r/>
+            <w:r>
+              <w:rPr>
+                <w:rFonts w:ascii="Times New Roman" w:hAnsi="Times New Roman" w:eastAsia="宋体"/>
+                <w:b/>
+                <w:sz w:val="16"/>
+              </w:rPr>
+              <w:t>policy_f1</w:t>
+            </w:r>
+          </w:p>
+        </w:tc>
+        <w:tc>
+          <w:tcPr>
+            <w:tcW w:type="dxa" w:w="1186"/>
+            <w:tcBorders>
+              <w:bottom w:val="single" w:sz="6" w:space="0" w:color="000000"/>
+              <w:left w:val="single" w:sz="4" w:space="0" w:color="999999"/>
+              <w:right w:val="single" w:sz="4" w:space="0" w:color="999999"/>
+              <w:top w:val="none" w:sz="0" w:space="0" w:color="auto"/>
+            </w:tcBorders>
+            <w:shd w:val="clear" w:color="auto" w:fill="F2F2F2"/>
+          </w:tcPr>
+          <w:p>
+            <w:pPr>
+              <w:spacing w:line="280" w:lineRule="exact" w:before="40" w:after="40"/>
+              <w:ind w:firstLine="0"/>
+              <w:jc w:val="center"/>
+            </w:pPr>
+            <w:r/>
+            <w:r>
+              <w:rPr>
+                <w:rFonts w:ascii="Times New Roman" w:hAnsi="Times New Roman" w:eastAsia="宋体"/>
+                <w:b/>
+                <w:sz w:val="16"/>
+              </w:rPr>
+              <w:t>direction_acc</w:t>
+            </w:r>
+          </w:p>
+        </w:tc>
+        <w:tc>
+          <w:tcPr>
+            <w:tcW w:type="dxa" w:w="1186"/>
+            <w:tcBorders>
+              <w:bottom w:val="single" w:sz="6" w:space="0" w:color="000000"/>
+              <w:left w:val="single" w:sz="4" w:space="0" w:color="999999"/>
+              <w:right w:val="single" w:sz="4" w:space="0" w:color="999999"/>
+              <w:top w:val="none" w:sz="0" w:space="0" w:color="auto"/>
+            </w:tcBorders>
+            <w:shd w:val="clear" w:color="auto" w:fill="F2F2F2"/>
+          </w:tcPr>
+          <w:p>
+            <w:pPr>
+              <w:spacing w:line="280" w:lineRule="exact" w:before="40" w:after="40"/>
+              <w:ind w:firstLine="0"/>
+              <w:jc w:val="center"/>
+            </w:pPr>
+            <w:r/>
+            <w:r>
+              <w:rPr>
+                <w:rFonts w:ascii="Times New Roman" w:hAnsi="Times New Roman" w:eastAsia="宋体"/>
+                <w:b/>
+                <w:sz w:val="16"/>
+              </w:rPr>
+              <w:t>direction_f1</w:t>
             </w:r>
           </w:p>
         </w:tc>
@@ -1785,82 +1929,190 @@
       <w:tr>
         <w:tc>
           <w:tcPr>
-            <w:tcW w:type="dxa" w:w="2767"/>
-            <w:tcBorders>
-              <w:left w:val="single" w:sz="4" w:space="0" w:color="CCCCCC"/>
-              <w:right w:val="single" w:sz="4" w:space="0" w:color="CCCCCC"/>
-              <w:top w:val="none" w:sz="0" w:space="0" w:color="auto"/>
-              <w:bottom w:val="none" w:sz="0" w:space="0" w:color="auto"/>
-            </w:tcBorders>
-          </w:tcPr>
-          <w:p>
-            <w:pPr>
-              <w:spacing w:line="260" w:lineRule="exact" w:before="20" w:after="20"/>
-              <w:ind w:firstLine="0"/>
-              <w:jc w:val="center"/>
-            </w:pPr>
-            <w:r/>
-            <w:r>
-              <w:rPr>
-                <w:rFonts w:ascii="Times New Roman" w:hAnsi="Times New Roman" w:eastAsia="宋体"/>
-                <w:b w:val="0"/>
-                <w:sz w:val="15"/>
-              </w:rPr>
-              <w:t>sentiment</w:t>
-            </w:r>
-          </w:p>
-        </w:tc>
-        <w:tc>
-          <w:tcPr>
-            <w:tcW w:type="dxa" w:w="2767"/>
-            <w:tcBorders>
-              <w:left w:val="single" w:sz="4" w:space="0" w:color="CCCCCC"/>
-              <w:right w:val="single" w:sz="4" w:space="0" w:color="CCCCCC"/>
-              <w:top w:val="none" w:sz="0" w:space="0" w:color="auto"/>
-              <w:bottom w:val="none" w:sz="0" w:space="0" w:color="auto"/>
-            </w:tcBorders>
-          </w:tcPr>
-          <w:p>
-            <w:pPr>
-              <w:spacing w:line="260" w:lineRule="exact" w:before="20" w:after="20"/>
-              <w:ind w:firstLine="0"/>
-              <w:jc w:val="center"/>
-            </w:pPr>
-            <w:r/>
-            <w:r>
-              <w:rPr>
-                <w:rFonts w:ascii="Times New Roman" w:hAnsi="Times New Roman" w:eastAsia="宋体"/>
-                <w:b w:val="0"/>
-                <w:sz w:val="15"/>
-              </w:rPr>
-              <w:t>0.2958</w:t>
-            </w:r>
-          </w:p>
-        </w:tc>
-        <w:tc>
-          <w:tcPr>
-            <w:tcW w:type="dxa" w:w="2767"/>
-            <w:tcBorders>
-              <w:left w:val="single" w:sz="4" w:space="0" w:color="CCCCCC"/>
-              <w:right w:val="single" w:sz="4" w:space="0" w:color="CCCCCC"/>
-              <w:top w:val="none" w:sz="0" w:space="0" w:color="auto"/>
-              <w:bottom w:val="none" w:sz="0" w:space="0" w:color="auto"/>
-            </w:tcBorders>
-          </w:tcPr>
-          <w:p>
-            <w:pPr>
-              <w:spacing w:line="260" w:lineRule="exact" w:before="20" w:after="20"/>
-              <w:ind w:firstLine="0"/>
-              <w:jc w:val="center"/>
-            </w:pPr>
-            <w:r/>
-            <w:r>
-              <w:rPr>
-                <w:rFonts w:ascii="Times New Roman" w:hAnsi="Times New Roman" w:eastAsia="宋体"/>
-                <w:b w:val="0"/>
-                <w:sz w:val="15"/>
-              </w:rPr>
-              <w:t>0.3272</w:t>
+            <w:tcW w:type="dxa" w:w="1186"/>
+            <w:tcBorders>
+              <w:left w:val="single" w:sz="4" w:space="0" w:color="CCCCCC"/>
+              <w:right w:val="single" w:sz="4" w:space="0" w:color="CCCCCC"/>
+              <w:top w:val="none" w:sz="0" w:space="0" w:color="auto"/>
+              <w:bottom w:val="none" w:sz="0" w:space="0" w:color="auto"/>
+            </w:tcBorders>
+          </w:tcPr>
+          <w:p>
+            <w:pPr>
+              <w:spacing w:line="260" w:lineRule="exact" w:before="20" w:after="20"/>
+              <w:ind w:firstLine="0"/>
+              <w:jc w:val="center"/>
+            </w:pPr>
+            <w:r/>
+            <w:r>
+              <w:rPr>
+                <w:rFonts w:ascii="Times New Roman" w:hAnsi="Times New Roman" w:eastAsia="宋体"/>
+                <w:b w:val="0"/>
+                <w:sz w:val="15"/>
+              </w:rPr>
+              <w:t>initial_dictionary_baseline</w:t>
+            </w:r>
+          </w:p>
+        </w:tc>
+        <w:tc>
+          <w:tcPr>
+            <w:tcW w:type="dxa" w:w="1186"/>
+            <w:tcBorders>
+              <w:left w:val="single" w:sz="4" w:space="0" w:color="CCCCCC"/>
+              <w:right w:val="single" w:sz="4" w:space="0" w:color="CCCCCC"/>
+              <w:top w:val="none" w:sz="0" w:space="0" w:color="auto"/>
+              <w:bottom w:val="none" w:sz="0" w:space="0" w:color="auto"/>
+            </w:tcBorders>
+          </w:tcPr>
+          <w:p>
+            <w:pPr>
+              <w:spacing w:line="260" w:lineRule="exact" w:before="20" w:after="20"/>
+              <w:ind w:firstLine="0"/>
+              <w:jc w:val="center"/>
+            </w:pPr>
+            <w:r/>
+            <w:r>
+              <w:rPr>
+                <w:rFonts w:ascii="Times New Roman" w:hAnsi="Times New Roman" w:eastAsia="宋体"/>
+                <w:b w:val="0"/>
+                <w:sz w:val="15"/>
+              </w:rPr>
+              <w:t>NA</w:t>
+            </w:r>
+          </w:p>
+        </w:tc>
+        <w:tc>
+          <w:tcPr>
+            <w:tcW w:type="dxa" w:w="1186"/>
+            <w:tcBorders>
+              <w:left w:val="single" w:sz="4" w:space="0" w:color="CCCCCC"/>
+              <w:right w:val="single" w:sz="4" w:space="0" w:color="CCCCCC"/>
+              <w:top w:val="none" w:sz="0" w:space="0" w:color="auto"/>
+              <w:bottom w:val="none" w:sz="0" w:space="0" w:color="auto"/>
+            </w:tcBorders>
+          </w:tcPr>
+          <w:p>
+            <w:pPr>
+              <w:spacing w:line="260" w:lineRule="exact" w:before="20" w:after="20"/>
+              <w:ind w:firstLine="0"/>
+              <w:jc w:val="center"/>
+            </w:pPr>
+            <w:r/>
+            <w:r>
+              <w:rPr>
+                <w:rFonts w:ascii="Times New Roman" w:hAnsi="Times New Roman" w:eastAsia="宋体"/>
+                <w:b w:val="0"/>
+                <w:sz w:val="15"/>
+              </w:rPr>
+              <w:t>NA</w:t>
+            </w:r>
+          </w:p>
+        </w:tc>
+        <w:tc>
+          <w:tcPr>
+            <w:tcW w:type="dxa" w:w="1186"/>
+            <w:tcBorders>
+              <w:left w:val="single" w:sz="4" w:space="0" w:color="CCCCCC"/>
+              <w:right w:val="single" w:sz="4" w:space="0" w:color="CCCCCC"/>
+              <w:top w:val="none" w:sz="0" w:space="0" w:color="auto"/>
+              <w:bottom w:val="none" w:sz="0" w:space="0" w:color="auto"/>
+            </w:tcBorders>
+          </w:tcPr>
+          <w:p>
+            <w:pPr>
+              <w:spacing w:line="260" w:lineRule="exact" w:before="20" w:after="20"/>
+              <w:ind w:firstLine="0"/>
+              <w:jc w:val="center"/>
+            </w:pPr>
+            <w:r/>
+            <w:r>
+              <w:rPr>
+                <w:rFonts w:ascii="Times New Roman" w:hAnsi="Times New Roman" w:eastAsia="宋体"/>
+                <w:b w:val="0"/>
+                <w:sz w:val="15"/>
+              </w:rPr>
+              <w:t>NA</w:t>
+            </w:r>
+          </w:p>
+        </w:tc>
+        <w:tc>
+          <w:tcPr>
+            <w:tcW w:type="dxa" w:w="1186"/>
+            <w:tcBorders>
+              <w:left w:val="single" w:sz="4" w:space="0" w:color="CCCCCC"/>
+              <w:right w:val="single" w:sz="4" w:space="0" w:color="CCCCCC"/>
+              <w:top w:val="none" w:sz="0" w:space="0" w:color="auto"/>
+              <w:bottom w:val="none" w:sz="0" w:space="0" w:color="auto"/>
+            </w:tcBorders>
+          </w:tcPr>
+          <w:p>
+            <w:pPr>
+              <w:spacing w:line="260" w:lineRule="exact" w:before="20" w:after="20"/>
+              <w:ind w:firstLine="0"/>
+              <w:jc w:val="center"/>
+            </w:pPr>
+            <w:r/>
+            <w:r>
+              <w:rPr>
+                <w:rFonts w:ascii="Times New Roman" w:hAnsi="Times New Roman" w:eastAsia="宋体"/>
+                <w:b w:val="0"/>
+                <w:sz w:val="15"/>
+              </w:rPr>
+              <w:t>NA</w:t>
+            </w:r>
+          </w:p>
+        </w:tc>
+        <w:tc>
+          <w:tcPr>
+            <w:tcW w:type="dxa" w:w="1186"/>
+            <w:tcBorders>
+              <w:left w:val="single" w:sz="4" w:space="0" w:color="CCCCCC"/>
+              <w:right w:val="single" w:sz="4" w:space="0" w:color="CCCCCC"/>
+              <w:top w:val="none" w:sz="0" w:space="0" w:color="auto"/>
+              <w:bottom w:val="none" w:sz="0" w:space="0" w:color="auto"/>
+            </w:tcBorders>
+          </w:tcPr>
+          <w:p>
+            <w:pPr>
+              <w:spacing w:line="260" w:lineRule="exact" w:before="20" w:after="20"/>
+              <w:ind w:firstLine="0"/>
+              <w:jc w:val="center"/>
+            </w:pPr>
+            <w:r/>
+            <w:r>
+              <w:rPr>
+                <w:rFonts w:ascii="Times New Roman" w:hAnsi="Times New Roman" w:eastAsia="宋体"/>
+                <w:b w:val="0"/>
+                <w:sz w:val="15"/>
+              </w:rPr>
+              <w:t>NA</w:t>
+            </w:r>
+          </w:p>
+        </w:tc>
+        <w:tc>
+          <w:tcPr>
+            <w:tcW w:type="dxa" w:w="1186"/>
+            <w:tcBorders>
+              <w:left w:val="single" w:sz="4" w:space="0" w:color="CCCCCC"/>
+              <w:right w:val="single" w:sz="4" w:space="0" w:color="CCCCCC"/>
+              <w:top w:val="none" w:sz="0" w:space="0" w:color="auto"/>
+              <w:bottom w:val="none" w:sz="0" w:space="0" w:color="auto"/>
+            </w:tcBorders>
+          </w:tcPr>
+          <w:p>
+            <w:pPr>
+              <w:spacing w:line="260" w:lineRule="exact" w:before="20" w:after="20"/>
+              <w:ind w:firstLine="0"/>
+              <w:jc w:val="center"/>
+            </w:pPr>
+            <w:r/>
+            <w:r>
+              <w:rPr>
+                <w:rFonts w:ascii="Times New Roman" w:hAnsi="Times New Roman" w:eastAsia="宋体"/>
+                <w:b w:val="0"/>
+                <w:sz w:val="15"/>
+              </w:rPr>
+              <w:t>NA</w:t>
             </w:r>
           </w:p>
         </w:tc>
@@ -1868,34 +2120,88 @@
       <w:tr>
         <w:tc>
           <w:tcPr>
-            <w:tcW w:type="dxa" w:w="2767"/>
-            <w:tcBorders>
-              <w:left w:val="single" w:sz="4" w:space="0" w:color="CCCCCC"/>
-              <w:right w:val="single" w:sz="4" w:space="0" w:color="CCCCCC"/>
-              <w:top w:val="none" w:sz="0" w:space="0" w:color="auto"/>
-              <w:bottom w:val="none" w:sz="0" w:space="0" w:color="auto"/>
-            </w:tcBorders>
-          </w:tcPr>
-          <w:p>
-            <w:pPr>
-              <w:spacing w:line="260" w:lineRule="exact" w:before="20" w:after="20"/>
-              <w:ind w:firstLine="0"/>
-              <w:jc w:val="center"/>
-            </w:pPr>
-            <w:r/>
-            <w:r>
-              <w:rPr>
-                <w:rFonts w:ascii="Times New Roman" w:hAnsi="Times New Roman" w:eastAsia="宋体"/>
-                <w:b w:val="0"/>
-                <w:sz w:val="15"/>
-              </w:rPr>
-              <w:t>policy_four_class</w:t>
-            </w:r>
-          </w:p>
-        </w:tc>
-        <w:tc>
-          <w:tcPr>
-            <w:tcW w:type="dxa" w:w="2767"/>
+            <w:tcW w:type="dxa" w:w="1186"/>
+            <w:tcBorders>
+              <w:left w:val="single" w:sz="4" w:space="0" w:color="CCCCCC"/>
+              <w:right w:val="single" w:sz="4" w:space="0" w:color="CCCCCC"/>
+              <w:top w:val="none" w:sz="0" w:space="0" w:color="auto"/>
+              <w:bottom w:val="none" w:sz="0" w:space="0" w:color="auto"/>
+            </w:tcBorders>
+          </w:tcPr>
+          <w:p>
+            <w:pPr>
+              <w:spacing w:line="260" w:lineRule="exact" w:before="20" w:after="20"/>
+              <w:ind w:firstLine="0"/>
+              <w:jc w:val="center"/>
+            </w:pPr>
+            <w:r/>
+            <w:r>
+              <w:rPr>
+                <w:rFonts w:ascii="Times New Roman" w:hAnsi="Times New Roman" w:eastAsia="宋体"/>
+                <w:b w:val="0"/>
+                <w:sz w:val="15"/>
+              </w:rPr>
+              <w:t>current_lexicon_context_gate</w:t>
+            </w:r>
+          </w:p>
+        </w:tc>
+        <w:tc>
+          <w:tcPr>
+            <w:tcW w:type="dxa" w:w="1186"/>
+            <w:tcBorders>
+              <w:left w:val="single" w:sz="4" w:space="0" w:color="CCCCCC"/>
+              <w:right w:val="single" w:sz="4" w:space="0" w:color="CCCCCC"/>
+              <w:top w:val="none" w:sz="0" w:space="0" w:color="auto"/>
+              <w:bottom w:val="none" w:sz="0" w:space="0" w:color="auto"/>
+            </w:tcBorders>
+          </w:tcPr>
+          <w:p>
+            <w:pPr>
+              <w:spacing w:line="260" w:lineRule="exact" w:before="20" w:after="20"/>
+              <w:ind w:firstLine="0"/>
+              <w:jc w:val="center"/>
+            </w:pPr>
+            <w:r/>
+            <w:r>
+              <w:rPr>
+                <w:rFonts w:ascii="Times New Roman" w:hAnsi="Times New Roman" w:eastAsia="宋体"/>
+                <w:b w:val="0"/>
+                <w:sz w:val="15"/>
+              </w:rPr>
+              <w:t>0.2958</w:t>
+            </w:r>
+          </w:p>
+        </w:tc>
+        <w:tc>
+          <w:tcPr>
+            <w:tcW w:type="dxa" w:w="1186"/>
+            <w:tcBorders>
+              <w:left w:val="single" w:sz="4" w:space="0" w:color="CCCCCC"/>
+              <w:right w:val="single" w:sz="4" w:space="0" w:color="CCCCCC"/>
+              <w:top w:val="none" w:sz="0" w:space="0" w:color="auto"/>
+              <w:bottom w:val="none" w:sz="0" w:space="0" w:color="auto"/>
+            </w:tcBorders>
+          </w:tcPr>
+          <w:p>
+            <w:pPr>
+              <w:spacing w:line="260" w:lineRule="exact" w:before="20" w:after="20"/>
+              <w:ind w:firstLine="0"/>
+              <w:jc w:val="center"/>
+            </w:pPr>
+            <w:r/>
+            <w:r>
+              <w:rPr>
+                <w:rFonts w:ascii="Times New Roman" w:hAnsi="Times New Roman" w:eastAsia="宋体"/>
+                <w:b w:val="0"/>
+                <w:sz w:val="15"/>
+              </w:rPr>
+              <w:t>0.3272</w:t>
+            </w:r>
+          </w:p>
+        </w:tc>
+        <w:tc>
+          <w:tcPr>
+            <w:tcW w:type="dxa" w:w="1186"/>
             <w:tcBorders>
               <w:left w:val="single" w:sz="4" w:space="0" w:color="CCCCCC"/>
               <w:right w:val="single" w:sz="4" w:space="0" w:color="CCCCCC"/>
@@ -1922,7 +2228,7 @@
         </w:tc>
         <w:tc>
           <w:tcPr>
-            <w:tcW w:type="dxa" w:w="2767"/>
+            <w:tcW w:type="dxa" w:w="1186"/>
             <w:tcBorders>
               <w:left w:val="single" w:sz="4" w:space="0" w:color="CCCCCC"/>
               <w:right w:val="single" w:sz="4" w:space="0" w:color="CCCCCC"/>
@@ -1944,6 +2250,60 @@
                 <w:sz w:val="15"/>
               </w:rPr>
               <w:t>0.6090</w:t>
+            </w:r>
+          </w:p>
+        </w:tc>
+        <w:tc>
+          <w:tcPr>
+            <w:tcW w:type="dxa" w:w="1186"/>
+            <w:tcBorders>
+              <w:left w:val="single" w:sz="4" w:space="0" w:color="CCCCCC"/>
+              <w:right w:val="single" w:sz="4" w:space="0" w:color="CCCCCC"/>
+              <w:top w:val="none" w:sz="0" w:space="0" w:color="auto"/>
+              <w:bottom w:val="none" w:sz="0" w:space="0" w:color="auto"/>
+            </w:tcBorders>
+          </w:tcPr>
+          <w:p>
+            <w:pPr>
+              <w:spacing w:line="260" w:lineRule="exact" w:before="20" w:after="20"/>
+              <w:ind w:firstLine="0"/>
+              <w:jc w:val="center"/>
+            </w:pPr>
+            <w:r/>
+            <w:r>
+              <w:rPr>
+                <w:rFonts w:ascii="Times New Roman" w:hAnsi="Times New Roman" w:eastAsia="宋体"/>
+                <w:b w:val="0"/>
+                <w:sz w:val="15"/>
+              </w:rPr>
+              <w:t>0.5303</w:t>
+            </w:r>
+          </w:p>
+        </w:tc>
+        <w:tc>
+          <w:tcPr>
+            <w:tcW w:type="dxa" w:w="1186"/>
+            <w:tcBorders>
+              <w:left w:val="single" w:sz="4" w:space="0" w:color="CCCCCC"/>
+              <w:right w:val="single" w:sz="4" w:space="0" w:color="CCCCCC"/>
+              <w:top w:val="none" w:sz="0" w:space="0" w:color="auto"/>
+              <w:bottom w:val="none" w:sz="0" w:space="0" w:color="auto"/>
+            </w:tcBorders>
+          </w:tcPr>
+          <w:p>
+            <w:pPr>
+              <w:spacing w:line="260" w:lineRule="exact" w:before="20" w:after="20"/>
+              <w:ind w:firstLine="0"/>
+              <w:jc w:val="center"/>
+            </w:pPr>
+            <w:r/>
+            <w:r>
+              <w:rPr>
+                <w:rFonts w:ascii="Times New Roman" w:hAnsi="Times New Roman" w:eastAsia="宋体"/>
+                <w:b w:val="0"/>
+                <w:sz w:val="15"/>
+              </w:rPr>
+              <w:t>0.5750</w:t>
             </w:r>
           </w:p>
         </w:tc>
@@ -1951,165 +2311,190 @@
       <w:tr>
         <w:tc>
           <w:tcPr>
-            <w:tcW w:type="dxa" w:w="2767"/>
-            <w:tcBorders>
-              <w:left w:val="single" w:sz="4" w:space="0" w:color="CCCCCC"/>
-              <w:right w:val="single" w:sz="4" w:space="0" w:color="CCCCCC"/>
-              <w:top w:val="none" w:sz="0" w:space="0" w:color="auto"/>
-              <w:bottom w:val="none" w:sz="0" w:space="0" w:color="auto"/>
-            </w:tcBorders>
-          </w:tcPr>
-          <w:p>
-            <w:pPr>
-              <w:spacing w:line="260" w:lineRule="exact" w:before="20" w:after="20"/>
-              <w:ind w:firstLine="0"/>
-              <w:jc w:val="center"/>
-            </w:pPr>
-            <w:r/>
-            <w:r>
-              <w:rPr>
-                <w:rFonts w:ascii="Times New Roman" w:hAnsi="Times New Roman" w:eastAsia="宋体"/>
-                <w:b w:val="0"/>
-                <w:sz w:val="15"/>
-              </w:rPr>
-              <w:t>policy_direction</w:t>
-            </w:r>
-          </w:p>
-        </w:tc>
-        <w:tc>
-          <w:tcPr>
-            <w:tcW w:type="dxa" w:w="2767"/>
-            <w:tcBorders>
-              <w:left w:val="single" w:sz="4" w:space="0" w:color="CCCCCC"/>
-              <w:right w:val="single" w:sz="4" w:space="0" w:color="CCCCCC"/>
-              <w:top w:val="none" w:sz="0" w:space="0" w:color="auto"/>
-              <w:bottom w:val="none" w:sz="0" w:space="0" w:color="auto"/>
-            </w:tcBorders>
-          </w:tcPr>
-          <w:p>
-            <w:pPr>
-              <w:spacing w:line="260" w:lineRule="exact" w:before="20" w:after="20"/>
-              <w:ind w:firstLine="0"/>
-              <w:jc w:val="center"/>
-            </w:pPr>
-            <w:r/>
-            <w:r>
-              <w:rPr>
-                <w:rFonts w:ascii="Times New Roman" w:hAnsi="Times New Roman" w:eastAsia="宋体"/>
-                <w:b w:val="0"/>
-                <w:sz w:val="15"/>
-              </w:rPr>
-              <w:t>0.5303</w:t>
-            </w:r>
-          </w:p>
-        </w:tc>
-        <w:tc>
-          <w:tcPr>
-            <w:tcW w:type="dxa" w:w="2767"/>
-            <w:tcBorders>
-              <w:left w:val="single" w:sz="4" w:space="0" w:color="CCCCCC"/>
-              <w:right w:val="single" w:sz="4" w:space="0" w:color="CCCCCC"/>
-              <w:top w:val="none" w:sz="0" w:space="0" w:color="auto"/>
-              <w:bottom w:val="none" w:sz="0" w:space="0" w:color="auto"/>
-            </w:tcBorders>
-          </w:tcPr>
-          <w:p>
-            <w:pPr>
-              <w:spacing w:line="260" w:lineRule="exact" w:before="20" w:after="20"/>
-              <w:ind w:firstLine="0"/>
-              <w:jc w:val="center"/>
-            </w:pPr>
-            <w:r/>
-            <w:r>
-              <w:rPr>
-                <w:rFonts w:ascii="Times New Roman" w:hAnsi="Times New Roman" w:eastAsia="宋体"/>
-                <w:b w:val="0"/>
-                <w:sz w:val="15"/>
-              </w:rPr>
-              <w:t>0.5750</w:t>
-            </w:r>
-          </w:p>
-        </w:tc>
-      </w:tr>
-      <w:tr>
-        <w:tc>
-          <w:tcPr>
-            <w:tcW w:type="dxa" w:w="2767"/>
-            <w:tcBorders>
-              <w:left w:val="single" w:sz="4" w:space="0" w:color="CCCCCC"/>
-              <w:right w:val="single" w:sz="4" w:space="0" w:color="CCCCCC"/>
-              <w:top w:val="none" w:sz="0" w:space="0" w:color="auto"/>
-              <w:bottom w:val="none" w:sz="0" w:space="0" w:color="auto"/>
-            </w:tcBorders>
-          </w:tcPr>
-          <w:p>
-            <w:pPr>
-              <w:spacing w:line="260" w:lineRule="exact" w:before="20" w:after="20"/>
-              <w:ind w:firstLine="0"/>
-              <w:jc w:val="center"/>
-            </w:pPr>
-            <w:r/>
-            <w:r>
-              <w:rPr>
-                <w:rFonts w:ascii="Times New Roman" w:hAnsi="Times New Roman" w:eastAsia="宋体"/>
-                <w:b w:val="0"/>
-                <w:sz w:val="15"/>
-              </w:rPr>
-              <w:t>topic</w:t>
-            </w:r>
-          </w:p>
-        </w:tc>
-        <w:tc>
-          <w:tcPr>
-            <w:tcW w:type="dxa" w:w="2767"/>
-            <w:tcBorders>
-              <w:left w:val="single" w:sz="4" w:space="0" w:color="CCCCCC"/>
-              <w:right w:val="single" w:sz="4" w:space="0" w:color="CCCCCC"/>
-              <w:top w:val="none" w:sz="0" w:space="0" w:color="auto"/>
-              <w:bottom w:val="none" w:sz="0" w:space="0" w:color="auto"/>
-            </w:tcBorders>
-          </w:tcPr>
-          <w:p>
-            <w:pPr>
-              <w:spacing w:line="260" w:lineRule="exact" w:before="20" w:after="20"/>
-              <w:ind w:firstLine="0"/>
-              <w:jc w:val="center"/>
-            </w:pPr>
-            <w:r/>
-            <w:r>
-              <w:rPr>
-                <w:rFonts w:ascii="Times New Roman" w:hAnsi="Times New Roman" w:eastAsia="宋体"/>
-                <w:b w:val="0"/>
-                <w:sz w:val="15"/>
-              </w:rPr>
-              <w:t>0.6542</w:t>
-            </w:r>
-          </w:p>
-        </w:tc>
-        <w:tc>
-          <w:tcPr>
-            <w:tcW w:type="dxa" w:w="2767"/>
-            <w:tcBorders>
-              <w:left w:val="single" w:sz="4" w:space="0" w:color="CCCCCC"/>
-              <w:right w:val="single" w:sz="4" w:space="0" w:color="CCCCCC"/>
-              <w:top w:val="none" w:sz="0" w:space="0" w:color="auto"/>
-              <w:bottom w:val="none" w:sz="0" w:space="0" w:color="auto"/>
-            </w:tcBorders>
-          </w:tcPr>
-          <w:p>
-            <w:pPr>
-              <w:spacing w:line="260" w:lineRule="exact" w:before="20" w:after="20"/>
-              <w:ind w:firstLine="0"/>
-              <w:jc w:val="center"/>
-            </w:pPr>
-            <w:r/>
-            <w:r>
-              <w:rPr>
-                <w:rFonts w:ascii="Times New Roman" w:hAnsi="Times New Roman" w:eastAsia="宋体"/>
-                <w:b w:val="0"/>
-                <w:sz w:val="15"/>
-              </w:rPr>
-              <w:t>0.4723</w:t>
+            <w:tcW w:type="dxa" w:w="1186"/>
+            <w:tcBorders>
+              <w:left w:val="single" w:sz="4" w:space="0" w:color="CCCCCC"/>
+              <w:right w:val="single" w:sz="4" w:space="0" w:color="CCCCCC"/>
+              <w:top w:val="none" w:sz="0" w:space="0" w:color="auto"/>
+              <w:bottom w:val="none" w:sz="0" w:space="0" w:color="auto"/>
+            </w:tcBorders>
+          </w:tcPr>
+          <w:p>
+            <w:pPr>
+              <w:spacing w:line="260" w:lineRule="exact" w:before="20" w:after="20"/>
+              <w:ind w:firstLine="0"/>
+              <w:jc w:val="center"/>
+            </w:pPr>
+            <w:r/>
+            <w:r>
+              <w:rPr>
+                <w:rFonts w:ascii="Times New Roman" w:hAnsi="Times New Roman" w:eastAsia="宋体"/>
+                <w:b w:val="0"/>
+                <w:sz w:val="15"/>
+              </w:rPr>
+              <w:t>char_tfidf_linearsvc_groupcv</w:t>
+            </w:r>
+          </w:p>
+        </w:tc>
+        <w:tc>
+          <w:tcPr>
+            <w:tcW w:type="dxa" w:w="1186"/>
+            <w:tcBorders>
+              <w:left w:val="single" w:sz="4" w:space="0" w:color="CCCCCC"/>
+              <w:right w:val="single" w:sz="4" w:space="0" w:color="CCCCCC"/>
+              <w:top w:val="none" w:sz="0" w:space="0" w:color="auto"/>
+              <w:bottom w:val="none" w:sz="0" w:space="0" w:color="auto"/>
+            </w:tcBorders>
+          </w:tcPr>
+          <w:p>
+            <w:pPr>
+              <w:spacing w:line="260" w:lineRule="exact" w:before="20" w:after="20"/>
+              <w:ind w:firstLine="0"/>
+              <w:jc w:val="center"/>
+            </w:pPr>
+            <w:r/>
+            <w:r>
+              <w:rPr>
+                <w:rFonts w:ascii="Times New Roman" w:hAnsi="Times New Roman" w:eastAsia="宋体"/>
+                <w:b w:val="0"/>
+                <w:sz w:val="15"/>
+              </w:rPr>
+              <w:t>0.8958</w:t>
+            </w:r>
+          </w:p>
+        </w:tc>
+        <w:tc>
+          <w:tcPr>
+            <w:tcW w:type="dxa" w:w="1186"/>
+            <w:tcBorders>
+              <w:left w:val="single" w:sz="4" w:space="0" w:color="CCCCCC"/>
+              <w:right w:val="single" w:sz="4" w:space="0" w:color="CCCCCC"/>
+              <w:top w:val="none" w:sz="0" w:space="0" w:color="auto"/>
+              <w:bottom w:val="none" w:sz="0" w:space="0" w:color="auto"/>
+            </w:tcBorders>
+          </w:tcPr>
+          <w:p>
+            <w:pPr>
+              <w:spacing w:line="260" w:lineRule="exact" w:before="20" w:after="20"/>
+              <w:ind w:firstLine="0"/>
+              <w:jc w:val="center"/>
+            </w:pPr>
+            <w:r/>
+            <w:r>
+              <w:rPr>
+                <w:rFonts w:ascii="Times New Roman" w:hAnsi="Times New Roman" w:eastAsia="宋体"/>
+                <w:b w:val="0"/>
+                <w:sz w:val="15"/>
+              </w:rPr>
+              <w:t>0.7993</w:t>
+            </w:r>
+          </w:p>
+        </w:tc>
+        <w:tc>
+          <w:tcPr>
+            <w:tcW w:type="dxa" w:w="1186"/>
+            <w:tcBorders>
+              <w:left w:val="single" w:sz="4" w:space="0" w:color="CCCCCC"/>
+              <w:right w:val="single" w:sz="4" w:space="0" w:color="CCCCCC"/>
+              <w:top w:val="none" w:sz="0" w:space="0" w:color="auto"/>
+              <w:bottom w:val="none" w:sz="0" w:space="0" w:color="auto"/>
+            </w:tcBorders>
+          </w:tcPr>
+          <w:p>
+            <w:pPr>
+              <w:spacing w:line="260" w:lineRule="exact" w:before="20" w:after="20"/>
+              <w:ind w:firstLine="0"/>
+              <w:jc w:val="center"/>
+            </w:pPr>
+            <w:r/>
+            <w:r>
+              <w:rPr>
+                <w:rFonts w:ascii="Times New Roman" w:hAnsi="Times New Roman" w:eastAsia="宋体"/>
+                <w:b w:val="0"/>
+                <w:sz w:val="15"/>
+              </w:rPr>
+              <w:t>0.8583</w:t>
+            </w:r>
+          </w:p>
+        </w:tc>
+        <w:tc>
+          <w:tcPr>
+            <w:tcW w:type="dxa" w:w="1186"/>
+            <w:tcBorders>
+              <w:left w:val="single" w:sz="4" w:space="0" w:color="CCCCCC"/>
+              <w:right w:val="single" w:sz="4" w:space="0" w:color="CCCCCC"/>
+              <w:top w:val="none" w:sz="0" w:space="0" w:color="auto"/>
+              <w:bottom w:val="none" w:sz="0" w:space="0" w:color="auto"/>
+            </w:tcBorders>
+          </w:tcPr>
+          <w:p>
+            <w:pPr>
+              <w:spacing w:line="260" w:lineRule="exact" w:before="20" w:after="20"/>
+              <w:ind w:firstLine="0"/>
+              <w:jc w:val="center"/>
+            </w:pPr>
+            <w:r/>
+            <w:r>
+              <w:rPr>
+                <w:rFonts w:ascii="Times New Roman" w:hAnsi="Times New Roman" w:eastAsia="宋体"/>
+                <w:b w:val="0"/>
+                <w:sz w:val="15"/>
+              </w:rPr>
+              <w:t>0.6804</w:t>
+            </w:r>
+          </w:p>
+        </w:tc>
+        <w:tc>
+          <w:tcPr>
+            <w:tcW w:type="dxa" w:w="1186"/>
+            <w:tcBorders>
+              <w:left w:val="single" w:sz="4" w:space="0" w:color="CCCCCC"/>
+              <w:right w:val="single" w:sz="4" w:space="0" w:color="CCCCCC"/>
+              <w:top w:val="none" w:sz="0" w:space="0" w:color="auto"/>
+              <w:bottom w:val="none" w:sz="0" w:space="0" w:color="auto"/>
+            </w:tcBorders>
+          </w:tcPr>
+          <w:p>
+            <w:pPr>
+              <w:spacing w:line="260" w:lineRule="exact" w:before="20" w:after="20"/>
+              <w:ind w:firstLine="0"/>
+              <w:jc w:val="center"/>
+            </w:pPr>
+            <w:r/>
+            <w:r>
+              <w:rPr>
+                <w:rFonts w:ascii="Times New Roman" w:hAnsi="Times New Roman" w:eastAsia="宋体"/>
+                <w:b w:val="0"/>
+                <w:sz w:val="15"/>
+              </w:rPr>
+              <w:t>0.7879</w:t>
+            </w:r>
+          </w:p>
+        </w:tc>
+        <w:tc>
+          <w:tcPr>
+            <w:tcW w:type="dxa" w:w="1186"/>
+            <w:tcBorders>
+              <w:left w:val="single" w:sz="4" w:space="0" w:color="CCCCCC"/>
+              <w:right w:val="single" w:sz="4" w:space="0" w:color="CCCCCC"/>
+              <w:top w:val="none" w:sz="0" w:space="0" w:color="auto"/>
+              <w:bottom w:val="none" w:sz="0" w:space="0" w:color="auto"/>
+            </w:tcBorders>
+          </w:tcPr>
+          <w:p>
+            <w:pPr>
+              <w:spacing w:line="260" w:lineRule="exact" w:before="20" w:after="20"/>
+              <w:ind w:firstLine="0"/>
+              <w:jc w:val="center"/>
+            </w:pPr>
+            <w:r/>
+            <w:r>
+              <w:rPr>
+                <w:rFonts w:ascii="Times New Roman" w:hAnsi="Times New Roman" w:eastAsia="宋体"/>
+                <w:b w:val="0"/>
+                <w:sz w:val="15"/>
+              </w:rPr>
+              <w:t>0.7301</w:t>
             </w:r>
           </w:p>
         </w:tc>
@@ -2126,7 +2511,7 @@
           <w:b w:val="0"/>
           <w:sz w:val="15"/>
         </w:rPr>
-        <w:t>注：指标来自当前词典实时重打分和固定监督验证流程。</w:t>
+        <w:t>注：数值均来自正式验证结果文件；主题硬分类仅作辅助诊断，正式解释使用连续主题关注度。</w:t>
       </w:r>
     </w:p>
     <w:p>
@@ -3721,7 +4106,7 @@
           <w:b w:val="0"/>
           <w:sz w:val="21"/>
         </w:rPr>
-        <w:t>日度高级稳健性使用完整连续交易日序列上的Student-t EGARCH-X。正式D0规格联合估计均值、方差和事件系数；D+1、D0+D1以及置换检验使用固定干扰参数条件似然，只作为诊断。样本期为2006-01-04至2026-02-12，共4888个交易日、80个报告日、79个创新度事件和107个真实政策操作日。主结果方法为full_joint_mle，收敛标记为True；标准化创新度方差项系数为0.0955，对应条件方差变化约10.0217%，条件波动率变化约4.8912%，正式联合LR p值为0.1887，条件置换诊断p值为0.2100。</w:t>
+        <w:t>日度高级稳健性使用完整连续交易日序列上的Student-t EGARCH-X。正式D0规格联合估计均值、方差和事件系数；D+1、D0+D1以及置换检验使用固定干扰参数条件似然，只作为诊断。样本期为2006-01-04至2026-02-12，共4888个交易日、80个报告日、79个创新度事件和107个真实政策操作日。主结果方法为full_joint_mle，收敛标记为True；标准化创新度方差项系数为0.0944，对应条件方差变化约9.9051%，条件波动率变化约4.8356%，正式联合LR p值为0.1888，条件置换诊断p值为0.2100。</w:t>
       </w:r>
     </w:p>
     <w:p>

</xml_diff>

<commit_message>
feat: Enhance journal paper generation and auditing tools
- Added document sanitization to replace engineering terms with their Chinese equivalents in the journal paper.
- Implemented normalization of DOCX spacing rules to avoid fixed-spacing tags.
- Updated title formatting in the journal paper to improve presentation.
- Introduced a backup script to archive important files before edits.
- Created a script to build the journal paper from output results, integrating various data sources.
- Developed a paper audit tool to check for forbidden terms and layout discrepancies in the generated PDF.
- Added functionality to render PDFs to PNGs for visual comparison against reference documents.
- Enhanced error handling and reporting in the auditing process.
</commit_message>
<xml_diff>
--- a/paper/课程论文_提交版.docx
+++ b/paper/课程论文_提交版.docx
@@ -1206,7 +1206,7 @@
     </w:tbl>
     <w:p>
       <w:pPr>
-        <w:spacing w:line="400" w:lineRule="exact" w:before="0" w:after="0"/>
+        <w:spacing w:line="400" w:lineRule="auto" w:before="0" w:after="0"/>
         <w:rPr>
           <w:rFonts w:ascii="黑体" w:eastAsia="黑体" w:hAnsi="黑体" w:cs="黑体"/>
           <w:sz w:val="24"/>
@@ -1231,7 +1231,7 @@
     </w:p>
     <w:p>
       <w:pPr>
-        <w:spacing w:line="482" w:lineRule="exact" w:before="0" w:after="0"/>
+        <w:spacing w:before="0" w:after="100" w:lineRule="auto" w:line="560"/>
         <w:jc w:val="center"/>
       </w:pPr>
       <w:r>
@@ -1239,14 +1239,14 @@
           <w:rFonts w:ascii="Times New Roman" w:hAnsi="Times New Roman" w:eastAsia="方正小标宋简体"/>
           <w:b/>
           <w:i w:val="0"/>
-          <w:sz w:val="36"/>
+          <w:sz w:val="44"/>
         </w:rPr>
         <w:t>中国货币政策报告文本特征</w:t>
       </w:r>
     </w:p>
     <w:p>
       <w:pPr>
-        <w:spacing w:line="482" w:lineRule="exact" w:before="0" w:after="0"/>
+        <w:spacing w:before="0" w:after="100" w:lineRule="auto" w:line="560"/>
         <w:jc w:val="center"/>
       </w:pPr>
       <w:r>
@@ -1254,14 +1254,14 @@
           <w:rFonts w:ascii="Times New Roman" w:hAnsi="Times New Roman" w:eastAsia="方正小标宋简体"/>
           <w:b/>
           <w:i w:val="0"/>
-          <w:sz w:val="36"/>
+          <w:sz w:val="44"/>
         </w:rPr>
         <w:t>与金融市场反应</w:t>
       </w:r>
     </w:p>
     <w:p>
       <w:pPr>
-        <w:spacing w:before="0" w:after="40" w:line="280" w:lineRule="exact"/>
+        <w:spacing w:before="0" w:after="40" w:lineRule="auto" w:line="280"/>
         <w:jc w:val="center"/>
       </w:pPr>
       <w:r>
@@ -1276,7 +1276,7 @@
     </w:p>
     <w:p>
       <w:pPr>
-        <w:spacing w:before="0" w:after="40" w:line="280" w:lineRule="exact"/>
+        <w:spacing w:before="0" w:after="40" w:lineRule="auto" w:line="280"/>
         <w:jc w:val="center"/>
       </w:pPr>
       <w:r>
@@ -1291,428 +1291,429 @@
     </w:p>
     <w:p>
       <w:pPr>
-        <w:spacing w:before="80" w:after="0" w:line="300" w:lineRule="exact"/>
+        <w:spacing w:before="80" w:after="0" w:lineRule="auto" w:line="300"/>
         <w:ind w:firstLine="0"/>
         <w:jc w:val="both"/>
+      </w:pPr>
+      <w:r>
+        <w:rPr>
+          <w:rFonts w:ascii="Times New Roman" w:hAnsi="Times New Roman" w:eastAsia="仿宋"/>
+          <w:b/>
+          <w:i w:val="0"/>
+          <w:sz w:val="19"/>
+        </w:rPr>
+        <w:t>内容提要：</w:t>
+      </w:r>
+      <w:r>
+        <w:rPr>
+          <w:rFonts w:ascii="Times New Roman" w:hAnsi="Times New Roman" w:eastAsia="宋体"/>
+          <w:b w:val="0"/>
+          <w:i w:val="0"/>
+          <w:sz w:val="19"/>
+        </w:rPr>
+        <w:t>本文基于2006Q1至2025Q4中国人民银行季度货币政策执行报告，构造政策指引扩展窗口TF-IDF创新度，并结合人工标注、语境门控和字符TF-IDF与LinearSVC检验文本测量有效性。股票事件研究显示，政策指引创新度与报告发布后五日实际波动率显著正相关；创新度提高一个样本标准差，实际波动率约提高13.0%。Student-t EGARCH-X日度模型得到方向一致但不显著的波动率效应。债券部分中，未预期政策语调和跨拟合监督语调对收益率曲线斜率的解释不稳定，适合作为探索性证据。结果表明，央行报告中的增量指引信息更直接地反映在股票短期不确定性中，而债券期限结构反应需要更细致地区分政策路径、宏观信息和期限溢价。</w:t>
+      </w:r>
+    </w:p>
+    <w:p>
+      <w:pPr>
+        <w:spacing w:before="20" w:after="20" w:lineRule="auto" w:line="300"/>
+        <w:ind w:firstLine="0"/>
+        <w:jc w:val="both"/>
+      </w:pPr>
+      <w:r>
+        <w:rPr>
+          <w:rFonts w:ascii="Times New Roman" w:hAnsi="Times New Roman" w:eastAsia="宋体"/>
+          <w:b w:val="0"/>
+          <w:i w:val="0"/>
+          <w:sz w:val="19"/>
+        </w:rPr>
+        <w:t>关键词：货币政策沟通；文本创新度；实际波动率；EGARCH-X；收益率曲线</w:t>
+      </w:r>
+    </w:p>
+    <w:p>
+      <w:pPr>
+        <w:spacing w:before="0" w:after="40" w:lineRule="auto" w:line="280"/>
+        <w:jc w:val="center"/>
+      </w:pPr>
+      <w:r>
+        <w:rPr>
+          <w:rFonts w:ascii="Times New Roman" w:hAnsi="Times New Roman" w:eastAsia="宋体"/>
+          <w:b w:val="0"/>
+          <w:i w:val="0"/>
+          <w:sz w:val="19"/>
+        </w:rPr>
+        <w:t>中图分类号：F822.0    文献标识码：A</w:t>
+      </w:r>
+    </w:p>
+    <w:p>
+      <w:pPr>
+        <w:spacing w:before="0" w:after="40" w:lineRule="auto" w:line="280"/>
+        <w:jc w:val="center"/>
+      </w:pPr>
+      <w:r>
+        <w:rPr>
+          <w:rFonts w:ascii="Times New Roman" w:hAnsi="Times New Roman" w:eastAsia="Times New Roman"/>
+          <w:b/>
+          <w:i w:val="0"/>
+          <w:sz w:val="22"/>
+        </w:rPr>
+        <w:t>Textual Features of China's Monetary Policy Reports and Financial Market Reactions</w:t>
+      </w:r>
+    </w:p>
+    <w:p>
+      <w:pPr>
+        <w:spacing w:before="0" w:after="40" w:lineRule="auto" w:line="280"/>
+        <w:jc w:val="center"/>
+      </w:pPr>
+      <w:r>
+        <w:rPr>
+          <w:rFonts w:ascii="Times New Roman" w:hAnsi="Times New Roman" w:eastAsia="Times New Roman"/>
+          <w:b w:val="0"/>
+          <w:i w:val="0"/>
+          <w:sz w:val="19"/>
+        </w:rPr>
+        <w:t>LUO Yunji</w:t>
+      </w:r>
+    </w:p>
+    <w:p>
+      <w:pPr>
+        <w:spacing w:before="40" w:after="0" w:lineRule="auto" w:line="280"/>
+        <w:ind w:firstLine="0"/>
+        <w:jc w:val="both"/>
+      </w:pPr>
+      <w:r>
+        <w:rPr>
+          <w:rFonts w:ascii="Times New Roman" w:hAnsi="Times New Roman" w:eastAsia="Times New Roman"/>
+          <w:b/>
+          <w:i w:val="0"/>
+          <w:sz w:val="19"/>
+        </w:rPr>
+      </w:r>
+      <w:r>
+        <w:rPr>
+          <w:rFonts w:ascii="Times New Roman" w:hAnsi="Times New Roman" w:eastAsia="Times New Roman"/>
+          <w:b w:val="0"/>
+          <w:i w:val="0"/>
+          <w:sz w:val="19"/>
+        </w:rPr>
+      </w:r>
+      <w:r>
+        <w:t>Abstract: This paper studies quarterly monetary policy reports of the People's Bank of China from 2006Q1 to 2025Q4. It constructs an expanding-window TF-IDF novelty measure for policy guidance, validates text measurement with manual annotations, context gating, and grouped cross-validation, and links the text measures to stock and bond market reactions. The core event-level evidence shows a positive association between guidance novelty and five-day realized stock volatility. A Student-t EGARCH-X 模型 on the full daily return sequence yields a positive but statistically weaker volatility effect. Unexpected policy tone and cross-fitted supervised tone do not robustly explain the government bond yield curve, suggesting that bond-market communication effects are harder to separate from macro-information and term-premium channels.</w:t>
+      </w:r>
+    </w:p>
+    <w:p>
+      <w:pPr>
+        <w:spacing w:before="0" w:after="40" w:lineRule="auto" w:line="280"/>
+        <w:jc w:val="center"/>
+      </w:pPr>
+      <w:r>
+        <w:rPr>
+          <w:rFonts w:ascii="Times New Roman" w:hAnsi="Times New Roman" w:eastAsia="Times New Roman"/>
+          <w:b w:val="0"/>
+          <w:i w:val="0"/>
+          <w:sz w:val="19"/>
+        </w:rPr>
+        <w:t>Key words: monetary policy communication; text novelty; realized volatility; EGARCH-X; yield curve</w:t>
+      </w:r>
+    </w:p>
+    <w:p>
+      <w:r>
+        <w:br w:type="page"/>
+      </w:r>
+    </w:p>
+    <w:p>
+      <w:pPr>
+        <w:spacing w:before="240" w:after="120" w:lineRule="auto" w:line="360"/>
+        <w:jc w:val="center"/>
+      </w:pPr>
+      <w:r>
+        <w:rPr>
+          <w:rFonts w:ascii="Times New Roman" w:hAnsi="Times New Roman" w:eastAsia="仿宋"/>
+          <w:b/>
+          <w:i w:val="0"/>
+          <w:sz w:val="28"/>
+        </w:rPr>
+        <w:t>一、引言</w:t>
+      </w:r>
+    </w:p>
+    <w:p>
+      <w:pPr>
+        <w:spacing w:before="0" w:after="0" w:lineRule="auto" w:line="360"/>
+        <w:ind w:firstLine="420"/>
+        <w:jc w:val="both"/>
+      </w:pPr>
+      <w:r>
+        <w:rPr>
+          <w:rFonts w:ascii="Times New Roman" w:hAnsi="Times New Roman" w:eastAsia="宋体"/>
+          <w:b w:val="0"/>
+          <w:i w:val="0"/>
+          <w:sz w:val="21"/>
+        </w:rPr>
+        <w:t>货币政策沟通不仅传递政策取向，也会改变市场对宏观状态和政策反应函数的判断。中国人民银行季度货币政策执行报告具有稳定的发布频率和较长的连续文本，是观察央行沟通变化的合适材料。与公告或新闻稿相比，季度报告包含更完整的宏观判断、政策回顾和下一阶段政策指引，因而能够为文本测度提供较多上下文。</w:t>
+      </w:r>
+    </w:p>
+    <w:p>
+      <w:pPr>
+        <w:spacing w:before="0" w:after="0" w:lineRule="auto" w:line="360"/>
+        <w:ind w:firstLine="420"/>
+        <w:jc w:val="both"/>
+      </w:pPr>
+      <w:r>
+        <w:rPr>
+          <w:rFonts w:ascii="Times New Roman" w:hAnsi="Times New Roman" w:eastAsia="宋体"/>
+          <w:b w:val="0"/>
+          <w:i w:val="0"/>
+          <w:sz w:val="21"/>
+        </w:rPr>
+        <w:t>已有研究从不同角度处理央行沟通信息。姜富伟、胡逸驰和黄楠（2021）将中国央行报告文本与股票市场反应联系起来；董青马等（2024）强调资产价格反应中未预期政策信息的重要性；尚玉皇、刘华和申峰（2025）则把央行沟通放入国债收益率曲线框架中讨论。国际文献中，Blinder等（2008）系统讨论央行沟通的理论和证据，Gurkaynak、Sack和Swanson（2005）区分政策行动与声明信息，Hansen和McMahon（2016）、Nakamura和Steinsson（2018）、Jarocinski和Karadi（2020）进一步提示央行信息效应可能与传统政策冲击交织在一起。</w:t>
+      </w:r>
+    </w:p>
+    <w:p>
+      <w:pPr>
+        <w:spacing w:before="0" w:after="0" w:lineRule="auto" w:line="360"/>
+        <w:ind w:firstLine="420"/>
+        <w:jc w:val="both"/>
+      </w:pPr>
+      <w:r>
+        <w:rPr>
+          <w:rFonts w:ascii="Times New Roman" w:hAnsi="Times New Roman" w:eastAsia="宋体"/>
+          <w:b w:val="0"/>
+          <w:i w:val="0"/>
+          <w:sz w:val="21"/>
+        </w:rPr>
+        <w:t>现有文献给本文留下的空间，不在于重新证明央行沟通会影响资产价格，而在于更细地处理“沟通中的哪一部分信息”以及“市场以何种形式反应”。季度报告中有大量宏观回顾和制度性表述，如果把全文语调直接接到市场变量上，容易把政策指引、经济判断和模板化文字混在一起。本文把政策指引章节从全文中分离出来，并把文本变化而不是文本水平作为核心解释变量。</w:t>
+      </w:r>
+    </w:p>
+    <w:p>
+      <w:pPr>
+        <w:spacing w:before="0" w:after="0" w:lineRule="auto" w:line="360"/>
+        <w:ind w:firstLine="420"/>
+        <w:jc w:val="both"/>
+      </w:pPr>
+      <w:r>
+        <w:rPr>
+          <w:rFonts w:ascii="Times New Roman" w:hAnsi="Times New Roman" w:eastAsia="宋体"/>
+          <w:b w:val="0"/>
+          <w:i w:val="0"/>
+          <w:sz w:val="21"/>
+        </w:rPr>
+        <w:t>这一处理也避免了把央行沟通简单等同于好消息或坏消息。政策指引的新增表述可能包含偏松信号、偏紧信号，也可能只是对政策工具组合、风险约束或执行方式的重新说明。市场反应未必表现为收益率或股价的单向移动，却可能表现为短期波动率上升。以创新度解释股票实际波动率，正是为了捕捉这种信息更新过程。</w:t>
+      </w:r>
+    </w:p>
+    <w:p>
+      <w:pPr>
+        <w:spacing w:before="0" w:after="0" w:lineRule="auto" w:line="360"/>
+        <w:ind w:firstLine="420"/>
+        <w:jc w:val="both"/>
+      </w:pPr>
+      <w:r>
+        <w:rPr>
+          <w:rFonts w:ascii="Times New Roman" w:hAnsi="Times New Roman" w:eastAsia="宋体"/>
+          <w:b w:val="0"/>
+          <w:i w:val="0"/>
+          <w:sz w:val="21"/>
+        </w:rPr>
+        <w:t>本文关心的问题更窄：在中国季度货币政策报告中，政策指引章节相对历史文本的新信息，是否与报告发布后的短期市场波动有关。研究以2006Q1至2025Q4的正式样本为基础，构造扩展窗口TF-IDF创新度，并将其与沪深300指数发布后五日实际波动率相连接。债券市场部分使用未预期政策语调和跨拟合监督语调解释国债收益率曲线变化，定位为探索性扩展。</w:t>
+      </w:r>
+    </w:p>
+    <w:p>
+      <w:pPr>
+        <w:spacing w:before="0" w:after="0" w:lineRule="auto" w:line="360"/>
+        <w:ind w:firstLine="420"/>
+        <w:jc w:val="both"/>
+      </w:pPr>
+      <w:r>
+        <w:rPr>
+          <w:rFonts w:ascii="Times New Roman" w:hAnsi="Times New Roman" w:eastAsia="宋体"/>
+          <w:b w:val="0"/>
+          <w:i w:val="0"/>
+          <w:sz w:val="21"/>
+        </w:rPr>
+        <w:t>本文的经验结果可以概括为三点。第一，政策指引创新度与股票市场短期实际波动率之间存在显著正相关关系，创新度提高一个样本标准差，发布后五日实际波动率约提高13.0%。第二，Student-t EGARCH-X模型在完整连续日度收益率序列上得到正向但不显著的创新度方差项，说明核心发现并非完全由一个日度条件异方差规格驱动，但稳健性证据较弱。第三，未预期政策语调与收益率曲线斜率、跨拟合监督语调与债券反应之间没有稳定显著关系，债券市场结果需要谨慎解释。</w:t>
+      </w:r>
+    </w:p>
+    <w:p>
+      <w:pPr>
+        <w:spacing w:before="0" w:after="0" w:lineRule="auto" w:line="360"/>
+        <w:ind w:firstLine="420"/>
+        <w:jc w:val="both"/>
+      </w:pPr>
+      <w:r>
+        <w:rPr>
+          <w:rFonts w:ascii="Times New Roman" w:hAnsi="Times New Roman" w:eastAsia="宋体"/>
+          <w:b w:val="0"/>
+          <w:i w:val="0"/>
+          <w:sz w:val="21"/>
+        </w:rPr>
+        <w:t>变量构造依赖较完整的Python文本处理过程。报告原文先经过PDF抽取和章节识别，再切分为句子并连接到报告层面的市场事件；金融数据也需要按照交易日历重排，才能把报告发布时间和事件窗口对齐。文本特征工程和金融事件研究在这里不是两个分离步骤，前者决定解释变量的含义，后者决定市场反应的计量口径。</w:t>
+      </w:r>
+    </w:p>
+    <w:p>
+      <w:pPr>
+        <w:spacing w:before="0" w:after="0" w:lineRule="auto" w:line="360"/>
+        <w:ind w:firstLine="420"/>
+        <w:jc w:val="both"/>
+      </w:pPr>
+      <w:r>
+        <w:rPr>
+          <w:rFonts w:ascii="Times New Roman" w:hAnsi="Times New Roman" w:eastAsia="宋体"/>
+          <w:b w:val="0"/>
+          <w:i w:val="0"/>
+          <w:sz w:val="21"/>
+        </w:rPr>
+        <w:t>本文的边际贡献主要在三个层面。其一，把政策指引章节单独拿出来度量，避免全文相似度被宏观回顾和固定格式稀释。其二，用按报告分组交叉验证检验文本测量，降低同一报告模板句泄漏到测试集的风险。其三，把股票事件级回归、日度波动模型和债券探索放在同一研究问题下比较，从而区分证据强弱，而不是只挑选单一显著结果。</w:t>
+      </w:r>
+    </w:p>
+    <w:p>
+      <w:pPr>
+        <w:spacing w:before="0" w:after="0" w:lineRule="auto" w:line="360"/>
+        <w:ind w:firstLine="420"/>
+        <w:jc w:val="both"/>
+      </w:pPr>
+      <w:r>
+        <w:rPr>
+          <w:rFonts w:ascii="Times New Roman" w:hAnsi="Times New Roman" w:eastAsia="宋体"/>
+          <w:b w:val="0"/>
+          <w:i w:val="0"/>
+          <w:sz w:val="21"/>
+        </w:rPr>
+        <w:t>这种安排也有助于解释不同市场结果为何不完全一致。股票波动率对信息不确定性和估值分歧反应更直接，政策指引的新表述即使不改变政策利率，也可能提高短期风险重估强度。债券收益率曲线则同时承载政策路径、增长通胀判断和期限溢价，单一语调指标更容易混合多种信息。因此，本文把股票创新度—波动率关系作为核心主线，把债券语调—收益率曲线关系作为探索性扩展。</w:t>
+      </w:r>
+    </w:p>
+    <w:p>
+      <w:pPr>
+        <w:spacing w:before="240" w:after="120" w:lineRule="auto" w:line="360"/>
+        <w:jc w:val="center"/>
+      </w:pPr>
+      <w:r>
+        <w:rPr>
+          <w:rFonts w:ascii="Times New Roman" w:hAnsi="Times New Roman" w:eastAsia="仿宋"/>
+          <w:b/>
+          <w:i w:val="0"/>
+          <w:sz w:val="28"/>
+        </w:rPr>
+        <w:t>二、数据来源与研究设计</w:t>
+      </w:r>
+    </w:p>
+    <w:p>
+      <w:pPr>
+        <w:spacing w:before="180" w:after="60" w:lineRule="auto" w:line="320"/>
+        <w:jc w:val="left"/>
       </w:pPr>
       <w:r>
         <w:rPr>
           <w:rFonts w:ascii="Times New Roman" w:hAnsi="Times New Roman" w:eastAsia="黑体"/>
           <w:b/>
           <w:i w:val="0"/>
-          <w:sz w:val="19"/>
-        </w:rPr>
-        <w:t>内容提要：</w:t>
-      </w:r>
-      <w:r>
-        <w:rPr>
-          <w:rFonts w:ascii="Times New Roman" w:hAnsi="Times New Roman" w:eastAsia="宋体"/>
-          <w:b w:val="0"/>
-          <w:i w:val="0"/>
-          <w:sz w:val="19"/>
-        </w:rPr>
-        <w:t>本文基于2006Q1至2025Q4中国人民银行季度货币政策执行报告，构造政策指引扩展窗口TF-IDF创新度，并结合人工标注、语境门控和字符TF-IDF与LinearSVC检验文本测量有效性。股票事件研究显示，政策指引创新度与报告发布后五日实际波动率显著正相关；创新度提高一个样本标准差，实际波动率约提高13.0%。Student-t EGARCH-X日度模型得到方向一致但不显著的波动率效应。债券部分中，未预期政策语调和跨拟合监督语调对收益率曲线斜率的解释不稳定，适合作为探索性证据。结果表明，央行报告中的增量指引信息更直接地反映在股票短期不确定性中，而债券期限结构反应需要更细致地区分政策路径、宏观信息和期限溢价。</w:t>
-      </w:r>
-    </w:p>
-    <w:p>
-      <w:pPr>
-        <w:spacing w:before="20" w:after="20" w:line="300" w:lineRule="exact"/>
-        <w:ind w:firstLine="0"/>
-        <w:jc w:val="both"/>
-      </w:pPr>
-      <w:r>
-        <w:rPr>
-          <w:rFonts w:ascii="Times New Roman" w:hAnsi="Times New Roman" w:eastAsia="宋体"/>
-          <w:b w:val="0"/>
-          <w:i w:val="0"/>
-          <w:sz w:val="19"/>
-        </w:rPr>
-        <w:t>关键词：货币政策沟通；文本创新度；实际波动率；EGARCH-X；收益率曲线</w:t>
-      </w:r>
-    </w:p>
-    <w:p>
-      <w:pPr>
-        <w:spacing w:before="0" w:after="40" w:line="280" w:lineRule="exact"/>
+          <w:sz w:val="24"/>
+        </w:rPr>
+        <w:t>（一）货币政策报告与金融市场数据</w:t>
+      </w:r>
+    </w:p>
+    <w:p>
+      <w:pPr>
+        <w:spacing w:before="0" w:after="0" w:lineRule="auto" w:line="360"/>
+        <w:ind w:firstLine="420"/>
+        <w:jc w:val="both"/>
+      </w:pPr>
+      <w:r>
+        <w:rPr>
+          <w:rFonts w:ascii="Times New Roman" w:hAnsi="Times New Roman" w:eastAsia="宋体"/>
+          <w:b w:val="0"/>
+          <w:i w:val="0"/>
+          <w:sz w:val="21"/>
+        </w:rPr>
+        <w:t>报告文本来自中国人民银行官网发布的《中国货币政策执行报告》。数据库覆盖2006Q1至2026Q1，正式实证样本限定在2006Q1至2025Q4，共80期。2026Q1仅保留在来源登记中，不进入正式估计。报告发布时间用于对齐股票和债券交易日；若发布时间落在非交易日，事件日顺延至下一可交易日。</w:t>
+      </w:r>
+    </w:p>
+    <w:p>
+      <w:pPr>
+        <w:spacing w:before="0" w:after="0" w:lineRule="auto" w:line="360"/>
+        <w:ind w:firstLine="420"/>
+        <w:jc w:val="both"/>
+      </w:pPr>
+      <w:r>
+        <w:rPr>
+          <w:rFonts w:ascii="Times New Roman" w:hAnsi="Times New Roman" w:eastAsia="宋体"/>
+          <w:b w:val="0"/>
+          <w:i w:val="0"/>
+          <w:sz w:val="21"/>
+        </w:rPr>
+        <w:t>金融市场数据包括沪深300指数日行情、中债国债1年、5年和10年期收益率，以及公开政策操作日期。股票部分计算报告发布后五个交易日实际波动率，债券部分构造收益率曲线水平、斜率和曲率的短窗口变化。政策操作变量只用于控制报告发布附近的政策环境，避免把同日或近日报告反应全部归因于文本。</w:t>
+      </w:r>
+    </w:p>
+    <w:p>
+      <w:pPr>
+        <w:spacing w:before="0" w:after="0" w:lineRule="auto" w:line="360"/>
+        <w:ind w:firstLine="420"/>
+        <w:jc w:val="both"/>
+      </w:pPr>
+      <w:r>
+        <w:rPr>
+          <w:rFonts w:ascii="Times New Roman" w:hAnsi="Times New Roman" w:eastAsia="宋体"/>
+          <w:b w:val="0"/>
+          <w:i w:val="0"/>
+          <w:sz w:val="21"/>
+        </w:rPr>
+        <w:t>这些数据的频率并不一致。货币政策报告是季度文本，股票和债券价格为日度序列，政策操作又是不定期事件。实证处理需要把低频文本信息压缩为报告层变量，再把高频金融数据聚合为事件窗口反应。这样得到的样本量由报告期数决定，而不是由日度行情观测数决定，这一点对后文解释检验功效和分时期估计尤其重要。</w:t>
+      </w:r>
+    </w:p>
+    <w:p>
+      <w:pPr>
+        <w:spacing w:before="0" w:after="0" w:lineRule="auto" w:line="360"/>
+        <w:ind w:firstLine="420"/>
+        <w:jc w:val="both"/>
+      </w:pPr>
+      <w:r>
+        <w:rPr>
+          <w:rFonts w:ascii="Times New Roman" w:hAnsi="Times New Roman" w:eastAsia="宋体"/>
+          <w:b w:val="0"/>
+          <w:i w:val="0"/>
+          <w:sz w:val="21"/>
+        </w:rPr>
+        <w:t>报告文本本身也存在时间上的可比性问题。早期报告排版和章节结构与后期不完全一致，若直接使用全文相似度，宏观回顾、专栏、附录和固定制度表述会稀释政策指引变化。本文只在正式样本内使用修复后的章节文本，并在表1中区分文本、市场和人工标注数据的样本口径，使不同来源的用途保持清楚。</w:t>
+      </w:r>
+    </w:p>
+    <w:p>
+      <w:pPr>
+        <w:spacing w:before="0" w:after="0" w:lineRule="auto" w:line="360"/>
+        <w:ind w:firstLine="420"/>
+        <w:jc w:val="both"/>
+      </w:pPr>
+      <w:r>
+        <w:rPr>
+          <w:rFonts w:ascii="Times New Roman" w:hAnsi="Times New Roman" w:eastAsia="宋体"/>
+          <w:b w:val="0"/>
+          <w:i w:val="0"/>
+          <w:sz w:val="21"/>
+        </w:rPr>
+        <w:t>事件日对齐采用发布日与交易日的对应关系。若报告在交易日收盘后发布，或发布日不是交易日，市场反应会落入后续交易日；若报告在交易时段内可被市场观察，则当日价格也可能包含反应。本文统一用已整理的发布时间映射事件日，并在股票与债券模型中保持同一口径，避免不同市场使用不同事件定义。</w:t>
+      </w:r>
+    </w:p>
+    <w:p>
+      <w:pPr>
+        <w:spacing w:before="0" w:after="0" w:lineRule="auto" w:line="360"/>
+        <w:ind w:firstLine="420"/>
+        <w:jc w:val="both"/>
+      </w:pPr>
+      <w:r>
+        <w:rPr>
+          <w:rFonts w:ascii="Times New Roman" w:hAnsi="Times New Roman" w:eastAsia="宋体"/>
+          <w:b w:val="0"/>
+          <w:i w:val="0"/>
+          <w:sz w:val="21"/>
+        </w:rPr>
+        <w:t>数据合法性和可追溯性主要体现在来源和口径上。政策报告来自央行公开网页，市场数据保留清洗后的日度序列和来源登记。论文正文不展开文件层面的复现说明，但表1给出了每类数据的频率、样本期和用途，读者可以据此判断文本、股票、债券和人工标注样本之间的对应关系。</w:t>
+      </w:r>
+    </w:p>
+    <w:p>
+      <w:pPr>
+        <w:spacing w:before="80" w:after="40" w:lineRule="auto" w:line="260"/>
         <w:jc w:val="center"/>
       </w:pPr>
       <w:r>
         <w:rPr>
-          <w:rFonts w:ascii="Times New Roman" w:hAnsi="Times New Roman" w:eastAsia="宋体"/>
-          <w:b w:val="0"/>
-          <w:i w:val="0"/>
-          <w:sz w:val="19"/>
-        </w:rPr>
-        <w:t>中图分类号：F822.0    文献标识码：A</w:t>
-      </w:r>
-    </w:p>
-    <w:p>
-      <w:pPr>
-        <w:spacing w:before="0" w:after="40" w:line="280" w:lineRule="exact"/>
-        <w:jc w:val="center"/>
-      </w:pPr>
-      <w:r>
-        <w:rPr>
-          <w:rFonts w:ascii="Times New Roman" w:hAnsi="Times New Roman" w:eastAsia="Times New Roman"/>
-          <w:b/>
-          <w:i w:val="0"/>
-          <w:sz w:val="22"/>
-        </w:rPr>
-        <w:t>Textual Features of China's Monetary Policy Reports and Financial Market Reactions</w:t>
-      </w:r>
-    </w:p>
-    <w:p>
-      <w:pPr>
-        <w:spacing w:before="0" w:after="40" w:line="280" w:lineRule="exact"/>
-        <w:jc w:val="center"/>
-      </w:pPr>
-      <w:r>
-        <w:rPr>
-          <w:rFonts w:ascii="Times New Roman" w:hAnsi="Times New Roman" w:eastAsia="Times New Roman"/>
-          <w:b w:val="0"/>
-          <w:i w:val="0"/>
-          <w:sz w:val="19"/>
-        </w:rPr>
-        <w:t>LUO Yunji</w:t>
-      </w:r>
-    </w:p>
-    <w:p>
-      <w:pPr>
-        <w:spacing w:before="40" w:after="0" w:line="280" w:lineRule="exact"/>
-        <w:ind w:firstLine="0"/>
-        <w:jc w:val="both"/>
-      </w:pPr>
-      <w:r>
-        <w:rPr>
-          <w:rFonts w:ascii="Times New Roman" w:hAnsi="Times New Roman" w:eastAsia="Times New Roman"/>
-          <w:b/>
-          <w:i w:val="0"/>
-          <w:sz w:val="19"/>
-        </w:rPr>
-        <w:t xml:space="preserve">Abstract: </w:t>
-      </w:r>
-      <w:r>
-        <w:rPr>
-          <w:rFonts w:ascii="Times New Roman" w:hAnsi="Times New Roman" w:eastAsia="Times New Roman"/>
-          <w:b w:val="0"/>
-          <w:i w:val="0"/>
-          <w:sz w:val="19"/>
-        </w:rPr>
-        <w:t>This paper studies quarterly monetary policy reports of the People's Bank of China from 2006Q1 to 2025Q4. It constructs an expanding-window TF-IDF novelty measure for policy guidance, validates text measurement with manual annotations, context gating, and grouped cross-validation, and links the text measures to stock and bond market reactions. The core event-level evidence shows a positive association between guidance novelty and five-day realized stock volatility. A Student-t EGARCH-X model on the full daily return sequence yields a positive but statistically weaker volatility effect. Unexpected policy tone and cross-fitted supervised tone do not robustly explain the government bond yield curve, suggesting that bond-market communication effects are harder to separate from macro-information and term-premium channels.</w:t>
-      </w:r>
-    </w:p>
-    <w:p>
-      <w:pPr>
-        <w:spacing w:before="0" w:after="40" w:line="280" w:lineRule="exact"/>
-        <w:jc w:val="center"/>
-      </w:pPr>
-      <w:r>
-        <w:rPr>
-          <w:rFonts w:ascii="Times New Roman" w:hAnsi="Times New Roman" w:eastAsia="Times New Roman"/>
-          <w:b w:val="0"/>
-          <w:i w:val="0"/>
-          <w:sz w:val="19"/>
-        </w:rPr>
-        <w:t>Key words: monetary policy communication; text novelty; realized volatility; EGARCH-X; yield curve</w:t>
-      </w:r>
-    </w:p>
-    <w:p>
-      <w:r>
-        <w:br w:type="page"/>
-      </w:r>
-    </w:p>
-    <w:p>
-      <w:pPr>
-        <w:spacing w:before="240" w:after="120" w:line="360" w:lineRule="exact"/>
-        <w:jc w:val="center"/>
-      </w:pPr>
-      <w:r>
-        <w:rPr>
-          <w:rFonts w:ascii="Times New Roman" w:hAnsi="Times New Roman" w:eastAsia="黑体"/>
-          <w:b/>
-          <w:i w:val="0"/>
-          <w:sz w:val="28"/>
-        </w:rPr>
-        <w:t>一、引言</w:t>
-      </w:r>
-    </w:p>
-    <w:p>
-      <w:pPr>
-        <w:spacing w:before="0" w:after="0" w:line="360" w:lineRule="exact"/>
-        <w:ind w:firstLine="420"/>
-        <w:jc w:val="both"/>
-      </w:pPr>
-      <w:r>
-        <w:rPr>
-          <w:rFonts w:ascii="Times New Roman" w:hAnsi="Times New Roman" w:eastAsia="宋体"/>
-          <w:b w:val="0"/>
-          <w:i w:val="0"/>
-          <w:sz w:val="21"/>
-        </w:rPr>
-        <w:t>货币政策沟通不仅传递政策取向，也会改变市场对宏观状态和政策反应函数的判断。中国人民银行季度货币政策执行报告具有稳定的发布频率和较长的连续文本，是观察央行沟通变化的合适材料。与公告或新闻稿相比，季度报告包含更完整的宏观判断、政策回顾和下一阶段政策指引，因而能够为文本测度提供较多上下文。</w:t>
-      </w:r>
-    </w:p>
-    <w:p>
-      <w:pPr>
-        <w:spacing w:before="0" w:after="0" w:line="360" w:lineRule="exact"/>
-        <w:ind w:firstLine="420"/>
-        <w:jc w:val="both"/>
-      </w:pPr>
-      <w:r>
-        <w:rPr>
-          <w:rFonts w:ascii="Times New Roman" w:hAnsi="Times New Roman" w:eastAsia="宋体"/>
-          <w:b w:val="0"/>
-          <w:i w:val="0"/>
-          <w:sz w:val="21"/>
-        </w:rPr>
-        <w:t>已有研究从不同角度处理央行沟通信息。姜富伟、胡逸驰和黄楠（2021）将中国央行报告文本与股票市场反应联系起来；董青马等（2024）强调资产价格反应中未预期政策信息的重要性；尚玉皇、刘华和申峰（2025）则把央行沟通放入国债收益率曲线框架中讨论。国际文献中，Blinder等（2008）系统讨论央行沟通的理论和证据，Gurkaynak、Sack和Swanson（2005）区分政策行动与声明信息，Hansen和McMahon（2016）、Nakamura和Steinsson（2018）、Jarocinski和Karadi（2020）进一步提示央行信息效应可能与传统政策冲击交织在一起。</w:t>
-      </w:r>
-    </w:p>
-    <w:p>
-      <w:pPr>
-        <w:spacing w:before="0" w:after="0" w:line="360" w:lineRule="exact"/>
-        <w:ind w:firstLine="420"/>
-        <w:jc w:val="both"/>
-      </w:pPr>
-      <w:r>
-        <w:rPr>
-          <w:rFonts w:ascii="Times New Roman" w:hAnsi="Times New Roman" w:eastAsia="宋体"/>
-          <w:b w:val="0"/>
-          <w:i w:val="0"/>
-          <w:sz w:val="21"/>
-        </w:rPr>
-        <w:t>现有文献给本文留下的空间，不在于重新证明央行沟通会影响资产价格，而在于更细地处理“沟通中的哪一部分信息”以及“市场以何种形式反应”。季度报告中有大量宏观回顾和制度性表述，如果把全文语调直接接到市场变量上，容易把政策指引、经济判断和模板化文字混在一起。本文把政策指引章节从全文中分离出来，并把文本变化而不是文本水平作为核心解释变量。</w:t>
-      </w:r>
-    </w:p>
-    <w:p>
-      <w:pPr>
-        <w:spacing w:before="0" w:after="0" w:line="360" w:lineRule="exact"/>
-        <w:ind w:firstLine="420"/>
-        <w:jc w:val="both"/>
-      </w:pPr>
-      <w:r>
-        <w:rPr>
-          <w:rFonts w:ascii="Times New Roman" w:hAnsi="Times New Roman" w:eastAsia="宋体"/>
-          <w:b w:val="0"/>
-          <w:i w:val="0"/>
-          <w:sz w:val="21"/>
-        </w:rPr>
-        <w:t>这一处理也避免了把央行沟通简单等同于好消息或坏消息。政策指引的新增表述可能包含偏松信号、偏紧信号，也可能只是对政策工具组合、风险约束或执行方式的重新说明。市场反应未必表现为收益率或股价的单向移动，却可能表现为短期波动率上升。以创新度解释股票实际波动率，正是为了捕捉这种信息更新过程。</w:t>
-      </w:r>
-    </w:p>
-    <w:p>
-      <w:pPr>
-        <w:spacing w:before="0" w:after="0" w:line="360" w:lineRule="exact"/>
-        <w:ind w:firstLine="420"/>
-        <w:jc w:val="both"/>
-      </w:pPr>
-      <w:r>
-        <w:rPr>
-          <w:rFonts w:ascii="Times New Roman" w:hAnsi="Times New Roman" w:eastAsia="宋体"/>
-          <w:b w:val="0"/>
-          <w:i w:val="0"/>
-          <w:sz w:val="21"/>
-        </w:rPr>
-        <w:t>本文关心的问题更窄：在中国季度货币政策报告中，政策指引章节相对历史文本的新信息，是否与报告发布后的短期市场波动有关。研究以2006Q1至2025Q4的正式样本为基础，构造扩展窗口TF-IDF创新度，并将其与沪深300指数发布后五日实际波动率相连接。债券市场部分使用未预期政策语调和跨拟合监督语调解释国债收益率曲线变化，定位为探索性扩展。</w:t>
-      </w:r>
-    </w:p>
-    <w:p>
-      <w:pPr>
-        <w:spacing w:before="0" w:after="0" w:line="360" w:lineRule="exact"/>
-        <w:ind w:firstLine="420"/>
-        <w:jc w:val="both"/>
-      </w:pPr>
-      <w:r>
-        <w:rPr>
-          <w:rFonts w:ascii="Times New Roman" w:hAnsi="Times New Roman" w:eastAsia="宋体"/>
-          <w:b w:val="0"/>
-          <w:i w:val="0"/>
-          <w:sz w:val="21"/>
-        </w:rPr>
-        <w:t>本文的经验结果可以概括为三点。第一，政策指引创新度与股票市场短期实际波动率之间存在显著正相关关系，创新度提高一个样本标准差，发布后五日实际波动率约提高13.0%。第二，Student-t EGARCH-X模型在完整连续日度收益率序列上得到正向但不显著的创新度方差项，说明核心发现并非完全由一个日度条件异方差规格驱动，但稳健性证据较弱。第三，未预期政策语调与收益率曲线斜率、跨拟合监督语调与债券反应之间没有稳定显著关系，债券市场结果需要谨慎解释。</w:t>
-      </w:r>
-    </w:p>
-    <w:p>
-      <w:pPr>
-        <w:spacing w:before="0" w:after="0" w:line="360" w:lineRule="exact"/>
-        <w:ind w:firstLine="420"/>
-        <w:jc w:val="both"/>
-      </w:pPr>
-      <w:r>
-        <w:rPr>
-          <w:rFonts w:ascii="Times New Roman" w:hAnsi="Times New Roman" w:eastAsia="宋体"/>
-          <w:b w:val="0"/>
-          <w:i w:val="0"/>
-          <w:sz w:val="21"/>
-        </w:rPr>
-        <w:t>变量构造依赖较完整的Python文本处理过程。报告原文先经过PDF抽取和章节识别，再切分为句子并连接到报告层面的市场事件；金融数据也需要按照交易日历重排，才能把报告发布时间和事件窗口对齐。文本特征工程和金融事件研究在这里不是两个分离步骤，前者决定解释变量的含义，后者决定市场反应的计量口径。</w:t>
-      </w:r>
-    </w:p>
-    <w:p>
-      <w:pPr>
-        <w:spacing w:before="0" w:after="0" w:line="360" w:lineRule="exact"/>
-        <w:ind w:firstLine="420"/>
-        <w:jc w:val="both"/>
-      </w:pPr>
-      <w:r>
-        <w:rPr>
-          <w:rFonts w:ascii="Times New Roman" w:hAnsi="Times New Roman" w:eastAsia="宋体"/>
-          <w:b w:val="0"/>
-          <w:i w:val="0"/>
-          <w:sz w:val="21"/>
-        </w:rPr>
-        <w:t>本文的边际贡献主要在三个层面。其一，把政策指引章节单独拿出来度量，避免全文相似度被宏观回顾和固定格式稀释。其二，用按报告分组交叉验证检验文本测量，降低同一报告模板句泄漏到测试集的风险。其三，把股票事件级回归、日度波动模型和债券探索放在同一研究问题下比较，从而区分证据强弱，而不是只挑选单一显著结果。</w:t>
-      </w:r>
-    </w:p>
-    <w:p>
-      <w:pPr>
-        <w:spacing w:before="0" w:after="0" w:line="360" w:lineRule="exact"/>
-        <w:ind w:firstLine="420"/>
-        <w:jc w:val="both"/>
-      </w:pPr>
-      <w:r>
-        <w:rPr>
-          <w:rFonts w:ascii="Times New Roman" w:hAnsi="Times New Roman" w:eastAsia="宋体"/>
-          <w:b w:val="0"/>
-          <w:i w:val="0"/>
-          <w:sz w:val="21"/>
-        </w:rPr>
-        <w:t>这种安排也有助于解释不同市场结果为何不完全一致。股票波动率对信息不确定性和估值分歧反应更直接，政策指引的新表述即使不改变政策利率，也可能提高短期风险重估强度。债券收益率曲线则同时承载政策路径、增长通胀判断和期限溢价，单一语调指标更容易混合多种信息。因此，本文把股票创新度—波动率关系作为核心主线，把债券语调—收益率曲线关系作为探索性扩展。</w:t>
-      </w:r>
-    </w:p>
-    <w:p>
-      <w:pPr>
-        <w:spacing w:before="240" w:after="120" w:line="360" w:lineRule="exact"/>
-        <w:jc w:val="center"/>
-      </w:pPr>
-      <w:r>
-        <w:rPr>
-          <w:rFonts w:ascii="Times New Roman" w:hAnsi="Times New Roman" w:eastAsia="黑体"/>
-          <w:b/>
-          <w:i w:val="0"/>
-          <w:sz w:val="28"/>
-        </w:rPr>
-        <w:t>二、数据来源与研究设计</w:t>
-      </w:r>
-    </w:p>
-    <w:p>
-      <w:pPr>
-        <w:spacing w:before="180" w:after="60" w:line="320" w:lineRule="exact"/>
-        <w:jc w:val="left"/>
-      </w:pPr>
-      <w:r>
-        <w:rPr>
-          <w:rFonts w:ascii="Times New Roman" w:hAnsi="Times New Roman" w:eastAsia="黑体"/>
-          <w:b/>
-          <w:i w:val="0"/>
-          <w:sz w:val="24"/>
-        </w:rPr>
-        <w:t>（一）货币政策报告与金融市场数据</w:t>
-      </w:r>
-    </w:p>
-    <w:p>
-      <w:pPr>
-        <w:spacing w:before="0" w:after="0" w:line="360" w:lineRule="exact"/>
-        <w:ind w:firstLine="420"/>
-        <w:jc w:val="both"/>
-      </w:pPr>
-      <w:r>
-        <w:rPr>
-          <w:rFonts w:ascii="Times New Roman" w:hAnsi="Times New Roman" w:eastAsia="宋体"/>
-          <w:b w:val="0"/>
-          <w:i w:val="0"/>
-          <w:sz w:val="21"/>
-        </w:rPr>
-        <w:t>报告文本来自中国人民银行官网发布的《中国货币政策执行报告》。数据库覆盖2006Q1至2026Q1，正式实证样本限定在2006Q1至2025Q4，共80期。2026Q1仅保留在来源登记中，不进入正式估计。报告发布时间用于对齐股票和债券交易日；若发布时间落在非交易日，事件日顺延至下一可交易日。</w:t>
-      </w:r>
-    </w:p>
-    <w:p>
-      <w:pPr>
-        <w:spacing w:before="0" w:after="0" w:line="360" w:lineRule="exact"/>
-        <w:ind w:firstLine="420"/>
-        <w:jc w:val="both"/>
-      </w:pPr>
-      <w:r>
-        <w:rPr>
-          <w:rFonts w:ascii="Times New Roman" w:hAnsi="Times New Roman" w:eastAsia="宋体"/>
-          <w:b w:val="0"/>
-          <w:i w:val="0"/>
-          <w:sz w:val="21"/>
-        </w:rPr>
-        <w:t>金融市场数据包括沪深300指数日行情、中债国债1年、5年和10年期收益率，以及公开政策操作日期。股票部分计算报告发布后五个交易日实际波动率，债券部分构造收益率曲线水平、斜率和曲率的短窗口变化。政策操作变量只用于控制报告发布附近的政策环境，避免把同日或近日报告反应全部归因于文本。</w:t>
-      </w:r>
-    </w:p>
-    <w:p>
-      <w:pPr>
-        <w:spacing w:before="0" w:after="0" w:line="360" w:lineRule="exact"/>
-        <w:ind w:firstLine="420"/>
-        <w:jc w:val="both"/>
-      </w:pPr>
-      <w:r>
-        <w:rPr>
-          <w:rFonts w:ascii="Times New Roman" w:hAnsi="Times New Roman" w:eastAsia="宋体"/>
-          <w:b w:val="0"/>
-          <w:i w:val="0"/>
-          <w:sz w:val="21"/>
-        </w:rPr>
-        <w:t>这些数据的频率并不一致。货币政策报告是季度文本，股票和债券价格为日度序列，政策操作又是不定期事件。实证处理需要把低频文本信息压缩为报告层变量，再把高频金融数据聚合为事件窗口反应。这样得到的样本量由报告期数决定，而不是由日度行情观测数决定，这一点对后文解释检验功效和分时期估计尤其重要。</w:t>
-      </w:r>
-    </w:p>
-    <w:p>
-      <w:pPr>
-        <w:spacing w:before="0" w:after="0" w:line="360" w:lineRule="exact"/>
-        <w:ind w:firstLine="420"/>
-        <w:jc w:val="both"/>
-      </w:pPr>
-      <w:r>
-        <w:rPr>
-          <w:rFonts w:ascii="Times New Roman" w:hAnsi="Times New Roman" w:eastAsia="宋体"/>
-          <w:b w:val="0"/>
-          <w:i w:val="0"/>
-          <w:sz w:val="21"/>
-        </w:rPr>
-        <w:t>报告文本本身也存在时间上的可比性问题。早期报告排版和章节结构与后期不完全一致，若直接使用全文相似度，宏观回顾、专栏、附录和固定制度表述会稀释政策指引变化。本文只在正式样本内使用修复后的章节文本，并在表1中区分文本、市场和人工标注数据的样本口径，使不同来源的用途保持清楚。</w:t>
-      </w:r>
-    </w:p>
-    <w:p>
-      <w:pPr>
-        <w:spacing w:before="0" w:after="0" w:line="360" w:lineRule="exact"/>
-        <w:ind w:firstLine="420"/>
-        <w:jc w:val="both"/>
-      </w:pPr>
-      <w:r>
-        <w:rPr>
-          <w:rFonts w:ascii="Times New Roman" w:hAnsi="Times New Roman" w:eastAsia="宋体"/>
-          <w:b w:val="0"/>
-          <w:i w:val="0"/>
-          <w:sz w:val="21"/>
-        </w:rPr>
-        <w:t>事件日对齐采用发布日与交易日的对应关系。若报告在交易日收盘后发布，或发布日不是交易日，市场反应会落入后续交易日；若报告在交易时段内可被市场观察，则当日价格也可能包含反应。本文统一用已整理的发布时间映射事件日，并在股票与债券模型中保持同一口径，避免不同市场使用不同事件定义。</w:t>
-      </w:r>
-    </w:p>
-    <w:p>
-      <w:pPr>
-        <w:spacing w:before="0" w:after="0" w:line="360" w:lineRule="exact"/>
-        <w:ind w:firstLine="420"/>
-        <w:jc w:val="both"/>
-      </w:pPr>
-      <w:r>
-        <w:rPr>
-          <w:rFonts w:ascii="Times New Roman" w:hAnsi="Times New Roman" w:eastAsia="宋体"/>
-          <w:b w:val="0"/>
-          <w:i w:val="0"/>
-          <w:sz w:val="21"/>
-        </w:rPr>
-        <w:t>数据合法性和可追溯性主要体现在来源和口径上。政策报告来自央行公开网页，市场数据保留清洗后的日度序列和来源登记。论文正文不展开文件层面的复现说明，但表1给出了每类数据的频率、样本期和用途，读者可以据此判断文本、股票、债券和人工标注样本之间的对应关系。</w:t>
-      </w:r>
-    </w:p>
-    <w:p>
-      <w:pPr>
-        <w:spacing w:before="80" w:after="40" w:line="260" w:lineRule="exact"/>
-        <w:jc w:val="center"/>
-      </w:pPr>
-      <w:r>
-        <w:rPr>
-          <w:rFonts w:ascii="Times New Roman" w:hAnsi="Times New Roman" w:eastAsia="黑体"/>
+          <w:rFonts w:ascii="Times New Roman" w:hAnsi="Times New Roman" w:eastAsia="仿宋"/>
           <w:b/>
           <w:i w:val="0"/>
           <w:sz w:val="18"/>
@@ -1756,7 +1757,7 @@
           </w:tcPr>
           <w:p>
             <w:pPr>
-              <w:spacing w:before="0" w:after="0" w:line="240" w:lineRule="exact"/>
+              <w:spacing w:before="0" w:after="0" w:line="240" w:lineRule="auto"/>
               <w:jc w:val="center"/>
             </w:pPr>
             <w:r>
@@ -1780,7 +1781,7 @@
           </w:tcPr>
           <w:p>
             <w:pPr>
-              <w:spacing w:before="0" w:after="0" w:line="240" w:lineRule="exact"/>
+              <w:spacing w:before="0" w:after="0" w:line="240" w:lineRule="auto"/>
               <w:jc w:val="center"/>
             </w:pPr>
             <w:r>
@@ -1804,7 +1805,7 @@
           </w:tcPr>
           <w:p>
             <w:pPr>
-              <w:spacing w:before="0" w:after="0" w:line="240" w:lineRule="exact"/>
+              <w:spacing w:before="0" w:after="0" w:line="240" w:lineRule="auto"/>
               <w:jc w:val="center"/>
             </w:pPr>
             <w:r>
@@ -1828,7 +1829,7 @@
           </w:tcPr>
           <w:p>
             <w:pPr>
-              <w:spacing w:before="0" w:after="0" w:line="240" w:lineRule="exact"/>
+              <w:spacing w:before="0" w:after="0" w:line="240" w:lineRule="auto"/>
               <w:jc w:val="center"/>
             </w:pPr>
             <w:r>
@@ -1852,7 +1853,7 @@
           </w:tcPr>
           <w:p>
             <w:pPr>
-              <w:spacing w:before="0" w:after="0" w:line="240" w:lineRule="exact"/>
+              <w:spacing w:before="0" w:after="0" w:line="240" w:lineRule="auto"/>
               <w:jc w:val="center"/>
             </w:pPr>
             <w:r>
@@ -1878,7 +1879,7 @@
           </w:tcPr>
           <w:p>
             <w:pPr>
-              <w:spacing w:before="0" w:after="0" w:line="240" w:lineRule="exact"/>
+              <w:spacing w:before="0" w:after="0" w:line="240" w:lineRule="auto"/>
               <w:jc w:val="center"/>
             </w:pPr>
             <w:r>
@@ -1899,7 +1900,7 @@
           </w:tcPr>
           <w:p>
             <w:pPr>
-              <w:spacing w:before="0" w:after="0" w:line="240" w:lineRule="exact"/>
+              <w:spacing w:before="0" w:after="0" w:line="240" w:lineRule="auto"/>
               <w:jc w:val="center"/>
             </w:pPr>
             <w:r>
@@ -1920,7 +1921,7 @@
           </w:tcPr>
           <w:p>
             <w:pPr>
-              <w:spacing w:before="0" w:after="0" w:line="240" w:lineRule="exact"/>
+              <w:spacing w:before="0" w:after="0" w:line="240" w:lineRule="auto"/>
               <w:jc w:val="center"/>
             </w:pPr>
             <w:r>
@@ -1941,7 +1942,7 @@
           </w:tcPr>
           <w:p>
             <w:pPr>
-              <w:spacing w:before="0" w:after="0" w:line="240" w:lineRule="exact"/>
+              <w:spacing w:before="0" w:after="0" w:line="240" w:lineRule="auto"/>
               <w:jc w:val="center"/>
             </w:pPr>
             <w:r>
@@ -1962,7 +1963,7 @@
           </w:tcPr>
           <w:p>
             <w:pPr>
-              <w:spacing w:before="0" w:after="0" w:line="240" w:lineRule="exact"/>
+              <w:spacing w:before="0" w:after="0" w:line="240" w:lineRule="auto"/>
               <w:jc w:val="center"/>
             </w:pPr>
             <w:r>
@@ -1988,7 +1989,7 @@
           </w:tcPr>
           <w:p>
             <w:pPr>
-              <w:spacing w:before="0" w:after="0" w:line="240" w:lineRule="exact"/>
+              <w:spacing w:before="0" w:after="0" w:line="240" w:lineRule="auto"/>
               <w:jc w:val="center"/>
             </w:pPr>
             <w:r>
@@ -2009,7 +2010,7 @@
           </w:tcPr>
           <w:p>
             <w:pPr>
-              <w:spacing w:before="0" w:after="0" w:line="240" w:lineRule="exact"/>
+              <w:spacing w:before="0" w:after="0" w:line="240" w:lineRule="auto"/>
               <w:jc w:val="center"/>
             </w:pPr>
             <w:r>
@@ -2030,7 +2031,7 @@
           </w:tcPr>
           <w:p>
             <w:pPr>
-              <w:spacing w:before="0" w:after="0" w:line="240" w:lineRule="exact"/>
+              <w:spacing w:before="0" w:after="0" w:line="240" w:lineRule="auto"/>
               <w:jc w:val="center"/>
             </w:pPr>
             <w:r>
@@ -2051,7 +2052,7 @@
           </w:tcPr>
           <w:p>
             <w:pPr>
-              <w:spacing w:before="0" w:after="0" w:line="240" w:lineRule="exact"/>
+              <w:spacing w:before="0" w:after="0" w:line="240" w:lineRule="auto"/>
               <w:jc w:val="center"/>
             </w:pPr>
             <w:r>
@@ -2072,7 +2073,7 @@
           </w:tcPr>
           <w:p>
             <w:pPr>
-              <w:spacing w:before="0" w:after="0" w:line="240" w:lineRule="exact"/>
+              <w:spacing w:before="0" w:after="0" w:line="240" w:lineRule="auto"/>
               <w:jc w:val="center"/>
             </w:pPr>
             <w:r>
@@ -2098,7 +2099,7 @@
           </w:tcPr>
           <w:p>
             <w:pPr>
-              <w:spacing w:before="0" w:after="0" w:line="240" w:lineRule="exact"/>
+              <w:spacing w:before="0" w:after="0" w:line="240" w:lineRule="auto"/>
               <w:jc w:val="center"/>
             </w:pPr>
             <w:r>
@@ -2119,7 +2120,7 @@
           </w:tcPr>
           <w:p>
             <w:pPr>
-              <w:spacing w:before="0" w:after="0" w:line="240" w:lineRule="exact"/>
+              <w:spacing w:before="0" w:after="0" w:line="240" w:lineRule="auto"/>
               <w:jc w:val="center"/>
             </w:pPr>
             <w:r>
@@ -2140,7 +2141,7 @@
           </w:tcPr>
           <w:p>
             <w:pPr>
-              <w:spacing w:before="0" w:after="0" w:line="240" w:lineRule="exact"/>
+              <w:spacing w:before="0" w:after="0" w:line="240" w:lineRule="auto"/>
               <w:jc w:val="center"/>
             </w:pPr>
             <w:r>
@@ -2161,7 +2162,7 @@
           </w:tcPr>
           <w:p>
             <w:pPr>
-              <w:spacing w:before="0" w:after="0" w:line="240" w:lineRule="exact"/>
+              <w:spacing w:before="0" w:after="0" w:line="240" w:lineRule="auto"/>
               <w:jc w:val="center"/>
             </w:pPr>
             <w:r>
@@ -2182,7 +2183,7 @@
           </w:tcPr>
           <w:p>
             <w:pPr>
-              <w:spacing w:before="0" w:after="0" w:line="240" w:lineRule="exact"/>
+              <w:spacing w:before="0" w:after="0" w:line="240" w:lineRule="auto"/>
               <w:jc w:val="center"/>
             </w:pPr>
             <w:r>
@@ -2208,7 +2209,7 @@
           </w:tcPr>
           <w:p>
             <w:pPr>
-              <w:spacing w:before="0" w:after="0" w:line="240" w:lineRule="exact"/>
+              <w:spacing w:before="0" w:after="0" w:line="240" w:lineRule="auto"/>
               <w:jc w:val="center"/>
             </w:pPr>
             <w:r>
@@ -2229,7 +2230,7 @@
           </w:tcPr>
           <w:p>
             <w:pPr>
-              <w:spacing w:before="0" w:after="0" w:line="240" w:lineRule="exact"/>
+              <w:spacing w:before="0" w:after="0" w:line="240" w:lineRule="auto"/>
               <w:jc w:val="center"/>
             </w:pPr>
             <w:r>
@@ -2250,7 +2251,7 @@
           </w:tcPr>
           <w:p>
             <w:pPr>
-              <w:spacing w:before="0" w:after="0" w:line="240" w:lineRule="exact"/>
+              <w:spacing w:before="0" w:after="0" w:line="240" w:lineRule="auto"/>
               <w:jc w:val="center"/>
             </w:pPr>
             <w:r>
@@ -2271,7 +2272,7 @@
           </w:tcPr>
           <w:p>
             <w:pPr>
-              <w:spacing w:before="0" w:after="0" w:line="240" w:lineRule="exact"/>
+              <w:spacing w:before="0" w:after="0" w:line="240" w:lineRule="auto"/>
               <w:jc w:val="center"/>
             </w:pPr>
             <w:r>
@@ -2292,7 +2293,7 @@
           </w:tcPr>
           <w:p>
             <w:pPr>
-              <w:spacing w:before="0" w:after="0" w:line="240" w:lineRule="exact"/>
+              <w:spacing w:before="0" w:after="0" w:line="240" w:lineRule="auto"/>
               <w:jc w:val="center"/>
             </w:pPr>
             <w:r>
@@ -2321,7 +2322,7 @@
           </w:tcPr>
           <w:p>
             <w:pPr>
-              <w:spacing w:before="0" w:after="0" w:line="240" w:lineRule="exact"/>
+              <w:spacing w:before="0" w:after="0" w:line="240" w:lineRule="auto"/>
               <w:jc w:val="center"/>
             </w:pPr>
             <w:r>
@@ -2345,7 +2346,7 @@
           </w:tcPr>
           <w:p>
             <w:pPr>
-              <w:spacing w:before="0" w:after="0" w:line="240" w:lineRule="exact"/>
+              <w:spacing w:before="0" w:after="0" w:line="240" w:lineRule="auto"/>
               <w:jc w:val="center"/>
             </w:pPr>
             <w:r>
@@ -2369,7 +2370,7 @@
           </w:tcPr>
           <w:p>
             <w:pPr>
-              <w:spacing w:before="0" w:after="0" w:line="240" w:lineRule="exact"/>
+              <w:spacing w:before="0" w:after="0" w:line="240" w:lineRule="auto"/>
               <w:jc w:val="center"/>
             </w:pPr>
             <w:r>
@@ -2393,7 +2394,7 @@
           </w:tcPr>
           <w:p>
             <w:pPr>
-              <w:spacing w:before="0" w:after="0" w:line="240" w:lineRule="exact"/>
+              <w:spacing w:before="0" w:after="0" w:line="240" w:lineRule="auto"/>
               <w:jc w:val="center"/>
             </w:pPr>
             <w:r>
@@ -2417,7 +2418,7 @@
           </w:tcPr>
           <w:p>
             <w:pPr>
-              <w:spacing w:before="0" w:after="0" w:line="240" w:lineRule="exact"/>
+              <w:spacing w:before="0" w:after="0" w:line="240" w:lineRule="auto"/>
               <w:jc w:val="center"/>
             </w:pPr>
             <w:r>
@@ -2435,7 +2436,7 @@
     </w:tbl>
     <w:p>
       <w:pPr>
-        <w:spacing w:before="40" w:after="80" w:line="220" w:lineRule="exact"/>
+        <w:spacing w:before="40" w:after="80" w:lineRule="auto" w:line="220"/>
         <w:ind w:firstLine="0"/>
         <w:jc w:val="both"/>
       </w:pPr>
@@ -2451,7 +2452,7 @@
     </w:p>
     <w:p>
       <w:pPr>
-        <w:spacing w:before="180" w:after="60" w:line="320" w:lineRule="exact"/>
+        <w:spacing w:before="180" w:after="60" w:lineRule="auto" w:line="320"/>
         <w:jc w:val="left"/>
       </w:pPr>
       <w:r>
@@ -2466,7 +2467,7 @@
     </w:p>
     <w:p>
       <w:pPr>
-        <w:spacing w:before="0" w:after="0" w:line="360" w:lineRule="exact"/>
+        <w:spacing w:before="0" w:after="0" w:lineRule="auto" w:line="360"/>
         <w:ind w:firstLine="420"/>
         <w:jc w:val="both"/>
       </w:pPr>
@@ -2482,7 +2483,7 @@
     </w:p>
     <w:p>
       <w:pPr>
-        <w:spacing w:before="0" w:after="0" w:line="360" w:lineRule="exact"/>
+        <w:spacing w:before="0" w:after="0" w:lineRule="auto" w:line="360"/>
         <w:ind w:firstLine="420"/>
         <w:jc w:val="both"/>
       </w:pPr>
@@ -2498,7 +2499,7 @@
     </w:p>
     <w:p>
       <w:pPr>
-        <w:spacing w:before="0" w:after="0" w:line="360" w:lineRule="exact"/>
+        <w:spacing w:before="0" w:after="0" w:lineRule="auto" w:line="360"/>
         <w:ind w:firstLine="420"/>
         <w:jc w:val="both"/>
       </w:pPr>
@@ -2514,7 +2515,7 @@
     </w:p>
     <w:p>
       <w:pPr>
-        <w:spacing w:before="0" w:after="0" w:line="360" w:lineRule="exact"/>
+        <w:spacing w:before="0" w:after="0" w:lineRule="auto" w:line="360"/>
         <w:ind w:firstLine="420"/>
         <w:jc w:val="both"/>
       </w:pPr>
@@ -2530,7 +2531,7 @@
     </w:p>
     <w:p>
       <w:pPr>
-        <w:spacing w:before="0" w:after="0" w:line="360" w:lineRule="exact"/>
+        <w:spacing w:before="0" w:after="0" w:lineRule="auto" w:line="360"/>
         <w:ind w:firstLine="420"/>
         <w:jc w:val="both"/>
       </w:pPr>
@@ -2546,7 +2547,7 @@
     </w:p>
     <w:p>
       <w:pPr>
-        <w:spacing w:before="0" w:after="0" w:line="360" w:lineRule="exact"/>
+        <w:spacing w:before="0" w:after="0" w:lineRule="auto" w:line="360"/>
         <w:ind w:firstLine="420"/>
         <w:jc w:val="both"/>
       </w:pPr>
@@ -2562,7 +2563,7 @@
     </w:p>
     <w:p>
       <w:pPr>
-        <w:spacing w:before="0" w:after="0" w:line="360" w:lineRule="exact"/>
+        <w:spacing w:before="0" w:after="0" w:lineRule="auto" w:line="360"/>
         <w:ind w:firstLine="420"/>
         <w:jc w:val="both"/>
       </w:pPr>
@@ -2578,14 +2579,14 @@
     </w:p>
     <w:p>
       <w:pPr>
-        <w:spacing w:before="80" w:after="20" w:line="240" w:lineRule="exact"/>
+        <w:spacing w:before="80" w:after="20"/>
         <w:ind w:firstLine="0"/>
         <w:jc w:val="center"/>
       </w:pPr>
       <w:r>
         <w:drawing>
           <wp:inline xmlns:a="http://schemas.openxmlformats.org/drawingml/2006/main" xmlns:pic="http://schemas.openxmlformats.org/drawingml/2006/picture">
-            <wp:extent cx="4140000" cy="1529104"/>
+            <wp:extent cx="4140000" cy="1529931"/>
             <wp:docPr id="29" name="Picture 29"/>
             <wp:cNvGraphicFramePr>
               <a:graphicFrameLocks noChangeAspect="1"/>
@@ -2598,7 +2599,7 @@
                     <pic:cNvPicPr/>
                   </pic:nvPicPr>
                   <pic:blipFill>
-                    <a:blip r:embed="rId17"/>
+                    <a:blip r:embed="rId18"/>
                     <a:stretch>
                       <a:fillRect/>
                     </a:stretch>
@@ -2606,7 +2607,7 @@
                   <pic:spPr>
                     <a:xfrm>
                       <a:off x="0" y="0"/>
-                      <a:ext cx="4140000" cy="1529104"/>
+                      <a:ext cx="4140000" cy="1529931"/>
                     </a:xfrm>
                     <a:prstGeom prst="rect"/>
                   </pic:spPr>
@@ -2619,7 +2620,7 @@
     </w:p>
     <w:p>
       <w:pPr>
-        <w:spacing w:before="20" w:after="80" w:line="260" w:lineRule="exact"/>
+        <w:spacing w:before="20" w:after="80" w:lineRule="auto" w:line="260"/>
         <w:ind w:firstLine="0"/>
         <w:jc w:val="center"/>
       </w:pPr>
@@ -2635,7 +2636,7 @@
     </w:p>
     <w:p>
       <w:pPr>
-        <w:spacing w:before="180" w:after="60" w:line="320" w:lineRule="exact"/>
+        <w:spacing w:before="180" w:after="60" w:lineRule="auto" w:line="320"/>
         <w:jc w:val="left"/>
       </w:pPr>
       <w:r>
@@ -2650,7 +2651,7 @@
     </w:p>
     <w:p>
       <w:pPr>
-        <w:spacing w:before="0" w:after="0" w:line="360" w:lineRule="exact"/>
+        <w:spacing w:before="0" w:after="0" w:lineRule="auto" w:line="360"/>
         <w:ind w:firstLine="420"/>
         <w:jc w:val="both"/>
       </w:pPr>
@@ -2666,7 +2667,7 @@
     </w:p>
     <w:p>
       <w:pPr>
-        <w:spacing w:before="0" w:after="0" w:line="360" w:lineRule="exact"/>
+        <w:spacing w:before="0" w:after="0" w:lineRule="auto" w:line="360"/>
         <w:ind w:firstLine="420"/>
         <w:jc w:val="both"/>
       </w:pPr>
@@ -2682,7 +2683,7 @@
     </w:p>
     <w:p>
       <w:pPr>
-        <w:spacing w:before="0" w:after="0" w:line="360" w:lineRule="exact"/>
+        <w:spacing w:before="0" w:after="0" w:lineRule="auto" w:line="360"/>
         <w:ind w:firstLine="420"/>
         <w:jc w:val="both"/>
       </w:pPr>
@@ -2698,7 +2699,7 @@
     </w:p>
     <w:p>
       <w:pPr>
-        <w:spacing w:before="0" w:after="0" w:line="360" w:lineRule="exact"/>
+        <w:spacing w:before="0" w:after="0" w:lineRule="auto" w:line="360"/>
         <w:ind w:firstLine="420"/>
         <w:jc w:val="both"/>
       </w:pPr>
@@ -2714,7 +2715,7 @@
     </w:p>
     <w:p>
       <w:pPr>
-        <w:spacing w:before="0" w:after="0" w:line="360" w:lineRule="exact"/>
+        <w:spacing w:before="0" w:after="0" w:lineRule="auto" w:line="360"/>
         <w:ind w:firstLine="420"/>
         <w:jc w:val="both"/>
       </w:pPr>
@@ -2730,22 +2731,85 @@
     </w:p>
     <w:p>
       <w:pPr>
-        <w:spacing w:before="240" w:after="120" w:line="360" w:lineRule="exact"/>
+        <w:spacing w:before="240" w:after="120" w:lineRule="auto" w:line="360"/>
         <w:jc w:val="center"/>
+      </w:pPr>
+      <w:r>
+        <w:rPr>
+          <w:rFonts w:ascii="Times New Roman" w:hAnsi="Times New Roman" w:eastAsia="仿宋"/>
+          <w:b/>
+          <w:i w:val="0"/>
+          <w:sz w:val="28"/>
+        </w:rPr>
+        <w:t>三、文本测量与有效性检验</w:t>
+      </w:r>
+    </w:p>
+    <w:p>
+      <w:pPr>
+        <w:spacing w:before="180" w:after="60" w:lineRule="auto" w:line="320"/>
+        <w:jc w:val="left"/>
       </w:pPr>
       <w:r>
         <w:rPr>
           <w:rFonts w:ascii="Times New Roman" w:hAnsi="Times New Roman" w:eastAsia="黑体"/>
           <w:b/>
           <w:i w:val="0"/>
-          <w:sz w:val="28"/>
-        </w:rPr>
-        <w:t>三、文本测量与有效性检验</w:t>
-      </w:r>
-    </w:p>
-    <w:p>
-      <w:pPr>
-        <w:spacing w:before="180" w:after="60" w:line="320" w:lineRule="exact"/>
+          <w:sz w:val="24"/>
+        </w:rPr>
+        <w:t>（一）词典与语境门控</w:t>
+      </w:r>
+    </w:p>
+    <w:p>
+      <w:pPr>
+        <w:spacing w:before="0" w:after="0" w:lineRule="auto" w:line="360"/>
+        <w:ind w:firstLine="420"/>
+        <w:jc w:val="both"/>
+      </w:pPr>
+      <w:r>
+        <w:rPr>
+          <w:rFonts w:ascii="Times New Roman" w:hAnsi="Times New Roman" w:eastAsia="宋体"/>
+          <w:b w:val="0"/>
+          <w:i w:val="0"/>
+          <w:sz w:val="21"/>
+        </w:rPr>
+        <w:t>中文央行文本存在明显的语境差异。同一个词在宏观判断、政策目标和操作安排中可能含义不同，例如“保持合理充裕”与一般积极情绪并不等价。本文先用公开金融情感词典识别情绪，再用领域词表和语境规则修正政策倾向，尤其处理否定、条件、政策目标和无关制度表述。</w:t>
+      </w:r>
+    </w:p>
+    <w:p>
+      <w:pPr>
+        <w:spacing w:before="0" w:after="0" w:lineRule="auto" w:line="360"/>
+        <w:ind w:firstLine="420"/>
+        <w:jc w:val="both"/>
+      </w:pPr>
+      <w:r>
+        <w:rPr>
+          <w:rFonts w:ascii="Times New Roman" w:hAnsi="Times New Roman" w:eastAsia="宋体"/>
+          <w:b w:val="0"/>
+          <w:i w:val="0"/>
+          <w:sz w:val="21"/>
+        </w:rPr>
+        <w:t>词典和语境门控在240句人工标注样本上接受检验。当前词典的情感准确率为0.2958，政策四分类准确率为0.8125；若只在政策相关句中区分偏松、偏紧和中性，准确率为0.5303。这些指标说明规则方法能够捕捉一部分政策语义，但对金融情感的细粒度识别仍不充分。</w:t>
+      </w:r>
+    </w:p>
+    <w:p>
+      <w:pPr>
+        <w:spacing w:before="0" w:after="0" w:lineRule="auto" w:line="360"/>
+        <w:ind w:firstLine="420"/>
+        <w:jc w:val="both"/>
+      </w:pPr>
+      <w:r>
+        <w:rPr>
+          <w:rFonts w:ascii="Times New Roman" w:hAnsi="Times New Roman" w:eastAsia="宋体"/>
+          <w:b w:val="0"/>
+          <w:i w:val="0"/>
+          <w:sz w:val="21"/>
+        </w:rPr>
+        <w:t>规则方法的优势是透明。每一次分数变化都可以追溯到词典匹配、否定词和语境规则；缺点也同样清楚，固定词表很难识别新表述和复杂句法。央行报告中常见的长句往往把目标、约束和操作安排放在同一句内，单纯逐词加总会丢失关系信息。因此，词典结果更适合作为可解释基准，而不是唯一的文本测量依据。</w:t>
+      </w:r>
+    </w:p>
+    <w:p>
+      <w:pPr>
+        <w:spacing w:before="180" w:after="60" w:lineRule="auto" w:line="320"/>
         <w:jc w:val="left"/>
       </w:pPr>
       <w:r>
@@ -2755,60 +2819,108 @@
           <w:i w:val="0"/>
           <w:sz w:val="24"/>
         </w:rPr>
-        <w:t>（一）词典与语境门控</w:t>
-      </w:r>
-    </w:p>
-    <w:p>
-      <w:pPr>
-        <w:spacing w:before="0" w:after="0" w:line="360" w:lineRule="exact"/>
-        <w:ind w:firstLine="420"/>
-        <w:jc w:val="both"/>
-      </w:pPr>
-      <w:r>
-        <w:rPr>
-          <w:rFonts w:ascii="Times New Roman" w:hAnsi="Times New Roman" w:eastAsia="宋体"/>
-          <w:b w:val="0"/>
-          <w:i w:val="0"/>
-          <w:sz w:val="21"/>
-        </w:rPr>
-        <w:t>中文央行文本存在明显的语境差异。同一个词在宏观判断、政策目标和操作安排中可能含义不同，例如“保持合理充裕”与一般积极情绪并不等价。本文先用公开金融情感词典识别情绪，再用领域词表和语境规则修正政策倾向，尤其处理否定、条件、政策目标和无关制度表述。</w:t>
-      </w:r>
-    </w:p>
-    <w:p>
-      <w:pPr>
-        <w:spacing w:before="0" w:after="0" w:line="360" w:lineRule="exact"/>
-        <w:ind w:firstLine="420"/>
-        <w:jc w:val="both"/>
-      </w:pPr>
-      <w:r>
-        <w:rPr>
-          <w:rFonts w:ascii="Times New Roman" w:hAnsi="Times New Roman" w:eastAsia="宋体"/>
-          <w:b w:val="0"/>
-          <w:i w:val="0"/>
-          <w:sz w:val="21"/>
-        </w:rPr>
-        <w:t>词典和语境门控在240句人工标注样本上接受检验。当前词典的情感准确率为0.2958，政策四分类准确率为0.8125；若只在政策相关句中区分偏松、偏紧和中性，准确率为0.5303。这些指标说明规则方法能够捕捉一部分政策语义，但对金融情感的细粒度识别仍不充分。</w:t>
-      </w:r>
-    </w:p>
-    <w:p>
-      <w:pPr>
-        <w:spacing w:before="0" w:after="0" w:line="360" w:lineRule="exact"/>
-        <w:ind w:firstLine="420"/>
-        <w:jc w:val="both"/>
-      </w:pPr>
-      <w:r>
-        <w:rPr>
-          <w:rFonts w:ascii="Times New Roman" w:hAnsi="Times New Roman" w:eastAsia="宋体"/>
-          <w:b w:val="0"/>
-          <w:i w:val="0"/>
-          <w:sz w:val="21"/>
-        </w:rPr>
-        <w:t>规则方法的优势是透明。每一次分数变化都可以追溯到词典匹配、否定词和语境规则；缺点也同样清楚，固定词表很难识别新表述和复杂句法。央行报告中常见的长句往往把目标、约束和操作安排放在同一句内，单纯逐词加总会丢失关系信息。因此，词典结果更适合作为可解释基准，而不是唯一的文本测量依据。</w:t>
-      </w:r>
-    </w:p>
-    <w:p>
-      <w:pPr>
-        <w:spacing w:before="180" w:after="60" w:line="320" w:lineRule="exact"/>
+        <w:t>（二）人工标注与分组交叉验证</w:t>
+      </w:r>
+    </w:p>
+    <w:p>
+      <w:pPr>
+        <w:spacing w:before="0" w:after="0" w:lineRule="auto" w:line="360"/>
+        <w:ind w:firstLine="420"/>
+        <w:jc w:val="both"/>
+      </w:pPr>
+      <w:r>
+        <w:rPr>
+          <w:rFonts w:ascii="Times New Roman" w:hAnsi="Times New Roman" w:eastAsia="宋体"/>
+          <w:b w:val="0"/>
+          <w:i w:val="0"/>
+          <w:sz w:val="21"/>
+        </w:rPr>
+        <w:t>人工标注样本按报告抽取政策指引句子，标注金融情感、政策倾向和主题类别。由于同一报告内部存在大量近似表述，随机句子切分会使相似文本同时进入训练集和测试集，导致验证结果偏高。监督分类采用按报告分组的交叉验证，并将近重复句子合并为同一分组。</w:t>
+      </w:r>
+    </w:p>
+    <w:p>
+      <w:pPr>
+        <w:spacing w:before="0" w:after="0" w:lineRule="auto" w:line="360"/>
+        <w:ind w:firstLine="420"/>
+        <w:jc w:val="both"/>
+      </w:pPr>
+      <w:r>
+        <w:rPr>
+          <w:rFonts w:ascii="Times New Roman" w:hAnsi="Times New Roman" w:eastAsia="宋体"/>
+          <w:b w:val="0"/>
+          <w:i w:val="0"/>
+          <w:sz w:val="21"/>
+        </w:rPr>
+        <w:t>字符TF-IDF与LinearSVC在情感任务上的准确率为0.8958、Macro-F1为0.7993；政策四分类准确率为0.8583、Macro-F1为0.6804；条件政策方向准确率为0.7879、Macro-F1为0.7301。监督模型明显改善了情感和政策倾向识别，但少数类别仍受样本规模限制。</w:t>
+      </w:r>
+    </w:p>
+    <w:p>
+      <w:pPr>
+        <w:spacing w:before="0" w:after="0" w:lineRule="auto" w:line="360"/>
+        <w:ind w:firstLine="420"/>
+        <w:jc w:val="both"/>
+      </w:pPr>
+      <w:r>
+        <w:rPr>
+          <w:rFonts w:ascii="Times New Roman" w:hAnsi="Times New Roman" w:eastAsia="宋体"/>
+          <w:b w:val="0"/>
+          <w:i w:val="0"/>
+          <w:sz w:val="21"/>
+        </w:rPr>
+        <w:t>按报告分组交叉验证的结果通常低于随机切分结果，但它更接近真实使用场景。模型在预测一份新报告时，不能依赖同一报告中已经出现过的相似句子；如果验证集和训练集共享同一段模板，准确率会被高估。本文据此接受更严格的验证口径，并把主题硬分类降为描述性材料。</w:t>
+      </w:r>
+    </w:p>
+    <w:p>
+      <w:pPr>
+        <w:spacing w:before="0" w:after="0" w:lineRule="auto" w:line="360"/>
+        <w:ind w:firstLine="420"/>
+        <w:jc w:val="both"/>
+      </w:pPr>
+      <w:r>
+        <w:rPr>
+          <w:rFonts w:ascii="Times New Roman" w:hAnsi="Times New Roman" w:eastAsia="宋体"/>
+          <w:b w:val="0"/>
+          <w:i w:val="0"/>
+          <w:sz w:val="21"/>
+        </w:rPr>
+        <w:t>人工标注规模也影响评价方式。240句样本足以比较词典、语境门控和轻量监督模型的相对表现，却不足以支撑细主题和少数政策方向的稳定高精度识别。因此，表2同时报告准确率和Macro-F1，避免多数类别主导结论。条件政策方向只在政策相关句内评价，原因是无关句不应被强行纳入偏松、偏紧和中性之间的比较。</w:t>
+      </w:r>
+    </w:p>
+    <w:p>
+      <w:pPr>
+        <w:spacing w:before="0" w:after="0" w:lineRule="auto" w:line="360"/>
+        <w:ind w:firstLine="420"/>
+        <w:jc w:val="both"/>
+      </w:pPr>
+      <w:r>
+        <w:rPr>
+          <w:rFonts w:ascii="Times New Roman" w:hAnsi="Times New Roman" w:eastAsia="宋体"/>
+          <w:b w:val="0"/>
+          <w:i w:val="0"/>
+          <w:sz w:val="21"/>
+        </w:rPr>
+        <w:t>学习曲线进一步支持这一判断。情感分类在训练比例从25%提高到100%时，Macro-F1从0.6476提高到0.7993；政策四分类Macro-F1从0.4312提高到0.6804；主题分类Macro-F1只从0.2518提高到0.3329。情感和政策倾向任务随着标注样本增加有所改善，主题任务则明显受类别稀疏和边界模糊限制。</w:t>
+      </w:r>
+    </w:p>
+    <w:p>
+      <w:pPr>
+        <w:spacing w:before="0" w:after="0" w:lineRule="auto" w:line="360"/>
+        <w:ind w:firstLine="420"/>
+        <w:jc w:val="both"/>
+      </w:pPr>
+      <w:r>
+        <w:rPr>
+          <w:rFonts w:ascii="Times New Roman" w:hAnsi="Times New Roman" w:eastAsia="宋体"/>
+          <w:b w:val="0"/>
+          <w:i w:val="0"/>
+          <w:sz w:val="21"/>
+        </w:rPr>
+        <w:t>字符TF-IDF适合这个样本规模。中文央行文本中的政策含义常体现在短语和固定搭配上，字符n元特征能够捕捉“合理充裕”“精准有力”“不搞大水漫灌”等局部表达。LinearSVC的线性结构使特征权重较容易解释，也避免在小样本人工标注上使用过于复杂的模型。</w:t>
+      </w:r>
+    </w:p>
+    <w:p>
+      <w:pPr>
+        <w:spacing w:before="180" w:after="60" w:lineRule="auto" w:line="320"/>
         <w:jc w:val="left"/>
       </w:pPr>
       <w:r>
@@ -2818,146 +2930,35 @@
           <w:i w:val="0"/>
           <w:sz w:val="24"/>
         </w:rPr>
-        <w:t>（二）人工标注与分组交叉验证</w:t>
-      </w:r>
-    </w:p>
-    <w:p>
-      <w:pPr>
-        <w:spacing w:before="0" w:after="0" w:line="360" w:lineRule="exact"/>
-        <w:ind w:firstLine="420"/>
-        <w:jc w:val="both"/>
-      </w:pPr>
-      <w:r>
-        <w:rPr>
-          <w:rFonts w:ascii="Times New Roman" w:hAnsi="Times New Roman" w:eastAsia="宋体"/>
-          <w:b w:val="0"/>
-          <w:i w:val="0"/>
-          <w:sz w:val="21"/>
-        </w:rPr>
-        <w:t>人工标注样本按报告抽取政策指引句子，标注金融情感、政策倾向和主题类别。由于同一报告内部存在大量近似表述，随机句子切分会使相似文本同时进入训练集和测试集，导致验证结果偏高。监督分类采用按报告分组的交叉验证，并将近重复句子合并为同一分组。</w:t>
-      </w:r>
-    </w:p>
-    <w:p>
-      <w:pPr>
-        <w:spacing w:before="0" w:after="0" w:line="360" w:lineRule="exact"/>
-        <w:ind w:firstLine="420"/>
-        <w:jc w:val="both"/>
-      </w:pPr>
-      <w:r>
-        <w:rPr>
-          <w:rFonts w:ascii="Times New Roman" w:hAnsi="Times New Roman" w:eastAsia="宋体"/>
-          <w:b w:val="0"/>
-          <w:i w:val="0"/>
-          <w:sz w:val="21"/>
-        </w:rPr>
-        <w:t>字符TF-IDF与LinearSVC在情感任务上的准确率为0.8958、Macro-F1为0.7993；政策四分类准确率为0.8583、Macro-F1为0.6804；条件政策方向准确率为0.7879、Macro-F1为0.7301。监督模型明显改善了情感和政策倾向识别，但少数类别仍受样本规模限制。</w:t>
-      </w:r>
-    </w:p>
-    <w:p>
-      <w:pPr>
-        <w:spacing w:before="0" w:after="0" w:line="360" w:lineRule="exact"/>
-        <w:ind w:firstLine="420"/>
-        <w:jc w:val="both"/>
-      </w:pPr>
-      <w:r>
-        <w:rPr>
-          <w:rFonts w:ascii="Times New Roman" w:hAnsi="Times New Roman" w:eastAsia="宋体"/>
-          <w:b w:val="0"/>
-          <w:i w:val="0"/>
-          <w:sz w:val="21"/>
-        </w:rPr>
-        <w:t>按报告分组交叉验证的结果通常低于随机切分结果，但它更接近真实使用场景。模型在预测一份新报告时，不能依赖同一报告中已经出现过的相似句子；如果验证集和训练集共享同一段模板，准确率会被高估。本文据此接受更严格的验证口径，并把主题硬分类降为描述性材料。</w:t>
-      </w:r>
-    </w:p>
-    <w:p>
-      <w:pPr>
-        <w:spacing w:before="0" w:after="0" w:line="360" w:lineRule="exact"/>
-        <w:ind w:firstLine="420"/>
-        <w:jc w:val="both"/>
-      </w:pPr>
-      <w:r>
-        <w:rPr>
-          <w:rFonts w:ascii="Times New Roman" w:hAnsi="Times New Roman" w:eastAsia="宋体"/>
-          <w:b w:val="0"/>
-          <w:i w:val="0"/>
-          <w:sz w:val="21"/>
-        </w:rPr>
-        <w:t>人工标注规模也影响评价方式。240句样本足以比较词典、语境门控和轻量监督模型的相对表现，却不足以支撑细主题和少数政策方向的稳定高精度识别。因此，表2同时报告准确率和Macro-F1，避免多数类别主导结论。条件政策方向只在政策相关句内评价，原因是无关句不应被强行纳入偏松、偏紧和中性之间的比较。</w:t>
-      </w:r>
-    </w:p>
-    <w:p>
-      <w:pPr>
-        <w:spacing w:before="0" w:after="0" w:line="360" w:lineRule="exact"/>
-        <w:ind w:firstLine="420"/>
-        <w:jc w:val="both"/>
-      </w:pPr>
-      <w:r>
-        <w:rPr>
-          <w:rFonts w:ascii="Times New Roman" w:hAnsi="Times New Roman" w:eastAsia="宋体"/>
-          <w:b w:val="0"/>
-          <w:i w:val="0"/>
-          <w:sz w:val="21"/>
-        </w:rPr>
-        <w:t>学习曲线进一步支持这一判断。情感分类在训练比例从25%提高到100%时，Macro-F1从0.6476提高到0.7993；政策四分类Macro-F1从0.4312提高到0.6804；主题分类Macro-F1只从0.2518提高到0.3329。情感和政策倾向任务随着标注样本增加有所改善，主题任务则明显受类别稀疏和边界模糊限制。</w:t>
-      </w:r>
-    </w:p>
-    <w:p>
-      <w:pPr>
-        <w:spacing w:before="0" w:after="0" w:line="360" w:lineRule="exact"/>
-        <w:ind w:firstLine="420"/>
-        <w:jc w:val="both"/>
-      </w:pPr>
-      <w:r>
-        <w:rPr>
-          <w:rFonts w:ascii="Times New Roman" w:hAnsi="Times New Roman" w:eastAsia="宋体"/>
-          <w:b w:val="0"/>
-          <w:i w:val="0"/>
-          <w:sz w:val="21"/>
-        </w:rPr>
-        <w:t>字符TF-IDF适合这个样本规模。中文央行文本中的政策含义常体现在短语和固定搭配上，字符n元特征能够捕捉“合理充裕”“精准有力”“不搞大水漫灌”等局部表达。LinearSVC的线性结构使特征权重较容易解释，也避免在小样本人工标注上使用过于复杂的模型。</w:t>
-      </w:r>
-    </w:p>
-    <w:p>
-      <w:pPr>
-        <w:spacing w:before="180" w:after="60" w:line="320" w:lineRule="exact"/>
-        <w:jc w:val="left"/>
-      </w:pPr>
-      <w:r>
-        <w:rPr>
-          <w:rFonts w:ascii="Times New Roman" w:hAnsi="Times New Roman" w:eastAsia="黑体"/>
+        <w:t>（三）文本测量结果</w:t>
+      </w:r>
+    </w:p>
+    <w:p>
+      <w:pPr>
+        <w:spacing w:before="0" w:after="0" w:lineRule="auto" w:line="360"/>
+        <w:ind w:firstLine="420"/>
+        <w:jc w:val="both"/>
+      </w:pPr>
+      <w:r>
+        <w:rPr>
+          <w:rFonts w:ascii="Times New Roman" w:hAnsi="Times New Roman" w:eastAsia="宋体"/>
+          <w:b w:val="0"/>
+          <w:i w:val="0"/>
+          <w:sz w:val="21"/>
+        </w:rPr>
+        <w:t>表2中的三类方法处在不同的测量层级。初始词典只作为方法起点，不报告正式验证指标；语境门控词典提供可解释的规则基准；监督模型用于检验文本信息是否能在未见过的报告中保持一定辨识力。主题硬分类的稳定性弱于情感和政策倾向，因此正文只把连续主题关注度用于经济背景解释。</w:t>
+      </w:r>
+    </w:p>
+    <w:p>
+      <w:pPr>
+        <w:spacing w:before="80" w:after="40" w:lineRule="auto" w:line="260"/>
+        <w:jc w:val="center"/>
+      </w:pPr>
+      <w:r>
+        <w:rPr>
+          <w:rFonts w:ascii="Times New Roman" w:hAnsi="Times New Roman" w:eastAsia="仿宋"/>
           <w:b/>
           <w:i w:val="0"/>
-          <w:sz w:val="24"/>
-        </w:rPr>
-        <w:t>（三）文本测量结果</w:t>
-      </w:r>
-    </w:p>
-    <w:p>
-      <w:pPr>
-        <w:spacing w:before="0" w:after="0" w:line="360" w:lineRule="exact"/>
-        <w:ind w:firstLine="420"/>
-        <w:jc w:val="both"/>
-      </w:pPr>
-      <w:r>
-        <w:rPr>
-          <w:rFonts w:ascii="Times New Roman" w:hAnsi="Times New Roman" w:eastAsia="宋体"/>
-          <w:b w:val="0"/>
-          <w:i w:val="0"/>
-          <w:sz w:val="21"/>
-        </w:rPr>
-        <w:t>表2中的三类方法处在不同的测量层级。初始词典只作为方法起点，不报告正式验证指标；语境门控词典提供可解释的规则基准；监督模型用于检验文本信息是否能在未见过的报告中保持一定辨识力。主题硬分类的稳定性弱于情感和政策倾向，因此正文只把连续主题关注度用于经济背景解释。</w:t>
-      </w:r>
-    </w:p>
-    <w:p>
-      <w:pPr>
-        <w:spacing w:before="80" w:after="40" w:line="260" w:lineRule="exact"/>
-        <w:jc w:val="center"/>
-      </w:pPr>
-      <w:r>
-        <w:rPr>
-          <w:rFonts w:ascii="Times New Roman" w:hAnsi="Times New Roman" w:eastAsia="黑体"/>
-          <w:b/>
-          <w:i w:val="0"/>
           <w:sz w:val="18"/>
         </w:rPr>
         <w:t>表2  文本测量方法比较</w:t>
@@ -2965,13 +2966,13 @@
     </w:p>
     <w:p>
       <w:pPr>
-        <w:spacing w:before="40" w:after="20" w:line="240" w:lineRule="exact"/>
+        <w:spacing w:before="40" w:after="20" w:lineRule="auto" w:line="240"/>
         <w:ind w:firstLine="0"/>
         <w:jc w:val="both"/>
       </w:pPr>
       <w:r>
         <w:rPr>
-          <w:rFonts w:ascii="Times New Roman" w:hAnsi="Times New Roman" w:eastAsia="黑体"/>
+          <w:rFonts w:ascii="Times New Roman" w:hAnsi="Times New Roman" w:eastAsia="仿宋"/>
           <w:b/>
           <w:i w:val="0"/>
           <w:sz w:val="18"/>
@@ -3015,7 +3016,7 @@
           </w:tcPr>
           <w:p>
             <w:pPr>
-              <w:spacing w:before="0" w:after="0" w:line="240" w:lineRule="exact"/>
+              <w:spacing w:before="0" w:after="0" w:line="240" w:lineRule="auto"/>
               <w:jc w:val="center"/>
             </w:pPr>
             <w:r>
@@ -3039,7 +3040,7 @@
           </w:tcPr>
           <w:p>
             <w:pPr>
-              <w:spacing w:before="0" w:after="0" w:line="240" w:lineRule="exact"/>
+              <w:spacing w:before="0" w:after="0" w:line="240" w:lineRule="auto"/>
               <w:jc w:val="center"/>
             </w:pPr>
             <w:r>
@@ -3063,7 +3064,7 @@
           </w:tcPr>
           <w:p>
             <w:pPr>
-              <w:spacing w:before="0" w:after="0" w:line="240" w:lineRule="exact"/>
+              <w:spacing w:before="0" w:after="0" w:line="240" w:lineRule="auto"/>
               <w:jc w:val="center"/>
             </w:pPr>
             <w:r>
@@ -3087,7 +3088,7 @@
           </w:tcPr>
           <w:p>
             <w:pPr>
-              <w:spacing w:before="0" w:after="0" w:line="240" w:lineRule="exact"/>
+              <w:spacing w:before="0" w:after="0" w:line="240" w:lineRule="auto"/>
               <w:jc w:val="center"/>
             </w:pPr>
             <w:r>
@@ -3111,7 +3112,7 @@
           </w:tcPr>
           <w:p>
             <w:pPr>
-              <w:spacing w:before="0" w:after="0" w:line="240" w:lineRule="exact"/>
+              <w:spacing w:before="0" w:after="0" w:line="240" w:lineRule="auto"/>
               <w:jc w:val="center"/>
             </w:pPr>
             <w:r>
@@ -3137,7 +3138,7 @@
           </w:tcPr>
           <w:p>
             <w:pPr>
-              <w:spacing w:before="0" w:after="0" w:line="240" w:lineRule="exact"/>
+              <w:spacing w:before="0" w:after="0" w:line="240" w:lineRule="auto"/>
               <w:jc w:val="center"/>
             </w:pPr>
             <w:r>
@@ -3158,7 +3159,7 @@
           </w:tcPr>
           <w:p>
             <w:pPr>
-              <w:spacing w:before="0" w:after="0" w:line="240" w:lineRule="exact"/>
+              <w:spacing w:before="0" w:after="0" w:line="240" w:lineRule="auto"/>
               <w:jc w:val="center"/>
             </w:pPr>
             <w:r>
@@ -3179,7 +3180,7 @@
           </w:tcPr>
           <w:p>
             <w:pPr>
-              <w:spacing w:before="0" w:after="0" w:line="240" w:lineRule="exact"/>
+              <w:spacing w:before="0" w:after="0" w:line="240" w:lineRule="auto"/>
               <w:jc w:val="center"/>
             </w:pPr>
             <w:r>
@@ -3200,7 +3201,7 @@
           </w:tcPr>
           <w:p>
             <w:pPr>
-              <w:spacing w:before="0" w:after="0" w:line="240" w:lineRule="exact"/>
+              <w:spacing w:before="0" w:after="0" w:line="240" w:lineRule="auto"/>
               <w:jc w:val="center"/>
             </w:pPr>
             <w:r>
@@ -3221,7 +3222,7 @@
           </w:tcPr>
           <w:p>
             <w:pPr>
-              <w:spacing w:before="0" w:after="0" w:line="240" w:lineRule="exact"/>
+              <w:spacing w:before="0" w:after="0" w:line="240" w:lineRule="auto"/>
               <w:jc w:val="center"/>
             </w:pPr>
             <w:r>
@@ -3247,7 +3248,7 @@
           </w:tcPr>
           <w:p>
             <w:pPr>
-              <w:spacing w:before="0" w:after="0" w:line="240" w:lineRule="exact"/>
+              <w:spacing w:before="0" w:after="0" w:line="240" w:lineRule="auto"/>
               <w:jc w:val="center"/>
             </w:pPr>
             <w:r>
@@ -3268,7 +3269,7 @@
           </w:tcPr>
           <w:p>
             <w:pPr>
-              <w:spacing w:before="0" w:after="0" w:line="240" w:lineRule="exact"/>
+              <w:spacing w:before="0" w:after="0" w:line="240" w:lineRule="auto"/>
               <w:jc w:val="right"/>
             </w:pPr>
             <w:r>
@@ -3289,7 +3290,28 @@
           </w:tcPr>
           <w:p>
             <w:pPr>
-              <w:spacing w:before="0" w:after="0" w:line="240" w:lineRule="exact"/>
+              <w:spacing w:before="0" w:after="0" w:line="240" w:lineRule="auto"/>
+              <w:jc w:val="center"/>
+            </w:pPr>
+            <w:r>
+              <w:rPr>
+                <w:rFonts w:ascii="Times New Roman" w:hAnsi="Times New Roman" w:eastAsia="宋体"/>
+                <w:b w:val="0"/>
+                <w:i w:val="0"/>
+                <w:sz w:val="18"/>
+              </w:rPr>
+              <w:t>—</w:t>
+            </w:r>
+          </w:p>
+        </w:tc>
+        <w:tc>
+          <w:tcPr>
+            <w:tcW w:type="dxa" w:w="1701"/>
+            <w:vAlign w:val="center"/>
+          </w:tcPr>
+          <w:p>
+            <w:pPr>
+              <w:spacing w:before="0" w:after="0" w:line="240" w:lineRule="auto"/>
               <w:jc w:val="right"/>
             </w:pPr>
             <w:r>
@@ -3299,7 +3321,7 @@
                 <w:i w:val="0"/>
                 <w:sz w:val="18"/>
               </w:rPr>
-              <w:t>0.3272</w:t>
+              <w:t>0.8125</w:t>
             </w:r>
           </w:p>
         </w:tc>
@@ -3310,38 +3332,17 @@
           </w:tcPr>
           <w:p>
             <w:pPr>
-              <w:spacing w:before="0" w:after="0" w:line="240" w:lineRule="exact"/>
-              <w:jc w:val="right"/>
-            </w:pPr>
-            <w:r>
-              <w:rPr>
-                <w:rFonts w:ascii="Times New Roman" w:hAnsi="Times New Roman" w:eastAsia="宋体"/>
-                <w:b w:val="0"/>
-                <w:i w:val="0"/>
-                <w:sz w:val="18"/>
-              </w:rPr>
-              <w:t>0.8125</w:t>
-            </w:r>
-          </w:p>
-        </w:tc>
-        <w:tc>
-          <w:tcPr>
-            <w:tcW w:type="dxa" w:w="1701"/>
-            <w:vAlign w:val="center"/>
-          </w:tcPr>
-          <w:p>
-            <w:pPr>
-              <w:spacing w:before="0" w:after="0" w:line="240" w:lineRule="exact"/>
-              <w:jc w:val="right"/>
-            </w:pPr>
-            <w:r>
-              <w:rPr>
-                <w:rFonts w:ascii="Times New Roman" w:hAnsi="Times New Roman" w:eastAsia="宋体"/>
-                <w:b w:val="0"/>
-                <w:i w:val="0"/>
-                <w:sz w:val="18"/>
-              </w:rPr>
-              <w:t>0.6090</w:t>
+              <w:spacing w:before="0" w:after="0" w:line="240" w:lineRule="auto"/>
+              <w:jc w:val="center"/>
+            </w:pPr>
+            <w:r>
+              <w:rPr>
+                <w:rFonts w:ascii="Times New Roman" w:hAnsi="Times New Roman" w:eastAsia="宋体"/>
+                <w:b w:val="0"/>
+                <w:i w:val="0"/>
+                <w:sz w:val="18"/>
+              </w:rPr>
+              <w:t>—</w:t>
             </w:r>
           </w:p>
         </w:tc>
@@ -3360,7 +3361,7 @@
           </w:tcPr>
           <w:p>
             <w:pPr>
-              <w:spacing w:before="0" w:after="0" w:line="240" w:lineRule="exact"/>
+              <w:spacing w:before="0" w:after="0" w:line="240" w:lineRule="auto"/>
               <w:jc w:val="center"/>
             </w:pPr>
             <w:r>
@@ -3384,7 +3385,7 @@
           </w:tcPr>
           <w:p>
             <w:pPr>
-              <w:spacing w:before="0" w:after="0" w:line="240" w:lineRule="exact"/>
+              <w:spacing w:before="0" w:after="0" w:line="240" w:lineRule="auto"/>
               <w:jc w:val="right"/>
             </w:pPr>
             <w:r>
@@ -3408,7 +3409,7 @@
           </w:tcPr>
           <w:p>
             <w:pPr>
-              <w:spacing w:before="0" w:after="0" w:line="240" w:lineRule="exact"/>
+              <w:spacing w:before="0" w:after="0" w:line="240" w:lineRule="auto"/>
               <w:jc w:val="right"/>
             </w:pPr>
             <w:r>
@@ -3432,7 +3433,7 @@
           </w:tcPr>
           <w:p>
             <w:pPr>
-              <w:spacing w:before="0" w:after="0" w:line="240" w:lineRule="exact"/>
+              <w:spacing w:before="0" w:after="0" w:line="240" w:lineRule="auto"/>
               <w:jc w:val="right"/>
             </w:pPr>
             <w:r>
@@ -3456,7 +3457,7 @@
           </w:tcPr>
           <w:p>
             <w:pPr>
-              <w:spacing w:before="0" w:after="0" w:line="240" w:lineRule="exact"/>
+              <w:spacing w:before="0" w:after="0" w:line="240" w:lineRule="auto"/>
               <w:jc w:val="right"/>
             </w:pPr>
             <w:r>
@@ -3474,13 +3475,13 @@
     </w:tbl>
     <w:p>
       <w:pPr>
-        <w:spacing w:before="40" w:after="20" w:line="240" w:lineRule="exact"/>
+        <w:spacing w:before="40" w:after="20" w:lineRule="auto" w:line="240"/>
         <w:ind w:firstLine="0"/>
         <w:jc w:val="both"/>
       </w:pPr>
       <w:r>
         <w:rPr>
-          <w:rFonts w:ascii="Times New Roman" w:hAnsi="Times New Roman" w:eastAsia="黑体"/>
+          <w:rFonts w:ascii="Times New Roman" w:hAnsi="Times New Roman" w:eastAsia="仿宋"/>
           <w:b/>
           <w:i w:val="0"/>
           <w:sz w:val="18"/>
@@ -3522,7 +3523,7 @@
           </w:tcPr>
           <w:p>
             <w:pPr>
-              <w:spacing w:before="0" w:after="0" w:line="240" w:lineRule="exact"/>
+              <w:spacing w:before="0" w:after="0" w:line="240" w:lineRule="auto"/>
               <w:jc w:val="center"/>
             </w:pPr>
             <w:r>
@@ -3546,7 +3547,7 @@
           </w:tcPr>
           <w:p>
             <w:pPr>
-              <w:spacing w:before="0" w:after="0" w:line="240" w:lineRule="exact"/>
+              <w:spacing w:before="0" w:after="0" w:line="240" w:lineRule="auto"/>
               <w:jc w:val="center"/>
             </w:pPr>
             <w:r>
@@ -3570,7 +3571,7 @@
           </w:tcPr>
           <w:p>
             <w:pPr>
-              <w:spacing w:before="0" w:after="0" w:line="240" w:lineRule="exact"/>
+              <w:spacing w:before="0" w:after="0" w:line="240" w:lineRule="auto"/>
               <w:jc w:val="center"/>
             </w:pPr>
             <w:r>
@@ -3596,7 +3597,7 @@
           </w:tcPr>
           <w:p>
             <w:pPr>
-              <w:spacing w:before="0" w:after="0" w:line="240" w:lineRule="exact"/>
+              <w:spacing w:before="0" w:after="0" w:line="240" w:lineRule="auto"/>
               <w:jc w:val="center"/>
             </w:pPr>
             <w:r>
@@ -3617,7 +3618,7 @@
           </w:tcPr>
           <w:p>
             <w:pPr>
-              <w:spacing w:before="0" w:after="0" w:line="240" w:lineRule="exact"/>
+              <w:spacing w:before="0" w:after="0" w:line="240" w:lineRule="auto"/>
               <w:jc w:val="center"/>
             </w:pPr>
             <w:r>
@@ -3638,7 +3639,7 @@
           </w:tcPr>
           <w:p>
             <w:pPr>
-              <w:spacing w:before="0" w:after="0" w:line="240" w:lineRule="exact"/>
+              <w:spacing w:before="0" w:after="0" w:line="240" w:lineRule="auto"/>
               <w:jc w:val="center"/>
             </w:pPr>
             <w:r>
@@ -3664,7 +3665,7 @@
           </w:tcPr>
           <w:p>
             <w:pPr>
-              <w:spacing w:before="0" w:after="0" w:line="240" w:lineRule="exact"/>
+              <w:spacing w:before="0" w:after="0" w:line="240" w:lineRule="auto"/>
               <w:jc w:val="center"/>
             </w:pPr>
             <w:r>
@@ -3685,7 +3686,7 @@
           </w:tcPr>
           <w:p>
             <w:pPr>
-              <w:spacing w:before="0" w:after="0" w:line="240" w:lineRule="exact"/>
+              <w:spacing w:before="0" w:after="0" w:line="240" w:lineRule="auto"/>
               <w:jc w:val="right"/>
             </w:pPr>
             <w:r>
@@ -3706,17 +3707,17 @@
           </w:tcPr>
           <w:p>
             <w:pPr>
-              <w:spacing w:before="0" w:after="0" w:line="240" w:lineRule="exact"/>
-              <w:jc w:val="right"/>
-            </w:pPr>
-            <w:r>
-              <w:rPr>
-                <w:rFonts w:ascii="Times New Roman" w:hAnsi="Times New Roman" w:eastAsia="宋体"/>
-                <w:b w:val="0"/>
-                <w:i w:val="0"/>
-                <w:sz w:val="18"/>
-              </w:rPr>
-              <w:t>0.5750</w:t>
+              <w:spacing w:before="0" w:after="0" w:line="240" w:lineRule="auto"/>
+              <w:jc w:val="center"/>
+            </w:pPr>
+            <w:r>
+              <w:rPr>
+                <w:rFonts w:ascii="Times New Roman" w:hAnsi="Times New Roman" w:eastAsia="宋体"/>
+                <w:b w:val="0"/>
+                <w:i w:val="0"/>
+                <w:sz w:val="18"/>
+              </w:rPr>
+              <w:t>—</w:t>
             </w:r>
           </w:p>
         </w:tc>
@@ -3735,7 +3736,7 @@
           </w:tcPr>
           <w:p>
             <w:pPr>
-              <w:spacing w:before="0" w:after="0" w:line="240" w:lineRule="exact"/>
+              <w:spacing w:before="0" w:after="0" w:line="240" w:lineRule="auto"/>
               <w:jc w:val="center"/>
             </w:pPr>
             <w:r>
@@ -3759,7 +3760,7 @@
           </w:tcPr>
           <w:p>
             <w:pPr>
-              <w:spacing w:before="0" w:after="0" w:line="240" w:lineRule="exact"/>
+              <w:spacing w:before="0" w:after="0" w:line="240" w:lineRule="auto"/>
               <w:jc w:val="right"/>
             </w:pPr>
             <w:r>
@@ -3783,7 +3784,7 @@
           </w:tcPr>
           <w:p>
             <w:pPr>
-              <w:spacing w:before="0" w:after="0" w:line="240" w:lineRule="exact"/>
+              <w:spacing w:before="0" w:after="0" w:line="240" w:lineRule="auto"/>
               <w:jc w:val="right"/>
             </w:pPr>
             <w:r>
@@ -3801,7 +3802,7 @@
     </w:tbl>
     <w:p>
       <w:pPr>
-        <w:spacing w:before="40" w:after="80" w:line="220" w:lineRule="exact"/>
+        <w:spacing w:before="40" w:after="80" w:lineRule="auto" w:line="220"/>
         <w:ind w:firstLine="0"/>
         <w:jc w:val="both"/>
       </w:pPr>
@@ -3822,29 +3823,29 @@
     </w:p>
     <w:p>
       <w:pPr>
-        <w:spacing w:before="240" w:after="120" w:line="360" w:lineRule="exact"/>
+        <w:spacing w:before="240" w:after="120" w:lineRule="auto" w:line="360"/>
         <w:jc w:val="center"/>
+      </w:pPr>
+      <w:r>
+        <w:rPr>
+          <w:rFonts w:ascii="Times New Roman" w:hAnsi="Times New Roman" w:eastAsia="仿宋"/>
+          <w:b/>
+          <w:i w:val="0"/>
+          <w:sz w:val="28"/>
+        </w:rPr>
+        <w:t>四、政策指引创新度与股票市场反应</w:t>
+      </w:r>
+    </w:p>
+    <w:p>
+      <w:pPr>
+        <w:spacing w:before="180" w:after="60" w:lineRule="auto" w:line="320"/>
+        <w:jc w:val="left"/>
       </w:pPr>
       <w:r>
         <w:rPr>
           <w:rFonts w:ascii="Times New Roman" w:hAnsi="Times New Roman" w:eastAsia="黑体"/>
           <w:b/>
           <w:i w:val="0"/>
-          <w:sz w:val="28"/>
-        </w:rPr>
-        <w:t>四、政策指引创新度与股票市场反应</w:t>
-      </w:r>
-    </w:p>
-    <w:p>
-      <w:pPr>
-        <w:spacing w:before="180" w:after="60" w:line="320" w:lineRule="exact"/>
-        <w:jc w:val="left"/>
-      </w:pPr>
-      <w:r>
-        <w:rPr>
-          <w:rFonts w:ascii="Times New Roman" w:hAnsi="Times New Roman" w:eastAsia="黑体"/>
-          <w:b/>
-          <w:i w:val="0"/>
           <w:sz w:val="24"/>
         </w:rPr>
         <w:t>（一）基准结果</w:t>
@@ -3852,7 +3853,7 @@
     </w:p>
     <w:p>
       <w:pPr>
-        <w:spacing w:before="0" w:after="0" w:line="360" w:lineRule="exact"/>
+        <w:spacing w:before="0" w:after="0" w:lineRule="auto" w:line="360"/>
         <w:ind w:firstLine="420"/>
         <w:jc w:val="both"/>
       </w:pPr>
@@ -3868,7 +3869,7 @@
     </w:p>
     <w:p>
       <w:pPr>
-        <w:spacing w:before="0" w:after="0" w:line="360" w:lineRule="exact"/>
+        <w:spacing w:before="0" w:after="0" w:lineRule="auto" w:line="360"/>
         <w:ind w:firstLine="420"/>
         <w:jc w:val="both"/>
       </w:pPr>
@@ -3884,7 +3885,7 @@
     </w:p>
     <w:p>
       <w:pPr>
-        <w:spacing w:before="0" w:after="0" w:line="360" w:lineRule="exact"/>
+        <w:spacing w:before="0" w:after="0" w:lineRule="auto" w:line="360"/>
         <w:ind w:firstLine="420"/>
         <w:jc w:val="both"/>
       </w:pPr>
@@ -3900,7 +3901,7 @@
     </w:p>
     <w:p>
       <w:pPr>
-        <w:spacing w:before="0" w:after="0" w:line="360" w:lineRule="exact"/>
+        <w:spacing w:before="0" w:after="0" w:lineRule="auto" w:line="360"/>
         <w:ind w:firstLine="420"/>
         <w:jc w:val="both"/>
       </w:pPr>
@@ -3916,7 +3917,7 @@
     </w:p>
     <w:p>
       <w:pPr>
-        <w:spacing w:before="0" w:after="0" w:line="360" w:lineRule="exact"/>
+        <w:spacing w:before="0" w:after="0" w:lineRule="auto" w:line="360"/>
         <w:ind w:firstLine="420"/>
         <w:jc w:val="both"/>
       </w:pPr>
@@ -3932,7 +3933,7 @@
     </w:p>
     <w:p>
       <w:pPr>
-        <w:spacing w:before="0" w:after="0" w:line="360" w:lineRule="exact"/>
+        <w:spacing w:before="0" w:after="0" w:lineRule="auto" w:line="360"/>
         <w:ind w:firstLine="420"/>
         <w:jc w:val="both"/>
       </w:pPr>
@@ -3948,12 +3949,12 @@
     </w:p>
     <w:p>
       <w:pPr>
-        <w:spacing w:before="80" w:after="40" w:line="260" w:lineRule="exact"/>
+        <w:spacing w:before="80" w:after="40" w:lineRule="auto" w:line="260"/>
         <w:jc w:val="center"/>
       </w:pPr>
       <w:r>
         <w:rPr>
-          <w:rFonts w:ascii="Times New Roman" w:hAnsi="Times New Roman" w:eastAsia="黑体"/>
+          <w:rFonts w:ascii="Times New Roman" w:hAnsi="Times New Roman" w:eastAsia="仿宋"/>
           <w:b/>
           <w:i w:val="0"/>
           <w:sz w:val="18"/>
@@ -3997,7 +3998,7 @@
           </w:tcPr>
           <w:p>
             <w:pPr>
-              <w:spacing w:before="0" w:after="0" w:line="240" w:lineRule="exact"/>
+              <w:spacing w:before="0" w:after="0" w:line="240" w:lineRule="auto"/>
               <w:jc w:val="center"/>
             </w:pPr>
             <w:r>
@@ -4021,7 +4022,7 @@
           </w:tcPr>
           <w:p>
             <w:pPr>
-              <w:spacing w:before="0" w:after="0" w:line="240" w:lineRule="exact"/>
+              <w:spacing w:before="0" w:after="0" w:line="240" w:lineRule="auto"/>
               <w:jc w:val="center"/>
             </w:pPr>
             <w:r>
@@ -4045,7 +4046,7 @@
           </w:tcPr>
           <w:p>
             <w:pPr>
-              <w:spacing w:before="0" w:after="0" w:line="240" w:lineRule="exact"/>
+              <w:spacing w:before="0" w:after="0" w:line="240" w:lineRule="auto"/>
               <w:jc w:val="center"/>
             </w:pPr>
             <w:r>
@@ -4069,7 +4070,7 @@
           </w:tcPr>
           <w:p>
             <w:pPr>
-              <w:spacing w:before="0" w:after="0" w:line="240" w:lineRule="exact"/>
+              <w:spacing w:before="0" w:after="0" w:line="240" w:lineRule="auto"/>
               <w:jc w:val="center"/>
             </w:pPr>
             <w:r>
@@ -4093,7 +4094,7 @@
           </w:tcPr>
           <w:p>
             <w:pPr>
-              <w:spacing w:before="0" w:after="0" w:line="240" w:lineRule="exact"/>
+              <w:spacing w:before="0" w:after="0" w:line="240" w:lineRule="auto"/>
               <w:jc w:val="center"/>
             </w:pPr>
             <w:r>
@@ -4119,7 +4120,7 @@
           </w:tcPr>
           <w:p>
             <w:pPr>
-              <w:spacing w:before="0" w:after="0" w:line="240" w:lineRule="exact"/>
+              <w:spacing w:before="0" w:after="0" w:line="240" w:lineRule="auto"/>
               <w:jc w:val="center"/>
             </w:pPr>
             <w:r>
@@ -4140,7 +4141,7 @@
           </w:tcPr>
           <w:p>
             <w:pPr>
-              <w:spacing w:before="0" w:after="0" w:line="240" w:lineRule="exact"/>
+              <w:spacing w:before="0" w:after="0" w:line="240" w:lineRule="auto"/>
               <w:jc w:val="right"/>
             </w:pPr>
             <w:r>
@@ -4161,7 +4162,7 @@
           </w:tcPr>
           <w:p>
             <w:pPr>
-              <w:spacing w:before="0" w:after="0" w:line="240" w:lineRule="exact"/>
+              <w:spacing w:before="0" w:after="0" w:line="240" w:lineRule="auto"/>
               <w:jc w:val="right"/>
             </w:pPr>
             <w:r>
@@ -4182,7 +4183,7 @@
           </w:tcPr>
           <w:p>
             <w:pPr>
-              <w:spacing w:before="0" w:after="0" w:line="240" w:lineRule="exact"/>
+              <w:spacing w:before="0" w:after="0" w:line="240" w:lineRule="auto"/>
               <w:jc w:val="right"/>
             </w:pPr>
             <w:r>
@@ -4203,7 +4204,7 @@
           </w:tcPr>
           <w:p>
             <w:pPr>
-              <w:spacing w:before="0" w:after="0" w:line="240" w:lineRule="exact"/>
+              <w:spacing w:before="0" w:after="0" w:line="240" w:lineRule="auto"/>
               <w:jc w:val="right"/>
             </w:pPr>
             <w:r>
@@ -4229,7 +4230,7 @@
           </w:tcPr>
           <w:p>
             <w:pPr>
-              <w:spacing w:before="0" w:after="0" w:line="240" w:lineRule="exact"/>
+              <w:spacing w:before="0" w:after="0" w:line="240" w:lineRule="auto"/>
               <w:jc w:val="center"/>
             </w:pPr>
             <w:r>
@@ -4250,7 +4251,7 @@
           </w:tcPr>
           <w:p>
             <w:pPr>
-              <w:spacing w:before="0" w:after="0" w:line="240" w:lineRule="exact"/>
+              <w:spacing w:before="0" w:after="0" w:line="240" w:lineRule="auto"/>
               <w:jc w:val="right"/>
             </w:pPr>
             <w:r>
@@ -4271,7 +4272,7 @@
           </w:tcPr>
           <w:p>
             <w:pPr>
-              <w:spacing w:before="0" w:after="0" w:line="240" w:lineRule="exact"/>
+              <w:spacing w:before="0" w:after="0" w:line="240" w:lineRule="auto"/>
               <w:jc w:val="right"/>
             </w:pPr>
             <w:r>
@@ -4292,7 +4293,7 @@
           </w:tcPr>
           <w:p>
             <w:pPr>
-              <w:spacing w:before="0" w:after="0" w:line="240" w:lineRule="exact"/>
+              <w:spacing w:before="0" w:after="0" w:line="240" w:lineRule="auto"/>
               <w:jc w:val="right"/>
             </w:pPr>
             <w:r>
@@ -4313,7 +4314,7 @@
           </w:tcPr>
           <w:p>
             <w:pPr>
-              <w:spacing w:before="0" w:after="0" w:line="240" w:lineRule="exact"/>
+              <w:spacing w:before="0" w:after="0" w:line="240" w:lineRule="auto"/>
               <w:jc w:val="right"/>
             </w:pPr>
             <w:r>
@@ -4339,7 +4340,7 @@
           </w:tcPr>
           <w:p>
             <w:pPr>
-              <w:spacing w:before="0" w:after="0" w:line="240" w:lineRule="exact"/>
+              <w:spacing w:before="0" w:after="0" w:line="240" w:lineRule="auto"/>
               <w:jc w:val="center"/>
             </w:pPr>
             <w:r>
@@ -4360,7 +4361,7 @@
           </w:tcPr>
           <w:p>
             <w:pPr>
-              <w:spacing w:before="0" w:after="0" w:line="240" w:lineRule="exact"/>
+              <w:spacing w:before="0" w:after="0" w:line="240" w:lineRule="auto"/>
               <w:jc w:val="right"/>
             </w:pPr>
             <w:r>
@@ -4381,7 +4382,7 @@
           </w:tcPr>
           <w:p>
             <w:pPr>
-              <w:spacing w:before="0" w:after="0" w:line="240" w:lineRule="exact"/>
+              <w:spacing w:before="0" w:after="0" w:line="240" w:lineRule="auto"/>
               <w:jc w:val="right"/>
             </w:pPr>
             <w:r>
@@ -4402,7 +4403,7 @@
           </w:tcPr>
           <w:p>
             <w:pPr>
-              <w:spacing w:before="0" w:after="0" w:line="240" w:lineRule="exact"/>
+              <w:spacing w:before="0" w:after="0" w:line="240" w:lineRule="auto"/>
               <w:jc w:val="right"/>
             </w:pPr>
             <w:r>
@@ -4423,7 +4424,7 @@
           </w:tcPr>
           <w:p>
             <w:pPr>
-              <w:spacing w:before="0" w:after="0" w:line="240" w:lineRule="exact"/>
+              <w:spacing w:before="0" w:after="0" w:line="240" w:lineRule="auto"/>
               <w:jc w:val="right"/>
             </w:pPr>
             <w:r>
@@ -4449,7 +4450,7 @@
           </w:tcPr>
           <w:p>
             <w:pPr>
-              <w:spacing w:before="0" w:after="0" w:line="240" w:lineRule="exact"/>
+              <w:spacing w:before="0" w:after="0" w:line="240" w:lineRule="auto"/>
               <w:jc w:val="center"/>
             </w:pPr>
             <w:r>
@@ -4470,7 +4471,7 @@
           </w:tcPr>
           <w:p>
             <w:pPr>
-              <w:spacing w:before="0" w:after="0" w:line="240" w:lineRule="exact"/>
+              <w:spacing w:before="0" w:after="0" w:line="240" w:lineRule="auto"/>
               <w:jc w:val="right"/>
             </w:pPr>
             <w:r>
@@ -4491,7 +4492,7 @@
           </w:tcPr>
           <w:p>
             <w:pPr>
-              <w:spacing w:before="0" w:after="0" w:line="240" w:lineRule="exact"/>
+              <w:spacing w:before="0" w:after="0" w:line="240" w:lineRule="auto"/>
               <w:jc w:val="right"/>
             </w:pPr>
             <w:r>
@@ -4512,7 +4513,7 @@
           </w:tcPr>
           <w:p>
             <w:pPr>
-              <w:spacing w:before="0" w:after="0" w:line="240" w:lineRule="exact"/>
+              <w:spacing w:before="0" w:after="0" w:line="240" w:lineRule="auto"/>
               <w:jc w:val="right"/>
             </w:pPr>
             <w:r>
@@ -4533,7 +4534,7 @@
           </w:tcPr>
           <w:p>
             <w:pPr>
-              <w:spacing w:before="0" w:after="0" w:line="240" w:lineRule="exact"/>
+              <w:spacing w:before="0" w:after="0" w:line="240" w:lineRule="auto"/>
               <w:jc w:val="right"/>
             </w:pPr>
             <w:r>
@@ -4562,7 +4563,7 @@
           </w:tcPr>
           <w:p>
             <w:pPr>
-              <w:spacing w:before="0" w:after="0" w:line="240" w:lineRule="exact"/>
+              <w:spacing w:before="0" w:after="0" w:line="240" w:lineRule="auto"/>
               <w:jc w:val="center"/>
             </w:pPr>
             <w:r>
@@ -4586,7 +4587,7 @@
           </w:tcPr>
           <w:p>
             <w:pPr>
-              <w:spacing w:before="0" w:after="0" w:line="240" w:lineRule="exact"/>
+              <w:spacing w:before="0" w:after="0" w:line="240" w:lineRule="auto"/>
               <w:jc w:val="right"/>
             </w:pPr>
             <w:r>
@@ -4610,7 +4611,7 @@
           </w:tcPr>
           <w:p>
             <w:pPr>
-              <w:spacing w:before="0" w:after="0" w:line="240" w:lineRule="exact"/>
+              <w:spacing w:before="0" w:after="0" w:line="240" w:lineRule="auto"/>
               <w:jc w:val="right"/>
             </w:pPr>
             <w:r>
@@ -4634,7 +4635,7 @@
           </w:tcPr>
           <w:p>
             <w:pPr>
-              <w:spacing w:before="0" w:after="0" w:line="240" w:lineRule="exact"/>
+              <w:spacing w:before="0" w:after="0" w:line="240" w:lineRule="auto"/>
               <w:jc w:val="right"/>
             </w:pPr>
             <w:r>
@@ -4658,7 +4659,7 @@
           </w:tcPr>
           <w:p>
             <w:pPr>
-              <w:spacing w:before="0" w:after="0" w:line="240" w:lineRule="exact"/>
+              <w:spacing w:before="0" w:after="0" w:line="240" w:lineRule="auto"/>
               <w:jc w:val="right"/>
             </w:pPr>
             <w:r>
@@ -4676,7 +4677,7 @@
     </w:tbl>
     <w:p>
       <w:pPr>
-        <w:spacing w:before="40" w:after="80" w:line="220" w:lineRule="exact"/>
+        <w:spacing w:before="40" w:after="80" w:lineRule="auto" w:line="220"/>
         <w:ind w:firstLine="0"/>
         <w:jc w:val="both"/>
       </w:pPr>
@@ -4692,7 +4693,7 @@
     </w:p>
     <w:p>
       <w:pPr>
-        <w:spacing w:before="180" w:after="60" w:line="320" w:lineRule="exact"/>
+        <w:spacing w:before="180" w:after="60" w:lineRule="auto" w:line="320"/>
         <w:jc w:val="left"/>
       </w:pPr>
       <w:r>
@@ -4707,7 +4708,7 @@
     </w:p>
     <w:p>
       <w:pPr>
-        <w:spacing w:before="0" w:after="0" w:line="360" w:lineRule="exact"/>
+        <w:spacing w:before="0" w:after="0" w:lineRule="auto" w:line="360"/>
         <w:ind w:firstLine="420"/>
         <w:jc w:val="both"/>
       </w:pPr>
@@ -4723,7 +4724,7 @@
     </w:p>
     <w:p>
       <w:pPr>
-        <w:spacing w:before="0" w:after="0" w:line="360" w:lineRule="exact"/>
+        <w:spacing w:before="0" w:after="0" w:lineRule="auto" w:line="360"/>
         <w:ind w:firstLine="420"/>
         <w:jc w:val="both"/>
       </w:pPr>
@@ -4739,7 +4740,7 @@
     </w:p>
     <w:p>
       <w:pPr>
-        <w:spacing w:before="0" w:after="0" w:line="360" w:lineRule="exact"/>
+        <w:spacing w:before="0" w:after="0" w:lineRule="auto" w:line="360"/>
         <w:ind w:firstLine="420"/>
         <w:jc w:val="both"/>
       </w:pPr>
@@ -4755,7 +4756,7 @@
     </w:p>
     <w:p>
       <w:pPr>
-        <w:spacing w:before="0" w:after="0" w:line="360" w:lineRule="exact"/>
+        <w:spacing w:before="0" w:after="0" w:lineRule="auto" w:line="360"/>
         <w:ind w:firstLine="420"/>
         <w:jc w:val="both"/>
       </w:pPr>
@@ -4771,7 +4772,7 @@
     </w:p>
     <w:p>
       <w:pPr>
-        <w:spacing w:before="0" w:after="0" w:line="360" w:lineRule="exact"/>
+        <w:spacing w:before="0" w:after="0" w:lineRule="auto" w:line="360"/>
         <w:ind w:firstLine="420"/>
         <w:jc w:val="both"/>
       </w:pPr>
@@ -4787,7 +4788,7 @@
     </w:p>
     <w:p>
       <w:pPr>
-        <w:spacing w:before="0" w:after="0" w:line="360" w:lineRule="exact"/>
+        <w:spacing w:before="0" w:after="0" w:lineRule="auto" w:line="360"/>
         <w:ind w:firstLine="420"/>
         <w:jc w:val="both"/>
       </w:pPr>
@@ -4803,14 +4804,14 @@
     </w:p>
     <w:p>
       <w:pPr>
-        <w:spacing w:before="80" w:after="20" w:line="240" w:lineRule="exact"/>
+        <w:spacing w:before="80" w:after="20"/>
         <w:ind w:firstLine="0"/>
         <w:jc w:val="center"/>
       </w:pPr>
       <w:r>
         <w:drawing>
           <wp:inline xmlns:a="http://schemas.openxmlformats.org/drawingml/2006/main" xmlns:pic="http://schemas.openxmlformats.org/drawingml/2006/picture">
-            <wp:extent cx="4140000" cy="1571244"/>
+            <wp:extent cx="4140000" cy="1572028"/>
             <wp:docPr id="30" name="Picture 30"/>
             <wp:cNvGraphicFramePr>
               <a:graphicFrameLocks noChangeAspect="1"/>
@@ -4823,7 +4824,7 @@
                     <pic:cNvPicPr/>
                   </pic:nvPicPr>
                   <pic:blipFill>
-                    <a:blip r:embed="rId18"/>
+                    <a:blip r:embed="rId19"/>
                     <a:stretch>
                       <a:fillRect/>
                     </a:stretch>
@@ -4831,7 +4832,7 @@
                   <pic:spPr>
                     <a:xfrm>
                       <a:off x="0" y="0"/>
-                      <a:ext cx="4140000" cy="1571244"/>
+                      <a:ext cx="4140000" cy="1572028"/>
                     </a:xfrm>
                     <a:prstGeom prst="rect"/>
                   </pic:spPr>
@@ -4844,7 +4845,7 @@
     </w:p>
     <w:p>
       <w:pPr>
-        <w:spacing w:before="20" w:after="80" w:line="260" w:lineRule="exact"/>
+        <w:spacing w:before="20" w:after="80" w:lineRule="auto" w:line="260"/>
         <w:ind w:firstLine="0"/>
         <w:jc w:val="center"/>
       </w:pPr>
@@ -4860,7 +4861,7 @@
     </w:p>
     <w:p>
       <w:pPr>
-        <w:spacing w:before="180" w:after="60" w:line="320" w:lineRule="exact"/>
+        <w:spacing w:before="180" w:after="60" w:lineRule="auto" w:line="320"/>
         <w:jc w:val="left"/>
       </w:pPr>
       <w:r>
@@ -4875,7 +4876,7 @@
     </w:p>
     <w:p>
       <w:pPr>
-        <w:spacing w:before="0" w:after="0" w:line="360" w:lineRule="exact"/>
+        <w:spacing w:before="0" w:after="0" w:lineRule="auto" w:line="360"/>
         <w:ind w:firstLine="420"/>
         <w:jc w:val="both"/>
       </w:pPr>
@@ -4891,7 +4892,7 @@
     </w:p>
     <w:p>
       <w:pPr>
-        <w:spacing w:before="0" w:after="0" w:line="360" w:lineRule="exact"/>
+        <w:spacing w:before="0" w:after="0" w:lineRule="auto" w:line="360"/>
         <w:ind w:firstLine="420"/>
         <w:jc w:val="both"/>
       </w:pPr>
@@ -4907,7 +4908,7 @@
     </w:p>
     <w:p>
       <w:pPr>
-        <w:spacing w:before="0" w:after="0" w:line="360" w:lineRule="exact"/>
+        <w:spacing w:before="0" w:after="0" w:lineRule="auto" w:line="360"/>
         <w:ind w:firstLine="420"/>
         <w:jc w:val="both"/>
       </w:pPr>
@@ -4923,7 +4924,7 @@
     </w:p>
     <w:p>
       <w:pPr>
-        <w:spacing w:before="0" w:after="0" w:line="360" w:lineRule="exact"/>
+        <w:spacing w:before="0" w:after="0" w:lineRule="auto" w:line="360"/>
         <w:ind w:firstLine="420"/>
         <w:jc w:val="both"/>
       </w:pPr>
@@ -4939,7 +4940,7 @@
     </w:p>
     <w:p>
       <w:pPr>
-        <w:spacing w:before="0" w:after="0" w:line="360" w:lineRule="exact"/>
+        <w:spacing w:before="0" w:after="0" w:lineRule="auto" w:line="360"/>
         <w:ind w:firstLine="420"/>
         <w:jc w:val="both"/>
       </w:pPr>
@@ -4955,7 +4956,7 @@
     </w:p>
     <w:p>
       <w:pPr>
-        <w:spacing w:before="0" w:after="0" w:line="360" w:lineRule="exact"/>
+        <w:spacing w:before="0" w:after="0" w:lineRule="auto" w:line="360"/>
         <w:ind w:firstLine="420"/>
         <w:jc w:val="both"/>
       </w:pPr>
@@ -4976,22 +4977,133 @@
     </w:p>
     <w:p>
       <w:pPr>
-        <w:spacing w:before="240" w:after="120" w:line="360" w:lineRule="exact"/>
+        <w:spacing w:before="240" w:after="120" w:lineRule="auto" w:line="360"/>
         <w:jc w:val="center"/>
+      </w:pPr>
+      <w:r>
+        <w:rPr>
+          <w:rFonts w:ascii="Times New Roman" w:hAnsi="Times New Roman" w:eastAsia="仿宋"/>
+          <w:b/>
+          <w:i w:val="0"/>
+          <w:sz w:val="28"/>
+        </w:rPr>
+        <w:t>五、政策语调与国债收益率曲线</w:t>
+      </w:r>
+    </w:p>
+    <w:p>
+      <w:pPr>
+        <w:spacing w:before="180" w:after="60" w:lineRule="auto" w:line="320"/>
+        <w:jc w:val="left"/>
       </w:pPr>
       <w:r>
         <w:rPr>
           <w:rFonts w:ascii="Times New Roman" w:hAnsi="Times New Roman" w:eastAsia="黑体"/>
           <w:b/>
           <w:i w:val="0"/>
-          <w:sz w:val="28"/>
-        </w:rPr>
-        <w:t>五、政策语调与国债收益率曲线</w:t>
-      </w:r>
-    </w:p>
-    <w:p>
-      <w:pPr>
-        <w:spacing w:before="180" w:after="60" w:line="320" w:lineRule="exact"/>
+          <w:sz w:val="24"/>
+        </w:rPr>
+        <w:t>（一）未预期政策语调</w:t>
+      </w:r>
+    </w:p>
+    <w:p>
+      <w:pPr>
+        <w:spacing w:before="0" w:after="0" w:lineRule="auto" w:line="360"/>
+        <w:ind w:firstLine="420"/>
+        <w:jc w:val="both"/>
+      </w:pPr>
+      <w:r>
+        <w:rPr>
+          <w:rFonts w:ascii="Times New Roman" w:hAnsi="Times New Roman" w:eastAsia="宋体"/>
+          <w:b w:val="0"/>
+          <w:i w:val="0"/>
+          <w:sz w:val="21"/>
+        </w:rPr>
+        <w:t>债券部分考察政策指引未预期语调与收益率曲线斜率变化。三日窗口内斜率回归的主效应系数为0.9542，HC3标准误为1.1858，p值为0.4210；2019年后总效应为-0.6080，总效应p值为0.7239。估计方向在不同曲线因子之间并不稳定，债券证据弱于股票波动结果。</w:t>
+      </w:r>
+    </w:p>
+    <w:p>
+      <w:pPr>
+        <w:spacing w:before="0" w:after="0" w:lineRule="auto" w:line="360"/>
+        <w:ind w:firstLine="420"/>
+        <w:jc w:val="both"/>
+      </w:pPr>
+      <w:r>
+        <w:rPr>
+          <w:rFonts w:ascii="Times New Roman" w:hAnsi="Times New Roman" w:eastAsia="宋体"/>
+          <w:b w:val="0"/>
+          <w:i w:val="0"/>
+          <w:sz w:val="21"/>
+        </w:rPr>
+        <w:t>收益率曲线同时反映短端政策利率预期、长端增长通胀预期和期限溢价。央行报告中的偏松或偏紧表述可能推低短端，也可能通过增长预期抬升长端；两个渠道叠加后，斜率反应未必呈现单一方向。Kuttner（2001）和Gurkaynak等（2005）关于未预期政策信息的研究提示，利率市场对政策消息的反应往往依赖识别口径和期限结构。</w:t>
+      </w:r>
+    </w:p>
+    <w:p>
+      <w:pPr>
+        <w:spacing w:before="0" w:after="0" w:lineRule="auto" w:line="360"/>
+        <w:ind w:firstLine="420"/>
+        <w:jc w:val="both"/>
+      </w:pPr>
+      <w:r>
+        <w:rPr>
+          <w:rFonts w:ascii="Times New Roman" w:hAnsi="Times New Roman" w:eastAsia="宋体"/>
+          <w:b w:val="0"/>
+          <w:i w:val="0"/>
+          <w:sz w:val="21"/>
+        </w:rPr>
+        <w:t>未预期语调的构造以报告自身的历史规律为基准，试图区分常规表述和超出惯性的政策倾向变化。这个思路与董青马等（2024）强调的“潜在”未预期信息相呼应；本研究仅借鉴其问题意识，并不复制其完整识别框架。季度报告文本较长，且包含大量宏观判断，未预期语调进入债券回归后仍可能同时反映政策冲击和央行信息冲击。</w:t>
+      </w:r>
+    </w:p>
+    <w:p>
+      <w:pPr>
+        <w:spacing w:before="0" w:after="0" w:lineRule="auto" w:line="360"/>
+        <w:ind w:firstLine="420"/>
+        <w:jc w:val="both"/>
+      </w:pPr>
+      <w:r>
+        <w:rPr>
+          <w:rFonts w:ascii="Times New Roman" w:hAnsi="Times New Roman" w:eastAsia="宋体"/>
+          <w:b w:val="0"/>
+          <w:i w:val="0"/>
+          <w:sz w:val="21"/>
+        </w:rPr>
+        <w:t>Nakamura和Steinsson（2018）、Jarocinski和Karadi（2020）的研究表明，央行信息效应可能使市场把政策消息理解为关于经济前景的信号。放在收益率曲线上，偏紧语调并不一定只推高短端利率；如果市场把它理解为经济韧性更强，也可能影响长端收益率。本文的债券结果不稳定，正反映了这类信息分解在季度文本场景中的困难。</w:t>
+      </w:r>
+    </w:p>
+    <w:p>
+      <w:pPr>
+        <w:spacing w:before="0" w:after="0" w:lineRule="auto" w:line="360"/>
+        <w:ind w:firstLine="420"/>
+        <w:jc w:val="both"/>
+      </w:pPr>
+      <w:r>
+        <w:rPr>
+          <w:rFonts w:ascii="Times New Roman" w:hAnsi="Times New Roman" w:eastAsia="宋体"/>
+          <w:b w:val="0"/>
+          <w:i w:val="0"/>
+          <w:sz w:val="21"/>
+        </w:rPr>
+        <w:t>中国债券市场还受到资金面、监管预期和机构配置需求影响。季度报告发布时点附近，如果资金利率、公开市场操作或海外利率同步变化，收益率曲线可能先反映这些高频因素。文本语调变量在三日窗口中要与这些因素竞争解释力，得到弱结果并不奇怪。</w:t>
+      </w:r>
+    </w:p>
+    <w:p>
+      <w:pPr>
+        <w:spacing w:before="0" w:after="0" w:lineRule="auto" w:line="360"/>
+        <w:ind w:firstLine="420"/>
+        <w:jc w:val="both"/>
+      </w:pPr>
+      <w:r>
+        <w:rPr>
+          <w:rFonts w:ascii="Times New Roman" w:hAnsi="Times New Roman" w:eastAsia="宋体"/>
+          <w:b w:val="0"/>
+          <w:i w:val="0"/>
+          <w:sz w:val="21"/>
+        </w:rPr>
+        <w:t>曲线水平、斜率和曲率的经济含义不同。水平变化更接近整体利率环境，斜率变化反映短端和长端相对调整，曲率则对应中期限收益率的相对位置。政策语调若主要影响短端，斜率会变化；若市场同时调整增长和通胀预期，水平和曲率也可能移动。表4的Panel B把三类结果放在一起，正是为了避免只报告单一曲线因子。</w:t>
+      </w:r>
+    </w:p>
+    <w:p>
+      <w:pPr>
+        <w:spacing w:before="180" w:after="60" w:lineRule="auto" w:line="320"/>
         <w:jc w:val="left"/>
       </w:pPr>
       <w:r>
@@ -5001,108 +5113,108 @@
           <w:i w:val="0"/>
           <w:sz w:val="24"/>
         </w:rPr>
-        <w:t>（一）未预期政策语调</w:t>
-      </w:r>
-    </w:p>
-    <w:p>
-      <w:pPr>
-        <w:spacing w:before="0" w:after="0" w:line="360" w:lineRule="exact"/>
-        <w:ind w:firstLine="420"/>
-        <w:jc w:val="both"/>
-      </w:pPr>
-      <w:r>
-        <w:rPr>
-          <w:rFonts w:ascii="Times New Roman" w:hAnsi="Times New Roman" w:eastAsia="宋体"/>
-          <w:b w:val="0"/>
-          <w:i w:val="0"/>
-          <w:sz w:val="21"/>
-        </w:rPr>
-        <w:t>债券部分考察政策指引未预期语调与收益率曲线斜率变化。三日窗口内斜率回归的主效应系数为0.9542，HC3标准误为1.1858，p值为0.4210；2019年后总效应为-0.6080，总效应p值为0.7239。估计方向在不同曲线因子之间并不稳定，债券证据弱于股票波动结果。</w:t>
-      </w:r>
-    </w:p>
-    <w:p>
-      <w:pPr>
-        <w:spacing w:before="0" w:after="0" w:line="360" w:lineRule="exact"/>
-        <w:ind w:firstLine="420"/>
-        <w:jc w:val="both"/>
-      </w:pPr>
-      <w:r>
-        <w:rPr>
-          <w:rFonts w:ascii="Times New Roman" w:hAnsi="Times New Roman" w:eastAsia="宋体"/>
-          <w:b w:val="0"/>
-          <w:i w:val="0"/>
-          <w:sz w:val="21"/>
-        </w:rPr>
-        <w:t>收益率曲线同时反映短端政策利率预期、长端增长通胀预期和期限溢价。央行报告中的偏松或偏紧表述可能推低短端，也可能通过增长预期抬升长端；两个渠道叠加后，斜率反应未必呈现单一方向。Kuttner（2001）和Gurkaynak等（2005）关于未预期政策信息的研究提示，利率市场对政策消息的反应往往依赖识别口径和期限结构。</w:t>
-      </w:r>
-    </w:p>
-    <w:p>
-      <w:pPr>
-        <w:spacing w:before="0" w:after="0" w:line="360" w:lineRule="exact"/>
-        <w:ind w:firstLine="420"/>
-        <w:jc w:val="both"/>
-      </w:pPr>
-      <w:r>
-        <w:rPr>
-          <w:rFonts w:ascii="Times New Roman" w:hAnsi="Times New Roman" w:eastAsia="宋体"/>
-          <w:b w:val="0"/>
-          <w:i w:val="0"/>
-          <w:sz w:val="21"/>
-        </w:rPr>
-        <w:t>未预期语调的构造以报告自身的历史规律为基准，试图区分常规表述和超出惯性的政策倾向变化。这个思路与董青马等（2024）强调的“潜在”未预期信息相呼应；本研究仅借鉴其问题意识，并不复制其完整识别框架。季度报告文本较长，且包含大量宏观判断，未预期语调进入债券回归后仍可能同时反映政策冲击和央行信息冲击。</w:t>
-      </w:r>
-    </w:p>
-    <w:p>
-      <w:pPr>
-        <w:spacing w:before="0" w:after="0" w:line="360" w:lineRule="exact"/>
-        <w:ind w:firstLine="420"/>
-        <w:jc w:val="both"/>
-      </w:pPr>
-      <w:r>
-        <w:rPr>
-          <w:rFonts w:ascii="Times New Roman" w:hAnsi="Times New Roman" w:eastAsia="宋体"/>
-          <w:b w:val="0"/>
-          <w:i w:val="0"/>
-          <w:sz w:val="21"/>
-        </w:rPr>
-        <w:t>Nakamura和Steinsson（2018）、Jarocinski和Karadi（2020）的研究表明，央行信息效应可能使市场把政策消息理解为关于经济前景的信号。放在收益率曲线上，偏紧语调并不一定只推高短端利率；如果市场把它理解为经济韧性更强，也可能影响长端收益率。本文的债券结果不稳定，正反映了这类信息分解在季度文本场景中的困难。</w:t>
-      </w:r>
-    </w:p>
-    <w:p>
-      <w:pPr>
-        <w:spacing w:before="0" w:after="0" w:line="360" w:lineRule="exact"/>
-        <w:ind w:firstLine="420"/>
-        <w:jc w:val="both"/>
-      </w:pPr>
-      <w:r>
-        <w:rPr>
-          <w:rFonts w:ascii="Times New Roman" w:hAnsi="Times New Roman" w:eastAsia="宋体"/>
-          <w:b w:val="0"/>
-          <w:i w:val="0"/>
-          <w:sz w:val="21"/>
-        </w:rPr>
-        <w:t>中国债券市场还受到资金面、监管预期和机构配置需求影响。季度报告发布时点附近，如果资金利率、公开市场操作或海外利率同步变化，收益率曲线可能先反映这些高频因素。文本语调变量在三日窗口中要与这些因素竞争解释力，得到弱结果并不奇怪。</w:t>
-      </w:r>
-    </w:p>
-    <w:p>
-      <w:pPr>
-        <w:spacing w:before="0" w:after="0" w:line="360" w:lineRule="exact"/>
-        <w:ind w:firstLine="420"/>
-        <w:jc w:val="both"/>
-      </w:pPr>
-      <w:r>
-        <w:rPr>
-          <w:rFonts w:ascii="Times New Roman" w:hAnsi="Times New Roman" w:eastAsia="宋体"/>
-          <w:b w:val="0"/>
-          <w:i w:val="0"/>
-          <w:sz w:val="21"/>
-        </w:rPr>
-        <w:t>曲线水平、斜率和曲率的经济含义不同。水平变化更接近整体利率环境，斜率变化反映短端和长端相对调整，曲率则对应中期限收益率的相对位置。政策语调若主要影响短端，斜率会变化；若市场同时调整增长和通胀预期，水平和曲率也可能移动。表4的Panel B把三类结果放在一起，正是为了避免只报告单一曲线因子。</w:t>
-      </w:r>
-    </w:p>
-    <w:p>
-      <w:pPr>
-        <w:spacing w:before="180" w:after="60" w:line="320" w:lineRule="exact"/>
+        <w:t>（二）跨拟合监督语调</w:t>
+      </w:r>
+    </w:p>
+    <w:p>
+      <w:pPr>
+        <w:spacing w:before="0" w:after="0" w:lineRule="auto" w:line="360"/>
+        <w:ind w:firstLine="420"/>
+        <w:jc w:val="both"/>
+      </w:pPr>
+      <w:r>
+        <w:rPr>
+          <w:rFonts w:ascii="Times New Roman" w:hAnsi="Times New Roman" w:eastAsia="宋体"/>
+          <w:b w:val="0"/>
+          <w:i w:val="0"/>
+          <w:sz w:val="21"/>
+        </w:rPr>
+        <w:t>跨拟合政策语调把人工标注句子的监督分类结果聚合到报告层面。政策相关句均值的主效应为0.4744，p值为0.9079；2019年后总效应为-0.1124，总效应p值为0.9852。该结果没有稳定改善债券解释力。</w:t>
+      </w:r>
+    </w:p>
+    <w:p>
+      <w:pPr>
+        <w:spacing w:before="0" w:after="0" w:lineRule="auto" w:line="360"/>
+        <w:ind w:firstLine="420"/>
+        <w:jc w:val="both"/>
+      </w:pPr>
+      <w:r>
+        <w:rPr>
+          <w:rFonts w:ascii="Times New Roman" w:hAnsi="Times New Roman" w:eastAsia="宋体"/>
+          <w:b w:val="0"/>
+          <w:i w:val="0"/>
+          <w:sz w:val="21"/>
+        </w:rPr>
+        <w:t>跨拟合处理的价值在于降低训练集和解释变量之间的机械重合：每份报告的预测语调来自未使用该报告标注句训练的模型。问题也很清楚，人工标注样本只有240句，少数政策方向样本偏少，折外预测进入债券回归后噪声会被放大。因此，跨拟合监督语调更适合展示测量思路，而不是承担核心市场检验。</w:t>
+      </w:r>
+    </w:p>
+    <w:p>
+      <w:pPr>
+        <w:spacing w:before="0" w:after="0" w:lineRule="auto" w:line="360"/>
+        <w:ind w:firstLine="420"/>
+        <w:jc w:val="both"/>
+      </w:pPr>
+      <w:r>
+        <w:rPr>
+          <w:rFonts w:ascii="Times New Roman" w:hAnsi="Times New Roman" w:eastAsia="宋体"/>
+          <w:b w:val="0"/>
+          <w:i w:val="0"/>
+          <w:sz w:val="21"/>
+        </w:rPr>
+        <w:t>政策相关句均值是三种聚合方式中经济含义最清楚的一种。全部句子均值容易被宏观描述和背景性表述稀释，方向性句子均值又会丢掉大量中性但政策相关的信息。政策相关句均值保留了政策语境，同时减少无关句子的影响，因此正文用它报告主要跨拟合结果，并在表4中列出其他聚合方式作为对照。</w:t>
+      </w:r>
+    </w:p>
+    <w:p>
+      <w:pPr>
+        <w:spacing w:before="0" w:after="0" w:lineRule="auto" w:line="360"/>
+        <w:ind w:firstLine="420"/>
+        <w:jc w:val="both"/>
+      </w:pPr>
+      <w:r>
+        <w:rPr>
+          <w:rFonts w:ascii="Times New Roman" w:hAnsi="Times New Roman" w:eastAsia="宋体"/>
+          <w:b w:val="0"/>
+          <w:i w:val="0"/>
+          <w:sz w:val="21"/>
+        </w:rPr>
+        <w:t>监督语调没有稳定改善债券解释力，并不意味着人工标注或分类模型没有价值。它说明句子层方向识别和报告层市场反应之间还存在一个聚合与识别问题：报告可能同时出现偏松、偏紧和风险提示句，市场反应也可能取决于这些句子在报告结构中的位置，而不是简单平均后的得分。</w:t>
+      </w:r>
+    </w:p>
+    <w:p>
+      <w:pPr>
+        <w:spacing w:before="0" w:after="0" w:lineRule="auto" w:line="360"/>
+        <w:ind w:firstLine="420"/>
+        <w:jc w:val="both"/>
+      </w:pPr>
+      <w:r>
+        <w:rPr>
+          <w:rFonts w:ascii="Times New Roman" w:hAnsi="Times New Roman" w:eastAsia="宋体"/>
+          <w:b w:val="0"/>
+          <w:i w:val="0"/>
+          <w:sz w:val="21"/>
+        </w:rPr>
+        <w:t>跨拟合结果还提醒我们，文本测量误差会在金融回归中被放大。句子分类即使在验证集上有较高准确率，聚合到报告层后仍可能因句子数量、章节位置和类别不平衡产生偏差。债券回归样本只有季度报告事件，解释变量的一点噪声就会显著影响系数稳定性。</w:t>
+      </w:r>
+    </w:p>
+    <w:p>
+      <w:pPr>
+        <w:spacing w:before="0" w:after="0" w:lineRule="auto" w:line="360"/>
+        <w:ind w:firstLine="420"/>
+        <w:jc w:val="both"/>
+      </w:pPr>
+      <w:r>
+        <w:rPr>
+          <w:rFonts w:ascii="Times New Roman" w:hAnsi="Times New Roman" w:eastAsia="宋体"/>
+          <w:b w:val="0"/>
+          <w:i w:val="0"/>
+          <w:sz w:val="21"/>
+        </w:rPr>
+        <w:t>因此，跨拟合监督语调在本文中主要用于验证测量链条：人工标注能否支持监督分类，监督分类能否生成报告层语调，报告层语调进入债券模型后是否有清晰解释力。前两步结果相对可用，最后一步证据不足，这一层级差异本身就是研究结论的一部分。</w:t>
+      </w:r>
+    </w:p>
+    <w:p>
+      <w:pPr>
+        <w:spacing w:before="180" w:after="60" w:lineRule="auto" w:line="320"/>
         <w:jc w:val="left"/>
       </w:pPr>
       <w:r>
@@ -5112,178 +5224,67 @@
           <w:i w:val="0"/>
           <w:sz w:val="24"/>
         </w:rPr>
-        <w:t>（二）跨拟合监督语调</w:t>
-      </w:r>
-    </w:p>
-    <w:p>
-      <w:pPr>
-        <w:spacing w:before="0" w:after="0" w:line="360" w:lineRule="exact"/>
-        <w:ind w:firstLine="420"/>
-        <w:jc w:val="both"/>
-      </w:pPr>
-      <w:r>
-        <w:rPr>
-          <w:rFonts w:ascii="Times New Roman" w:hAnsi="Times New Roman" w:eastAsia="宋体"/>
-          <w:b w:val="0"/>
-          <w:i w:val="0"/>
-          <w:sz w:val="21"/>
-        </w:rPr>
-        <w:t>跨拟合政策语调把人工标注句子的监督分类结果聚合到报告层面。政策相关句均值的主效应为0.4744，p值为0.9079；2019年后总效应为-0.1124，总效应p值为0.9852。该结果没有稳定改善债券解释力。</w:t>
-      </w:r>
-    </w:p>
-    <w:p>
-      <w:pPr>
-        <w:spacing w:before="0" w:after="0" w:line="360" w:lineRule="exact"/>
-        <w:ind w:firstLine="420"/>
-        <w:jc w:val="both"/>
-      </w:pPr>
-      <w:r>
-        <w:rPr>
-          <w:rFonts w:ascii="Times New Roman" w:hAnsi="Times New Roman" w:eastAsia="宋体"/>
-          <w:b w:val="0"/>
-          <w:i w:val="0"/>
-          <w:sz w:val="21"/>
-        </w:rPr>
-        <w:t>跨拟合处理的价值在于降低训练集和解释变量之间的机械重合：每份报告的预测语调来自未使用该报告标注句训练的模型。问题也很清楚，人工标注样本只有240句，少数政策方向样本偏少，折外预测进入债券回归后噪声会被放大。因此，跨拟合监督语调更适合展示测量思路，而不是承担核心市场检验。</w:t>
-      </w:r>
-    </w:p>
-    <w:p>
-      <w:pPr>
-        <w:spacing w:before="0" w:after="0" w:line="360" w:lineRule="exact"/>
-        <w:ind w:firstLine="420"/>
-        <w:jc w:val="both"/>
-      </w:pPr>
-      <w:r>
-        <w:rPr>
-          <w:rFonts w:ascii="Times New Roman" w:hAnsi="Times New Roman" w:eastAsia="宋体"/>
-          <w:b w:val="0"/>
-          <w:i w:val="0"/>
-          <w:sz w:val="21"/>
-        </w:rPr>
-        <w:t>政策相关句均值是三种聚合方式中经济含义最清楚的一种。全部句子均值容易被宏观描述和背景性表述稀释，方向性句子均值又会丢掉大量中性但政策相关的信息。政策相关句均值保留了政策语境，同时减少无关句子的影响，因此正文用它报告主要跨拟合结果，并在表4中列出其他聚合方式作为对照。</w:t>
-      </w:r>
-    </w:p>
-    <w:p>
-      <w:pPr>
-        <w:spacing w:before="0" w:after="0" w:line="360" w:lineRule="exact"/>
-        <w:ind w:firstLine="420"/>
-        <w:jc w:val="both"/>
-      </w:pPr>
-      <w:r>
-        <w:rPr>
-          <w:rFonts w:ascii="Times New Roman" w:hAnsi="Times New Roman" w:eastAsia="宋体"/>
-          <w:b w:val="0"/>
-          <w:i w:val="0"/>
-          <w:sz w:val="21"/>
-        </w:rPr>
-        <w:t>监督语调没有稳定改善债券解释力，并不意味着人工标注或分类模型没有价值。它说明句子层方向识别和报告层市场反应之间还存在一个聚合与识别问题：报告可能同时出现偏松、偏紧和风险提示句，市场反应也可能取决于这些句子在报告结构中的位置，而不是简单平均后的得分。</w:t>
-      </w:r>
-    </w:p>
-    <w:p>
-      <w:pPr>
-        <w:spacing w:before="0" w:after="0" w:line="360" w:lineRule="exact"/>
-        <w:ind w:firstLine="420"/>
-        <w:jc w:val="both"/>
-      </w:pPr>
-      <w:r>
-        <w:rPr>
-          <w:rFonts w:ascii="Times New Roman" w:hAnsi="Times New Roman" w:eastAsia="宋体"/>
-          <w:b w:val="0"/>
-          <w:i w:val="0"/>
-          <w:sz w:val="21"/>
-        </w:rPr>
-        <w:t>跨拟合结果还提醒我们，文本测量误差会在金融回归中被放大。句子分类即使在验证集上有较高准确率，聚合到报告层后仍可能因句子数量、章节位置和类别不平衡产生偏差。债券回归样本只有季度报告事件，解释变量的一点噪声就会显著影响系数稳定性。</w:t>
-      </w:r>
-    </w:p>
-    <w:p>
-      <w:pPr>
-        <w:spacing w:before="0" w:after="0" w:line="360" w:lineRule="exact"/>
-        <w:ind w:firstLine="420"/>
-        <w:jc w:val="both"/>
-      </w:pPr>
-      <w:r>
-        <w:rPr>
-          <w:rFonts w:ascii="Times New Roman" w:hAnsi="Times New Roman" w:eastAsia="宋体"/>
-          <w:b w:val="0"/>
-          <w:i w:val="0"/>
-          <w:sz w:val="21"/>
-        </w:rPr>
-        <w:t>因此，跨拟合监督语调在本文中主要用于验证测量链条：人工标注能否支持监督分类，监督分类能否生成报告层语调，报告层语调进入债券模型后是否有清晰解释力。前两步结果相对可用，最后一步证据不足，这一层级差异本身就是研究结论的一部分。</w:t>
-      </w:r>
-    </w:p>
-    <w:p>
-      <w:pPr>
-        <w:spacing w:before="180" w:after="60" w:line="320" w:lineRule="exact"/>
-        <w:jc w:val="left"/>
-      </w:pPr>
-      <w:r>
-        <w:rPr>
-          <w:rFonts w:ascii="Times New Roman" w:hAnsi="Times New Roman" w:eastAsia="黑体"/>
+        <w:t>（三）结果讨论</w:t>
+      </w:r>
+    </w:p>
+    <w:p>
+      <w:pPr>
+        <w:spacing w:before="0" w:after="0" w:lineRule="auto" w:line="360"/>
+        <w:ind w:firstLine="420"/>
+        <w:jc w:val="both"/>
+      </w:pPr>
+      <w:r>
+        <w:rPr>
+          <w:rFonts w:ascii="Times New Roman" w:hAnsi="Times New Roman" w:eastAsia="宋体"/>
+          <w:b w:val="0"/>
+          <w:i w:val="0"/>
+          <w:sz w:val="21"/>
+        </w:rPr>
+        <w:t>股票和债券结果不一致，并不意外。股票波动率对不确定性本身敏感，文本创新度提高可能直接增加短期重新定价强度；债券收益率曲线则需要区分政策路径、宏观信息和期限溢价，单一语调变量难以同时捕捉这些渠道。McMahon、Schipke和Li（2018）指出，中国央行沟通仍处在制度化改进过程中，这也意味着不同市场吸收沟通信息的方式可能存在差异。</w:t>
+      </w:r>
+    </w:p>
+    <w:p>
+      <w:pPr>
+        <w:spacing w:before="0" w:after="0" w:lineRule="auto" w:line="360"/>
+        <w:ind w:firstLine="420"/>
+        <w:jc w:val="both"/>
+      </w:pPr>
+      <w:r>
+        <w:rPr>
+          <w:rFonts w:ascii="Times New Roman" w:hAnsi="Times New Roman" w:eastAsia="宋体"/>
+          <w:b w:val="0"/>
+          <w:i w:val="0"/>
+          <w:sz w:val="21"/>
+        </w:rPr>
+        <w:t>从市场微观角度看，股票和债券投资者关注的信息集合也不同。股票投资者更关心盈利预期、风险偏好和流动性折现，报告文本一旦改变政策指引，估值分歧就可能放大；债券投资者则更关注未来利率路径和期限补偿，语调变化必须先被解释为短端、长端或期限溢价冲击，才会表现为清晰的曲线变化。</w:t>
+      </w:r>
+    </w:p>
+    <w:p>
+      <w:pPr>
+        <w:spacing w:before="0" w:after="0" w:lineRule="auto" w:line="360"/>
+        <w:ind w:firstLine="420"/>
+        <w:jc w:val="both"/>
+      </w:pPr>
+      <w:r>
+        <w:rPr>
+          <w:rFonts w:ascii="Times New Roman" w:hAnsi="Times New Roman" w:eastAsia="宋体"/>
+          <w:b w:val="0"/>
+          <w:i w:val="0"/>
+          <w:sz w:val="21"/>
+        </w:rPr>
+        <w:t>债券图把收益率曲线因子和未预期语调分组放在同一张图中。Panel A显示曲线水平、斜率和曲率在较长样本内同步波动但并非同一变量；Panel B显示不同语调分组在2019年前后没有形成稳定单调关系。图形证据与表4一致：债券市场存在反应，但反应方向不够稳定，不能写成与股票结果同等强度的结论。</w:t>
+      </w:r>
+    </w:p>
+    <w:p>
+      <w:pPr>
+        <w:spacing w:before="80" w:after="40" w:lineRule="auto" w:line="260"/>
+        <w:jc w:val="center"/>
+      </w:pPr>
+      <w:r>
+        <w:rPr>
+          <w:rFonts w:ascii="Times New Roman" w:hAnsi="Times New Roman" w:eastAsia="仿宋"/>
           <w:b/>
           <w:i w:val="0"/>
-          <w:sz w:val="24"/>
-        </w:rPr>
-        <w:t>（三）结果讨论</w:t>
-      </w:r>
-    </w:p>
-    <w:p>
-      <w:pPr>
-        <w:spacing w:before="0" w:after="0" w:line="360" w:lineRule="exact"/>
-        <w:ind w:firstLine="420"/>
-        <w:jc w:val="both"/>
-      </w:pPr>
-      <w:r>
-        <w:rPr>
-          <w:rFonts w:ascii="Times New Roman" w:hAnsi="Times New Roman" w:eastAsia="宋体"/>
-          <w:b w:val="0"/>
-          <w:i w:val="0"/>
-          <w:sz w:val="21"/>
-        </w:rPr>
-        <w:t>股票和债券结果不一致，并不意外。股票波动率对不确定性本身敏感，文本创新度提高可能直接增加短期重新定价强度；债券收益率曲线则需要区分政策路径、宏观信息和期限溢价，单一语调变量难以同时捕捉这些渠道。McMahon、Schipke和Li（2018）指出，中国央行沟通仍处在制度化改进过程中，这也意味着不同市场吸收沟通信息的方式可能存在差异。</w:t>
-      </w:r>
-    </w:p>
-    <w:p>
-      <w:pPr>
-        <w:spacing w:before="0" w:after="0" w:line="360" w:lineRule="exact"/>
-        <w:ind w:firstLine="420"/>
-        <w:jc w:val="both"/>
-      </w:pPr>
-      <w:r>
-        <w:rPr>
-          <w:rFonts w:ascii="Times New Roman" w:hAnsi="Times New Roman" w:eastAsia="宋体"/>
-          <w:b w:val="0"/>
-          <w:i w:val="0"/>
-          <w:sz w:val="21"/>
-        </w:rPr>
-        <w:t>从市场微观角度看，股票和债券投资者关注的信息集合也不同。股票投资者更关心盈利预期、风险偏好和流动性折现，报告文本一旦改变政策指引，估值分歧就可能放大；债券投资者则更关注未来利率路径和期限补偿，语调变化必须先被解释为短端、长端或期限溢价冲击，才会表现为清晰的曲线变化。</w:t>
-      </w:r>
-    </w:p>
-    <w:p>
-      <w:pPr>
-        <w:spacing w:before="0" w:after="0" w:line="360" w:lineRule="exact"/>
-        <w:ind w:firstLine="420"/>
-        <w:jc w:val="both"/>
-      </w:pPr>
-      <w:r>
-        <w:rPr>
-          <w:rFonts w:ascii="Times New Roman" w:hAnsi="Times New Roman" w:eastAsia="宋体"/>
-          <w:b w:val="0"/>
-          <w:i w:val="0"/>
-          <w:sz w:val="21"/>
-        </w:rPr>
-        <w:t>债券图把收益率曲线因子和未预期语调分组放在同一张图中。Panel A显示曲线水平、斜率和曲率在较长样本内同步波动但并非同一变量；Panel B显示不同语调分组在2019年前后没有形成稳定单调关系。图形证据与表4一致：债券市场存在反应，但反应方向不够稳定，不能写成与股票结果同等强度的结论。</w:t>
-      </w:r>
-    </w:p>
-    <w:p>
-      <w:pPr>
-        <w:spacing w:before="80" w:after="40" w:line="260" w:lineRule="exact"/>
-        <w:jc w:val="center"/>
-      </w:pPr>
-      <w:r>
-        <w:rPr>
-          <w:rFonts w:ascii="Times New Roman" w:hAnsi="Times New Roman" w:eastAsia="黑体"/>
-          <w:b/>
-          <w:i w:val="0"/>
           <w:sz w:val="18"/>
         </w:rPr>
         <w:t>表4  日度稳健性与债券市场探索结果</w:t>
@@ -5291,13 +5292,13 @@
     </w:p>
     <w:p>
       <w:pPr>
-        <w:spacing w:before="40" w:after="20" w:line="240" w:lineRule="exact"/>
+        <w:spacing w:before="40" w:after="20" w:lineRule="auto" w:line="240"/>
         <w:ind w:firstLine="0"/>
         <w:jc w:val="both"/>
       </w:pPr>
       <w:r>
         <w:rPr>
-          <w:rFonts w:ascii="Times New Roman" w:hAnsi="Times New Roman" w:eastAsia="黑体"/>
+          <w:rFonts w:ascii="Times New Roman" w:hAnsi="Times New Roman" w:eastAsia="仿宋"/>
           <w:b/>
           <w:i w:val="0"/>
           <w:sz w:val="18"/>
@@ -5341,7 +5342,7 @@
           </w:tcPr>
           <w:p>
             <w:pPr>
-              <w:spacing w:before="0" w:after="0" w:line="240" w:lineRule="exact"/>
+              <w:spacing w:before="0" w:after="0" w:line="240" w:lineRule="auto"/>
               <w:jc w:val="center"/>
             </w:pPr>
             <w:r>
@@ -5365,7 +5366,7 @@
           </w:tcPr>
           <w:p>
             <w:pPr>
-              <w:spacing w:before="0" w:after="0" w:line="240" w:lineRule="exact"/>
+              <w:spacing w:before="0" w:after="0" w:line="240" w:lineRule="auto"/>
               <w:jc w:val="center"/>
             </w:pPr>
             <w:r>
@@ -5389,7 +5390,7 @@
           </w:tcPr>
           <w:p>
             <w:pPr>
-              <w:spacing w:before="0" w:after="0" w:line="240" w:lineRule="exact"/>
+              <w:spacing w:before="0" w:after="0" w:line="240" w:lineRule="auto"/>
               <w:jc w:val="center"/>
             </w:pPr>
             <w:r>
@@ -5413,7 +5414,7 @@
           </w:tcPr>
           <w:p>
             <w:pPr>
-              <w:spacing w:before="0" w:after="0" w:line="240" w:lineRule="exact"/>
+              <w:spacing w:before="0" w:after="0" w:line="240" w:lineRule="auto"/>
               <w:jc w:val="center"/>
             </w:pPr>
             <w:r>
@@ -5437,7 +5438,7 @@
           </w:tcPr>
           <w:p>
             <w:pPr>
-              <w:spacing w:before="0" w:after="0" w:line="240" w:lineRule="exact"/>
+              <w:spacing w:before="0" w:after="0" w:line="240" w:lineRule="auto"/>
               <w:jc w:val="center"/>
             </w:pPr>
             <w:r>
@@ -5463,7 +5464,7 @@
           </w:tcPr>
           <w:p>
             <w:pPr>
-              <w:spacing w:before="0" w:after="0" w:line="240" w:lineRule="exact"/>
+              <w:spacing w:before="0" w:after="0" w:line="240" w:lineRule="auto"/>
               <w:jc w:val="center"/>
             </w:pPr>
             <w:r>
@@ -5484,7 +5485,7 @@
           </w:tcPr>
           <w:p>
             <w:pPr>
-              <w:spacing w:before="0" w:after="0" w:line="240" w:lineRule="exact"/>
+              <w:spacing w:before="0" w:after="0" w:line="240" w:lineRule="auto"/>
               <w:jc w:val="right"/>
             </w:pPr>
             <w:r>
@@ -5505,7 +5506,7 @@
           </w:tcPr>
           <w:p>
             <w:pPr>
-              <w:spacing w:before="0" w:after="0" w:line="240" w:lineRule="exact"/>
+              <w:spacing w:before="0" w:after="0" w:line="240" w:lineRule="auto"/>
               <w:jc w:val="right"/>
             </w:pPr>
             <w:r>
@@ -5526,7 +5527,7 @@
           </w:tcPr>
           <w:p>
             <w:pPr>
-              <w:spacing w:before="0" w:after="0" w:line="240" w:lineRule="exact"/>
+              <w:spacing w:before="0" w:after="0" w:line="240" w:lineRule="auto"/>
               <w:jc w:val="right"/>
             </w:pPr>
             <w:r>
@@ -5547,7 +5548,7 @@
           </w:tcPr>
           <w:p>
             <w:pPr>
-              <w:spacing w:before="0" w:after="0" w:line="240" w:lineRule="exact"/>
+              <w:spacing w:before="0" w:after="0" w:line="240" w:lineRule="auto"/>
               <w:jc w:val="right"/>
             </w:pPr>
             <w:r>
@@ -5573,7 +5574,7 @@
           </w:tcPr>
           <w:p>
             <w:pPr>
-              <w:spacing w:before="0" w:after="0" w:line="240" w:lineRule="exact"/>
+              <w:spacing w:before="0" w:after="0" w:line="240" w:lineRule="auto"/>
               <w:jc w:val="center"/>
             </w:pPr>
             <w:r>
@@ -5594,7 +5595,7 @@
           </w:tcPr>
           <w:p>
             <w:pPr>
-              <w:spacing w:before="0" w:after="0" w:line="240" w:lineRule="exact"/>
+              <w:spacing w:before="0" w:after="0" w:line="240" w:lineRule="auto"/>
               <w:jc w:val="right"/>
             </w:pPr>
             <w:r>
@@ -5615,7 +5616,7 @@
           </w:tcPr>
           <w:p>
             <w:pPr>
-              <w:spacing w:before="0" w:after="0" w:line="240" w:lineRule="exact"/>
+              <w:spacing w:before="0" w:after="0" w:line="240" w:lineRule="auto"/>
               <w:jc w:val="right"/>
             </w:pPr>
             <w:r>
@@ -5636,7 +5637,7 @@
           </w:tcPr>
           <w:p>
             <w:pPr>
-              <w:spacing w:before="0" w:after="0" w:line="240" w:lineRule="exact"/>
+              <w:spacing w:before="0" w:after="0" w:line="240" w:lineRule="auto"/>
               <w:jc w:val="center"/>
             </w:pPr>
             <w:r>
@@ -5657,7 +5658,7 @@
           </w:tcPr>
           <w:p>
             <w:pPr>
-              <w:spacing w:before="0" w:after="0" w:line="240" w:lineRule="exact"/>
+              <w:spacing w:before="0" w:after="0" w:line="240" w:lineRule="auto"/>
               <w:jc w:val="right"/>
             </w:pPr>
             <w:r>
@@ -5683,7 +5684,7 @@
           </w:tcPr>
           <w:p>
             <w:pPr>
-              <w:spacing w:before="0" w:after="0" w:line="240" w:lineRule="exact"/>
+              <w:spacing w:before="0" w:after="0" w:line="240" w:lineRule="auto"/>
               <w:jc w:val="center"/>
             </w:pPr>
             <w:r>
@@ -5704,7 +5705,7 @@
           </w:tcPr>
           <w:p>
             <w:pPr>
-              <w:spacing w:before="0" w:after="0" w:line="240" w:lineRule="exact"/>
+              <w:spacing w:before="0" w:after="0" w:line="240" w:lineRule="auto"/>
               <w:jc w:val="right"/>
             </w:pPr>
             <w:r>
@@ -5725,7 +5726,7 @@
           </w:tcPr>
           <w:p>
             <w:pPr>
-              <w:spacing w:before="0" w:after="0" w:line="240" w:lineRule="exact"/>
+              <w:spacing w:before="0" w:after="0" w:line="240" w:lineRule="auto"/>
               <w:jc w:val="right"/>
             </w:pPr>
             <w:r>
@@ -5746,7 +5747,7 @@
           </w:tcPr>
           <w:p>
             <w:pPr>
-              <w:spacing w:before="0" w:after="0" w:line="240" w:lineRule="exact"/>
+              <w:spacing w:before="0" w:after="0" w:line="240" w:lineRule="auto"/>
               <w:jc w:val="center"/>
             </w:pPr>
             <w:r>
@@ -5767,7 +5768,7 @@
           </w:tcPr>
           <w:p>
             <w:pPr>
-              <w:spacing w:before="0" w:after="0" w:line="240" w:lineRule="exact"/>
+              <w:spacing w:before="0" w:after="0" w:line="240" w:lineRule="auto"/>
               <w:jc w:val="right"/>
             </w:pPr>
             <w:r>
@@ -5796,7 +5797,7 @@
           </w:tcPr>
           <w:p>
             <w:pPr>
-              <w:spacing w:before="0" w:after="0" w:line="240" w:lineRule="exact"/>
+              <w:spacing w:before="0" w:after="0" w:line="240" w:lineRule="auto"/>
               <w:jc w:val="center"/>
             </w:pPr>
             <w:r>
@@ -5820,7 +5821,7 @@
           </w:tcPr>
           <w:p>
             <w:pPr>
-              <w:spacing w:before="0" w:after="0" w:line="240" w:lineRule="exact"/>
+              <w:spacing w:before="0" w:after="0" w:line="240" w:lineRule="auto"/>
               <w:jc w:val="right"/>
             </w:pPr>
             <w:r>
@@ -5844,7 +5845,7 @@
           </w:tcPr>
           <w:p>
             <w:pPr>
-              <w:spacing w:before="0" w:after="0" w:line="240" w:lineRule="exact"/>
+              <w:spacing w:before="0" w:after="0" w:line="240" w:lineRule="auto"/>
               <w:jc w:val="right"/>
             </w:pPr>
             <w:r>
@@ -5868,7 +5869,7 @@
           </w:tcPr>
           <w:p>
             <w:pPr>
-              <w:spacing w:before="0" w:after="0" w:line="240" w:lineRule="exact"/>
+              <w:spacing w:before="0" w:after="0" w:line="240" w:lineRule="auto"/>
               <w:jc w:val="center"/>
             </w:pPr>
             <w:r>
@@ -5892,7 +5893,7 @@
           </w:tcPr>
           <w:p>
             <w:pPr>
-              <w:spacing w:before="0" w:after="0" w:line="240" w:lineRule="exact"/>
+              <w:spacing w:before="0" w:after="0" w:line="240" w:lineRule="auto"/>
               <w:jc w:val="right"/>
             </w:pPr>
             <w:r>
@@ -5910,13 +5911,13 @@
     </w:tbl>
     <w:p>
       <w:pPr>
-        <w:spacing w:before="40" w:after="20" w:line="240" w:lineRule="exact"/>
+        <w:spacing w:before="40" w:after="20" w:lineRule="auto" w:line="240"/>
         <w:ind w:firstLine="0"/>
         <w:jc w:val="both"/>
       </w:pPr>
       <w:r>
         <w:rPr>
-          <w:rFonts w:ascii="Times New Roman" w:hAnsi="Times New Roman" w:eastAsia="黑体"/>
+          <w:rFonts w:ascii="Times New Roman" w:hAnsi="Times New Roman" w:eastAsia="仿宋"/>
           <w:b/>
           <w:i w:val="0"/>
           <w:sz w:val="18"/>
@@ -5960,7 +5961,7 @@
           </w:tcPr>
           <w:p>
             <w:pPr>
-              <w:spacing w:before="0" w:after="0" w:line="240" w:lineRule="exact"/>
+              <w:spacing w:before="0" w:after="0" w:line="240" w:lineRule="auto"/>
               <w:jc w:val="center"/>
             </w:pPr>
             <w:r>
@@ -5984,7 +5985,7 @@
           </w:tcPr>
           <w:p>
             <w:pPr>
-              <w:spacing w:before="0" w:after="0" w:line="240" w:lineRule="exact"/>
+              <w:spacing w:before="0" w:after="0" w:line="240" w:lineRule="auto"/>
               <w:jc w:val="center"/>
             </w:pPr>
             <w:r>
@@ -6008,7 +6009,7 @@
           </w:tcPr>
           <w:p>
             <w:pPr>
-              <w:spacing w:before="0" w:after="0" w:line="240" w:lineRule="exact"/>
+              <w:spacing w:before="0" w:after="0" w:line="240" w:lineRule="auto"/>
               <w:jc w:val="center"/>
             </w:pPr>
             <w:r>
@@ -6032,7 +6033,7 @@
           </w:tcPr>
           <w:p>
             <w:pPr>
-              <w:spacing w:before="0" w:after="0" w:line="240" w:lineRule="exact"/>
+              <w:spacing w:before="0" w:after="0" w:line="240" w:lineRule="auto"/>
               <w:jc w:val="center"/>
             </w:pPr>
             <w:r>
@@ -6056,7 +6057,7 @@
           </w:tcPr>
           <w:p>
             <w:pPr>
-              <w:spacing w:before="0" w:after="0" w:line="240" w:lineRule="exact"/>
+              <w:spacing w:before="0" w:after="0" w:line="240" w:lineRule="auto"/>
               <w:jc w:val="center"/>
             </w:pPr>
             <w:r>
@@ -6082,7 +6083,7 @@
           </w:tcPr>
           <w:p>
             <w:pPr>
-              <w:spacing w:before="0" w:after="0" w:line="240" w:lineRule="exact"/>
+              <w:spacing w:before="0" w:after="0" w:line="240" w:lineRule="auto"/>
               <w:jc w:val="center"/>
             </w:pPr>
             <w:r>
@@ -6103,7 +6104,7 @@
           </w:tcPr>
           <w:p>
             <w:pPr>
-              <w:spacing w:before="0" w:after="0" w:line="240" w:lineRule="exact"/>
+              <w:spacing w:before="0" w:after="0" w:line="240" w:lineRule="auto"/>
               <w:jc w:val="center"/>
             </w:pPr>
             <w:r>
@@ -6124,7 +6125,7 @@
           </w:tcPr>
           <w:p>
             <w:pPr>
-              <w:spacing w:before="0" w:after="0" w:line="240" w:lineRule="exact"/>
+              <w:spacing w:before="0" w:after="0" w:line="240" w:lineRule="auto"/>
               <w:jc w:val="right"/>
             </w:pPr>
             <w:r>
@@ -6145,7 +6146,7 @@
           </w:tcPr>
           <w:p>
             <w:pPr>
-              <w:spacing w:before="0" w:after="0" w:line="240" w:lineRule="exact"/>
+              <w:spacing w:before="0" w:after="0" w:line="240" w:lineRule="auto"/>
               <w:jc w:val="right"/>
             </w:pPr>
             <w:r>
@@ -6166,7 +6167,7 @@
           </w:tcPr>
           <w:p>
             <w:pPr>
-              <w:spacing w:before="0" w:after="0" w:line="240" w:lineRule="exact"/>
+              <w:spacing w:before="0" w:after="0" w:line="240" w:lineRule="auto"/>
               <w:jc w:val="right"/>
             </w:pPr>
             <w:r>
@@ -6192,7 +6193,7 @@
           </w:tcPr>
           <w:p>
             <w:pPr>
-              <w:spacing w:before="0" w:after="0" w:line="240" w:lineRule="exact"/>
+              <w:spacing w:before="0" w:after="0" w:line="240" w:lineRule="auto"/>
               <w:jc w:val="center"/>
             </w:pPr>
             <w:r>
@@ -6213,7 +6214,7 @@
           </w:tcPr>
           <w:p>
             <w:pPr>
-              <w:spacing w:before="0" w:after="0" w:line="240" w:lineRule="exact"/>
+              <w:spacing w:before="0" w:after="0" w:line="240" w:lineRule="auto"/>
               <w:jc w:val="center"/>
             </w:pPr>
             <w:r>
@@ -6234,7 +6235,7 @@
           </w:tcPr>
           <w:p>
             <w:pPr>
-              <w:spacing w:before="0" w:after="0" w:line="240" w:lineRule="exact"/>
+              <w:spacing w:before="0" w:after="0" w:line="240" w:lineRule="auto"/>
               <w:jc w:val="right"/>
             </w:pPr>
             <w:r>
@@ -6255,7 +6256,7 @@
           </w:tcPr>
           <w:p>
             <w:pPr>
-              <w:spacing w:before="0" w:after="0" w:line="240" w:lineRule="exact"/>
+              <w:spacing w:before="0" w:after="0" w:line="240" w:lineRule="auto"/>
               <w:jc w:val="right"/>
             </w:pPr>
             <w:r>
@@ -6276,7 +6277,7 @@
           </w:tcPr>
           <w:p>
             <w:pPr>
-              <w:spacing w:before="0" w:after="0" w:line="240" w:lineRule="exact"/>
+              <w:spacing w:before="0" w:after="0" w:line="240" w:lineRule="auto"/>
               <w:jc w:val="right"/>
             </w:pPr>
             <w:r>
@@ -6305,7 +6306,7 @@
           </w:tcPr>
           <w:p>
             <w:pPr>
-              <w:spacing w:before="0" w:after="0" w:line="240" w:lineRule="exact"/>
+              <w:spacing w:before="0" w:after="0" w:line="240" w:lineRule="auto"/>
               <w:jc w:val="center"/>
             </w:pPr>
             <w:r>
@@ -6329,7 +6330,7 @@
           </w:tcPr>
           <w:p>
             <w:pPr>
-              <w:spacing w:before="0" w:after="0" w:line="240" w:lineRule="exact"/>
+              <w:spacing w:before="0" w:after="0" w:line="240" w:lineRule="auto"/>
               <w:jc w:val="center"/>
             </w:pPr>
             <w:r>
@@ -6353,7 +6354,7 @@
           </w:tcPr>
           <w:p>
             <w:pPr>
-              <w:spacing w:before="0" w:after="0" w:line="240" w:lineRule="exact"/>
+              <w:spacing w:before="0" w:after="0" w:line="240" w:lineRule="auto"/>
               <w:jc w:val="right"/>
             </w:pPr>
             <w:r>
@@ -6377,7 +6378,7 @@
           </w:tcPr>
           <w:p>
             <w:pPr>
-              <w:spacing w:before="0" w:after="0" w:line="240" w:lineRule="exact"/>
+              <w:spacing w:before="0" w:after="0" w:line="240" w:lineRule="auto"/>
               <w:jc w:val="right"/>
             </w:pPr>
             <w:r>
@@ -6401,7 +6402,7 @@
           </w:tcPr>
           <w:p>
             <w:pPr>
-              <w:spacing w:before="0" w:after="0" w:line="240" w:lineRule="exact"/>
+              <w:spacing w:before="0" w:after="0" w:line="240" w:lineRule="auto"/>
               <w:jc w:val="right"/>
             </w:pPr>
             <w:r>
@@ -6419,13 +6420,13 @@
     </w:tbl>
     <w:p>
       <w:pPr>
-        <w:spacing w:before="40" w:after="20" w:line="240" w:lineRule="exact"/>
+        <w:spacing w:before="40" w:after="20" w:lineRule="auto" w:line="240"/>
         <w:ind w:firstLine="0"/>
         <w:jc w:val="both"/>
       </w:pPr>
       <w:r>
         <w:rPr>
-          <w:rFonts w:ascii="Times New Roman" w:hAnsi="Times New Roman" w:eastAsia="黑体"/>
+          <w:rFonts w:ascii="Times New Roman" w:hAnsi="Times New Roman" w:eastAsia="仿宋"/>
           <w:b/>
           <w:i w:val="0"/>
           <w:sz w:val="18"/>
@@ -6470,7 +6471,7 @@
           </w:tcPr>
           <w:p>
             <w:pPr>
-              <w:spacing w:before="0" w:after="0" w:line="240" w:lineRule="exact"/>
+              <w:spacing w:before="0" w:after="0" w:line="240" w:lineRule="auto"/>
               <w:jc w:val="center"/>
             </w:pPr>
             <w:r>
@@ -6494,7 +6495,7 @@
           </w:tcPr>
           <w:p>
             <w:pPr>
-              <w:spacing w:before="0" w:after="0" w:line="240" w:lineRule="exact"/>
+              <w:spacing w:before="0" w:after="0" w:line="240" w:lineRule="auto"/>
               <w:jc w:val="center"/>
             </w:pPr>
             <w:r>
@@ -6518,7 +6519,7 @@
           </w:tcPr>
           <w:p>
             <w:pPr>
-              <w:spacing w:before="0" w:after="0" w:line="240" w:lineRule="exact"/>
+              <w:spacing w:before="0" w:after="0" w:line="240" w:lineRule="auto"/>
               <w:jc w:val="center"/>
             </w:pPr>
             <w:r>
@@ -6542,7 +6543,7 @@
           </w:tcPr>
           <w:p>
             <w:pPr>
-              <w:spacing w:before="0" w:after="0" w:line="240" w:lineRule="exact"/>
+              <w:spacing w:before="0" w:after="0" w:line="240" w:lineRule="auto"/>
               <w:jc w:val="center"/>
             </w:pPr>
             <w:r>
@@ -6566,7 +6567,7 @@
           </w:tcPr>
           <w:p>
             <w:pPr>
-              <w:spacing w:before="0" w:after="0" w:line="240" w:lineRule="exact"/>
+              <w:spacing w:before="0" w:after="0" w:line="240" w:lineRule="auto"/>
               <w:jc w:val="center"/>
             </w:pPr>
             <w:r>
@@ -6590,7 +6591,7 @@
           </w:tcPr>
           <w:p>
             <w:pPr>
-              <w:spacing w:before="0" w:after="0" w:line="240" w:lineRule="exact"/>
+              <w:spacing w:before="0" w:after="0" w:line="240" w:lineRule="auto"/>
               <w:jc w:val="center"/>
             </w:pPr>
             <w:r>
@@ -6616,7 +6617,7 @@
           </w:tcPr>
           <w:p>
             <w:pPr>
-              <w:spacing w:before="0" w:after="0" w:line="240" w:lineRule="exact"/>
+              <w:spacing w:before="0" w:after="0" w:line="240" w:lineRule="auto"/>
               <w:jc w:val="center"/>
             </w:pPr>
             <w:r>
@@ -6637,7 +6638,7 @@
           </w:tcPr>
           <w:p>
             <w:pPr>
-              <w:spacing w:before="0" w:after="0" w:line="240" w:lineRule="exact"/>
+              <w:spacing w:before="0" w:after="0" w:line="240" w:lineRule="auto"/>
               <w:jc w:val="right"/>
             </w:pPr>
             <w:r>
@@ -6658,7 +6659,7 @@
           </w:tcPr>
           <w:p>
             <w:pPr>
-              <w:spacing w:before="0" w:after="0" w:line="240" w:lineRule="exact"/>
+              <w:spacing w:before="0" w:after="0" w:line="240" w:lineRule="auto"/>
               <w:jc w:val="center"/>
             </w:pPr>
             <w:r>
@@ -6679,7 +6680,7 @@
           </w:tcPr>
           <w:p>
             <w:pPr>
-              <w:spacing w:before="0" w:after="0" w:line="240" w:lineRule="exact"/>
+              <w:spacing w:before="0" w:after="0" w:line="240" w:lineRule="auto"/>
               <w:jc w:val="right"/>
             </w:pPr>
             <w:r>
@@ -6700,7 +6701,7 @@
           </w:tcPr>
           <w:p>
             <w:pPr>
-              <w:spacing w:before="0" w:after="0" w:line="240" w:lineRule="exact"/>
+              <w:spacing w:before="0" w:after="0" w:line="240" w:lineRule="auto"/>
               <w:jc w:val="right"/>
             </w:pPr>
             <w:r>
@@ -6721,7 +6722,7 @@
           </w:tcPr>
           <w:p>
             <w:pPr>
-              <w:spacing w:before="0" w:after="0" w:line="240" w:lineRule="exact"/>
+              <w:spacing w:before="0" w:after="0" w:line="240" w:lineRule="auto"/>
               <w:jc w:val="right"/>
             </w:pPr>
             <w:r>
@@ -6747,7 +6748,7 @@
           </w:tcPr>
           <w:p>
             <w:pPr>
-              <w:spacing w:before="0" w:after="0" w:line="240" w:lineRule="exact"/>
+              <w:spacing w:before="0" w:after="0" w:line="240" w:lineRule="auto"/>
               <w:jc w:val="center"/>
             </w:pPr>
             <w:r>
@@ -6768,7 +6769,7 @@
           </w:tcPr>
           <w:p>
             <w:pPr>
-              <w:spacing w:before="0" w:after="0" w:line="240" w:lineRule="exact"/>
+              <w:spacing w:before="0" w:after="0" w:line="240" w:lineRule="auto"/>
               <w:jc w:val="right"/>
             </w:pPr>
             <w:r>
@@ -6789,7 +6790,7 @@
           </w:tcPr>
           <w:p>
             <w:pPr>
-              <w:spacing w:before="0" w:after="0" w:line="240" w:lineRule="exact"/>
+              <w:spacing w:before="0" w:after="0" w:line="240" w:lineRule="auto"/>
               <w:jc w:val="center"/>
             </w:pPr>
             <w:r>
@@ -6810,7 +6811,7 @@
           </w:tcPr>
           <w:p>
             <w:pPr>
-              <w:spacing w:before="0" w:after="0" w:line="240" w:lineRule="exact"/>
+              <w:spacing w:before="0" w:after="0" w:line="240" w:lineRule="auto"/>
               <w:jc w:val="right"/>
             </w:pPr>
             <w:r>
@@ -6831,7 +6832,7 @@
           </w:tcPr>
           <w:p>
             <w:pPr>
-              <w:spacing w:before="0" w:after="0" w:line="240" w:lineRule="exact"/>
+              <w:spacing w:before="0" w:after="0" w:line="240" w:lineRule="auto"/>
               <w:jc w:val="right"/>
             </w:pPr>
             <w:r>
@@ -6852,7 +6853,7 @@
           </w:tcPr>
           <w:p>
             <w:pPr>
-              <w:spacing w:before="0" w:after="0" w:line="240" w:lineRule="exact"/>
+              <w:spacing w:before="0" w:after="0" w:line="240" w:lineRule="auto"/>
               <w:jc w:val="right"/>
             </w:pPr>
             <w:r>
@@ -6881,7 +6882,7 @@
           </w:tcPr>
           <w:p>
             <w:pPr>
-              <w:spacing w:before="0" w:after="0" w:line="240" w:lineRule="exact"/>
+              <w:spacing w:before="0" w:after="0" w:line="240" w:lineRule="auto"/>
               <w:jc w:val="center"/>
             </w:pPr>
             <w:r>
@@ -6905,7 +6906,7 @@
           </w:tcPr>
           <w:p>
             <w:pPr>
-              <w:spacing w:before="0" w:after="0" w:line="240" w:lineRule="exact"/>
+              <w:spacing w:before="0" w:after="0" w:line="240" w:lineRule="auto"/>
               <w:jc w:val="right"/>
             </w:pPr>
             <w:r>
@@ -6929,7 +6930,7 @@
           </w:tcPr>
           <w:p>
             <w:pPr>
-              <w:spacing w:before="0" w:after="0" w:line="240" w:lineRule="exact"/>
+              <w:spacing w:before="0" w:after="0" w:line="240" w:lineRule="auto"/>
               <w:jc w:val="center"/>
             </w:pPr>
             <w:r>
@@ -6953,7 +6954,7 @@
           </w:tcPr>
           <w:p>
             <w:pPr>
-              <w:spacing w:before="0" w:after="0" w:line="240" w:lineRule="exact"/>
+              <w:spacing w:before="0" w:after="0" w:line="240" w:lineRule="auto"/>
               <w:jc w:val="right"/>
             </w:pPr>
             <w:r>
@@ -6977,7 +6978,7 @@
           </w:tcPr>
           <w:p>
             <w:pPr>
-              <w:spacing w:before="0" w:after="0" w:line="240" w:lineRule="exact"/>
+              <w:spacing w:before="0" w:after="0" w:line="240" w:lineRule="auto"/>
               <w:jc w:val="right"/>
             </w:pPr>
             <w:r>
@@ -7001,7 +7002,7 @@
           </w:tcPr>
           <w:p>
             <w:pPr>
-              <w:spacing w:before="0" w:after="0" w:line="240" w:lineRule="exact"/>
+              <w:spacing w:before="0" w:after="0" w:line="240" w:lineRule="auto"/>
               <w:jc w:val="right"/>
             </w:pPr>
             <w:r>
@@ -7019,7 +7020,7 @@
     </w:tbl>
     <w:p>
       <w:pPr>
-        <w:spacing w:before="40" w:after="80" w:line="220" w:lineRule="exact"/>
+        <w:spacing w:before="40" w:after="80" w:lineRule="auto" w:line="220"/>
         <w:ind w:firstLine="0"/>
         <w:jc w:val="both"/>
       </w:pPr>
@@ -7035,14 +7036,14 @@
     </w:p>
     <w:p>
       <w:pPr>
-        <w:spacing w:before="80" w:after="20" w:line="240" w:lineRule="exact"/>
+        <w:spacing w:before="80" w:after="20"/>
         <w:ind w:firstLine="0"/>
         <w:jc w:val="center"/>
       </w:pPr>
       <w:r>
         <w:drawing>
           <wp:inline xmlns:a="http://schemas.openxmlformats.org/drawingml/2006/main" xmlns:pic="http://schemas.openxmlformats.org/drawingml/2006/picture">
-            <wp:extent cx="4140000" cy="2073035"/>
+            <wp:extent cx="4140000" cy="2073030"/>
             <wp:docPr id="31" name="Picture 31"/>
             <wp:cNvGraphicFramePr>
               <a:graphicFrameLocks noChangeAspect="1"/>
@@ -7055,7 +7056,7 @@
                     <pic:cNvPicPr/>
                   </pic:nvPicPr>
                   <pic:blipFill>
-                    <a:blip r:embed="rId19"/>
+                    <a:blip r:embed="rId20"/>
                     <a:stretch>
                       <a:fillRect/>
                     </a:stretch>
@@ -7063,7 +7064,7 @@
                   <pic:spPr>
                     <a:xfrm>
                       <a:off x="0" y="0"/>
-                      <a:ext cx="4140000" cy="2073035"/>
+                      <a:ext cx="4140000" cy="2073030"/>
                     </a:xfrm>
                     <a:prstGeom prst="rect"/>
                   </pic:spPr>
@@ -7076,7 +7077,7 @@
     </w:p>
     <w:p>
       <w:pPr>
-        <w:spacing w:before="20" w:after="80" w:line="260" w:lineRule="exact"/>
+        <w:spacing w:before="20" w:after="80" w:lineRule="auto" w:line="260"/>
         <w:ind w:firstLine="0"/>
         <w:jc w:val="center"/>
       </w:pPr>
@@ -7097,29 +7098,29 @@
     </w:p>
     <w:p>
       <w:pPr>
-        <w:spacing w:before="240" w:after="120" w:line="360" w:lineRule="exact"/>
+        <w:spacing w:before="240" w:after="120" w:lineRule="auto" w:line="360"/>
         <w:jc w:val="center"/>
+      </w:pPr>
+      <w:r>
+        <w:rPr>
+          <w:rFonts w:ascii="Times New Roman" w:hAnsi="Times New Roman" w:eastAsia="仿宋"/>
+          <w:b/>
+          <w:i w:val="0"/>
+          <w:sz w:val="28"/>
+        </w:rPr>
+        <w:t>六、进一步检验与研究局限</w:t>
+      </w:r>
+    </w:p>
+    <w:p>
+      <w:pPr>
+        <w:spacing w:before="180" w:after="60" w:lineRule="auto" w:line="320"/>
+        <w:jc w:val="left"/>
       </w:pPr>
       <w:r>
         <w:rPr>
           <w:rFonts w:ascii="Times New Roman" w:hAnsi="Times New Roman" w:eastAsia="黑体"/>
           <w:b/>
           <w:i w:val="0"/>
-          <w:sz w:val="28"/>
-        </w:rPr>
-        <w:t>六、进一步检验与研究局限</w:t>
-      </w:r>
-    </w:p>
-    <w:p>
-      <w:pPr>
-        <w:spacing w:before="180" w:after="60" w:line="320" w:lineRule="exact"/>
-        <w:jc w:val="left"/>
-      </w:pPr>
-      <w:r>
-        <w:rPr>
-          <w:rFonts w:ascii="Times New Roman" w:hAnsi="Times New Roman" w:eastAsia="黑体"/>
-          <w:b/>
-          <w:i w:val="0"/>
           <w:sz w:val="24"/>
         </w:rPr>
         <w:t>（一）样本量与检验功效</w:t>
@@ -7127,7 +7128,7 @@
     </w:p>
     <w:p>
       <w:pPr>
-        <w:spacing w:before="0" w:after="0" w:line="360" w:lineRule="exact"/>
+        <w:spacing w:before="0" w:after="0" w:lineRule="auto" w:line="360"/>
         <w:ind w:firstLine="420"/>
         <w:jc w:val="both"/>
       </w:pPr>
@@ -7143,7 +7144,7 @@
     </w:p>
     <w:p>
       <w:pPr>
-        <w:spacing w:before="0" w:after="0" w:line="360" w:lineRule="exact"/>
+        <w:spacing w:before="0" w:after="0" w:lineRule="auto" w:line="360"/>
         <w:ind w:firstLine="420"/>
         <w:jc w:val="both"/>
       </w:pPr>
@@ -7159,7 +7160,7 @@
     </w:p>
     <w:p>
       <w:pPr>
-        <w:spacing w:before="0" w:after="0" w:line="360" w:lineRule="exact"/>
+        <w:spacing w:before="0" w:after="0" w:lineRule="auto" w:line="360"/>
         <w:ind w:firstLine="420"/>
         <w:jc w:val="both"/>
       </w:pPr>
@@ -7175,7 +7176,7 @@
     </w:p>
     <w:p>
       <w:pPr>
-        <w:spacing w:before="0" w:after="0" w:line="360" w:lineRule="exact"/>
+        <w:spacing w:before="0" w:after="0" w:lineRule="auto" w:line="360"/>
         <w:ind w:firstLine="420"/>
         <w:jc w:val="both"/>
       </w:pPr>
@@ -7191,7 +7192,7 @@
     </w:p>
     <w:p>
       <w:pPr>
-        <w:spacing w:before="0" w:after="0" w:line="360" w:lineRule="exact"/>
+        <w:spacing w:before="0" w:after="0" w:lineRule="auto" w:line="360"/>
         <w:ind w:firstLine="420"/>
         <w:jc w:val="both"/>
       </w:pPr>
@@ -7207,14 +7208,14 @@
     </w:p>
     <w:p>
       <w:pPr>
-        <w:spacing w:before="80" w:after="20" w:line="240" w:lineRule="exact"/>
+        <w:spacing w:before="80" w:after="20"/>
         <w:ind w:firstLine="0"/>
         <w:jc w:val="center"/>
       </w:pPr>
       <w:r>
         <w:drawing>
           <wp:inline xmlns:a="http://schemas.openxmlformats.org/drawingml/2006/main" xmlns:pic="http://schemas.openxmlformats.org/drawingml/2006/picture">
-            <wp:extent cx="4140000" cy="1529104"/>
+            <wp:extent cx="4140000" cy="1529931"/>
             <wp:docPr id="32" name="Picture 32"/>
             <wp:cNvGraphicFramePr>
               <a:graphicFrameLocks noChangeAspect="1"/>
@@ -7227,7 +7228,7 @@
                     <pic:cNvPicPr/>
                   </pic:nvPicPr>
                   <pic:blipFill>
-                    <a:blip r:embed="rId20"/>
+                    <a:blip r:embed="rId21"/>
                     <a:stretch>
                       <a:fillRect/>
                     </a:stretch>
@@ -7235,7 +7236,7 @@
                   <pic:spPr>
                     <a:xfrm>
                       <a:off x="0" y="0"/>
-                      <a:ext cx="4140000" cy="1529104"/>
+                      <a:ext cx="4140000" cy="1529931"/>
                     </a:xfrm>
                     <a:prstGeom prst="rect"/>
                   </pic:spPr>
@@ -7248,7 +7249,7 @@
     </w:p>
     <w:p>
       <w:pPr>
-        <w:spacing w:before="20" w:after="80" w:line="260" w:lineRule="exact"/>
+        <w:spacing w:before="20" w:after="80" w:lineRule="auto" w:line="260"/>
         <w:ind w:firstLine="0"/>
         <w:jc w:val="center"/>
       </w:pPr>
@@ -7264,7 +7265,7 @@
     </w:p>
     <w:p>
       <w:pPr>
-        <w:spacing w:before="180" w:after="60" w:line="320" w:lineRule="exact"/>
+        <w:spacing w:before="180" w:after="60" w:lineRule="auto" w:line="320"/>
         <w:jc w:val="left"/>
       </w:pPr>
       <w:r>
@@ -7279,7 +7280,7 @@
     </w:p>
     <w:p>
       <w:pPr>
-        <w:spacing w:before="0" w:after="0" w:line="360" w:lineRule="exact"/>
+        <w:spacing w:before="0" w:after="0" w:lineRule="auto" w:line="360"/>
         <w:ind w:firstLine="420"/>
         <w:jc w:val="both"/>
       </w:pPr>
@@ -7295,7 +7296,7 @@
     </w:p>
     <w:p>
       <w:pPr>
-        <w:spacing w:before="0" w:after="0" w:line="360" w:lineRule="exact"/>
+        <w:spacing w:before="0" w:after="0" w:lineRule="auto" w:line="360"/>
         <w:ind w:firstLine="420"/>
         <w:jc w:val="both"/>
       </w:pPr>
@@ -7311,7 +7312,7 @@
     </w:p>
     <w:p>
       <w:pPr>
-        <w:spacing w:before="0" w:after="0" w:line="360" w:lineRule="exact"/>
+        <w:spacing w:before="0" w:after="0" w:lineRule="auto" w:line="360"/>
         <w:ind w:firstLine="420"/>
         <w:jc w:val="both"/>
       </w:pPr>
@@ -7327,7 +7328,7 @@
     </w:p>
     <w:p>
       <w:pPr>
-        <w:spacing w:before="0" w:after="0" w:line="360" w:lineRule="exact"/>
+        <w:spacing w:before="0" w:after="0" w:lineRule="auto" w:line="360"/>
         <w:ind w:firstLine="420"/>
         <w:jc w:val="both"/>
       </w:pPr>
@@ -7343,7 +7344,7 @@
     </w:p>
     <w:p>
       <w:pPr>
-        <w:spacing w:before="0" w:after="0" w:line="360" w:lineRule="exact"/>
+        <w:spacing w:before="0" w:after="0" w:lineRule="auto" w:line="360"/>
         <w:ind w:firstLine="420"/>
         <w:jc w:val="both"/>
       </w:pPr>
@@ -7359,7 +7360,7 @@
     </w:p>
     <w:p>
       <w:pPr>
-        <w:spacing w:before="0" w:after="0" w:line="360" w:lineRule="exact"/>
+        <w:spacing w:before="0" w:after="0" w:lineRule="auto" w:line="360"/>
         <w:ind w:firstLine="420"/>
         <w:jc w:val="both"/>
       </w:pPr>
@@ -7375,7 +7376,7 @@
     </w:p>
     <w:p>
       <w:pPr>
-        <w:spacing w:before="0" w:after="0" w:line="360" w:lineRule="exact"/>
+        <w:spacing w:before="0" w:after="0" w:lineRule="auto" w:line="360"/>
         <w:ind w:firstLine="420"/>
         <w:jc w:val="both"/>
       </w:pPr>
@@ -7391,12 +7392,12 @@
     </w:p>
     <w:p>
       <w:pPr>
-        <w:spacing w:before="240" w:after="120" w:line="360" w:lineRule="exact"/>
+        <w:spacing w:before="240" w:after="120" w:lineRule="auto" w:line="360"/>
         <w:jc w:val="center"/>
       </w:pPr>
       <w:r>
         <w:rPr>
-          <w:rFonts w:ascii="Times New Roman" w:hAnsi="Times New Roman" w:eastAsia="黑体"/>
+          <w:rFonts w:ascii="Times New Roman" w:hAnsi="Times New Roman" w:eastAsia="仿宋"/>
           <w:b/>
           <w:i w:val="0"/>
           <w:sz w:val="28"/>
@@ -7406,7 +7407,7 @@
     </w:p>
     <w:p>
       <w:pPr>
-        <w:spacing w:before="0" w:after="0" w:line="360" w:lineRule="exact"/>
+        <w:spacing w:before="0" w:after="0" w:lineRule="auto" w:line="360"/>
         <w:ind w:firstLine="420"/>
         <w:jc w:val="both"/>
       </w:pPr>
@@ -7422,7 +7423,7 @@
     </w:p>
     <w:p>
       <w:pPr>
-        <w:spacing w:before="0" w:after="0" w:line="360" w:lineRule="exact"/>
+        <w:spacing w:before="0" w:after="0" w:lineRule="auto" w:line="360"/>
         <w:ind w:firstLine="420"/>
         <w:jc w:val="both"/>
       </w:pPr>
@@ -7438,7 +7439,7 @@
     </w:p>
     <w:p>
       <w:pPr>
-        <w:spacing w:before="0" w:after="0" w:line="360" w:lineRule="exact"/>
+        <w:spacing w:before="0" w:after="0" w:lineRule="auto" w:line="360"/>
         <w:ind w:firstLine="420"/>
         <w:jc w:val="both"/>
       </w:pPr>
@@ -7454,7 +7455,7 @@
     </w:p>
     <w:p>
       <w:pPr>
-        <w:spacing w:before="0" w:after="0" w:line="360" w:lineRule="exact"/>
+        <w:spacing w:before="0" w:after="0" w:lineRule="auto" w:line="360"/>
         <w:ind w:firstLine="420"/>
         <w:jc w:val="both"/>
       </w:pPr>
@@ -7470,7 +7471,7 @@
     </w:p>
     <w:p>
       <w:pPr>
-        <w:spacing w:before="0" w:after="0" w:line="360" w:lineRule="exact"/>
+        <w:spacing w:before="0" w:after="0" w:lineRule="auto" w:line="360"/>
         <w:ind w:firstLine="420"/>
         <w:jc w:val="both"/>
       </w:pPr>
@@ -7486,7 +7487,7 @@
     </w:p>
     <w:p>
       <w:pPr>
-        <w:spacing w:before="0" w:after="0" w:line="360" w:lineRule="exact"/>
+        <w:spacing w:before="0" w:after="0" w:lineRule="auto" w:line="360"/>
         <w:ind w:firstLine="420"/>
         <w:jc w:val="both"/>
       </w:pPr>
@@ -7502,7 +7503,7 @@
     </w:p>
     <w:p>
       <w:pPr>
-        <w:spacing w:before="0" w:after="0" w:line="360" w:lineRule="exact"/>
+        <w:spacing w:before="0" w:after="0" w:lineRule="auto" w:line="360"/>
         <w:ind w:firstLine="420"/>
         <w:jc w:val="both"/>
       </w:pPr>
@@ -7518,7 +7519,7 @@
     </w:p>
     <w:p>
       <w:pPr>
-        <w:spacing w:before="0" w:after="0" w:line="360" w:lineRule="exact"/>
+        <w:spacing w:before="0" w:after="0" w:lineRule="auto" w:line="360"/>
         <w:ind w:firstLine="420"/>
         <w:jc w:val="both"/>
       </w:pPr>
@@ -7534,7 +7535,7 @@
     </w:p>
     <w:p>
       <w:pPr>
-        <w:spacing w:before="0" w:after="0" w:line="360" w:lineRule="exact"/>
+        <w:spacing w:before="0" w:after="0" w:lineRule="auto" w:line="360"/>
         <w:ind w:firstLine="420"/>
         <w:jc w:val="both"/>
       </w:pPr>
@@ -7550,7 +7551,7 @@
     </w:p>
     <w:p>
       <w:pPr>
-        <w:spacing w:before="0" w:after="0" w:line="360" w:lineRule="exact"/>
+        <w:spacing w:before="0" w:after="0" w:lineRule="auto" w:line="360"/>
         <w:ind w:firstLine="420"/>
         <w:jc w:val="both"/>
       </w:pPr>
@@ -7566,7 +7567,7 @@
     </w:p>
     <w:p>
       <w:pPr>
-        <w:spacing w:before="0" w:after="0" w:line="360" w:lineRule="exact"/>
+        <w:spacing w:before="0" w:after="0" w:lineRule="auto" w:line="360"/>
         <w:ind w:firstLine="420"/>
         <w:jc w:val="both"/>
       </w:pPr>
@@ -7582,7 +7583,7 @@
     </w:p>
     <w:p>
       <w:pPr>
-        <w:spacing w:before="0" w:after="0" w:line="360" w:lineRule="exact"/>
+        <w:spacing w:before="0" w:after="0" w:lineRule="auto" w:line="360"/>
         <w:ind w:firstLine="420"/>
         <w:jc w:val="both"/>
       </w:pPr>
@@ -7598,7 +7599,7 @@
     </w:p>
     <w:p>
       <w:pPr>
-        <w:spacing w:before="0" w:after="0" w:line="360" w:lineRule="exact"/>
+        <w:spacing w:before="0" w:after="0" w:lineRule="auto" w:line="360"/>
         <w:ind w:firstLine="420"/>
         <w:jc w:val="both"/>
       </w:pPr>
@@ -7619,12 +7620,12 @@
     </w:p>
     <w:p>
       <w:pPr>
-        <w:spacing w:before="240" w:after="120" w:line="360" w:lineRule="exact"/>
+        <w:spacing w:before="240" w:after="120" w:lineRule="auto" w:line="360"/>
         <w:jc w:val="center"/>
       </w:pPr>
       <w:r>
         <w:rPr>
-          <w:rFonts w:ascii="Times New Roman" w:hAnsi="Times New Roman" w:eastAsia="黑体"/>
+          <w:rFonts w:ascii="Times New Roman" w:hAnsi="Times New Roman" w:eastAsia="仿宋"/>
           <w:b/>
           <w:i w:val="0"/>
           <w:sz w:val="28"/>
@@ -7634,7 +7635,7 @@
     </w:p>
     <w:p>
       <w:pPr>
-        <w:spacing w:before="0" w:after="0" w:line="260" w:lineRule="exact"/>
+        <w:spacing w:before="0" w:after="0" w:lineRule="auto" w:line="260"/>
         <w:ind w:hanging="420" w:left="420"/>
         <w:jc w:val="both"/>
       </w:pPr>
@@ -7650,7 +7651,7 @@
     </w:p>
     <w:p>
       <w:pPr>
-        <w:spacing w:before="0" w:after="0" w:line="260" w:lineRule="exact"/>
+        <w:spacing w:before="0" w:after="0" w:lineRule="auto" w:line="260"/>
         <w:ind w:hanging="420" w:left="420"/>
         <w:jc w:val="both"/>
       </w:pPr>
@@ -7666,7 +7667,7 @@
     </w:p>
     <w:p>
       <w:pPr>
-        <w:spacing w:before="0" w:after="0" w:line="260" w:lineRule="exact"/>
+        <w:spacing w:before="0" w:after="0" w:lineRule="auto" w:line="260"/>
         <w:ind w:hanging="420" w:left="420"/>
         <w:jc w:val="both"/>
       </w:pPr>
@@ -7682,7 +7683,7 @@
     </w:p>
     <w:p>
       <w:pPr>
-        <w:spacing w:before="0" w:after="0" w:line="260" w:lineRule="exact"/>
+        <w:spacing w:before="0" w:after="0" w:lineRule="auto" w:line="260"/>
         <w:ind w:hanging="420" w:left="420"/>
         <w:jc w:val="both"/>
       </w:pPr>
@@ -7698,7 +7699,7 @@
     </w:p>
     <w:p>
       <w:pPr>
-        <w:spacing w:before="0" w:after="0" w:line="260" w:lineRule="exact"/>
+        <w:spacing w:before="0" w:after="0" w:lineRule="auto" w:line="260"/>
         <w:ind w:hanging="420" w:left="420"/>
         <w:jc w:val="both"/>
       </w:pPr>
@@ -7714,7 +7715,7 @@
     </w:p>
     <w:p>
       <w:pPr>
-        <w:spacing w:before="0" w:after="0" w:line="260" w:lineRule="exact"/>
+        <w:spacing w:before="0" w:after="0" w:lineRule="auto" w:line="260"/>
         <w:ind w:hanging="420" w:left="420"/>
         <w:jc w:val="both"/>
       </w:pPr>
@@ -7730,7 +7731,7 @@
     </w:p>
     <w:p>
       <w:pPr>
-        <w:spacing w:before="0" w:after="0" w:line="260" w:lineRule="exact"/>
+        <w:spacing w:before="0" w:after="0" w:lineRule="auto" w:line="260"/>
         <w:ind w:hanging="420" w:left="420"/>
         <w:jc w:val="both"/>
       </w:pPr>
@@ -7746,7 +7747,7 @@
     </w:p>
     <w:p>
       <w:pPr>
-        <w:spacing w:before="0" w:after="0" w:line="260" w:lineRule="exact"/>
+        <w:spacing w:before="0" w:after="0" w:lineRule="auto" w:line="260"/>
         <w:ind w:hanging="420" w:left="420"/>
         <w:jc w:val="both"/>
       </w:pPr>
@@ -7762,7 +7763,7 @@
     </w:p>
     <w:p>
       <w:pPr>
-        <w:spacing w:before="0" w:after="0" w:line="260" w:lineRule="exact"/>
+        <w:spacing w:before="0" w:after="0" w:lineRule="auto" w:line="260"/>
         <w:ind w:hanging="420" w:left="420"/>
         <w:jc w:val="both"/>
       </w:pPr>
@@ -7778,7 +7779,7 @@
     </w:p>
     <w:p>
       <w:pPr>
-        <w:spacing w:before="0" w:after="0" w:line="260" w:lineRule="exact"/>
+        <w:spacing w:before="0" w:after="0" w:lineRule="auto" w:line="260"/>
         <w:ind w:hanging="420" w:left="420"/>
         <w:jc w:val="both"/>
       </w:pPr>
@@ -7794,7 +7795,7 @@
     </w:p>
     <w:p>
       <w:pPr>
-        <w:spacing w:before="0" w:after="0" w:line="260" w:lineRule="exact"/>
+        <w:spacing w:before="0" w:after="0" w:lineRule="auto" w:line="260"/>
         <w:ind w:hanging="420" w:left="420"/>
         <w:jc w:val="both"/>
       </w:pPr>
@@ -7810,7 +7811,7 @@
     </w:p>
     <w:p>
       <w:pPr>
-        <w:spacing w:before="0" w:after="0" w:line="260" w:lineRule="exact"/>
+        <w:spacing w:before="0" w:after="0" w:lineRule="auto" w:line="260"/>
         <w:ind w:hanging="420" w:left="420"/>
         <w:jc w:val="both"/>
       </w:pPr>
@@ -7826,7 +7827,7 @@
     </w:p>
     <w:p>
       <w:pPr>
-        <w:spacing w:before="0" w:after="0" w:line="260" w:lineRule="exact"/>
+        <w:spacing w:before="0" w:after="0" w:lineRule="auto" w:line="260"/>
         <w:ind w:hanging="420" w:left="420"/>
         <w:jc w:val="both"/>
       </w:pPr>
@@ -7843,7 +7844,8 @@
     <w:sectPr>
       <w:footerReference w:type="first" r:id="rId14"/>
       <w:headerReference w:type="default" r:id="rId15"/>
-      <w:footerReference w:type="default" r:id="rId16"/>
+      <w:headerReference w:type="even" r:id="rId16"/>
+      <w:footerReference w:type="default" r:id="rId17"/>
       <w:pgSz w:w="11906" w:h="16838"/>
       <w:pgMar w:top="1304" w:right="1417" w:bottom="1247" w:left="1417" w:header="851" w:footer="992" w:gutter="0"/>
       <w:cols w:space="425"/>
@@ -8064,6 +8066,40 @@
         <w:sz w:val="18"/>
       </w:rPr>
       <w:t>罗允绩：中国货币政策报告文本特征与金融市场反应</w:t>
+    </w:r>
+  </w:p>
+</w:hdr>
+</file>
+
+<file path=word/header4.xml><?xml version="1.0" encoding="utf-8"?>
+<w:hdr xmlns:m="http://schemas.openxmlformats.org/officeDocument/2006/math" xmlns:mc="http://schemas.openxmlformats.org/markup-compatibility/2006" xmlns:mo="http://schemas.microsoft.com/office/mac/office/2008/main" xmlns:mv="urn:schemas-microsoft-com:mac:vml" xmlns:o="urn:schemas-microsoft-com:office:office" xmlns:r="http://schemas.openxmlformats.org/officeDocument/2006/relationships" xmlns:v="urn:schemas-microsoft-com:vml" xmlns:w10="urn:schemas-microsoft-com:office:word" xmlns:w14="http://schemas.microsoft.com/office/word/2010/wordml" xmlns:w="http://schemas.openxmlformats.org/wordprocessingml/2006/main" xmlns:wne="http://schemas.microsoft.com/office/word/2006/wordml" xmlns:wp14="http://schemas.microsoft.com/office/word/2010/wordprocessingDrawing" xmlns:wp="http://schemas.openxmlformats.org/drawingml/2006/wordprocessingDrawing" xmlns:wpc="http://schemas.microsoft.com/office/word/2010/wordprocessingCanvas" xmlns:wpg="http://schemas.microsoft.com/office/word/2010/wordprocessingGroup" xmlns:wpi="http://schemas.microsoft.com/office/word/2010/wordprocessingInk" xmlns:wps="http://schemas.microsoft.com/office/word/2010/wordprocessingShape" mc:Ignorable="w14 wp14">
+  <w:p>
+    <w:pPr>
+      <w:pStyle w:val="Header"/>
+      <w:jc w:val="center"/>
+    </w:pPr>
+    <w:r>
+      <w:rPr>
+        <w:rFonts w:ascii="Times New Roman" w:hAnsi="Times New Roman" w:eastAsia="宋体"/>
+        <w:b w:val="0"/>
+        <w:i w:val="0"/>
+        <w:sz w:val="18"/>
+      </w:rPr>
+      <w:t>面向经济和金融的Python编程</w:t>
+    </w:r>
+  </w:p>
+  <w:p>
+    <w:pPr>
+      <w:jc w:val="right"/>
+    </w:pPr>
+    <w:r>
+      <w:rPr>
+        <w:rFonts w:ascii="Times New Roman" w:hAnsi="Times New Roman" w:eastAsia="宋体"/>
+        <w:b w:val="0"/>
+        <w:i w:val="0"/>
+        <w:sz w:val="18"/>
+      </w:rPr>
+      <w:t>2026年6月</w:t>
     </w:r>
   </w:p>
 </w:hdr>
@@ -8393,7 +8429,7 @@
     <w:next w:val="a"/>
     <w:qFormat/>
     <w:pPr>
-      <w:spacing w:line="400" w:lineRule="exact"/>
+      <w:spacing w:line="400" w:lineRule="auto"/>
       <w:jc w:val="left"/>
       <w:outlineLvl w:val="0"/>
     </w:pPr>

</xml_diff>

<commit_message>
add journal paper builder and update PBC domain lexicon to version 2
</commit_message>
<xml_diff>
--- a/paper/课程论文_提交版.docx
+++ b/paper/课程论文_提交版.docx
@@ -1782,11 +1782,12 @@
         </w:trPr>
         <w:tc>
           <w:tcPr>
-            <w:tcW w:type="dxa" w:w="3231"/>
-            <w:vAlign w:val="center"/>
+            <w:tcW w:type="dxa" w:w="1531"/>
             <w:tcBorders>
+              <w:top w:val="single" w:sz="8" w:space="0" w:color="000000"/>
               <w:bottom w:val="single" w:sz="4" w:space="0" w:color="000000"/>
             </w:tcBorders>
+            <w:vAlign w:val="center"/>
           </w:tcPr>
           <w:p>
             <w:pPr>
@@ -1806,11 +1807,12 @@
         </w:tc>
         <w:tc>
           <w:tcPr>
-            <w:tcW w:type="dxa" w:w="1318"/>
-            <w:vAlign w:val="center"/>
+            <w:tcW w:type="dxa" w:w="2551"/>
             <w:tcBorders>
+              <w:top w:val="single" w:sz="8" w:space="0" w:color="000000"/>
               <w:bottom w:val="single" w:sz="4" w:space="0" w:color="000000"/>
             </w:tcBorders>
+            <w:vAlign w:val="center"/>
           </w:tcPr>
           <w:p>
             <w:pPr>
@@ -1830,11 +1832,12 @@
         </w:tc>
         <w:tc>
           <w:tcPr>
-            <w:tcW w:type="dxa" w:w="1318"/>
-            <w:vAlign w:val="center"/>
+            <w:tcW w:type="dxa" w:w="850"/>
             <w:tcBorders>
+              <w:top w:val="single" w:sz="8" w:space="0" w:color="000000"/>
               <w:bottom w:val="single" w:sz="4" w:space="0" w:color="000000"/>
             </w:tcBorders>
+            <w:vAlign w:val="center"/>
           </w:tcPr>
           <w:p>
             <w:pPr>
@@ -1854,11 +1857,12 @@
         </w:tc>
         <w:tc>
           <w:tcPr>
-            <w:tcW w:type="dxa" w:w="1318"/>
-            <w:vAlign w:val="center"/>
+            <w:tcW w:type="dxa" w:w="1616"/>
             <w:tcBorders>
+              <w:top w:val="single" w:sz="8" w:space="0" w:color="000000"/>
               <w:bottom w:val="single" w:sz="4" w:space="0" w:color="000000"/>
             </w:tcBorders>
+            <w:vAlign w:val="center"/>
           </w:tcPr>
           <w:p>
             <w:pPr>
@@ -1878,11 +1882,12 @@
         </w:tc>
         <w:tc>
           <w:tcPr>
-            <w:tcW w:type="dxa" w:w="1318"/>
-            <w:vAlign w:val="center"/>
+            <w:tcW w:type="dxa" w:w="1956"/>
             <w:tcBorders>
+              <w:top w:val="single" w:sz="8" w:space="0" w:color="000000"/>
               <w:bottom w:val="single" w:sz="4" w:space="0" w:color="000000"/>
             </w:tcBorders>
+            <w:vAlign w:val="center"/>
           </w:tcPr>
           <w:p>
             <w:pPr>
@@ -1907,7 +1912,7 @@
         </w:trPr>
         <w:tc>
           <w:tcPr>
-            <w:tcW w:type="dxa" w:w="3231"/>
+            <w:tcW w:type="dxa" w:w="1531"/>
             <w:vAlign w:val="center"/>
           </w:tcPr>
           <w:p>
@@ -1928,7 +1933,7 @@
         </w:tc>
         <w:tc>
           <w:tcPr>
-            <w:tcW w:type="dxa" w:w="1318"/>
+            <w:tcW w:type="dxa" w:w="2551"/>
             <w:vAlign w:val="center"/>
           </w:tcPr>
           <w:p>
@@ -1949,7 +1954,7 @@
         </w:tc>
         <w:tc>
           <w:tcPr>
-            <w:tcW w:type="dxa" w:w="1318"/>
+            <w:tcW w:type="dxa" w:w="850"/>
             <w:vAlign w:val="center"/>
           </w:tcPr>
           <w:p>
@@ -1970,7 +1975,7 @@
         </w:tc>
         <w:tc>
           <w:tcPr>
-            <w:tcW w:type="dxa" w:w="1318"/>
+            <w:tcW w:type="dxa" w:w="1616"/>
             <w:vAlign w:val="center"/>
           </w:tcPr>
           <w:p>
@@ -1991,7 +1996,7 @@
         </w:tc>
         <w:tc>
           <w:tcPr>
-            <w:tcW w:type="dxa" w:w="1318"/>
+            <w:tcW w:type="dxa" w:w="1956"/>
             <w:vAlign w:val="center"/>
           </w:tcPr>
           <w:p>
@@ -2017,7 +2022,7 @@
         </w:trPr>
         <w:tc>
           <w:tcPr>
-            <w:tcW w:type="dxa" w:w="3231"/>
+            <w:tcW w:type="dxa" w:w="1531"/>
             <w:vAlign w:val="center"/>
           </w:tcPr>
           <w:p>
@@ -2038,7 +2043,7 @@
         </w:tc>
         <w:tc>
           <w:tcPr>
-            <w:tcW w:type="dxa" w:w="1318"/>
+            <w:tcW w:type="dxa" w:w="2551"/>
             <w:vAlign w:val="center"/>
           </w:tcPr>
           <w:p>
@@ -2059,7 +2064,7 @@
         </w:tc>
         <w:tc>
           <w:tcPr>
-            <w:tcW w:type="dxa" w:w="1318"/>
+            <w:tcW w:type="dxa" w:w="850"/>
             <w:vAlign w:val="center"/>
           </w:tcPr>
           <w:p>
@@ -2080,7 +2085,7 @@
         </w:tc>
         <w:tc>
           <w:tcPr>
-            <w:tcW w:type="dxa" w:w="1318"/>
+            <w:tcW w:type="dxa" w:w="1616"/>
             <w:vAlign w:val="center"/>
           </w:tcPr>
           <w:p>
@@ -2101,7 +2106,7 @@
         </w:tc>
         <w:tc>
           <w:tcPr>
-            <w:tcW w:type="dxa" w:w="1318"/>
+            <w:tcW w:type="dxa" w:w="1956"/>
             <w:vAlign w:val="center"/>
           </w:tcPr>
           <w:p>
@@ -2127,7 +2132,7 @@
         </w:trPr>
         <w:tc>
           <w:tcPr>
-            <w:tcW w:type="dxa" w:w="3231"/>
+            <w:tcW w:type="dxa" w:w="1531"/>
             <w:vAlign w:val="center"/>
           </w:tcPr>
           <w:p>
@@ -2148,7 +2153,7 @@
         </w:tc>
         <w:tc>
           <w:tcPr>
-            <w:tcW w:type="dxa" w:w="1318"/>
+            <w:tcW w:type="dxa" w:w="2551"/>
             <w:vAlign w:val="center"/>
           </w:tcPr>
           <w:p>
@@ -2169,7 +2174,7 @@
         </w:tc>
         <w:tc>
           <w:tcPr>
-            <w:tcW w:type="dxa" w:w="1318"/>
+            <w:tcW w:type="dxa" w:w="850"/>
             <w:vAlign w:val="center"/>
           </w:tcPr>
           <w:p>
@@ -2190,7 +2195,7 @@
         </w:tc>
         <w:tc>
           <w:tcPr>
-            <w:tcW w:type="dxa" w:w="1318"/>
+            <w:tcW w:type="dxa" w:w="1616"/>
             <w:vAlign w:val="center"/>
           </w:tcPr>
           <w:p>
@@ -2211,7 +2216,7 @@
         </w:tc>
         <w:tc>
           <w:tcPr>
-            <w:tcW w:type="dxa" w:w="1318"/>
+            <w:tcW w:type="dxa" w:w="1956"/>
             <w:vAlign w:val="center"/>
           </w:tcPr>
           <w:p>
@@ -2237,7 +2242,7 @@
         </w:trPr>
         <w:tc>
           <w:tcPr>
-            <w:tcW w:type="dxa" w:w="3231"/>
+            <w:tcW w:type="dxa" w:w="1531"/>
             <w:vAlign w:val="center"/>
           </w:tcPr>
           <w:p>
@@ -2258,7 +2263,7 @@
         </w:tc>
         <w:tc>
           <w:tcPr>
-            <w:tcW w:type="dxa" w:w="1318"/>
+            <w:tcW w:type="dxa" w:w="2551"/>
             <w:vAlign w:val="center"/>
           </w:tcPr>
           <w:p>
@@ -2279,7 +2284,7 @@
         </w:tc>
         <w:tc>
           <w:tcPr>
-            <w:tcW w:type="dxa" w:w="1318"/>
+            <w:tcW w:type="dxa" w:w="850"/>
             <w:vAlign w:val="center"/>
           </w:tcPr>
           <w:p>
@@ -2300,7 +2305,7 @@
         </w:tc>
         <w:tc>
           <w:tcPr>
-            <w:tcW w:type="dxa" w:w="1318"/>
+            <w:tcW w:type="dxa" w:w="1616"/>
             <w:vAlign w:val="center"/>
           </w:tcPr>
           <w:p>
@@ -2321,7 +2326,7 @@
         </w:tc>
         <w:tc>
           <w:tcPr>
-            <w:tcW w:type="dxa" w:w="1318"/>
+            <w:tcW w:type="dxa" w:w="1956"/>
             <w:vAlign w:val="center"/>
           </w:tcPr>
           <w:p>
@@ -2347,7 +2352,7 @@
         </w:trPr>
         <w:tc>
           <w:tcPr>
-            <w:tcW w:type="dxa" w:w="3231"/>
+            <w:tcW w:type="dxa" w:w="1531"/>
             <w:vAlign w:val="center"/>
             <w:tcBorders>
               <w:bottom w:val="single" w:sz="8" w:space="0" w:color="000000"/>
@@ -2371,7 +2376,7 @@
         </w:tc>
         <w:tc>
           <w:tcPr>
-            <w:tcW w:type="dxa" w:w="1318"/>
+            <w:tcW w:type="dxa" w:w="2551"/>
             <w:vAlign w:val="center"/>
             <w:tcBorders>
               <w:bottom w:val="single" w:sz="8" w:space="0" w:color="000000"/>
@@ -2395,7 +2400,7 @@
         </w:tc>
         <w:tc>
           <w:tcPr>
-            <w:tcW w:type="dxa" w:w="1318"/>
+            <w:tcW w:type="dxa" w:w="850"/>
             <w:vAlign w:val="center"/>
             <w:tcBorders>
               <w:bottom w:val="single" w:sz="8" w:space="0" w:color="000000"/>
@@ -2419,7 +2424,7 @@
         </w:tc>
         <w:tc>
           <w:tcPr>
-            <w:tcW w:type="dxa" w:w="1318"/>
+            <w:tcW w:type="dxa" w:w="1616"/>
             <w:vAlign w:val="center"/>
             <w:tcBorders>
               <w:bottom w:val="single" w:sz="8" w:space="0" w:color="000000"/>
@@ -2443,7 +2448,7 @@
         </w:tc>
         <w:tc>
           <w:tcPr>
-            <w:tcW w:type="dxa" w:w="1318"/>
+            <w:tcW w:type="dxa" w:w="1956"/>
             <w:vAlign w:val="center"/>
             <w:tcBorders>
               <w:bottom w:val="single" w:sz="8" w:space="0" w:color="000000"/>
@@ -3154,11 +3159,12 @@
         </w:trPr>
         <w:tc>
           <w:tcPr>
-            <w:tcW w:type="dxa" w:w="3231"/>
-            <w:vAlign w:val="center"/>
+            <w:tcW w:type="dxa" w:w="2721"/>
             <w:tcBorders>
+              <w:top w:val="single" w:sz="8" w:space="0" w:color="000000"/>
               <w:bottom w:val="single" w:sz="4" w:space="0" w:color="000000"/>
             </w:tcBorders>
+            <w:vAlign w:val="center"/>
           </w:tcPr>
           <w:p>
             <w:pPr>
@@ -3178,11 +3184,12 @@
         </w:tc>
         <w:tc>
           <w:tcPr>
-            <w:tcW w:type="dxa" w:w="1318"/>
-            <w:vAlign w:val="center"/>
+            <w:tcW w:type="dxa" w:w="1446"/>
             <w:tcBorders>
+              <w:top w:val="single" w:sz="8" w:space="0" w:color="000000"/>
               <w:bottom w:val="single" w:sz="4" w:space="0" w:color="000000"/>
             </w:tcBorders>
+            <w:vAlign w:val="center"/>
           </w:tcPr>
           <w:p>
             <w:pPr>
@@ -3202,11 +3209,12 @@
         </w:tc>
         <w:tc>
           <w:tcPr>
-            <w:tcW w:type="dxa" w:w="1318"/>
-            <w:vAlign w:val="center"/>
+            <w:tcW w:type="dxa" w:w="1446"/>
             <w:tcBorders>
+              <w:top w:val="single" w:sz="8" w:space="0" w:color="000000"/>
               <w:bottom w:val="single" w:sz="4" w:space="0" w:color="000000"/>
             </w:tcBorders>
+            <w:vAlign w:val="center"/>
           </w:tcPr>
           <w:p>
             <w:pPr>
@@ -3226,11 +3234,12 @@
         </w:tc>
         <w:tc>
           <w:tcPr>
-            <w:tcW w:type="dxa" w:w="1318"/>
-            <w:vAlign w:val="center"/>
+            <w:tcW w:type="dxa" w:w="1446"/>
             <w:tcBorders>
+              <w:top w:val="single" w:sz="8" w:space="0" w:color="000000"/>
               <w:bottom w:val="single" w:sz="4" w:space="0" w:color="000000"/>
             </w:tcBorders>
+            <w:vAlign w:val="center"/>
           </w:tcPr>
           <w:p>
             <w:pPr>
@@ -3250,11 +3259,12 @@
         </w:tc>
         <w:tc>
           <w:tcPr>
-            <w:tcW w:type="dxa" w:w="1318"/>
-            <w:vAlign w:val="center"/>
+            <w:tcW w:type="dxa" w:w="1446"/>
             <w:tcBorders>
+              <w:top w:val="single" w:sz="8" w:space="0" w:color="000000"/>
               <w:bottom w:val="single" w:sz="4" w:space="0" w:color="000000"/>
             </w:tcBorders>
+            <w:vAlign w:val="center"/>
           </w:tcPr>
           <w:p>
             <w:pPr>
@@ -3279,7 +3289,7 @@
         </w:trPr>
         <w:tc>
           <w:tcPr>
-            <w:tcW w:type="dxa" w:w="3231"/>
+            <w:tcW w:type="dxa" w:w="2721"/>
             <w:vAlign w:val="center"/>
           </w:tcPr>
           <w:p>
@@ -3300,7 +3310,7 @@
         </w:tc>
         <w:tc>
           <w:tcPr>
-            <w:tcW w:type="dxa" w:w="1318"/>
+            <w:tcW w:type="dxa" w:w="1446"/>
             <w:vAlign w:val="center"/>
           </w:tcPr>
           <w:p>
@@ -3321,7 +3331,7 @@
         </w:tc>
         <w:tc>
           <w:tcPr>
-            <w:tcW w:type="dxa" w:w="1318"/>
+            <w:tcW w:type="dxa" w:w="1446"/>
             <w:vAlign w:val="center"/>
           </w:tcPr>
           <w:p>
@@ -3342,7 +3352,7 @@
         </w:tc>
         <w:tc>
           <w:tcPr>
-            <w:tcW w:type="dxa" w:w="1318"/>
+            <w:tcW w:type="dxa" w:w="1446"/>
             <w:vAlign w:val="center"/>
           </w:tcPr>
           <w:p>
@@ -3363,7 +3373,7 @@
         </w:tc>
         <w:tc>
           <w:tcPr>
-            <w:tcW w:type="dxa" w:w="1318"/>
+            <w:tcW w:type="dxa" w:w="1446"/>
             <w:vAlign w:val="center"/>
           </w:tcPr>
           <w:p>
@@ -3389,7 +3399,7 @@
         </w:trPr>
         <w:tc>
           <w:tcPr>
-            <w:tcW w:type="dxa" w:w="3231"/>
+            <w:tcW w:type="dxa" w:w="2721"/>
             <w:vAlign w:val="center"/>
           </w:tcPr>
           <w:p>
@@ -3410,7 +3420,7 @@
         </w:tc>
         <w:tc>
           <w:tcPr>
-            <w:tcW w:type="dxa" w:w="1318"/>
+            <w:tcW w:type="dxa" w:w="1446"/>
             <w:vAlign w:val="center"/>
           </w:tcPr>
           <w:p>
@@ -3431,7 +3441,7 @@
         </w:tc>
         <w:tc>
           <w:tcPr>
-            <w:tcW w:type="dxa" w:w="1318"/>
+            <w:tcW w:type="dxa" w:w="1446"/>
             <w:vAlign w:val="center"/>
           </w:tcPr>
           <w:p>
@@ -3452,7 +3462,7 @@
         </w:tc>
         <w:tc>
           <w:tcPr>
-            <w:tcW w:type="dxa" w:w="1318"/>
+            <w:tcW w:type="dxa" w:w="1446"/>
             <w:vAlign w:val="center"/>
           </w:tcPr>
           <w:p>
@@ -3473,7 +3483,7 @@
         </w:tc>
         <w:tc>
           <w:tcPr>
-            <w:tcW w:type="dxa" w:w="1318"/>
+            <w:tcW w:type="dxa" w:w="1446"/>
             <w:vAlign w:val="center"/>
           </w:tcPr>
           <w:p>
@@ -3499,10 +3509,10 @@
         </w:trPr>
         <w:tc>
           <w:tcPr>
-            <w:tcW w:type="dxa" w:w="3231"/>
+            <w:tcW w:type="dxa" w:w="2721"/>
             <w:vAlign w:val="center"/>
             <w:tcBorders>
-              <w:bottom w:val="single" w:sz="8" w:space="0" w:color="000000"/>
+              <w:bottom w:val="single" w:sz="4" w:space="0" w:color="000000"/>
             </w:tcBorders>
           </w:tcPr>
           <w:p>
@@ -3523,10 +3533,10 @@
         </w:tc>
         <w:tc>
           <w:tcPr>
-            <w:tcW w:type="dxa" w:w="1318"/>
+            <w:tcW w:type="dxa" w:w="1446"/>
             <w:vAlign w:val="center"/>
             <w:tcBorders>
-              <w:bottom w:val="single" w:sz="8" w:space="0" w:color="000000"/>
+              <w:bottom w:val="single" w:sz="4" w:space="0" w:color="000000"/>
             </w:tcBorders>
           </w:tcPr>
           <w:p>
@@ -3547,10 +3557,10 @@
         </w:tc>
         <w:tc>
           <w:tcPr>
-            <w:tcW w:type="dxa" w:w="1318"/>
+            <w:tcW w:type="dxa" w:w="1446"/>
             <w:vAlign w:val="center"/>
             <w:tcBorders>
-              <w:bottom w:val="single" w:sz="8" w:space="0" w:color="000000"/>
+              <w:bottom w:val="single" w:sz="4" w:space="0" w:color="000000"/>
             </w:tcBorders>
           </w:tcPr>
           <w:p>
@@ -3571,10 +3581,10 @@
         </w:tc>
         <w:tc>
           <w:tcPr>
-            <w:tcW w:type="dxa" w:w="1318"/>
+            <w:tcW w:type="dxa" w:w="1446"/>
             <w:vAlign w:val="center"/>
             <w:tcBorders>
-              <w:bottom w:val="single" w:sz="8" w:space="0" w:color="000000"/>
+              <w:bottom w:val="single" w:sz="4" w:space="0" w:color="000000"/>
             </w:tcBorders>
           </w:tcPr>
           <w:p>
@@ -3595,10 +3605,10 @@
         </w:tc>
         <w:tc>
           <w:tcPr>
-            <w:tcW w:type="dxa" w:w="1318"/>
+            <w:tcW w:type="dxa" w:w="1446"/>
             <w:vAlign w:val="center"/>
             <w:tcBorders>
-              <w:bottom w:val="single" w:sz="8" w:space="0" w:color="000000"/>
+              <w:bottom w:val="single" w:sz="4" w:space="0" w:color="000000"/>
             </w:tcBorders>
           </w:tcPr>
           <w:p>
@@ -3662,7 +3672,7 @@
         </w:trPr>
         <w:tc>
           <w:tcPr>
-            <w:tcW w:type="dxa" w:w="3175"/>
+            <w:tcW w:type="dxa" w:w="2721"/>
             <w:vAlign w:val="center"/>
             <w:tcBorders>
               <w:bottom w:val="single" w:sz="4" w:space="0" w:color="000000"/>
@@ -3686,7 +3696,7 @@
         </w:tc>
         <w:tc>
           <w:tcPr>
-            <w:tcW w:type="dxa" w:w="2494"/>
+            <w:tcW w:type="dxa" w:w="2891"/>
             <w:vAlign w:val="center"/>
             <w:tcBorders>
               <w:bottom w:val="single" w:sz="4" w:space="0" w:color="000000"/>
@@ -3710,7 +3720,7 @@
         </w:tc>
         <w:tc>
           <w:tcPr>
-            <w:tcW w:type="dxa" w:w="2494"/>
+            <w:tcW w:type="dxa" w:w="2891"/>
             <w:vAlign w:val="center"/>
             <w:tcBorders>
               <w:bottom w:val="single" w:sz="4" w:space="0" w:color="000000"/>
@@ -3739,7 +3749,7 @@
         </w:trPr>
         <w:tc>
           <w:tcPr>
-            <w:tcW w:type="dxa" w:w="3175"/>
+            <w:tcW w:type="dxa" w:w="2721"/>
             <w:vAlign w:val="center"/>
           </w:tcPr>
           <w:p>
@@ -3760,7 +3770,7 @@
         </w:tc>
         <w:tc>
           <w:tcPr>
-            <w:tcW w:type="dxa" w:w="2494"/>
+            <w:tcW w:type="dxa" w:w="2891"/>
             <w:vAlign w:val="center"/>
           </w:tcPr>
           <w:p>
@@ -3781,7 +3791,7 @@
         </w:tc>
         <w:tc>
           <w:tcPr>
-            <w:tcW w:type="dxa" w:w="2494"/>
+            <w:tcW w:type="dxa" w:w="2891"/>
             <w:vAlign w:val="center"/>
           </w:tcPr>
           <w:p>
@@ -3807,7 +3817,7 @@
         </w:trPr>
         <w:tc>
           <w:tcPr>
-            <w:tcW w:type="dxa" w:w="3175"/>
+            <w:tcW w:type="dxa" w:w="2721"/>
             <w:vAlign w:val="center"/>
           </w:tcPr>
           <w:p>
@@ -3828,7 +3838,7 @@
         </w:tc>
         <w:tc>
           <w:tcPr>
-            <w:tcW w:type="dxa" w:w="2494"/>
+            <w:tcW w:type="dxa" w:w="2891"/>
             <w:vAlign w:val="center"/>
           </w:tcPr>
           <w:p>
@@ -3849,7 +3859,7 @@
         </w:tc>
         <w:tc>
           <w:tcPr>
-            <w:tcW w:type="dxa" w:w="2494"/>
+            <w:tcW w:type="dxa" w:w="2891"/>
             <w:vAlign w:val="center"/>
           </w:tcPr>
           <w:p>
@@ -3875,7 +3885,7 @@
         </w:trPr>
         <w:tc>
           <w:tcPr>
-            <w:tcW w:type="dxa" w:w="3175"/>
+            <w:tcW w:type="dxa" w:w="2721"/>
             <w:vAlign w:val="center"/>
             <w:tcBorders>
               <w:bottom w:val="single" w:sz="8" w:space="0" w:color="000000"/>
@@ -3899,7 +3909,7 @@
         </w:tc>
         <w:tc>
           <w:tcPr>
-            <w:tcW w:type="dxa" w:w="2494"/>
+            <w:tcW w:type="dxa" w:w="2891"/>
             <w:vAlign w:val="center"/>
             <w:tcBorders>
               <w:bottom w:val="single" w:sz="8" w:space="0" w:color="000000"/>
@@ -3923,7 +3933,7 @@
         </w:tc>
         <w:tc>
           <w:tcPr>
-            <w:tcW w:type="dxa" w:w="2494"/>
+            <w:tcW w:type="dxa" w:w="2891"/>
             <w:vAlign w:val="center"/>
             <w:tcBorders>
               <w:bottom w:val="single" w:sz="8" w:space="0" w:color="000000"/>
@@ -4150,10 +4160,11 @@
         <w:tc>
           <w:tcPr>
             <w:tcW w:type="dxa" w:w="3231"/>
-            <w:vAlign w:val="center"/>
             <w:tcBorders>
+              <w:top w:val="single" w:sz="8" w:space="0" w:color="000000"/>
               <w:bottom w:val="single" w:sz="4" w:space="0" w:color="000000"/>
             </w:tcBorders>
+            <w:vAlign w:val="center"/>
           </w:tcPr>
           <w:p>
             <w:pPr>
@@ -4173,11 +4184,12 @@
         </w:tc>
         <w:tc>
           <w:tcPr>
-            <w:tcW w:type="dxa" w:w="1318"/>
-            <w:vAlign w:val="center"/>
+            <w:tcW w:type="dxa" w:w="850"/>
             <w:tcBorders>
+              <w:top w:val="single" w:sz="8" w:space="0" w:color="000000"/>
               <w:bottom w:val="single" w:sz="4" w:space="0" w:color="000000"/>
             </w:tcBorders>
+            <w:vAlign w:val="center"/>
           </w:tcPr>
           <w:p>
             <w:pPr>
@@ -4197,11 +4209,12 @@
         </w:tc>
         <w:tc>
           <w:tcPr>
-            <w:tcW w:type="dxa" w:w="1318"/>
-            <w:vAlign w:val="center"/>
+            <w:tcW w:type="dxa" w:w="1474"/>
             <w:tcBorders>
+              <w:top w:val="single" w:sz="8" w:space="0" w:color="000000"/>
               <w:bottom w:val="single" w:sz="4" w:space="0" w:color="000000"/>
             </w:tcBorders>
+            <w:vAlign w:val="center"/>
           </w:tcPr>
           <w:p>
             <w:pPr>
@@ -4221,11 +4234,12 @@
         </w:tc>
         <w:tc>
           <w:tcPr>
-            <w:tcW w:type="dxa" w:w="1318"/>
-            <w:vAlign w:val="center"/>
+            <w:tcW w:type="dxa" w:w="1474"/>
             <w:tcBorders>
+              <w:top w:val="single" w:sz="8" w:space="0" w:color="000000"/>
               <w:bottom w:val="single" w:sz="4" w:space="0" w:color="000000"/>
             </w:tcBorders>
+            <w:vAlign w:val="center"/>
           </w:tcPr>
           <w:p>
             <w:pPr>
@@ -4245,11 +4259,12 @@
         </w:tc>
         <w:tc>
           <w:tcPr>
-            <w:tcW w:type="dxa" w:w="1318"/>
-            <w:vAlign w:val="center"/>
+            <w:tcW w:type="dxa" w:w="1474"/>
             <w:tcBorders>
+              <w:top w:val="single" w:sz="8" w:space="0" w:color="000000"/>
               <w:bottom w:val="single" w:sz="4" w:space="0" w:color="000000"/>
             </w:tcBorders>
+            <w:vAlign w:val="center"/>
           </w:tcPr>
           <w:p>
             <w:pPr>
@@ -4295,7 +4310,28 @@
         </w:tc>
         <w:tc>
           <w:tcPr>
-            <w:tcW w:type="dxa" w:w="1318"/>
+            <w:tcW w:type="dxa" w:w="850"/>
+            <w:vAlign w:val="center"/>
+          </w:tcPr>
+          <w:p>
+            <w:pPr>
+              <w:spacing w:before="0" w:after="0" w:line="240" w:lineRule="exact"/>
+              <w:jc w:val="center"/>
+            </w:pPr>
+            <w:r>
+              <w:rPr>
+                <w:rFonts w:ascii="Times New Roman" w:hAnsi="Times New Roman" w:eastAsia="宋体"/>
+                <w:b w:val="0"/>
+                <w:i w:val="0"/>
+                <w:sz w:val="18"/>
+              </w:rPr>
+              <w:t>79</w:t>
+            </w:r>
+          </w:p>
+        </w:tc>
+        <w:tc>
+          <w:tcPr>
+            <w:tcW w:type="dxa" w:w="1474"/>
             <w:vAlign w:val="center"/>
           </w:tcPr>
           <w:p>
@@ -4310,13 +4346,13 @@
                 <w:i w:val="0"/>
                 <w:sz w:val="18"/>
               </w:rPr>
-              <w:t>79</w:t>
-            </w:r>
-          </w:p>
-        </w:tc>
-        <w:tc>
-          <w:tcPr>
-            <w:tcW w:type="dxa" w:w="1318"/>
+              <w:t>0.7466</w:t>
+            </w:r>
+          </w:p>
+        </w:tc>
+        <w:tc>
+          <w:tcPr>
+            <w:tcW w:type="dxa" w:w="1474"/>
             <w:vAlign w:val="center"/>
           </w:tcPr>
           <w:p>
@@ -4331,34 +4367,13 @@
                 <w:i w:val="0"/>
                 <w:sz w:val="18"/>
               </w:rPr>
-              <w:t>0.7466</w:t>
-            </w:r>
-          </w:p>
-        </w:tc>
-        <w:tc>
-          <w:tcPr>
-            <w:tcW w:type="dxa" w:w="1318"/>
-            <w:vAlign w:val="center"/>
-          </w:tcPr>
-          <w:p>
-            <w:pPr>
-              <w:spacing w:before="0" w:after="0" w:line="240" w:lineRule="exact"/>
-              <w:jc w:val="right"/>
-            </w:pPr>
-            <w:r>
-              <w:rPr>
-                <w:rFonts w:ascii="Times New Roman" w:hAnsi="Times New Roman" w:eastAsia="宋体"/>
-                <w:b w:val="0"/>
-                <w:i w:val="0"/>
-                <w:sz w:val="18"/>
-              </w:rPr>
               <w:t>0.3348</w:t>
             </w:r>
           </w:p>
         </w:tc>
         <w:tc>
           <w:tcPr>
-            <w:tcW w:type="dxa" w:w="1318"/>
+            <w:tcW w:type="dxa" w:w="1474"/>
             <w:vAlign w:val="center"/>
           </w:tcPr>
           <w:p>
@@ -4405,7 +4420,28 @@
         </w:tc>
         <w:tc>
           <w:tcPr>
-            <w:tcW w:type="dxa" w:w="1318"/>
+            <w:tcW w:type="dxa" w:w="850"/>
+            <w:vAlign w:val="center"/>
+          </w:tcPr>
+          <w:p>
+            <w:pPr>
+              <w:spacing w:before="0" w:after="0" w:line="240" w:lineRule="exact"/>
+              <w:jc w:val="center"/>
+            </w:pPr>
+            <w:r>
+              <w:rPr>
+                <w:rFonts w:ascii="Times New Roman" w:hAnsi="Times New Roman" w:eastAsia="宋体"/>
+                <w:b w:val="0"/>
+                <w:i w:val="0"/>
+                <w:sz w:val="18"/>
+              </w:rPr>
+              <w:t>50</w:t>
+            </w:r>
+          </w:p>
+        </w:tc>
+        <w:tc>
+          <w:tcPr>
+            <w:tcW w:type="dxa" w:w="1474"/>
             <w:vAlign w:val="center"/>
           </w:tcPr>
           <w:p>
@@ -4420,13 +4456,13 @@
                 <w:i w:val="0"/>
                 <w:sz w:val="18"/>
               </w:rPr>
-              <w:t>50</w:t>
-            </w:r>
-          </w:p>
-        </w:tc>
-        <w:tc>
-          <w:tcPr>
-            <w:tcW w:type="dxa" w:w="1318"/>
+              <w:t>0.0494</w:t>
+            </w:r>
+          </w:p>
+        </w:tc>
+        <w:tc>
+          <w:tcPr>
+            <w:tcW w:type="dxa" w:w="1474"/>
             <w:vAlign w:val="center"/>
           </w:tcPr>
           <w:p>
@@ -4441,34 +4477,13 @@
                 <w:i w:val="0"/>
                 <w:sz w:val="18"/>
               </w:rPr>
-              <w:t>0.0494</w:t>
-            </w:r>
-          </w:p>
-        </w:tc>
-        <w:tc>
-          <w:tcPr>
-            <w:tcW w:type="dxa" w:w="1318"/>
-            <w:vAlign w:val="center"/>
-          </w:tcPr>
-          <w:p>
-            <w:pPr>
-              <w:spacing w:before="0" w:after="0" w:line="240" w:lineRule="exact"/>
-              <w:jc w:val="right"/>
-            </w:pPr>
-            <w:r>
-              <w:rPr>
-                <w:rFonts w:ascii="Times New Roman" w:hAnsi="Times New Roman" w:eastAsia="宋体"/>
-                <w:b w:val="0"/>
-                <w:i w:val="0"/>
-                <w:sz w:val="18"/>
-              </w:rPr>
               <w:t>0.3979</w:t>
             </w:r>
           </w:p>
         </w:tc>
         <w:tc>
           <w:tcPr>
-            <w:tcW w:type="dxa" w:w="1318"/>
+            <w:tcW w:type="dxa" w:w="1474"/>
             <w:vAlign w:val="center"/>
           </w:tcPr>
           <w:p>
@@ -4515,7 +4530,28 @@
         </w:tc>
         <w:tc>
           <w:tcPr>
-            <w:tcW w:type="dxa" w:w="1318"/>
+            <w:tcW w:type="dxa" w:w="850"/>
+            <w:vAlign w:val="center"/>
+          </w:tcPr>
+          <w:p>
+            <w:pPr>
+              <w:spacing w:before="0" w:after="0" w:line="240" w:lineRule="exact"/>
+              <w:jc w:val="center"/>
+            </w:pPr>
+            <w:r>
+              <w:rPr>
+                <w:rFonts w:ascii="Times New Roman" w:hAnsi="Times New Roman" w:eastAsia="宋体"/>
+                <w:b w:val="0"/>
+                <w:i w:val="0"/>
+                <w:sz w:val="18"/>
+              </w:rPr>
+              <w:t>29</w:t>
+            </w:r>
+          </w:p>
+        </w:tc>
+        <w:tc>
+          <w:tcPr>
+            <w:tcW w:type="dxa" w:w="1474"/>
             <w:vAlign w:val="center"/>
           </w:tcPr>
           <w:p>
@@ -4530,13 +4566,13 @@
                 <w:i w:val="0"/>
                 <w:sz w:val="18"/>
               </w:rPr>
-              <w:t>29</w:t>
-            </w:r>
-          </w:p>
-        </w:tc>
-        <w:tc>
-          <w:tcPr>
-            <w:tcW w:type="dxa" w:w="1318"/>
+              <w:t>1.4892</w:t>
+            </w:r>
+          </w:p>
+        </w:tc>
+        <w:tc>
+          <w:tcPr>
+            <w:tcW w:type="dxa" w:w="1474"/>
             <w:vAlign w:val="center"/>
           </w:tcPr>
           <w:p>
@@ -4551,34 +4587,13 @@
                 <w:i w:val="0"/>
                 <w:sz w:val="18"/>
               </w:rPr>
-              <w:t>1.4892</w:t>
-            </w:r>
-          </w:p>
-        </w:tc>
-        <w:tc>
-          <w:tcPr>
-            <w:tcW w:type="dxa" w:w="1318"/>
-            <w:vAlign w:val="center"/>
-          </w:tcPr>
-          <w:p>
-            <w:pPr>
-              <w:spacing w:before="0" w:after="0" w:line="240" w:lineRule="exact"/>
-              <w:jc w:val="right"/>
-            </w:pPr>
-            <w:r>
-              <w:rPr>
-                <w:rFonts w:ascii="Times New Roman" w:hAnsi="Times New Roman" w:eastAsia="宋体"/>
-                <w:b w:val="0"/>
-                <w:i w:val="0"/>
-                <w:sz w:val="18"/>
-              </w:rPr>
               <w:t>1.4358</w:t>
             </w:r>
           </w:p>
         </w:tc>
         <w:tc>
           <w:tcPr>
-            <w:tcW w:type="dxa" w:w="1318"/>
+            <w:tcW w:type="dxa" w:w="1474"/>
             <w:vAlign w:val="center"/>
           </w:tcPr>
           <w:p>
@@ -4625,7 +4640,28 @@
         </w:tc>
         <w:tc>
           <w:tcPr>
-            <w:tcW w:type="dxa" w:w="1318"/>
+            <w:tcW w:type="dxa" w:w="850"/>
+            <w:vAlign w:val="center"/>
+          </w:tcPr>
+          <w:p>
+            <w:pPr>
+              <w:spacing w:before="0" w:after="0" w:line="240" w:lineRule="exact"/>
+              <w:jc w:val="center"/>
+            </w:pPr>
+            <w:r>
+              <w:rPr>
+                <w:rFonts w:ascii="Times New Roman" w:hAnsi="Times New Roman" w:eastAsia="宋体"/>
+                <w:b w:val="0"/>
+                <w:i w:val="0"/>
+                <w:sz w:val="18"/>
+              </w:rPr>
+              <w:t>12</w:t>
+            </w:r>
+          </w:p>
+        </w:tc>
+        <w:tc>
+          <w:tcPr>
+            <w:tcW w:type="dxa" w:w="1474"/>
             <w:vAlign w:val="center"/>
           </w:tcPr>
           <w:p>
@@ -4640,13 +4676,13 @@
                 <w:i w:val="0"/>
                 <w:sz w:val="18"/>
               </w:rPr>
-              <w:t>12</w:t>
-            </w:r>
-          </w:p>
-        </w:tc>
-        <w:tc>
-          <w:tcPr>
-            <w:tcW w:type="dxa" w:w="1318"/>
+              <w:t>-0.4896</w:t>
+            </w:r>
+          </w:p>
+        </w:tc>
+        <w:tc>
+          <w:tcPr>
+            <w:tcW w:type="dxa" w:w="1474"/>
             <w:vAlign w:val="center"/>
           </w:tcPr>
           <w:p>
@@ -4661,34 +4697,13 @@
                 <w:i w:val="0"/>
                 <w:sz w:val="18"/>
               </w:rPr>
-              <w:t>-0.4896</w:t>
-            </w:r>
-          </w:p>
-        </w:tc>
-        <w:tc>
-          <w:tcPr>
-            <w:tcW w:type="dxa" w:w="1318"/>
-            <w:vAlign w:val="center"/>
-          </w:tcPr>
-          <w:p>
-            <w:pPr>
-              <w:spacing w:before="0" w:after="0" w:line="240" w:lineRule="exact"/>
-              <w:jc w:val="right"/>
-            </w:pPr>
-            <w:r>
-              <w:rPr>
-                <w:rFonts w:ascii="Times New Roman" w:hAnsi="Times New Roman" w:eastAsia="宋体"/>
-                <w:b w:val="0"/>
-                <w:i w:val="0"/>
-                <w:sz w:val="18"/>
-              </w:rPr>
               <w:t>6.4946</w:t>
             </w:r>
           </w:p>
         </w:tc>
         <w:tc>
           <w:tcPr>
-            <w:tcW w:type="dxa" w:w="1318"/>
+            <w:tcW w:type="dxa" w:w="1474"/>
             <w:vAlign w:val="center"/>
           </w:tcPr>
           <w:p>
@@ -4738,7 +4753,7 @@
         </w:tc>
         <w:tc>
           <w:tcPr>
-            <w:tcW w:type="dxa" w:w="1318"/>
+            <w:tcW w:type="dxa" w:w="850"/>
             <w:vAlign w:val="center"/>
             <w:tcBorders>
               <w:bottom w:val="single" w:sz="8" w:space="0" w:color="000000"/>
@@ -4747,7 +4762,7 @@
           <w:p>
             <w:pPr>
               <w:spacing w:before="0" w:after="0" w:line="240" w:lineRule="exact"/>
-              <w:jc w:val="right"/>
+              <w:jc w:val="center"/>
             </w:pPr>
             <w:r>
               <w:rPr>
@@ -4762,7 +4777,7 @@
         </w:tc>
         <w:tc>
           <w:tcPr>
-            <w:tcW w:type="dxa" w:w="1318"/>
+            <w:tcW w:type="dxa" w:w="1474"/>
             <w:vAlign w:val="center"/>
             <w:tcBorders>
               <w:bottom w:val="single" w:sz="8" w:space="0" w:color="000000"/>
@@ -4786,7 +4801,7 @@
         </w:tc>
         <w:tc>
           <w:tcPr>
-            <w:tcW w:type="dxa" w:w="1318"/>
+            <w:tcW w:type="dxa" w:w="1474"/>
             <w:vAlign w:val="center"/>
             <w:tcBorders>
               <w:bottom w:val="single" w:sz="8" w:space="0" w:color="000000"/>
@@ -4810,7 +4825,7 @@
         </w:tc>
         <w:tc>
           <w:tcPr>
-            <w:tcW w:type="dxa" w:w="1318"/>
+            <w:tcW w:type="dxa" w:w="1474"/>
             <w:vAlign w:val="center"/>
             <w:tcBorders>
               <w:bottom w:val="single" w:sz="8" w:space="0" w:color="000000"/>
@@ -5200,10 +5215,11 @@
         <w:tc>
           <w:tcPr>
             <w:tcW w:type="dxa" w:w="3231"/>
-            <w:vAlign w:val="center"/>
             <w:tcBorders>
+              <w:top w:val="single" w:sz="8" w:space="0" w:color="000000"/>
               <w:bottom w:val="single" w:sz="4" w:space="0" w:color="000000"/>
             </w:tcBorders>
+            <w:vAlign w:val="center"/>
           </w:tcPr>
           <w:p>
             <w:pPr>
@@ -5224,10 +5240,11 @@
         <w:tc>
           <w:tcPr>
             <w:tcW w:type="dxa" w:w="1318"/>
-            <w:vAlign w:val="center"/>
             <w:tcBorders>
+              <w:top w:val="single" w:sz="8" w:space="0" w:color="000000"/>
               <w:bottom w:val="single" w:sz="4" w:space="0" w:color="000000"/>
             </w:tcBorders>
+            <w:vAlign w:val="center"/>
           </w:tcPr>
           <w:p>
             <w:pPr>
@@ -5248,10 +5265,11 @@
         <w:tc>
           <w:tcPr>
             <w:tcW w:type="dxa" w:w="1318"/>
-            <w:vAlign w:val="center"/>
             <w:tcBorders>
+              <w:top w:val="single" w:sz="8" w:space="0" w:color="000000"/>
               <w:bottom w:val="single" w:sz="4" w:space="0" w:color="000000"/>
             </w:tcBorders>
+            <w:vAlign w:val="center"/>
           </w:tcPr>
           <w:p>
             <w:pPr>
@@ -5272,10 +5290,11 @@
         <w:tc>
           <w:tcPr>
             <w:tcW w:type="dxa" w:w="1318"/>
-            <w:vAlign w:val="center"/>
             <w:tcBorders>
+              <w:top w:val="single" w:sz="8" w:space="0" w:color="000000"/>
               <w:bottom w:val="single" w:sz="4" w:space="0" w:color="000000"/>
             </w:tcBorders>
+            <w:vAlign w:val="center"/>
           </w:tcPr>
           <w:p>
             <w:pPr>
@@ -5296,10 +5315,11 @@
         <w:tc>
           <w:tcPr>
             <w:tcW w:type="dxa" w:w="1318"/>
-            <w:vAlign w:val="center"/>
             <w:tcBorders>
+              <w:top w:val="single" w:sz="8" w:space="0" w:color="000000"/>
               <w:bottom w:val="single" w:sz="4" w:space="0" w:color="000000"/>
             </w:tcBorders>
+            <w:vAlign w:val="center"/>
           </w:tcPr>
           <w:p>
             <w:pPr>
@@ -5414,7 +5434,7 @@
           <w:p>
             <w:pPr>
               <w:spacing w:before="0" w:after="0" w:line="240" w:lineRule="exact"/>
-              <w:jc w:val="right"/>
+              <w:jc w:val="center"/>
             </w:pPr>
             <w:r>
               <w:rPr>
@@ -5524,7 +5544,7 @@
           <w:p>
             <w:pPr>
               <w:spacing w:before="0" w:after="0" w:line="240" w:lineRule="exact"/>
-              <w:jc w:val="right"/>
+              <w:jc w:val="center"/>
             </w:pPr>
             <w:r>
               <w:rPr>
@@ -5634,7 +5654,7 @@
           <w:p>
             <w:pPr>
               <w:spacing w:before="0" w:after="0" w:line="240" w:lineRule="exact"/>
-              <w:jc w:val="right"/>
+              <w:jc w:val="center"/>
             </w:pPr>
             <w:r>
               <w:rPr>
@@ -5759,7 +5779,7 @@
           <w:p>
             <w:pPr>
               <w:spacing w:before="0" w:after="0" w:line="240" w:lineRule="exact"/>
-              <w:jc w:val="right"/>
+              <w:jc w:val="center"/>
             </w:pPr>
             <w:r>
               <w:rPr>
@@ -6168,10 +6188,11 @@
         <w:tc>
           <w:tcPr>
             <w:tcW w:type="dxa" w:w="3231"/>
-            <w:vAlign w:val="center"/>
             <w:tcBorders>
+              <w:top w:val="single" w:sz="8" w:space="0" w:color="000000"/>
               <w:bottom w:val="single" w:sz="4" w:space="0" w:color="000000"/>
             </w:tcBorders>
+            <w:vAlign w:val="center"/>
           </w:tcPr>
           <w:p>
             <w:pPr>
@@ -6191,11 +6212,12 @@
         </w:tc>
         <w:tc>
           <w:tcPr>
-            <w:tcW w:type="dxa" w:w="1318"/>
-            <w:vAlign w:val="center"/>
+            <w:tcW w:type="dxa" w:w="850"/>
             <w:tcBorders>
+              <w:top w:val="single" w:sz="8" w:space="0" w:color="000000"/>
               <w:bottom w:val="single" w:sz="4" w:space="0" w:color="000000"/>
             </w:tcBorders>
+            <w:vAlign w:val="center"/>
           </w:tcPr>
           <w:p>
             <w:pPr>
@@ -6215,11 +6237,12 @@
         </w:tc>
         <w:tc>
           <w:tcPr>
-            <w:tcW w:type="dxa" w:w="1318"/>
-            <w:vAlign w:val="center"/>
+            <w:tcW w:type="dxa" w:w="1474"/>
             <w:tcBorders>
+              <w:top w:val="single" w:sz="8" w:space="0" w:color="000000"/>
               <w:bottom w:val="single" w:sz="4" w:space="0" w:color="000000"/>
             </w:tcBorders>
+            <w:vAlign w:val="center"/>
           </w:tcPr>
           <w:p>
             <w:pPr>
@@ -6239,11 +6262,12 @@
         </w:tc>
         <w:tc>
           <w:tcPr>
-            <w:tcW w:type="dxa" w:w="1318"/>
-            <w:vAlign w:val="center"/>
+            <w:tcW w:type="dxa" w:w="1474"/>
             <w:tcBorders>
+              <w:top w:val="single" w:sz="8" w:space="0" w:color="000000"/>
               <w:bottom w:val="single" w:sz="4" w:space="0" w:color="000000"/>
             </w:tcBorders>
+            <w:vAlign w:val="center"/>
           </w:tcPr>
           <w:p>
             <w:pPr>
@@ -6263,11 +6287,12 @@
         </w:tc>
         <w:tc>
           <w:tcPr>
-            <w:tcW w:type="dxa" w:w="1318"/>
-            <w:vAlign w:val="center"/>
+            <w:tcW w:type="dxa" w:w="1474"/>
             <w:tcBorders>
+              <w:top w:val="single" w:sz="8" w:space="0" w:color="000000"/>
               <w:bottom w:val="single" w:sz="4" w:space="0" w:color="000000"/>
             </w:tcBorders>
+            <w:vAlign w:val="center"/>
           </w:tcPr>
           <w:p>
             <w:pPr>
@@ -6313,7 +6338,28 @@
         </w:tc>
         <w:tc>
           <w:tcPr>
-            <w:tcW w:type="dxa" w:w="1318"/>
+            <w:tcW w:type="dxa" w:w="850"/>
+            <w:vAlign w:val="center"/>
+          </w:tcPr>
+          <w:p>
+            <w:pPr>
+              <w:spacing w:before="0" w:after="0" w:line="240" w:lineRule="exact"/>
+              <w:jc w:val="center"/>
+            </w:pPr>
+            <w:r>
+              <w:rPr>
+                <w:rFonts w:ascii="Times New Roman" w:hAnsi="Times New Roman" w:eastAsia="宋体"/>
+                <w:b w:val="0"/>
+                <w:i w:val="0"/>
+                <w:sz w:val="18"/>
+              </w:rPr>
+              <w:t>79</w:t>
+            </w:r>
+          </w:p>
+        </w:tc>
+        <w:tc>
+          <w:tcPr>
+            <w:tcW w:type="dxa" w:w="1474"/>
             <w:vAlign w:val="center"/>
           </w:tcPr>
           <w:p>
@@ -6328,13 +6374,13 @@
                 <w:i w:val="0"/>
                 <w:sz w:val="18"/>
               </w:rPr>
-              <w:t>79</w:t>
-            </w:r>
-          </w:p>
-        </w:tc>
-        <w:tc>
-          <w:tcPr>
-            <w:tcW w:type="dxa" w:w="1318"/>
+              <w:t>0.9542</w:t>
+            </w:r>
+          </w:p>
+        </w:tc>
+        <w:tc>
+          <w:tcPr>
+            <w:tcW w:type="dxa" w:w="1474"/>
             <w:vAlign w:val="center"/>
           </w:tcPr>
           <w:p>
@@ -6349,34 +6395,13 @@
                 <w:i w:val="0"/>
                 <w:sz w:val="18"/>
               </w:rPr>
-              <w:t>0.9542</w:t>
-            </w:r>
-          </w:p>
-        </w:tc>
-        <w:tc>
-          <w:tcPr>
-            <w:tcW w:type="dxa" w:w="1318"/>
-            <w:vAlign w:val="center"/>
-          </w:tcPr>
-          <w:p>
-            <w:pPr>
-              <w:spacing w:before="0" w:after="0" w:line="240" w:lineRule="exact"/>
-              <w:jc w:val="right"/>
-            </w:pPr>
-            <w:r>
-              <w:rPr>
-                <w:rFonts w:ascii="Times New Roman" w:hAnsi="Times New Roman" w:eastAsia="宋体"/>
-                <w:b w:val="0"/>
-                <w:i w:val="0"/>
-                <w:sz w:val="18"/>
-              </w:rPr>
               <w:t>1.1858</w:t>
             </w:r>
           </w:p>
         </w:tc>
         <w:tc>
           <w:tcPr>
-            <w:tcW w:type="dxa" w:w="1318"/>
+            <w:tcW w:type="dxa" w:w="1474"/>
             <w:vAlign w:val="center"/>
           </w:tcPr>
           <w:p>
@@ -6423,7 +6448,28 @@
         </w:tc>
         <w:tc>
           <w:tcPr>
-            <w:tcW w:type="dxa" w:w="1318"/>
+            <w:tcW w:type="dxa" w:w="850"/>
+            <w:vAlign w:val="center"/>
+          </w:tcPr>
+          <w:p>
+            <w:pPr>
+              <w:spacing w:before="0" w:after="0" w:line="240" w:lineRule="exact"/>
+              <w:jc w:val="center"/>
+            </w:pPr>
+            <w:r>
+              <w:rPr>
+                <w:rFonts w:ascii="Times New Roman" w:hAnsi="Times New Roman" w:eastAsia="宋体"/>
+                <w:b w:val="0"/>
+                <w:i w:val="0"/>
+                <w:sz w:val="18"/>
+              </w:rPr>
+              <w:t>79</w:t>
+            </w:r>
+          </w:p>
+        </w:tc>
+        <w:tc>
+          <w:tcPr>
+            <w:tcW w:type="dxa" w:w="1474"/>
             <w:vAlign w:val="center"/>
           </w:tcPr>
           <w:p>
@@ -6438,13 +6484,13 @@
                 <w:i w:val="0"/>
                 <w:sz w:val="18"/>
               </w:rPr>
-              <w:t>79</w:t>
-            </w:r>
-          </w:p>
-        </w:tc>
-        <w:tc>
-          <w:tcPr>
-            <w:tcW w:type="dxa" w:w="1318"/>
+              <w:t>0.5417</w:t>
+            </w:r>
+          </w:p>
+        </w:tc>
+        <w:tc>
+          <w:tcPr>
+            <w:tcW w:type="dxa" w:w="1474"/>
             <w:vAlign w:val="center"/>
           </w:tcPr>
           <w:p>
@@ -6459,34 +6505,13 @@
                 <w:i w:val="0"/>
                 <w:sz w:val="18"/>
               </w:rPr>
-              <w:t>0.5417</w:t>
-            </w:r>
-          </w:p>
-        </w:tc>
-        <w:tc>
-          <w:tcPr>
-            <w:tcW w:type="dxa" w:w="1318"/>
-            <w:vAlign w:val="center"/>
-          </w:tcPr>
-          <w:p>
-            <w:pPr>
-              <w:spacing w:before="0" w:after="0" w:line="240" w:lineRule="exact"/>
-              <w:jc w:val="right"/>
-            </w:pPr>
-            <w:r>
-              <w:rPr>
-                <w:rFonts w:ascii="Times New Roman" w:hAnsi="Times New Roman" w:eastAsia="宋体"/>
-                <w:b w:val="0"/>
-                <w:i w:val="0"/>
-                <w:sz w:val="18"/>
-              </w:rPr>
               <w:t>0.8941</w:t>
             </w:r>
           </w:p>
         </w:tc>
         <w:tc>
           <w:tcPr>
-            <w:tcW w:type="dxa" w:w="1318"/>
+            <w:tcW w:type="dxa" w:w="1474"/>
             <w:vAlign w:val="center"/>
           </w:tcPr>
           <w:p>
@@ -6515,7 +6540,7 @@
             <w:tcW w:type="dxa" w:w="3231"/>
             <w:vAlign w:val="center"/>
             <w:tcBorders>
-              <w:bottom w:val="single" w:sz="8" w:space="0" w:color="000000"/>
+              <w:bottom w:val="single" w:sz="4" w:space="0" w:color="000000"/>
             </w:tcBorders>
           </w:tcPr>
           <w:p>
@@ -6536,15 +6561,39 @@
         </w:tc>
         <w:tc>
           <w:tcPr>
-            <w:tcW w:type="dxa" w:w="1318"/>
+            <w:tcW w:type="dxa" w:w="850"/>
             <w:vAlign w:val="center"/>
             <w:tcBorders>
-              <w:bottom w:val="single" w:sz="8" w:space="0" w:color="000000"/>
+              <w:bottom w:val="single" w:sz="4" w:space="0" w:color="000000"/>
             </w:tcBorders>
           </w:tcPr>
           <w:p>
             <w:pPr>
               <w:spacing w:before="0" w:after="0" w:line="240" w:lineRule="exact"/>
+              <w:jc w:val="center"/>
+            </w:pPr>
+            <w:r>
+              <w:rPr>
+                <w:rFonts w:ascii="Times New Roman" w:hAnsi="Times New Roman" w:eastAsia="宋体"/>
+                <w:b w:val="0"/>
+                <w:i w:val="0"/>
+                <w:sz w:val="18"/>
+              </w:rPr>
+              <w:t>79</w:t>
+            </w:r>
+          </w:p>
+        </w:tc>
+        <w:tc>
+          <w:tcPr>
+            <w:tcW w:type="dxa" w:w="1474"/>
+            <w:vAlign w:val="center"/>
+            <w:tcBorders>
+              <w:bottom w:val="single" w:sz="4" w:space="0" w:color="000000"/>
+            </w:tcBorders>
+          </w:tcPr>
+          <w:p>
+            <w:pPr>
+              <w:spacing w:before="0" w:after="0" w:line="240" w:lineRule="exact"/>
               <w:jc w:val="right"/>
             </w:pPr>
             <w:r>
@@ -6554,16 +6603,16 @@
                 <w:i w:val="0"/>
                 <w:sz w:val="18"/>
               </w:rPr>
-              <w:t>79</w:t>
-            </w:r>
-          </w:p>
-        </w:tc>
-        <w:tc>
-          <w:tcPr>
-            <w:tcW w:type="dxa" w:w="1318"/>
+              <w:t>1.7235</w:t>
+            </w:r>
+          </w:p>
+        </w:tc>
+        <w:tc>
+          <w:tcPr>
+            <w:tcW w:type="dxa" w:w="1474"/>
             <w:vAlign w:val="center"/>
             <w:tcBorders>
-              <w:bottom w:val="single" w:sz="8" w:space="0" w:color="000000"/>
+              <w:bottom w:val="single" w:sz="4" w:space="0" w:color="000000"/>
             </w:tcBorders>
           </w:tcPr>
           <w:p>
@@ -6578,40 +6627,16 @@
                 <w:i w:val="0"/>
                 <w:sz w:val="18"/>
               </w:rPr>
-              <w:t>1.7235</w:t>
-            </w:r>
-          </w:p>
-        </w:tc>
-        <w:tc>
-          <w:tcPr>
-            <w:tcW w:type="dxa" w:w="1318"/>
+              <w:t>1.4930</w:t>
+            </w:r>
+          </w:p>
+        </w:tc>
+        <w:tc>
+          <w:tcPr>
+            <w:tcW w:type="dxa" w:w="1474"/>
             <w:vAlign w:val="center"/>
             <w:tcBorders>
-              <w:bottom w:val="single" w:sz="8" w:space="0" w:color="000000"/>
-            </w:tcBorders>
-          </w:tcPr>
-          <w:p>
-            <w:pPr>
-              <w:spacing w:before="0" w:after="0" w:line="240" w:lineRule="exact"/>
-              <w:jc w:val="right"/>
-            </w:pPr>
-            <w:r>
-              <w:rPr>
-                <w:rFonts w:ascii="Times New Roman" w:hAnsi="Times New Roman" w:eastAsia="宋体"/>
-                <w:b w:val="0"/>
-                <w:i w:val="0"/>
-                <w:sz w:val="18"/>
-              </w:rPr>
-              <w:t>1.4930</w:t>
-            </w:r>
-          </w:p>
-        </w:tc>
-        <w:tc>
-          <w:tcPr>
-            <w:tcW w:type="dxa" w:w="1318"/>
-            <w:vAlign w:val="center"/>
-            <w:tcBorders>
-              <w:bottom w:val="single" w:sz="8" w:space="0" w:color="000000"/>
+              <w:bottom w:val="single" w:sz="4" w:space="0" w:color="000000"/>
             </w:tcBorders>
           </w:tcPr>
           <w:p>
@@ -6726,7 +6751,7 @@
         </w:tc>
         <w:tc>
           <w:tcPr>
-            <w:tcW w:type="dxa" w:w="1276"/>
+            <w:tcW w:type="dxa" w:w="935"/>
             <w:vAlign w:val="center"/>
             <w:tcBorders>
               <w:bottom w:val="single" w:sz="4" w:space="0" w:color="000000"/>
@@ -6750,7 +6775,7 @@
         </w:tc>
         <w:tc>
           <w:tcPr>
-            <w:tcW w:type="dxa" w:w="935"/>
+            <w:tcW w:type="dxa" w:w="1276"/>
             <w:vAlign w:val="center"/>
             <w:tcBorders>
               <w:bottom w:val="single" w:sz="4" w:space="0" w:color="000000"/>
@@ -6854,6 +6879,27 @@
           <w:p>
             <w:pPr>
               <w:spacing w:before="0" w:after="0" w:line="240" w:lineRule="exact"/>
+              <w:jc w:val="center"/>
+            </w:pPr>
+            <w:r>
+              <w:rPr>
+                <w:rFonts w:ascii="Times New Roman" w:hAnsi="Times New Roman" w:eastAsia="宋体"/>
+                <w:b w:val="0"/>
+                <w:i w:val="0"/>
+                <w:sz w:val="18"/>
+              </w:rPr>
+              <w:t>76</w:t>
+            </w:r>
+          </w:p>
+        </w:tc>
+        <w:tc>
+          <w:tcPr>
+            <w:tcW w:type="dxa" w:w="935"/>
+            <w:vAlign w:val="center"/>
+          </w:tcPr>
+          <w:p>
+            <w:pPr>
+              <w:spacing w:before="0" w:after="0" w:line="240" w:lineRule="exact"/>
               <w:jc w:val="right"/>
             </w:pPr>
             <w:r>
@@ -6863,34 +6909,13 @@
                 <w:i w:val="0"/>
                 <w:sz w:val="18"/>
               </w:rPr>
-              <w:t>76</w:t>
+              <w:t>0.7131</w:t>
             </w:r>
           </w:p>
         </w:tc>
         <w:tc>
           <w:tcPr>
             <w:tcW w:type="dxa" w:w="1276"/>
-            <w:vAlign w:val="center"/>
-          </w:tcPr>
-          <w:p>
-            <w:pPr>
-              <w:spacing w:before="0" w:after="0" w:line="240" w:lineRule="exact"/>
-              <w:jc w:val="right"/>
-            </w:pPr>
-            <w:r>
-              <w:rPr>
-                <w:rFonts w:ascii="Times New Roman" w:hAnsi="Times New Roman" w:eastAsia="宋体"/>
-                <w:b w:val="0"/>
-                <w:i w:val="0"/>
-                <w:sz w:val="18"/>
-              </w:rPr>
-              <w:t>0.7131</w:t>
-            </w:r>
-          </w:p>
-        </w:tc>
-        <w:tc>
-          <w:tcPr>
-            <w:tcW w:type="dxa" w:w="935"/>
             <w:vAlign w:val="center"/>
           </w:tcPr>
           <w:p>
@@ -6985,6 +7010,27 @@
           <w:p>
             <w:pPr>
               <w:spacing w:before="0" w:after="0" w:line="240" w:lineRule="exact"/>
+              <w:jc w:val="center"/>
+            </w:pPr>
+            <w:r>
+              <w:rPr>
+                <w:rFonts w:ascii="Times New Roman" w:hAnsi="Times New Roman" w:eastAsia="宋体"/>
+                <w:b w:val="0"/>
+                <w:i w:val="0"/>
+                <w:sz w:val="18"/>
+              </w:rPr>
+              <w:t>76</w:t>
+            </w:r>
+          </w:p>
+        </w:tc>
+        <w:tc>
+          <w:tcPr>
+            <w:tcW w:type="dxa" w:w="935"/>
+            <w:vAlign w:val="center"/>
+          </w:tcPr>
+          <w:p>
+            <w:pPr>
+              <w:spacing w:before="0" w:after="0" w:line="240" w:lineRule="exact"/>
               <w:jc w:val="right"/>
             </w:pPr>
             <w:r>
@@ -6994,34 +7040,13 @@
                 <w:i w:val="0"/>
                 <w:sz w:val="18"/>
               </w:rPr>
-              <w:t>76</w:t>
+              <w:t>0.9079</w:t>
             </w:r>
           </w:p>
         </w:tc>
         <w:tc>
           <w:tcPr>
             <w:tcW w:type="dxa" w:w="1276"/>
-            <w:vAlign w:val="center"/>
-          </w:tcPr>
-          <w:p>
-            <w:pPr>
-              <w:spacing w:before="0" w:after="0" w:line="240" w:lineRule="exact"/>
-              <w:jc w:val="right"/>
-            </w:pPr>
-            <w:r>
-              <w:rPr>
-                <w:rFonts w:ascii="Times New Roman" w:hAnsi="Times New Roman" w:eastAsia="宋体"/>
-                <w:b w:val="0"/>
-                <w:i w:val="0"/>
-                <w:sz w:val="18"/>
-              </w:rPr>
-              <w:t>0.9079</w:t>
-            </w:r>
-          </w:p>
-        </w:tc>
-        <w:tc>
-          <w:tcPr>
-            <w:tcW w:type="dxa" w:w="935"/>
             <w:vAlign w:val="center"/>
           </w:tcPr>
           <w:p>
@@ -7122,7 +7147,7 @@
           <w:p>
             <w:pPr>
               <w:spacing w:before="0" w:after="0" w:line="240" w:lineRule="exact"/>
-              <w:jc w:val="right"/>
+              <w:jc w:val="center"/>
             </w:pPr>
             <w:r>
               <w:rPr>
@@ -7137,7 +7162,7 @@
         </w:tc>
         <w:tc>
           <w:tcPr>
-            <w:tcW w:type="dxa" w:w="1276"/>
+            <w:tcW w:type="dxa" w:w="935"/>
             <w:vAlign w:val="center"/>
             <w:tcBorders>
               <w:bottom w:val="single" w:sz="8" w:space="0" w:color="000000"/>
@@ -7161,7 +7186,7 @@
         </w:tc>
         <w:tc>
           <w:tcPr>
-            <w:tcW w:type="dxa" w:w="935"/>
+            <w:tcW w:type="dxa" w:w="1276"/>
             <w:vAlign w:val="center"/>
             <w:tcBorders>
               <w:bottom w:val="single" w:sz="8" w:space="0" w:color="000000"/>

</xml_diff>

<commit_message>
feat: implement journal formatting utilities and lexicon update for document generation
</commit_message>
<xml_diff>
--- a/paper/课程论文_提交版.docx
+++ b/paper/课程论文_提交版.docx
@@ -1756,7 +1756,7 @@
     </w:p>
     <w:tbl>
       <w:tblPr>
-        <w:tblW w:type="auto" w:w="0"/>
+        <w:tblW w:type="dxa" w:w="8504"/>
         <w:tblLayout w:type="fixed"/>
         <w:tblLook w:firstColumn="1" w:firstRow="1" w:lastColumn="0" w:lastRow="0" w:noHBand="0" w:noVBand="1" w:val="04A0"/>
         <w:jc w:val="center"/>
@@ -1770,11 +1770,11 @@
         </w:tblBorders>
       </w:tblPr>
       <w:tblGrid>
-        <w:gridCol w:w="1814"/>
-        <w:gridCol w:w="1814"/>
-        <w:gridCol w:w="1814"/>
-        <w:gridCol w:w="1814"/>
-        <w:gridCol w:w="1814"/>
+        <w:gridCol w:w="1530"/>
+        <w:gridCol w:w="2551"/>
+        <w:gridCol w:w="850"/>
+        <w:gridCol w:w="1615"/>
+        <w:gridCol w:w="1958"/>
       </w:tblGrid>
       <w:tr>
         <w:trPr>
@@ -1782,11 +1782,17 @@
         </w:trPr>
         <w:tc>
           <w:tcPr>
-            <w:tcW w:type="dxa" w:w="1531"/>
+            <w:tcW w:type="dxa" w:w="1530"/>
             <w:tcBorders>
               <w:top w:val="single" w:sz="8" w:space="0" w:color="000000"/>
               <w:bottom w:val="single" w:sz="4" w:space="0" w:color="000000"/>
             </w:tcBorders>
+            <w:tcMar>
+              <w:top w:type="dxa" w:w="0"/>
+              <w:bottom w:type="dxa" w:w="0"/>
+              <w:left w:type="dxa" w:w="56"/>
+              <w:right w:type="dxa" w:w="56"/>
+            </w:tcMar>
             <w:vAlign w:val="center"/>
           </w:tcPr>
           <w:p>
@@ -1812,6 +1818,12 @@
               <w:top w:val="single" w:sz="8" w:space="0" w:color="000000"/>
               <w:bottom w:val="single" w:sz="4" w:space="0" w:color="000000"/>
             </w:tcBorders>
+            <w:tcMar>
+              <w:top w:type="dxa" w:w="0"/>
+              <w:bottom w:type="dxa" w:w="0"/>
+              <w:left w:type="dxa" w:w="56"/>
+              <w:right w:type="dxa" w:w="56"/>
+            </w:tcMar>
             <w:vAlign w:val="center"/>
           </w:tcPr>
           <w:p>
@@ -1837,6 +1849,12 @@
               <w:top w:val="single" w:sz="8" w:space="0" w:color="000000"/>
               <w:bottom w:val="single" w:sz="4" w:space="0" w:color="000000"/>
             </w:tcBorders>
+            <w:tcMar>
+              <w:top w:type="dxa" w:w="0"/>
+              <w:bottom w:type="dxa" w:w="0"/>
+              <w:left w:type="dxa" w:w="56"/>
+              <w:right w:type="dxa" w:w="56"/>
+            </w:tcMar>
             <w:vAlign w:val="center"/>
           </w:tcPr>
           <w:p>
@@ -1857,11 +1875,17 @@
         </w:tc>
         <w:tc>
           <w:tcPr>
-            <w:tcW w:type="dxa" w:w="1616"/>
+            <w:tcW w:type="dxa" w:w="1615"/>
             <w:tcBorders>
               <w:top w:val="single" w:sz="8" w:space="0" w:color="000000"/>
               <w:bottom w:val="single" w:sz="4" w:space="0" w:color="000000"/>
             </w:tcBorders>
+            <w:tcMar>
+              <w:top w:type="dxa" w:w="0"/>
+              <w:bottom w:type="dxa" w:w="0"/>
+              <w:left w:type="dxa" w:w="56"/>
+              <w:right w:type="dxa" w:w="56"/>
+            </w:tcMar>
             <w:vAlign w:val="center"/>
           </w:tcPr>
           <w:p>
@@ -1882,11 +1906,17 @@
         </w:tc>
         <w:tc>
           <w:tcPr>
-            <w:tcW w:type="dxa" w:w="1956"/>
+            <w:tcW w:type="dxa" w:w="1958"/>
             <w:tcBorders>
               <w:top w:val="single" w:sz="8" w:space="0" w:color="000000"/>
               <w:bottom w:val="single" w:sz="4" w:space="0" w:color="000000"/>
             </w:tcBorders>
+            <w:tcMar>
+              <w:top w:type="dxa" w:w="0"/>
+              <w:bottom w:type="dxa" w:w="0"/>
+              <w:left w:type="dxa" w:w="56"/>
+              <w:right w:type="dxa" w:w="56"/>
+            </w:tcMar>
             <w:vAlign w:val="center"/>
           </w:tcPr>
           <w:p>
@@ -1912,7 +1942,13 @@
         </w:trPr>
         <w:tc>
           <w:tcPr>
-            <w:tcW w:type="dxa" w:w="1531"/>
+            <w:tcW w:type="dxa" w:w="1530"/>
+            <w:tcMar>
+              <w:top w:type="dxa" w:w="0"/>
+              <w:bottom w:type="dxa" w:w="0"/>
+              <w:left w:type="dxa" w:w="56"/>
+              <w:right w:type="dxa" w:w="56"/>
+            </w:tcMar>
             <w:vAlign w:val="center"/>
           </w:tcPr>
           <w:p>
@@ -1934,6 +1970,12 @@
         <w:tc>
           <w:tcPr>
             <w:tcW w:type="dxa" w:w="2551"/>
+            <w:tcMar>
+              <w:top w:type="dxa" w:w="0"/>
+              <w:bottom w:type="dxa" w:w="0"/>
+              <w:left w:type="dxa" w:w="56"/>
+              <w:right w:type="dxa" w:w="56"/>
+            </w:tcMar>
             <w:vAlign w:val="center"/>
           </w:tcPr>
           <w:p>
@@ -1955,6 +1997,12 @@
         <w:tc>
           <w:tcPr>
             <w:tcW w:type="dxa" w:w="850"/>
+            <w:tcMar>
+              <w:top w:type="dxa" w:w="0"/>
+              <w:bottom w:type="dxa" w:w="0"/>
+              <w:left w:type="dxa" w:w="56"/>
+              <w:right w:type="dxa" w:w="56"/>
+            </w:tcMar>
             <w:vAlign w:val="center"/>
           </w:tcPr>
           <w:p>
@@ -1975,7 +2023,13 @@
         </w:tc>
         <w:tc>
           <w:tcPr>
-            <w:tcW w:type="dxa" w:w="1616"/>
+            <w:tcW w:type="dxa" w:w="1615"/>
+            <w:tcMar>
+              <w:top w:type="dxa" w:w="0"/>
+              <w:bottom w:type="dxa" w:w="0"/>
+              <w:left w:type="dxa" w:w="56"/>
+              <w:right w:type="dxa" w:w="56"/>
+            </w:tcMar>
             <w:vAlign w:val="center"/>
           </w:tcPr>
           <w:p>
@@ -1996,7 +2050,13 @@
         </w:tc>
         <w:tc>
           <w:tcPr>
-            <w:tcW w:type="dxa" w:w="1956"/>
+            <w:tcW w:type="dxa" w:w="1958"/>
+            <w:tcMar>
+              <w:top w:type="dxa" w:w="0"/>
+              <w:bottom w:type="dxa" w:w="0"/>
+              <w:left w:type="dxa" w:w="56"/>
+              <w:right w:type="dxa" w:w="56"/>
+            </w:tcMar>
             <w:vAlign w:val="center"/>
           </w:tcPr>
           <w:p>
@@ -2022,7 +2082,13 @@
         </w:trPr>
         <w:tc>
           <w:tcPr>
-            <w:tcW w:type="dxa" w:w="1531"/>
+            <w:tcW w:type="dxa" w:w="1530"/>
+            <w:tcMar>
+              <w:top w:type="dxa" w:w="0"/>
+              <w:bottom w:type="dxa" w:w="0"/>
+              <w:left w:type="dxa" w:w="56"/>
+              <w:right w:type="dxa" w:w="56"/>
+            </w:tcMar>
             <w:vAlign w:val="center"/>
           </w:tcPr>
           <w:p>
@@ -2044,6 +2110,12 @@
         <w:tc>
           <w:tcPr>
             <w:tcW w:type="dxa" w:w="2551"/>
+            <w:tcMar>
+              <w:top w:type="dxa" w:w="0"/>
+              <w:bottom w:type="dxa" w:w="0"/>
+              <w:left w:type="dxa" w:w="56"/>
+              <w:right w:type="dxa" w:w="56"/>
+            </w:tcMar>
             <w:vAlign w:val="center"/>
           </w:tcPr>
           <w:p>
@@ -2065,6 +2137,12 @@
         <w:tc>
           <w:tcPr>
             <w:tcW w:type="dxa" w:w="850"/>
+            <w:tcMar>
+              <w:top w:type="dxa" w:w="0"/>
+              <w:bottom w:type="dxa" w:w="0"/>
+              <w:left w:type="dxa" w:w="56"/>
+              <w:right w:type="dxa" w:w="56"/>
+            </w:tcMar>
             <w:vAlign w:val="center"/>
           </w:tcPr>
           <w:p>
@@ -2085,7 +2163,13 @@
         </w:tc>
         <w:tc>
           <w:tcPr>
-            <w:tcW w:type="dxa" w:w="1616"/>
+            <w:tcW w:type="dxa" w:w="1615"/>
+            <w:tcMar>
+              <w:top w:type="dxa" w:w="0"/>
+              <w:bottom w:type="dxa" w:w="0"/>
+              <w:left w:type="dxa" w:w="56"/>
+              <w:right w:type="dxa" w:w="56"/>
+            </w:tcMar>
             <w:vAlign w:val="center"/>
           </w:tcPr>
           <w:p>
@@ -2106,7 +2190,13 @@
         </w:tc>
         <w:tc>
           <w:tcPr>
-            <w:tcW w:type="dxa" w:w="1956"/>
+            <w:tcW w:type="dxa" w:w="1958"/>
+            <w:tcMar>
+              <w:top w:type="dxa" w:w="0"/>
+              <w:bottom w:type="dxa" w:w="0"/>
+              <w:left w:type="dxa" w:w="56"/>
+              <w:right w:type="dxa" w:w="56"/>
+            </w:tcMar>
             <w:vAlign w:val="center"/>
           </w:tcPr>
           <w:p>
@@ -2132,7 +2222,13 @@
         </w:trPr>
         <w:tc>
           <w:tcPr>
-            <w:tcW w:type="dxa" w:w="1531"/>
+            <w:tcW w:type="dxa" w:w="1530"/>
+            <w:tcMar>
+              <w:top w:type="dxa" w:w="0"/>
+              <w:bottom w:type="dxa" w:w="0"/>
+              <w:left w:type="dxa" w:w="56"/>
+              <w:right w:type="dxa" w:w="56"/>
+            </w:tcMar>
             <w:vAlign w:val="center"/>
           </w:tcPr>
           <w:p>
@@ -2154,6 +2250,12 @@
         <w:tc>
           <w:tcPr>
             <w:tcW w:type="dxa" w:w="2551"/>
+            <w:tcMar>
+              <w:top w:type="dxa" w:w="0"/>
+              <w:bottom w:type="dxa" w:w="0"/>
+              <w:left w:type="dxa" w:w="56"/>
+              <w:right w:type="dxa" w:w="56"/>
+            </w:tcMar>
             <w:vAlign w:val="center"/>
           </w:tcPr>
           <w:p>
@@ -2175,6 +2277,12 @@
         <w:tc>
           <w:tcPr>
             <w:tcW w:type="dxa" w:w="850"/>
+            <w:tcMar>
+              <w:top w:type="dxa" w:w="0"/>
+              <w:bottom w:type="dxa" w:w="0"/>
+              <w:left w:type="dxa" w:w="56"/>
+              <w:right w:type="dxa" w:w="56"/>
+            </w:tcMar>
             <w:vAlign w:val="center"/>
           </w:tcPr>
           <w:p>
@@ -2195,7 +2303,13 @@
         </w:tc>
         <w:tc>
           <w:tcPr>
-            <w:tcW w:type="dxa" w:w="1616"/>
+            <w:tcW w:type="dxa" w:w="1615"/>
+            <w:tcMar>
+              <w:top w:type="dxa" w:w="0"/>
+              <w:bottom w:type="dxa" w:w="0"/>
+              <w:left w:type="dxa" w:w="56"/>
+              <w:right w:type="dxa" w:w="56"/>
+            </w:tcMar>
             <w:vAlign w:val="center"/>
           </w:tcPr>
           <w:p>
@@ -2216,7 +2330,13 @@
         </w:tc>
         <w:tc>
           <w:tcPr>
-            <w:tcW w:type="dxa" w:w="1956"/>
+            <w:tcW w:type="dxa" w:w="1958"/>
+            <w:tcMar>
+              <w:top w:type="dxa" w:w="0"/>
+              <w:bottom w:type="dxa" w:w="0"/>
+              <w:left w:type="dxa" w:w="56"/>
+              <w:right w:type="dxa" w:w="56"/>
+            </w:tcMar>
             <w:vAlign w:val="center"/>
           </w:tcPr>
           <w:p>
@@ -2242,7 +2362,13 @@
         </w:trPr>
         <w:tc>
           <w:tcPr>
-            <w:tcW w:type="dxa" w:w="1531"/>
+            <w:tcW w:type="dxa" w:w="1530"/>
+            <w:tcMar>
+              <w:top w:type="dxa" w:w="0"/>
+              <w:bottom w:type="dxa" w:w="0"/>
+              <w:left w:type="dxa" w:w="56"/>
+              <w:right w:type="dxa" w:w="56"/>
+            </w:tcMar>
             <w:vAlign w:val="center"/>
           </w:tcPr>
           <w:p>
@@ -2264,6 +2390,12 @@
         <w:tc>
           <w:tcPr>
             <w:tcW w:type="dxa" w:w="2551"/>
+            <w:tcMar>
+              <w:top w:type="dxa" w:w="0"/>
+              <w:bottom w:type="dxa" w:w="0"/>
+              <w:left w:type="dxa" w:w="56"/>
+              <w:right w:type="dxa" w:w="56"/>
+            </w:tcMar>
             <w:vAlign w:val="center"/>
           </w:tcPr>
           <w:p>
@@ -2285,6 +2417,12 @@
         <w:tc>
           <w:tcPr>
             <w:tcW w:type="dxa" w:w="850"/>
+            <w:tcMar>
+              <w:top w:type="dxa" w:w="0"/>
+              <w:bottom w:type="dxa" w:w="0"/>
+              <w:left w:type="dxa" w:w="56"/>
+              <w:right w:type="dxa" w:w="56"/>
+            </w:tcMar>
             <w:vAlign w:val="center"/>
           </w:tcPr>
           <w:p>
@@ -2305,7 +2443,13 @@
         </w:tc>
         <w:tc>
           <w:tcPr>
-            <w:tcW w:type="dxa" w:w="1616"/>
+            <w:tcW w:type="dxa" w:w="1615"/>
+            <w:tcMar>
+              <w:top w:type="dxa" w:w="0"/>
+              <w:bottom w:type="dxa" w:w="0"/>
+              <w:left w:type="dxa" w:w="56"/>
+              <w:right w:type="dxa" w:w="56"/>
+            </w:tcMar>
             <w:vAlign w:val="center"/>
           </w:tcPr>
           <w:p>
@@ -2326,7 +2470,13 @@
         </w:tc>
         <w:tc>
           <w:tcPr>
-            <w:tcW w:type="dxa" w:w="1956"/>
+            <w:tcW w:type="dxa" w:w="1958"/>
+            <w:tcMar>
+              <w:top w:type="dxa" w:w="0"/>
+              <w:bottom w:type="dxa" w:w="0"/>
+              <w:left w:type="dxa" w:w="56"/>
+              <w:right w:type="dxa" w:w="56"/>
+            </w:tcMar>
             <w:vAlign w:val="center"/>
           </w:tcPr>
           <w:p>
@@ -2352,7 +2502,13 @@
         </w:trPr>
         <w:tc>
           <w:tcPr>
-            <w:tcW w:type="dxa" w:w="1531"/>
+            <w:tcW w:type="dxa" w:w="1530"/>
+            <w:tcMar>
+              <w:top w:type="dxa" w:w="0"/>
+              <w:bottom w:type="dxa" w:w="0"/>
+              <w:left w:type="dxa" w:w="56"/>
+              <w:right w:type="dxa" w:w="56"/>
+            </w:tcMar>
             <w:vAlign w:val="center"/>
             <w:tcBorders>
               <w:bottom w:val="single" w:sz="8" w:space="0" w:color="000000"/>
@@ -2377,6 +2533,12 @@
         <w:tc>
           <w:tcPr>
             <w:tcW w:type="dxa" w:w="2551"/>
+            <w:tcMar>
+              <w:top w:type="dxa" w:w="0"/>
+              <w:bottom w:type="dxa" w:w="0"/>
+              <w:left w:type="dxa" w:w="56"/>
+              <w:right w:type="dxa" w:w="56"/>
+            </w:tcMar>
             <w:vAlign w:val="center"/>
             <w:tcBorders>
               <w:bottom w:val="single" w:sz="8" w:space="0" w:color="000000"/>
@@ -2401,6 +2563,12 @@
         <w:tc>
           <w:tcPr>
             <w:tcW w:type="dxa" w:w="850"/>
+            <w:tcMar>
+              <w:top w:type="dxa" w:w="0"/>
+              <w:bottom w:type="dxa" w:w="0"/>
+              <w:left w:type="dxa" w:w="56"/>
+              <w:right w:type="dxa" w:w="56"/>
+            </w:tcMar>
             <w:vAlign w:val="center"/>
             <w:tcBorders>
               <w:bottom w:val="single" w:sz="8" w:space="0" w:color="000000"/>
@@ -2424,7 +2592,13 @@
         </w:tc>
         <w:tc>
           <w:tcPr>
-            <w:tcW w:type="dxa" w:w="1616"/>
+            <w:tcW w:type="dxa" w:w="1615"/>
+            <w:tcMar>
+              <w:top w:type="dxa" w:w="0"/>
+              <w:bottom w:type="dxa" w:w="0"/>
+              <w:left w:type="dxa" w:w="56"/>
+              <w:right w:type="dxa" w:w="56"/>
+            </w:tcMar>
             <w:vAlign w:val="center"/>
             <w:tcBorders>
               <w:bottom w:val="single" w:sz="8" w:space="0" w:color="000000"/>
@@ -2448,7 +2622,13 @@
         </w:tc>
         <w:tc>
           <w:tcPr>
-            <w:tcW w:type="dxa" w:w="1956"/>
+            <w:tcW w:type="dxa" w:w="1958"/>
+            <w:tcMar>
+              <w:top w:type="dxa" w:w="0"/>
+              <w:bottom w:type="dxa" w:w="0"/>
+              <w:left w:type="dxa" w:w="56"/>
+              <w:right w:type="dxa" w:w="56"/>
+            </w:tcMar>
             <w:vAlign w:val="center"/>
             <w:tcBorders>
               <w:bottom w:val="single" w:sz="8" w:space="0" w:color="000000"/>
@@ -3133,7 +3313,7 @@
     </w:p>
     <w:tbl>
       <w:tblPr>
-        <w:tblW w:type="auto" w:w="0"/>
+        <w:tblW w:type="dxa" w:w="8504"/>
         <w:tblLayout w:type="fixed"/>
         <w:tblLook w:firstColumn="1" w:firstRow="1" w:lastColumn="0" w:lastRow="0" w:noHBand="0" w:noVBand="1" w:val="04A0"/>
         <w:jc w:val="center"/>
@@ -3147,11 +3327,11 @@
         </w:tblBorders>
       </w:tblPr>
       <w:tblGrid>
-        <w:gridCol w:w="1814"/>
-        <w:gridCol w:w="1814"/>
-        <w:gridCol w:w="1814"/>
-        <w:gridCol w:w="1814"/>
-        <w:gridCol w:w="1814"/>
+        <w:gridCol w:w="2721"/>
+        <w:gridCol w:w="1445"/>
+        <w:gridCol w:w="1445"/>
+        <w:gridCol w:w="1445"/>
+        <w:gridCol w:w="1448"/>
       </w:tblGrid>
       <w:tr>
         <w:trPr>
@@ -3164,6 +3344,12 @@
               <w:top w:val="single" w:sz="8" w:space="0" w:color="000000"/>
               <w:bottom w:val="single" w:sz="4" w:space="0" w:color="000000"/>
             </w:tcBorders>
+            <w:tcMar>
+              <w:top w:type="dxa" w:w="0"/>
+              <w:bottom w:type="dxa" w:w="0"/>
+              <w:left w:type="dxa" w:w="56"/>
+              <w:right w:type="dxa" w:w="56"/>
+            </w:tcMar>
             <w:vAlign w:val="center"/>
           </w:tcPr>
           <w:p>
@@ -3184,11 +3370,17 @@
         </w:tc>
         <w:tc>
           <w:tcPr>
-            <w:tcW w:type="dxa" w:w="1446"/>
+            <w:tcW w:type="dxa" w:w="1445"/>
             <w:tcBorders>
               <w:top w:val="single" w:sz="8" w:space="0" w:color="000000"/>
               <w:bottom w:val="single" w:sz="4" w:space="0" w:color="000000"/>
             </w:tcBorders>
+            <w:tcMar>
+              <w:top w:type="dxa" w:w="0"/>
+              <w:bottom w:type="dxa" w:w="0"/>
+              <w:left w:type="dxa" w:w="56"/>
+              <w:right w:type="dxa" w:w="56"/>
+            </w:tcMar>
             <w:vAlign w:val="center"/>
           </w:tcPr>
           <w:p>
@@ -3209,11 +3401,17 @@
         </w:tc>
         <w:tc>
           <w:tcPr>
-            <w:tcW w:type="dxa" w:w="1446"/>
+            <w:tcW w:type="dxa" w:w="1445"/>
             <w:tcBorders>
               <w:top w:val="single" w:sz="8" w:space="0" w:color="000000"/>
               <w:bottom w:val="single" w:sz="4" w:space="0" w:color="000000"/>
             </w:tcBorders>
+            <w:tcMar>
+              <w:top w:type="dxa" w:w="0"/>
+              <w:bottom w:type="dxa" w:w="0"/>
+              <w:left w:type="dxa" w:w="56"/>
+              <w:right w:type="dxa" w:w="56"/>
+            </w:tcMar>
             <w:vAlign w:val="center"/>
           </w:tcPr>
           <w:p>
@@ -3234,11 +3432,17 @@
         </w:tc>
         <w:tc>
           <w:tcPr>
-            <w:tcW w:type="dxa" w:w="1446"/>
+            <w:tcW w:type="dxa" w:w="1445"/>
             <w:tcBorders>
               <w:top w:val="single" w:sz="8" w:space="0" w:color="000000"/>
               <w:bottom w:val="single" w:sz="4" w:space="0" w:color="000000"/>
             </w:tcBorders>
+            <w:tcMar>
+              <w:top w:type="dxa" w:w="0"/>
+              <w:bottom w:type="dxa" w:w="0"/>
+              <w:left w:type="dxa" w:w="56"/>
+              <w:right w:type="dxa" w:w="56"/>
+            </w:tcMar>
             <w:vAlign w:val="center"/>
           </w:tcPr>
           <w:p>
@@ -3259,11 +3463,17 @@
         </w:tc>
         <w:tc>
           <w:tcPr>
-            <w:tcW w:type="dxa" w:w="1446"/>
+            <w:tcW w:type="dxa" w:w="1448"/>
             <w:tcBorders>
               <w:top w:val="single" w:sz="8" w:space="0" w:color="000000"/>
               <w:bottom w:val="single" w:sz="4" w:space="0" w:color="000000"/>
             </w:tcBorders>
+            <w:tcMar>
+              <w:top w:type="dxa" w:w="0"/>
+              <w:bottom w:type="dxa" w:w="0"/>
+              <w:left w:type="dxa" w:w="56"/>
+              <w:right w:type="dxa" w:w="56"/>
+            </w:tcMar>
             <w:vAlign w:val="center"/>
           </w:tcPr>
           <w:p>
@@ -3290,6 +3500,12 @@
         <w:tc>
           <w:tcPr>
             <w:tcW w:type="dxa" w:w="2721"/>
+            <w:tcMar>
+              <w:top w:type="dxa" w:w="0"/>
+              <w:bottom w:type="dxa" w:w="0"/>
+              <w:left w:type="dxa" w:w="56"/>
+              <w:right w:type="dxa" w:w="56"/>
+            </w:tcMar>
             <w:vAlign w:val="center"/>
           </w:tcPr>
           <w:p>
@@ -3310,7 +3526,13 @@
         </w:tc>
         <w:tc>
           <w:tcPr>
-            <w:tcW w:type="dxa" w:w="1446"/>
+            <w:tcW w:type="dxa" w:w="1445"/>
+            <w:tcMar>
+              <w:top w:type="dxa" w:w="0"/>
+              <w:bottom w:type="dxa" w:w="0"/>
+              <w:left w:type="dxa" w:w="56"/>
+              <w:right w:type="dxa" w:w="56"/>
+            </w:tcMar>
             <w:vAlign w:val="center"/>
           </w:tcPr>
           <w:p>
@@ -3331,7 +3553,13 @@
         </w:tc>
         <w:tc>
           <w:tcPr>
-            <w:tcW w:type="dxa" w:w="1446"/>
+            <w:tcW w:type="dxa" w:w="1445"/>
+            <w:tcMar>
+              <w:top w:type="dxa" w:w="0"/>
+              <w:bottom w:type="dxa" w:w="0"/>
+              <w:left w:type="dxa" w:w="56"/>
+              <w:right w:type="dxa" w:w="56"/>
+            </w:tcMar>
             <w:vAlign w:val="center"/>
           </w:tcPr>
           <w:p>
@@ -3352,7 +3580,13 @@
         </w:tc>
         <w:tc>
           <w:tcPr>
-            <w:tcW w:type="dxa" w:w="1446"/>
+            <w:tcW w:type="dxa" w:w="1445"/>
+            <w:tcMar>
+              <w:top w:type="dxa" w:w="0"/>
+              <w:bottom w:type="dxa" w:w="0"/>
+              <w:left w:type="dxa" w:w="56"/>
+              <w:right w:type="dxa" w:w="56"/>
+            </w:tcMar>
             <w:vAlign w:val="center"/>
           </w:tcPr>
           <w:p>
@@ -3373,7 +3607,13 @@
         </w:tc>
         <w:tc>
           <w:tcPr>
-            <w:tcW w:type="dxa" w:w="1446"/>
+            <w:tcW w:type="dxa" w:w="1448"/>
+            <w:tcMar>
+              <w:top w:type="dxa" w:w="0"/>
+              <w:bottom w:type="dxa" w:w="0"/>
+              <w:left w:type="dxa" w:w="56"/>
+              <w:right w:type="dxa" w:w="56"/>
+            </w:tcMar>
             <w:vAlign w:val="center"/>
           </w:tcPr>
           <w:p>
@@ -3400,6 +3640,12 @@
         <w:tc>
           <w:tcPr>
             <w:tcW w:type="dxa" w:w="2721"/>
+            <w:tcMar>
+              <w:top w:type="dxa" w:w="0"/>
+              <w:bottom w:type="dxa" w:w="0"/>
+              <w:left w:type="dxa" w:w="56"/>
+              <w:right w:type="dxa" w:w="56"/>
+            </w:tcMar>
             <w:vAlign w:val="center"/>
           </w:tcPr>
           <w:p>
@@ -3420,17 +3666,29 @@
         </w:tc>
         <w:tc>
           <w:tcPr>
-            <w:tcW w:type="dxa" w:w="1446"/>
-            <w:vAlign w:val="center"/>
-          </w:tcPr>
-          <w:p>
-            <w:pPr>
-              <w:spacing w:before="0" w:after="0" w:line="240" w:lineRule="exact"/>
-              <w:jc w:val="right"/>
-            </w:pPr>
-            <w:r>
-              <w:rPr>
-                <w:rFonts w:ascii="Times New Roman" w:hAnsi="Times New Roman" w:eastAsia="宋体"/>
+            <w:tcW w:type="dxa" w:w="1445"/>
+            <w:tcMar>
+              <w:top w:type="dxa" w:w="0"/>
+              <w:bottom w:type="dxa" w:w="0"/>
+              <w:left w:type="dxa" w:w="56"/>
+              <w:right w:type="dxa" w:w="56"/>
+            </w:tcMar>
+          </w:tcPr>
+          <w:p>
+            <w:pPr>
+              <w:spacing w:before="0" w:after="0" w:line="240" w:lineRule="exact"/>
+              <w:ind w:left="0" w:right="0"/>
+              <w:jc w:val="left"/>
+              <w:tabs>
+                <w:tab w:val="decimal" w:pos="598"/>
+              </w:tabs>
+            </w:pPr>
+            <w:r>
+              <w:tab/>
+            </w:r>
+            <w:r>
+              <w:rPr>
+                <w:rFonts w:ascii="Times New Roman" w:hAnsi="Times New Roman" w:eastAsia="Times New Roman"/>
                 <w:b w:val="0"/>
                 <w:i w:val="0"/>
                 <w:sz w:val="18"/>
@@ -3441,7 +3699,13 @@
         </w:tc>
         <w:tc>
           <w:tcPr>
-            <w:tcW w:type="dxa" w:w="1446"/>
+            <w:tcW w:type="dxa" w:w="1445"/>
+            <w:tcMar>
+              <w:top w:type="dxa" w:w="0"/>
+              <w:bottom w:type="dxa" w:w="0"/>
+              <w:left w:type="dxa" w:w="56"/>
+              <w:right w:type="dxa" w:w="56"/>
+            </w:tcMar>
             <w:vAlign w:val="center"/>
           </w:tcPr>
           <w:p>
@@ -3462,17 +3726,29 @@
         </w:tc>
         <w:tc>
           <w:tcPr>
-            <w:tcW w:type="dxa" w:w="1446"/>
-            <w:vAlign w:val="center"/>
-          </w:tcPr>
-          <w:p>
-            <w:pPr>
-              <w:spacing w:before="0" w:after="0" w:line="240" w:lineRule="exact"/>
-              <w:jc w:val="right"/>
-            </w:pPr>
-            <w:r>
-              <w:rPr>
-                <w:rFonts w:ascii="Times New Roman" w:hAnsi="Times New Roman" w:eastAsia="宋体"/>
+            <w:tcW w:type="dxa" w:w="1445"/>
+            <w:tcMar>
+              <w:top w:type="dxa" w:w="0"/>
+              <w:bottom w:type="dxa" w:w="0"/>
+              <w:left w:type="dxa" w:w="56"/>
+              <w:right w:type="dxa" w:w="56"/>
+            </w:tcMar>
+          </w:tcPr>
+          <w:p>
+            <w:pPr>
+              <w:spacing w:before="0" w:after="0" w:line="240" w:lineRule="exact"/>
+              <w:ind w:left="0" w:right="0"/>
+              <w:jc w:val="left"/>
+              <w:tabs>
+                <w:tab w:val="decimal" w:pos="598"/>
+              </w:tabs>
+            </w:pPr>
+            <w:r>
+              <w:tab/>
+            </w:r>
+            <w:r>
+              <w:rPr>
+                <w:rFonts w:ascii="Times New Roman" w:hAnsi="Times New Roman" w:eastAsia="Times New Roman"/>
                 <w:b w:val="0"/>
                 <w:i w:val="0"/>
                 <w:sz w:val="18"/>
@@ -3483,7 +3759,13 @@
         </w:tc>
         <w:tc>
           <w:tcPr>
-            <w:tcW w:type="dxa" w:w="1446"/>
+            <w:tcW w:type="dxa" w:w="1448"/>
+            <w:tcMar>
+              <w:top w:type="dxa" w:w="0"/>
+              <w:bottom w:type="dxa" w:w="0"/>
+              <w:left w:type="dxa" w:w="56"/>
+              <w:right w:type="dxa" w:w="56"/>
+            </w:tcMar>
             <w:vAlign w:val="center"/>
           </w:tcPr>
           <w:p>
@@ -3510,6 +3792,12 @@
         <w:tc>
           <w:tcPr>
             <w:tcW w:type="dxa" w:w="2721"/>
+            <w:tcMar>
+              <w:top w:type="dxa" w:w="0"/>
+              <w:bottom w:type="dxa" w:w="0"/>
+              <w:left w:type="dxa" w:w="56"/>
+              <w:right w:type="dxa" w:w="56"/>
+            </w:tcMar>
             <w:vAlign w:val="center"/>
             <w:tcBorders>
               <w:bottom w:val="single" w:sz="4" w:space="0" w:color="000000"/>
@@ -3533,8 +3821,13 @@
         </w:tc>
         <w:tc>
           <w:tcPr>
-            <w:tcW w:type="dxa" w:w="1446"/>
-            <w:vAlign w:val="center"/>
+            <w:tcW w:type="dxa" w:w="1445"/>
+            <w:tcMar>
+              <w:top w:type="dxa" w:w="0"/>
+              <w:bottom w:type="dxa" w:w="0"/>
+              <w:left w:type="dxa" w:w="56"/>
+              <w:right w:type="dxa" w:w="56"/>
+            </w:tcMar>
             <w:tcBorders>
               <w:bottom w:val="single" w:sz="4" w:space="0" w:color="000000"/>
             </w:tcBorders>
@@ -3542,11 +3835,18 @@
           <w:p>
             <w:pPr>
               <w:spacing w:before="0" w:after="0" w:line="240" w:lineRule="exact"/>
-              <w:jc w:val="right"/>
-            </w:pPr>
-            <w:r>
-              <w:rPr>
-                <w:rFonts w:ascii="Times New Roman" w:hAnsi="Times New Roman" w:eastAsia="宋体"/>
+              <w:ind w:left="0" w:right="0"/>
+              <w:jc w:val="left"/>
+              <w:tabs>
+                <w:tab w:val="decimal" w:pos="598"/>
+              </w:tabs>
+            </w:pPr>
+            <w:r>
+              <w:tab/>
+            </w:r>
+            <w:r>
+              <w:rPr>
+                <w:rFonts w:ascii="Times New Roman" w:hAnsi="Times New Roman" w:eastAsia="Times New Roman"/>
                 <w:b w:val="0"/>
                 <w:i w:val="0"/>
                 <w:sz w:val="18"/>
@@ -3557,8 +3857,13 @@
         </w:tc>
         <w:tc>
           <w:tcPr>
-            <w:tcW w:type="dxa" w:w="1446"/>
-            <w:vAlign w:val="center"/>
+            <w:tcW w:type="dxa" w:w="1445"/>
+            <w:tcMar>
+              <w:top w:type="dxa" w:w="0"/>
+              <w:bottom w:type="dxa" w:w="0"/>
+              <w:left w:type="dxa" w:w="56"/>
+              <w:right w:type="dxa" w:w="56"/>
+            </w:tcMar>
             <w:tcBorders>
               <w:bottom w:val="single" w:sz="4" w:space="0" w:color="000000"/>
             </w:tcBorders>
@@ -3566,11 +3871,18 @@
           <w:p>
             <w:pPr>
               <w:spacing w:before="0" w:after="0" w:line="240" w:lineRule="exact"/>
-              <w:jc w:val="right"/>
-            </w:pPr>
-            <w:r>
-              <w:rPr>
-                <w:rFonts w:ascii="Times New Roman" w:hAnsi="Times New Roman" w:eastAsia="宋体"/>
+              <w:ind w:left="0" w:right="0"/>
+              <w:jc w:val="left"/>
+              <w:tabs>
+                <w:tab w:val="decimal" w:pos="598"/>
+              </w:tabs>
+            </w:pPr>
+            <w:r>
+              <w:tab/>
+            </w:r>
+            <w:r>
+              <w:rPr>
+                <w:rFonts w:ascii="Times New Roman" w:hAnsi="Times New Roman" w:eastAsia="Times New Roman"/>
                 <w:b w:val="0"/>
                 <w:i w:val="0"/>
                 <w:sz w:val="18"/>
@@ -3581,8 +3893,13 @@
         </w:tc>
         <w:tc>
           <w:tcPr>
-            <w:tcW w:type="dxa" w:w="1446"/>
-            <w:vAlign w:val="center"/>
+            <w:tcW w:type="dxa" w:w="1445"/>
+            <w:tcMar>
+              <w:top w:type="dxa" w:w="0"/>
+              <w:bottom w:type="dxa" w:w="0"/>
+              <w:left w:type="dxa" w:w="56"/>
+              <w:right w:type="dxa" w:w="56"/>
+            </w:tcMar>
             <w:tcBorders>
               <w:bottom w:val="single" w:sz="4" w:space="0" w:color="000000"/>
             </w:tcBorders>
@@ -3590,11 +3907,18 @@
           <w:p>
             <w:pPr>
               <w:spacing w:before="0" w:after="0" w:line="240" w:lineRule="exact"/>
-              <w:jc w:val="right"/>
-            </w:pPr>
-            <w:r>
-              <w:rPr>
-                <w:rFonts w:ascii="Times New Roman" w:hAnsi="Times New Roman" w:eastAsia="宋体"/>
+              <w:ind w:left="0" w:right="0"/>
+              <w:jc w:val="left"/>
+              <w:tabs>
+                <w:tab w:val="decimal" w:pos="598"/>
+              </w:tabs>
+            </w:pPr>
+            <w:r>
+              <w:tab/>
+            </w:r>
+            <w:r>
+              <w:rPr>
+                <w:rFonts w:ascii="Times New Roman" w:hAnsi="Times New Roman" w:eastAsia="Times New Roman"/>
                 <w:b w:val="0"/>
                 <w:i w:val="0"/>
                 <w:sz w:val="18"/>
@@ -3605,8 +3929,13 @@
         </w:tc>
         <w:tc>
           <w:tcPr>
-            <w:tcW w:type="dxa" w:w="1446"/>
-            <w:vAlign w:val="center"/>
+            <w:tcW w:type="dxa" w:w="1448"/>
+            <w:tcMar>
+              <w:top w:type="dxa" w:w="0"/>
+              <w:bottom w:type="dxa" w:w="0"/>
+              <w:left w:type="dxa" w:w="56"/>
+              <w:right w:type="dxa" w:w="56"/>
+            </w:tcMar>
             <w:tcBorders>
               <w:bottom w:val="single" w:sz="4" w:space="0" w:color="000000"/>
             </w:tcBorders>
@@ -3614,11 +3943,18 @@
           <w:p>
             <w:pPr>
               <w:spacing w:before="0" w:after="0" w:line="240" w:lineRule="exact"/>
-              <w:jc w:val="right"/>
-            </w:pPr>
-            <w:r>
-              <w:rPr>
-                <w:rFonts w:ascii="Times New Roman" w:hAnsi="Times New Roman" w:eastAsia="宋体"/>
+              <w:ind w:left="0" w:right="0"/>
+              <w:jc w:val="left"/>
+              <w:tabs>
+                <w:tab w:val="decimal" w:pos="598"/>
+              </w:tabs>
+            </w:pPr>
+            <w:r>
+              <w:tab/>
+            </w:r>
+            <w:r>
+              <w:rPr>
+                <w:rFonts w:ascii="Times New Roman" w:hAnsi="Times New Roman" w:eastAsia="Times New Roman"/>
                 <w:b w:val="0"/>
                 <w:i w:val="0"/>
                 <w:sz w:val="18"/>
@@ -3648,7 +3984,7 @@
     </w:p>
     <w:tbl>
       <w:tblPr>
-        <w:tblW w:type="auto" w:w="0"/>
+        <w:tblW w:type="dxa" w:w="8504"/>
         <w:tblLayout w:type="fixed"/>
         <w:tblLook w:firstColumn="1" w:firstRow="1" w:lastColumn="0" w:lastRow="0" w:noHBand="0" w:noVBand="1" w:val="04A0"/>
         <w:jc w:val="center"/>
@@ -3662,9 +3998,9 @@
         </w:tblBorders>
       </w:tblPr>
       <w:tblGrid>
-        <w:gridCol w:w="3024"/>
-        <w:gridCol w:w="3024"/>
-        <w:gridCol w:w="3024"/>
+        <w:gridCol w:w="2721"/>
+        <w:gridCol w:w="2891"/>
+        <w:gridCol w:w="2892"/>
       </w:tblGrid>
       <w:tr>
         <w:trPr>
@@ -3673,6 +4009,12 @@
         <w:tc>
           <w:tcPr>
             <w:tcW w:type="dxa" w:w="2721"/>
+            <w:tcMar>
+              <w:top w:type="dxa" w:w="0"/>
+              <w:bottom w:type="dxa" w:w="0"/>
+              <w:left w:type="dxa" w:w="56"/>
+              <w:right w:type="dxa" w:w="56"/>
+            </w:tcMar>
             <w:vAlign w:val="center"/>
             <w:tcBorders>
               <w:bottom w:val="single" w:sz="4" w:space="0" w:color="000000"/>
@@ -3697,6 +4039,12 @@
         <w:tc>
           <w:tcPr>
             <w:tcW w:type="dxa" w:w="2891"/>
+            <w:tcMar>
+              <w:top w:type="dxa" w:w="0"/>
+              <w:bottom w:type="dxa" w:w="0"/>
+              <w:left w:type="dxa" w:w="56"/>
+              <w:right w:type="dxa" w:w="56"/>
+            </w:tcMar>
             <w:vAlign w:val="center"/>
             <w:tcBorders>
               <w:bottom w:val="single" w:sz="4" w:space="0" w:color="000000"/>
@@ -3720,7 +4068,13 @@
         </w:tc>
         <w:tc>
           <w:tcPr>
-            <w:tcW w:type="dxa" w:w="2891"/>
+            <w:tcW w:type="dxa" w:w="2892"/>
+            <w:tcMar>
+              <w:top w:type="dxa" w:w="0"/>
+              <w:bottom w:type="dxa" w:w="0"/>
+              <w:left w:type="dxa" w:w="56"/>
+              <w:right w:type="dxa" w:w="56"/>
+            </w:tcMar>
             <w:vAlign w:val="center"/>
             <w:tcBorders>
               <w:bottom w:val="single" w:sz="4" w:space="0" w:color="000000"/>
@@ -3750,6 +4104,12 @@
         <w:tc>
           <w:tcPr>
             <w:tcW w:type="dxa" w:w="2721"/>
+            <w:tcMar>
+              <w:top w:type="dxa" w:w="0"/>
+              <w:bottom w:type="dxa" w:w="0"/>
+              <w:left w:type="dxa" w:w="56"/>
+              <w:right w:type="dxa" w:w="56"/>
+            </w:tcMar>
             <w:vAlign w:val="center"/>
           </w:tcPr>
           <w:p>
@@ -3771,6 +4131,12 @@
         <w:tc>
           <w:tcPr>
             <w:tcW w:type="dxa" w:w="2891"/>
+            <w:tcMar>
+              <w:top w:type="dxa" w:w="0"/>
+              <w:bottom w:type="dxa" w:w="0"/>
+              <w:left w:type="dxa" w:w="56"/>
+              <w:right w:type="dxa" w:w="56"/>
+            </w:tcMar>
             <w:vAlign w:val="center"/>
           </w:tcPr>
           <w:p>
@@ -3791,7 +4157,13 @@
         </w:tc>
         <w:tc>
           <w:tcPr>
-            <w:tcW w:type="dxa" w:w="2891"/>
+            <w:tcW w:type="dxa" w:w="2892"/>
+            <w:tcMar>
+              <w:top w:type="dxa" w:w="0"/>
+              <w:bottom w:type="dxa" w:w="0"/>
+              <w:left w:type="dxa" w:w="56"/>
+              <w:right w:type="dxa" w:w="56"/>
+            </w:tcMar>
             <w:vAlign w:val="center"/>
           </w:tcPr>
           <w:p>
@@ -3818,6 +4190,12 @@
         <w:tc>
           <w:tcPr>
             <w:tcW w:type="dxa" w:w="2721"/>
+            <w:tcMar>
+              <w:top w:type="dxa" w:w="0"/>
+              <w:bottom w:type="dxa" w:w="0"/>
+              <w:left w:type="dxa" w:w="56"/>
+              <w:right w:type="dxa" w:w="56"/>
+            </w:tcMar>
             <w:vAlign w:val="center"/>
           </w:tcPr>
           <w:p>
@@ -3839,16 +4217,28 @@
         <w:tc>
           <w:tcPr>
             <w:tcW w:type="dxa" w:w="2891"/>
-            <w:vAlign w:val="center"/>
-          </w:tcPr>
-          <w:p>
-            <w:pPr>
-              <w:spacing w:before="0" w:after="0" w:line="240" w:lineRule="exact"/>
-              <w:jc w:val="right"/>
-            </w:pPr>
-            <w:r>
-              <w:rPr>
-                <w:rFonts w:ascii="Times New Roman" w:hAnsi="Times New Roman" w:eastAsia="宋体"/>
+            <w:tcMar>
+              <w:top w:type="dxa" w:w="0"/>
+              <w:bottom w:type="dxa" w:w="0"/>
+              <w:left w:type="dxa" w:w="56"/>
+              <w:right w:type="dxa" w:w="56"/>
+            </w:tcMar>
+          </w:tcPr>
+          <w:p>
+            <w:pPr>
+              <w:spacing w:before="0" w:after="0" w:line="240" w:lineRule="exact"/>
+              <w:ind w:left="0" w:right="0"/>
+              <w:jc w:val="left"/>
+              <w:tabs>
+                <w:tab w:val="decimal" w:pos="1249"/>
+              </w:tabs>
+            </w:pPr>
+            <w:r>
+              <w:tab/>
+            </w:r>
+            <w:r>
+              <w:rPr>
+                <w:rFonts w:ascii="Times New Roman" w:hAnsi="Times New Roman" w:eastAsia="Times New Roman"/>
                 <w:b w:val="0"/>
                 <w:i w:val="0"/>
                 <w:sz w:val="18"/>
@@ -3859,7 +4249,13 @@
         </w:tc>
         <w:tc>
           <w:tcPr>
-            <w:tcW w:type="dxa" w:w="2891"/>
+            <w:tcW w:type="dxa" w:w="2892"/>
+            <w:tcMar>
+              <w:top w:type="dxa" w:w="0"/>
+              <w:bottom w:type="dxa" w:w="0"/>
+              <w:left w:type="dxa" w:w="56"/>
+              <w:right w:type="dxa" w:w="56"/>
+            </w:tcMar>
             <w:vAlign w:val="center"/>
           </w:tcPr>
           <w:p>
@@ -3886,6 +4282,12 @@
         <w:tc>
           <w:tcPr>
             <w:tcW w:type="dxa" w:w="2721"/>
+            <w:tcMar>
+              <w:top w:type="dxa" w:w="0"/>
+              <w:bottom w:type="dxa" w:w="0"/>
+              <w:left w:type="dxa" w:w="56"/>
+              <w:right w:type="dxa" w:w="56"/>
+            </w:tcMar>
             <w:vAlign w:val="center"/>
             <w:tcBorders>
               <w:bottom w:val="single" w:sz="8" w:space="0" w:color="000000"/>
@@ -3910,7 +4312,12 @@
         <w:tc>
           <w:tcPr>
             <w:tcW w:type="dxa" w:w="2891"/>
-            <w:vAlign w:val="center"/>
+            <w:tcMar>
+              <w:top w:type="dxa" w:w="0"/>
+              <w:bottom w:type="dxa" w:w="0"/>
+              <w:left w:type="dxa" w:w="56"/>
+              <w:right w:type="dxa" w:w="56"/>
+            </w:tcMar>
             <w:tcBorders>
               <w:bottom w:val="single" w:sz="8" w:space="0" w:color="000000"/>
             </w:tcBorders>
@@ -3918,11 +4325,18 @@
           <w:p>
             <w:pPr>
               <w:spacing w:before="0" w:after="0" w:line="240" w:lineRule="exact"/>
-              <w:jc w:val="right"/>
-            </w:pPr>
-            <w:r>
-              <w:rPr>
-                <w:rFonts w:ascii="Times New Roman" w:hAnsi="Times New Roman" w:eastAsia="宋体"/>
+              <w:ind w:left="0" w:right="0"/>
+              <w:jc w:val="left"/>
+              <w:tabs>
+                <w:tab w:val="decimal" w:pos="1249"/>
+              </w:tabs>
+            </w:pPr>
+            <w:r>
+              <w:tab/>
+            </w:r>
+            <w:r>
+              <w:rPr>
+                <w:rFonts w:ascii="Times New Roman" w:hAnsi="Times New Roman" w:eastAsia="Times New Roman"/>
                 <w:b w:val="0"/>
                 <w:i w:val="0"/>
                 <w:sz w:val="18"/>
@@ -3933,8 +4347,13 @@
         </w:tc>
         <w:tc>
           <w:tcPr>
-            <w:tcW w:type="dxa" w:w="2891"/>
-            <w:vAlign w:val="center"/>
+            <w:tcW w:type="dxa" w:w="2892"/>
+            <w:tcMar>
+              <w:top w:type="dxa" w:w="0"/>
+              <w:bottom w:type="dxa" w:w="0"/>
+              <w:left w:type="dxa" w:w="56"/>
+              <w:right w:type="dxa" w:w="56"/>
+            </w:tcMar>
             <w:tcBorders>
               <w:bottom w:val="single" w:sz="8" w:space="0" w:color="000000"/>
             </w:tcBorders>
@@ -3942,11 +4361,18 @@
           <w:p>
             <w:pPr>
               <w:spacing w:before="0" w:after="0" w:line="240" w:lineRule="exact"/>
-              <w:jc w:val="right"/>
-            </w:pPr>
-            <w:r>
-              <w:rPr>
-                <w:rFonts w:ascii="Times New Roman" w:hAnsi="Times New Roman" w:eastAsia="宋体"/>
+              <w:ind w:left="0" w:right="0"/>
+              <w:jc w:val="left"/>
+              <w:tabs>
+                <w:tab w:val="decimal" w:pos="1249"/>
+              </w:tabs>
+            </w:pPr>
+            <w:r>
+              <w:tab/>
+            </w:r>
+            <w:r>
+              <w:rPr>
+                <w:rFonts w:ascii="Times New Roman" w:hAnsi="Times New Roman" w:eastAsia="Times New Roman"/>
                 <w:b w:val="0"/>
                 <w:i w:val="0"/>
                 <w:sz w:val="18"/>
@@ -4133,7 +4559,7 @@
     </w:p>
     <w:tbl>
       <w:tblPr>
-        <w:tblW w:type="auto" w:w="0"/>
+        <w:tblW w:type="dxa" w:w="8504"/>
         <w:tblLayout w:type="fixed"/>
         <w:tblLook w:firstColumn="1" w:firstRow="1" w:lastColumn="0" w:lastRow="0" w:noHBand="0" w:noVBand="1" w:val="04A0"/>
         <w:jc w:val="center"/>
@@ -4147,11 +4573,11 @@
         </w:tblBorders>
       </w:tblPr>
       <w:tblGrid>
-        <w:gridCol w:w="1814"/>
-        <w:gridCol w:w="1814"/>
-        <w:gridCol w:w="1814"/>
-        <w:gridCol w:w="1814"/>
-        <w:gridCol w:w="1814"/>
+        <w:gridCol w:w="3231"/>
+        <w:gridCol w:w="850"/>
+        <w:gridCol w:w="1474"/>
+        <w:gridCol w:w="1474"/>
+        <w:gridCol w:w="1475"/>
       </w:tblGrid>
       <w:tr>
         <w:trPr>
@@ -4164,6 +4590,12 @@
               <w:top w:val="single" w:sz="8" w:space="0" w:color="000000"/>
               <w:bottom w:val="single" w:sz="4" w:space="0" w:color="000000"/>
             </w:tcBorders>
+            <w:tcMar>
+              <w:top w:type="dxa" w:w="0"/>
+              <w:bottom w:type="dxa" w:w="0"/>
+              <w:left w:type="dxa" w:w="56"/>
+              <w:right w:type="dxa" w:w="56"/>
+            </w:tcMar>
             <w:vAlign w:val="center"/>
           </w:tcPr>
           <w:p>
@@ -4189,6 +4621,12 @@
               <w:top w:val="single" w:sz="8" w:space="0" w:color="000000"/>
               <w:bottom w:val="single" w:sz="4" w:space="0" w:color="000000"/>
             </w:tcBorders>
+            <w:tcMar>
+              <w:top w:type="dxa" w:w="0"/>
+              <w:bottom w:type="dxa" w:w="0"/>
+              <w:left w:type="dxa" w:w="56"/>
+              <w:right w:type="dxa" w:w="56"/>
+            </w:tcMar>
             <w:vAlign w:val="center"/>
           </w:tcPr>
           <w:p>
@@ -4214,6 +4652,12 @@
               <w:top w:val="single" w:sz="8" w:space="0" w:color="000000"/>
               <w:bottom w:val="single" w:sz="4" w:space="0" w:color="000000"/>
             </w:tcBorders>
+            <w:tcMar>
+              <w:top w:type="dxa" w:w="0"/>
+              <w:bottom w:type="dxa" w:w="0"/>
+              <w:left w:type="dxa" w:w="56"/>
+              <w:right w:type="dxa" w:w="56"/>
+            </w:tcMar>
             <w:vAlign w:val="center"/>
           </w:tcPr>
           <w:p>
@@ -4239,6 +4683,12 @@
               <w:top w:val="single" w:sz="8" w:space="0" w:color="000000"/>
               <w:bottom w:val="single" w:sz="4" w:space="0" w:color="000000"/>
             </w:tcBorders>
+            <w:tcMar>
+              <w:top w:type="dxa" w:w="0"/>
+              <w:bottom w:type="dxa" w:w="0"/>
+              <w:left w:type="dxa" w:w="56"/>
+              <w:right w:type="dxa" w:w="56"/>
+            </w:tcMar>
             <w:vAlign w:val="center"/>
           </w:tcPr>
           <w:p>
@@ -4259,11 +4709,17 @@
         </w:tc>
         <w:tc>
           <w:tcPr>
-            <w:tcW w:type="dxa" w:w="1474"/>
+            <w:tcW w:type="dxa" w:w="1475"/>
             <w:tcBorders>
               <w:top w:val="single" w:sz="8" w:space="0" w:color="000000"/>
               <w:bottom w:val="single" w:sz="4" w:space="0" w:color="000000"/>
             </w:tcBorders>
+            <w:tcMar>
+              <w:top w:type="dxa" w:w="0"/>
+              <w:bottom w:type="dxa" w:w="0"/>
+              <w:left w:type="dxa" w:w="56"/>
+              <w:right w:type="dxa" w:w="56"/>
+            </w:tcMar>
             <w:vAlign w:val="center"/>
           </w:tcPr>
           <w:p>
@@ -4290,6 +4746,12 @@
         <w:tc>
           <w:tcPr>
             <w:tcW w:type="dxa" w:w="3231"/>
+            <w:tcMar>
+              <w:top w:type="dxa" w:w="0"/>
+              <w:bottom w:type="dxa" w:w="0"/>
+              <w:left w:type="dxa" w:w="56"/>
+              <w:right w:type="dxa" w:w="56"/>
+            </w:tcMar>
             <w:vAlign w:val="center"/>
           </w:tcPr>
           <w:p>
@@ -4311,6 +4773,12 @@
         <w:tc>
           <w:tcPr>
             <w:tcW w:type="dxa" w:w="850"/>
+            <w:tcMar>
+              <w:top w:type="dxa" w:w="0"/>
+              <w:bottom w:type="dxa" w:w="0"/>
+              <w:left w:type="dxa" w:w="56"/>
+              <w:right w:type="dxa" w:w="56"/>
+            </w:tcMar>
             <w:vAlign w:val="center"/>
           </w:tcPr>
           <w:p>
@@ -4332,16 +4800,28 @@
         <w:tc>
           <w:tcPr>
             <w:tcW w:type="dxa" w:w="1474"/>
-            <w:vAlign w:val="center"/>
-          </w:tcPr>
-          <w:p>
-            <w:pPr>
-              <w:spacing w:before="0" w:after="0" w:line="240" w:lineRule="exact"/>
-              <w:jc w:val="right"/>
-            </w:pPr>
-            <w:r>
-              <w:rPr>
-                <w:rFonts w:ascii="Times New Roman" w:hAnsi="Times New Roman" w:eastAsia="宋体"/>
+            <w:tcMar>
+              <w:top w:type="dxa" w:w="0"/>
+              <w:bottom w:type="dxa" w:w="0"/>
+              <w:left w:type="dxa" w:w="56"/>
+              <w:right w:type="dxa" w:w="56"/>
+            </w:tcMar>
+          </w:tcPr>
+          <w:p>
+            <w:pPr>
+              <w:spacing w:before="0" w:after="0" w:line="240" w:lineRule="exact"/>
+              <w:ind w:left="0" w:right="0"/>
+              <w:jc w:val="left"/>
+              <w:tabs>
+                <w:tab w:val="decimal" w:pos="612"/>
+              </w:tabs>
+            </w:pPr>
+            <w:r>
+              <w:tab/>
+            </w:r>
+            <w:r>
+              <w:rPr>
+                <w:rFonts w:ascii="Times New Roman" w:hAnsi="Times New Roman" w:eastAsia="Times New Roman"/>
                 <w:b w:val="0"/>
                 <w:i w:val="0"/>
                 <w:sz w:val="18"/>
@@ -4353,16 +4833,28 @@
         <w:tc>
           <w:tcPr>
             <w:tcW w:type="dxa" w:w="1474"/>
-            <w:vAlign w:val="center"/>
-          </w:tcPr>
-          <w:p>
-            <w:pPr>
-              <w:spacing w:before="0" w:after="0" w:line="240" w:lineRule="exact"/>
-              <w:jc w:val="right"/>
-            </w:pPr>
-            <w:r>
-              <w:rPr>
-                <w:rFonts w:ascii="Times New Roman" w:hAnsi="Times New Roman" w:eastAsia="宋体"/>
+            <w:tcMar>
+              <w:top w:type="dxa" w:w="0"/>
+              <w:bottom w:type="dxa" w:w="0"/>
+              <w:left w:type="dxa" w:w="56"/>
+              <w:right w:type="dxa" w:w="56"/>
+            </w:tcMar>
+          </w:tcPr>
+          <w:p>
+            <w:pPr>
+              <w:spacing w:before="0" w:after="0" w:line="240" w:lineRule="exact"/>
+              <w:ind w:left="0" w:right="0"/>
+              <w:jc w:val="left"/>
+              <w:tabs>
+                <w:tab w:val="decimal" w:pos="612"/>
+              </w:tabs>
+            </w:pPr>
+            <w:r>
+              <w:tab/>
+            </w:r>
+            <w:r>
+              <w:rPr>
+                <w:rFonts w:ascii="Times New Roman" w:hAnsi="Times New Roman" w:eastAsia="Times New Roman"/>
                 <w:b w:val="0"/>
                 <w:i w:val="0"/>
                 <w:sz w:val="18"/>
@@ -4373,17 +4865,29 @@
         </w:tc>
         <w:tc>
           <w:tcPr>
-            <w:tcW w:type="dxa" w:w="1474"/>
-            <w:vAlign w:val="center"/>
-          </w:tcPr>
-          <w:p>
-            <w:pPr>
-              <w:spacing w:before="0" w:after="0" w:line="240" w:lineRule="exact"/>
-              <w:jc w:val="right"/>
-            </w:pPr>
-            <w:r>
-              <w:rPr>
-                <w:rFonts w:ascii="Times New Roman" w:hAnsi="Times New Roman" w:eastAsia="宋体"/>
+            <w:tcW w:type="dxa" w:w="1475"/>
+            <w:tcMar>
+              <w:top w:type="dxa" w:w="0"/>
+              <w:bottom w:type="dxa" w:w="0"/>
+              <w:left w:type="dxa" w:w="56"/>
+              <w:right w:type="dxa" w:w="56"/>
+            </w:tcMar>
+          </w:tcPr>
+          <w:p>
+            <w:pPr>
+              <w:spacing w:before="0" w:after="0" w:line="240" w:lineRule="exact"/>
+              <w:ind w:left="0" w:right="0"/>
+              <w:jc w:val="left"/>
+              <w:tabs>
+                <w:tab w:val="decimal" w:pos="612"/>
+              </w:tabs>
+            </w:pPr>
+            <w:r>
+              <w:tab/>
+            </w:r>
+            <w:r>
+              <w:rPr>
+                <w:rFonts w:ascii="Times New Roman" w:hAnsi="Times New Roman" w:eastAsia="Times New Roman"/>
                 <w:b w:val="0"/>
                 <w:i w:val="0"/>
                 <w:sz w:val="18"/>
@@ -4400,6 +4904,12 @@
         <w:tc>
           <w:tcPr>
             <w:tcW w:type="dxa" w:w="3231"/>
+            <w:tcMar>
+              <w:top w:type="dxa" w:w="0"/>
+              <w:bottom w:type="dxa" w:w="0"/>
+              <w:left w:type="dxa" w:w="56"/>
+              <w:right w:type="dxa" w:w="56"/>
+            </w:tcMar>
             <w:vAlign w:val="center"/>
           </w:tcPr>
           <w:p>
@@ -4421,6 +4931,12 @@
         <w:tc>
           <w:tcPr>
             <w:tcW w:type="dxa" w:w="850"/>
+            <w:tcMar>
+              <w:top w:type="dxa" w:w="0"/>
+              <w:bottom w:type="dxa" w:w="0"/>
+              <w:left w:type="dxa" w:w="56"/>
+              <w:right w:type="dxa" w:w="56"/>
+            </w:tcMar>
             <w:vAlign w:val="center"/>
           </w:tcPr>
           <w:p>
@@ -4442,16 +4958,28 @@
         <w:tc>
           <w:tcPr>
             <w:tcW w:type="dxa" w:w="1474"/>
-            <w:vAlign w:val="center"/>
-          </w:tcPr>
-          <w:p>
-            <w:pPr>
-              <w:spacing w:before="0" w:after="0" w:line="240" w:lineRule="exact"/>
-              <w:jc w:val="right"/>
-            </w:pPr>
-            <w:r>
-              <w:rPr>
-                <w:rFonts w:ascii="Times New Roman" w:hAnsi="Times New Roman" w:eastAsia="宋体"/>
+            <w:tcMar>
+              <w:top w:type="dxa" w:w="0"/>
+              <w:bottom w:type="dxa" w:w="0"/>
+              <w:left w:type="dxa" w:w="56"/>
+              <w:right w:type="dxa" w:w="56"/>
+            </w:tcMar>
+          </w:tcPr>
+          <w:p>
+            <w:pPr>
+              <w:spacing w:before="0" w:after="0" w:line="240" w:lineRule="exact"/>
+              <w:ind w:left="0" w:right="0"/>
+              <w:jc w:val="left"/>
+              <w:tabs>
+                <w:tab w:val="decimal" w:pos="612"/>
+              </w:tabs>
+            </w:pPr>
+            <w:r>
+              <w:tab/>
+            </w:r>
+            <w:r>
+              <w:rPr>
+                <w:rFonts w:ascii="Times New Roman" w:hAnsi="Times New Roman" w:eastAsia="Times New Roman"/>
                 <w:b w:val="0"/>
                 <w:i w:val="0"/>
                 <w:sz w:val="18"/>
@@ -4463,16 +4991,28 @@
         <w:tc>
           <w:tcPr>
             <w:tcW w:type="dxa" w:w="1474"/>
-            <w:vAlign w:val="center"/>
-          </w:tcPr>
-          <w:p>
-            <w:pPr>
-              <w:spacing w:before="0" w:after="0" w:line="240" w:lineRule="exact"/>
-              <w:jc w:val="right"/>
-            </w:pPr>
-            <w:r>
-              <w:rPr>
-                <w:rFonts w:ascii="Times New Roman" w:hAnsi="Times New Roman" w:eastAsia="宋体"/>
+            <w:tcMar>
+              <w:top w:type="dxa" w:w="0"/>
+              <w:bottom w:type="dxa" w:w="0"/>
+              <w:left w:type="dxa" w:w="56"/>
+              <w:right w:type="dxa" w:w="56"/>
+            </w:tcMar>
+          </w:tcPr>
+          <w:p>
+            <w:pPr>
+              <w:spacing w:before="0" w:after="0" w:line="240" w:lineRule="exact"/>
+              <w:ind w:left="0" w:right="0"/>
+              <w:jc w:val="left"/>
+              <w:tabs>
+                <w:tab w:val="decimal" w:pos="612"/>
+              </w:tabs>
+            </w:pPr>
+            <w:r>
+              <w:tab/>
+            </w:r>
+            <w:r>
+              <w:rPr>
+                <w:rFonts w:ascii="Times New Roman" w:hAnsi="Times New Roman" w:eastAsia="Times New Roman"/>
                 <w:b w:val="0"/>
                 <w:i w:val="0"/>
                 <w:sz w:val="18"/>
@@ -4483,17 +5023,29 @@
         </w:tc>
         <w:tc>
           <w:tcPr>
-            <w:tcW w:type="dxa" w:w="1474"/>
-            <w:vAlign w:val="center"/>
-          </w:tcPr>
-          <w:p>
-            <w:pPr>
-              <w:spacing w:before="0" w:after="0" w:line="240" w:lineRule="exact"/>
-              <w:jc w:val="right"/>
-            </w:pPr>
-            <w:r>
-              <w:rPr>
-                <w:rFonts w:ascii="Times New Roman" w:hAnsi="Times New Roman" w:eastAsia="宋体"/>
+            <w:tcW w:type="dxa" w:w="1475"/>
+            <w:tcMar>
+              <w:top w:type="dxa" w:w="0"/>
+              <w:bottom w:type="dxa" w:w="0"/>
+              <w:left w:type="dxa" w:w="56"/>
+              <w:right w:type="dxa" w:w="56"/>
+            </w:tcMar>
+          </w:tcPr>
+          <w:p>
+            <w:pPr>
+              <w:spacing w:before="0" w:after="0" w:line="240" w:lineRule="exact"/>
+              <w:ind w:left="0" w:right="0"/>
+              <w:jc w:val="left"/>
+              <w:tabs>
+                <w:tab w:val="decimal" w:pos="612"/>
+              </w:tabs>
+            </w:pPr>
+            <w:r>
+              <w:tab/>
+            </w:r>
+            <w:r>
+              <w:rPr>
+                <w:rFonts w:ascii="Times New Roman" w:hAnsi="Times New Roman" w:eastAsia="Times New Roman"/>
                 <w:b w:val="0"/>
                 <w:i w:val="0"/>
                 <w:sz w:val="18"/>
@@ -4510,6 +5062,12 @@
         <w:tc>
           <w:tcPr>
             <w:tcW w:type="dxa" w:w="3231"/>
+            <w:tcMar>
+              <w:top w:type="dxa" w:w="0"/>
+              <w:bottom w:type="dxa" w:w="0"/>
+              <w:left w:type="dxa" w:w="56"/>
+              <w:right w:type="dxa" w:w="56"/>
+            </w:tcMar>
             <w:vAlign w:val="center"/>
           </w:tcPr>
           <w:p>
@@ -4531,6 +5089,12 @@
         <w:tc>
           <w:tcPr>
             <w:tcW w:type="dxa" w:w="850"/>
+            <w:tcMar>
+              <w:top w:type="dxa" w:w="0"/>
+              <w:bottom w:type="dxa" w:w="0"/>
+              <w:left w:type="dxa" w:w="56"/>
+              <w:right w:type="dxa" w:w="56"/>
+            </w:tcMar>
             <w:vAlign w:val="center"/>
           </w:tcPr>
           <w:p>
@@ -4552,16 +5116,28 @@
         <w:tc>
           <w:tcPr>
             <w:tcW w:type="dxa" w:w="1474"/>
-            <w:vAlign w:val="center"/>
-          </w:tcPr>
-          <w:p>
-            <w:pPr>
-              <w:spacing w:before="0" w:after="0" w:line="240" w:lineRule="exact"/>
-              <w:jc w:val="right"/>
-            </w:pPr>
-            <w:r>
-              <w:rPr>
-                <w:rFonts w:ascii="Times New Roman" w:hAnsi="Times New Roman" w:eastAsia="宋体"/>
+            <w:tcMar>
+              <w:top w:type="dxa" w:w="0"/>
+              <w:bottom w:type="dxa" w:w="0"/>
+              <w:left w:type="dxa" w:w="56"/>
+              <w:right w:type="dxa" w:w="56"/>
+            </w:tcMar>
+          </w:tcPr>
+          <w:p>
+            <w:pPr>
+              <w:spacing w:before="0" w:after="0" w:line="240" w:lineRule="exact"/>
+              <w:ind w:left="0" w:right="0"/>
+              <w:jc w:val="left"/>
+              <w:tabs>
+                <w:tab w:val="decimal" w:pos="612"/>
+              </w:tabs>
+            </w:pPr>
+            <w:r>
+              <w:tab/>
+            </w:r>
+            <w:r>
+              <w:rPr>
+                <w:rFonts w:ascii="Times New Roman" w:hAnsi="Times New Roman" w:eastAsia="Times New Roman"/>
                 <w:b w:val="0"/>
                 <w:i w:val="0"/>
                 <w:sz w:val="18"/>
@@ -4573,16 +5149,28 @@
         <w:tc>
           <w:tcPr>
             <w:tcW w:type="dxa" w:w="1474"/>
-            <w:vAlign w:val="center"/>
-          </w:tcPr>
-          <w:p>
-            <w:pPr>
-              <w:spacing w:before="0" w:after="0" w:line="240" w:lineRule="exact"/>
-              <w:jc w:val="right"/>
-            </w:pPr>
-            <w:r>
-              <w:rPr>
-                <w:rFonts w:ascii="Times New Roman" w:hAnsi="Times New Roman" w:eastAsia="宋体"/>
+            <w:tcMar>
+              <w:top w:type="dxa" w:w="0"/>
+              <w:bottom w:type="dxa" w:w="0"/>
+              <w:left w:type="dxa" w:w="56"/>
+              <w:right w:type="dxa" w:w="56"/>
+            </w:tcMar>
+          </w:tcPr>
+          <w:p>
+            <w:pPr>
+              <w:spacing w:before="0" w:after="0" w:line="240" w:lineRule="exact"/>
+              <w:ind w:left="0" w:right="0"/>
+              <w:jc w:val="left"/>
+              <w:tabs>
+                <w:tab w:val="decimal" w:pos="612"/>
+              </w:tabs>
+            </w:pPr>
+            <w:r>
+              <w:tab/>
+            </w:r>
+            <w:r>
+              <w:rPr>
+                <w:rFonts w:ascii="Times New Roman" w:hAnsi="Times New Roman" w:eastAsia="Times New Roman"/>
                 <w:b w:val="0"/>
                 <w:i w:val="0"/>
                 <w:sz w:val="18"/>
@@ -4593,17 +5181,29 @@
         </w:tc>
         <w:tc>
           <w:tcPr>
-            <w:tcW w:type="dxa" w:w="1474"/>
-            <w:vAlign w:val="center"/>
-          </w:tcPr>
-          <w:p>
-            <w:pPr>
-              <w:spacing w:before="0" w:after="0" w:line="240" w:lineRule="exact"/>
-              <w:jc w:val="right"/>
-            </w:pPr>
-            <w:r>
-              <w:rPr>
-                <w:rFonts w:ascii="Times New Roman" w:hAnsi="Times New Roman" w:eastAsia="宋体"/>
+            <w:tcW w:type="dxa" w:w="1475"/>
+            <w:tcMar>
+              <w:top w:type="dxa" w:w="0"/>
+              <w:bottom w:type="dxa" w:w="0"/>
+              <w:left w:type="dxa" w:w="56"/>
+              <w:right w:type="dxa" w:w="56"/>
+            </w:tcMar>
+          </w:tcPr>
+          <w:p>
+            <w:pPr>
+              <w:spacing w:before="0" w:after="0" w:line="240" w:lineRule="exact"/>
+              <w:ind w:left="0" w:right="0"/>
+              <w:jc w:val="left"/>
+              <w:tabs>
+                <w:tab w:val="decimal" w:pos="612"/>
+              </w:tabs>
+            </w:pPr>
+            <w:r>
+              <w:tab/>
+            </w:r>
+            <w:r>
+              <w:rPr>
+                <w:rFonts w:ascii="Times New Roman" w:hAnsi="Times New Roman" w:eastAsia="Times New Roman"/>
                 <w:b w:val="0"/>
                 <w:i w:val="0"/>
                 <w:sz w:val="18"/>
@@ -4620,6 +5220,12 @@
         <w:tc>
           <w:tcPr>
             <w:tcW w:type="dxa" w:w="3231"/>
+            <w:tcMar>
+              <w:top w:type="dxa" w:w="0"/>
+              <w:bottom w:type="dxa" w:w="0"/>
+              <w:left w:type="dxa" w:w="56"/>
+              <w:right w:type="dxa" w:w="56"/>
+            </w:tcMar>
             <w:vAlign w:val="center"/>
           </w:tcPr>
           <w:p>
@@ -4641,6 +5247,12 @@
         <w:tc>
           <w:tcPr>
             <w:tcW w:type="dxa" w:w="850"/>
+            <w:tcMar>
+              <w:top w:type="dxa" w:w="0"/>
+              <w:bottom w:type="dxa" w:w="0"/>
+              <w:left w:type="dxa" w:w="56"/>
+              <w:right w:type="dxa" w:w="56"/>
+            </w:tcMar>
             <w:vAlign w:val="center"/>
           </w:tcPr>
           <w:p>
@@ -4662,16 +5274,28 @@
         <w:tc>
           <w:tcPr>
             <w:tcW w:type="dxa" w:w="1474"/>
-            <w:vAlign w:val="center"/>
-          </w:tcPr>
-          <w:p>
-            <w:pPr>
-              <w:spacing w:before="0" w:after="0" w:line="240" w:lineRule="exact"/>
-              <w:jc w:val="right"/>
-            </w:pPr>
-            <w:r>
-              <w:rPr>
-                <w:rFonts w:ascii="Times New Roman" w:hAnsi="Times New Roman" w:eastAsia="宋体"/>
+            <w:tcMar>
+              <w:top w:type="dxa" w:w="0"/>
+              <w:bottom w:type="dxa" w:w="0"/>
+              <w:left w:type="dxa" w:w="56"/>
+              <w:right w:type="dxa" w:w="56"/>
+            </w:tcMar>
+          </w:tcPr>
+          <w:p>
+            <w:pPr>
+              <w:spacing w:before="0" w:after="0" w:line="240" w:lineRule="exact"/>
+              <w:ind w:left="0" w:right="0"/>
+              <w:jc w:val="left"/>
+              <w:tabs>
+                <w:tab w:val="decimal" w:pos="612"/>
+              </w:tabs>
+            </w:pPr>
+            <w:r>
+              <w:tab/>
+            </w:r>
+            <w:r>
+              <w:rPr>
+                <w:rFonts w:ascii="Times New Roman" w:hAnsi="Times New Roman" w:eastAsia="Times New Roman"/>
                 <w:b w:val="0"/>
                 <w:i w:val="0"/>
                 <w:sz w:val="18"/>
@@ -4683,16 +5307,28 @@
         <w:tc>
           <w:tcPr>
             <w:tcW w:type="dxa" w:w="1474"/>
-            <w:vAlign w:val="center"/>
-          </w:tcPr>
-          <w:p>
-            <w:pPr>
-              <w:spacing w:before="0" w:after="0" w:line="240" w:lineRule="exact"/>
-              <w:jc w:val="right"/>
-            </w:pPr>
-            <w:r>
-              <w:rPr>
-                <w:rFonts w:ascii="Times New Roman" w:hAnsi="Times New Roman" w:eastAsia="宋体"/>
+            <w:tcMar>
+              <w:top w:type="dxa" w:w="0"/>
+              <w:bottom w:type="dxa" w:w="0"/>
+              <w:left w:type="dxa" w:w="56"/>
+              <w:right w:type="dxa" w:w="56"/>
+            </w:tcMar>
+          </w:tcPr>
+          <w:p>
+            <w:pPr>
+              <w:spacing w:before="0" w:after="0" w:line="240" w:lineRule="exact"/>
+              <w:ind w:left="0" w:right="0"/>
+              <w:jc w:val="left"/>
+              <w:tabs>
+                <w:tab w:val="decimal" w:pos="612"/>
+              </w:tabs>
+            </w:pPr>
+            <w:r>
+              <w:tab/>
+            </w:r>
+            <w:r>
+              <w:rPr>
+                <w:rFonts w:ascii="Times New Roman" w:hAnsi="Times New Roman" w:eastAsia="Times New Roman"/>
                 <w:b w:val="0"/>
                 <w:i w:val="0"/>
                 <w:sz w:val="18"/>
@@ -4703,17 +5339,29 @@
         </w:tc>
         <w:tc>
           <w:tcPr>
-            <w:tcW w:type="dxa" w:w="1474"/>
-            <w:vAlign w:val="center"/>
-          </w:tcPr>
-          <w:p>
-            <w:pPr>
-              <w:spacing w:before="0" w:after="0" w:line="240" w:lineRule="exact"/>
-              <w:jc w:val="right"/>
-            </w:pPr>
-            <w:r>
-              <w:rPr>
-                <w:rFonts w:ascii="Times New Roman" w:hAnsi="Times New Roman" w:eastAsia="宋体"/>
+            <w:tcW w:type="dxa" w:w="1475"/>
+            <w:tcMar>
+              <w:top w:type="dxa" w:w="0"/>
+              <w:bottom w:type="dxa" w:w="0"/>
+              <w:left w:type="dxa" w:w="56"/>
+              <w:right w:type="dxa" w:w="56"/>
+            </w:tcMar>
+          </w:tcPr>
+          <w:p>
+            <w:pPr>
+              <w:spacing w:before="0" w:after="0" w:line="240" w:lineRule="exact"/>
+              <w:ind w:left="0" w:right="0"/>
+              <w:jc w:val="left"/>
+              <w:tabs>
+                <w:tab w:val="decimal" w:pos="612"/>
+              </w:tabs>
+            </w:pPr>
+            <w:r>
+              <w:tab/>
+            </w:r>
+            <w:r>
+              <w:rPr>
+                <w:rFonts w:ascii="Times New Roman" w:hAnsi="Times New Roman" w:eastAsia="Times New Roman"/>
                 <w:b w:val="0"/>
                 <w:i w:val="0"/>
                 <w:sz w:val="18"/>
@@ -4730,6 +5378,12 @@
         <w:tc>
           <w:tcPr>
             <w:tcW w:type="dxa" w:w="3231"/>
+            <w:tcMar>
+              <w:top w:type="dxa" w:w="0"/>
+              <w:bottom w:type="dxa" w:w="0"/>
+              <w:left w:type="dxa" w:w="56"/>
+              <w:right w:type="dxa" w:w="56"/>
+            </w:tcMar>
             <w:vAlign w:val="center"/>
             <w:tcBorders>
               <w:bottom w:val="single" w:sz="8" w:space="0" w:color="000000"/>
@@ -4754,6 +5408,12 @@
         <w:tc>
           <w:tcPr>
             <w:tcW w:type="dxa" w:w="850"/>
+            <w:tcMar>
+              <w:top w:type="dxa" w:w="0"/>
+              <w:bottom w:type="dxa" w:w="0"/>
+              <w:left w:type="dxa" w:w="56"/>
+              <w:right w:type="dxa" w:w="56"/>
+            </w:tcMar>
             <w:vAlign w:val="center"/>
             <w:tcBorders>
               <w:bottom w:val="single" w:sz="8" w:space="0" w:color="000000"/>
@@ -4778,7 +5438,12 @@
         <w:tc>
           <w:tcPr>
             <w:tcW w:type="dxa" w:w="1474"/>
-            <w:vAlign w:val="center"/>
+            <w:tcMar>
+              <w:top w:type="dxa" w:w="0"/>
+              <w:bottom w:type="dxa" w:w="0"/>
+              <w:left w:type="dxa" w:w="56"/>
+              <w:right w:type="dxa" w:w="56"/>
+            </w:tcMar>
             <w:tcBorders>
               <w:bottom w:val="single" w:sz="8" w:space="0" w:color="000000"/>
             </w:tcBorders>
@@ -4786,11 +5451,18 @@
           <w:p>
             <w:pPr>
               <w:spacing w:before="0" w:after="0" w:line="240" w:lineRule="exact"/>
-              <w:jc w:val="right"/>
-            </w:pPr>
-            <w:r>
-              <w:rPr>
-                <w:rFonts w:ascii="Times New Roman" w:hAnsi="Times New Roman" w:eastAsia="宋体"/>
+              <w:ind w:left="0" w:right="0"/>
+              <w:jc w:val="left"/>
+              <w:tabs>
+                <w:tab w:val="decimal" w:pos="612"/>
+              </w:tabs>
+            </w:pPr>
+            <w:r>
+              <w:tab/>
+            </w:r>
+            <w:r>
+              <w:rPr>
+                <w:rFonts w:ascii="Times New Roman" w:hAnsi="Times New Roman" w:eastAsia="Times New Roman"/>
                 <w:b w:val="0"/>
                 <w:i w:val="0"/>
                 <w:sz w:val="18"/>
@@ -4802,7 +5474,12 @@
         <w:tc>
           <w:tcPr>
             <w:tcW w:type="dxa" w:w="1474"/>
-            <w:vAlign w:val="center"/>
+            <w:tcMar>
+              <w:top w:type="dxa" w:w="0"/>
+              <w:bottom w:type="dxa" w:w="0"/>
+              <w:left w:type="dxa" w:w="56"/>
+              <w:right w:type="dxa" w:w="56"/>
+            </w:tcMar>
             <w:tcBorders>
               <w:bottom w:val="single" w:sz="8" w:space="0" w:color="000000"/>
             </w:tcBorders>
@@ -4810,11 +5487,18 @@
           <w:p>
             <w:pPr>
               <w:spacing w:before="0" w:after="0" w:line="240" w:lineRule="exact"/>
-              <w:jc w:val="right"/>
-            </w:pPr>
-            <w:r>
-              <w:rPr>
-                <w:rFonts w:ascii="Times New Roman" w:hAnsi="Times New Roman" w:eastAsia="宋体"/>
+              <w:ind w:left="0" w:right="0"/>
+              <w:jc w:val="left"/>
+              <w:tabs>
+                <w:tab w:val="decimal" w:pos="612"/>
+              </w:tabs>
+            </w:pPr>
+            <w:r>
+              <w:tab/>
+            </w:r>
+            <w:r>
+              <w:rPr>
+                <w:rFonts w:ascii="Times New Roman" w:hAnsi="Times New Roman" w:eastAsia="Times New Roman"/>
                 <w:b w:val="0"/>
                 <w:i w:val="0"/>
                 <w:sz w:val="18"/>
@@ -4825,8 +5509,13 @@
         </w:tc>
         <w:tc>
           <w:tcPr>
-            <w:tcW w:type="dxa" w:w="1474"/>
-            <w:vAlign w:val="center"/>
+            <w:tcW w:type="dxa" w:w="1475"/>
+            <w:tcMar>
+              <w:top w:type="dxa" w:w="0"/>
+              <w:bottom w:type="dxa" w:w="0"/>
+              <w:left w:type="dxa" w:w="56"/>
+              <w:right w:type="dxa" w:w="56"/>
+            </w:tcMar>
             <w:tcBorders>
               <w:bottom w:val="single" w:sz="8" w:space="0" w:color="000000"/>
             </w:tcBorders>
@@ -4834,11 +5523,18 @@
           <w:p>
             <w:pPr>
               <w:spacing w:before="0" w:after="0" w:line="240" w:lineRule="exact"/>
-              <w:jc w:val="right"/>
-            </w:pPr>
-            <w:r>
-              <w:rPr>
-                <w:rFonts w:ascii="Times New Roman" w:hAnsi="Times New Roman" w:eastAsia="宋体"/>
+              <w:ind w:left="0" w:right="0"/>
+              <w:jc w:val="left"/>
+              <w:tabs>
+                <w:tab w:val="decimal" w:pos="612"/>
+              </w:tabs>
+            </w:pPr>
+            <w:r>
+              <w:tab/>
+            </w:r>
+            <w:r>
+              <w:rPr>
+                <w:rFonts w:ascii="Times New Roman" w:hAnsi="Times New Roman" w:eastAsia="Times New Roman"/>
                 <w:b w:val="0"/>
                 <w:i w:val="0"/>
                 <w:sz w:val="18"/>
@@ -5188,7 +5884,7 @@
     </w:p>
     <w:tbl>
       <w:tblPr>
-        <w:tblW w:type="auto" w:w="0"/>
+        <w:tblW w:type="dxa" w:w="8504"/>
         <w:tblLayout w:type="fixed"/>
         <w:tblLook w:firstColumn="1" w:firstRow="1" w:lastColumn="0" w:lastRow="0" w:noHBand="0" w:noVBand="1" w:val="04A0"/>
         <w:jc w:val="center"/>
@@ -5202,11 +5898,11 @@
         </w:tblBorders>
       </w:tblPr>
       <w:tblGrid>
-        <w:gridCol w:w="1814"/>
-        <w:gridCol w:w="1814"/>
-        <w:gridCol w:w="1814"/>
-        <w:gridCol w:w="1814"/>
-        <w:gridCol w:w="1814"/>
+        <w:gridCol w:w="3231"/>
+        <w:gridCol w:w="1318"/>
+        <w:gridCol w:w="1318"/>
+        <w:gridCol w:w="1318"/>
+        <w:gridCol w:w="1319"/>
       </w:tblGrid>
       <w:tr>
         <w:trPr>
@@ -5219,6 +5915,12 @@
               <w:top w:val="single" w:sz="8" w:space="0" w:color="000000"/>
               <w:bottom w:val="single" w:sz="4" w:space="0" w:color="000000"/>
             </w:tcBorders>
+            <w:tcMar>
+              <w:top w:type="dxa" w:w="0"/>
+              <w:bottom w:type="dxa" w:w="0"/>
+              <w:left w:type="dxa" w:w="56"/>
+              <w:right w:type="dxa" w:w="56"/>
+            </w:tcMar>
             <w:vAlign w:val="center"/>
           </w:tcPr>
           <w:p>
@@ -5244,6 +5946,12 @@
               <w:top w:val="single" w:sz="8" w:space="0" w:color="000000"/>
               <w:bottom w:val="single" w:sz="4" w:space="0" w:color="000000"/>
             </w:tcBorders>
+            <w:tcMar>
+              <w:top w:type="dxa" w:w="0"/>
+              <w:bottom w:type="dxa" w:w="0"/>
+              <w:left w:type="dxa" w:w="56"/>
+              <w:right w:type="dxa" w:w="56"/>
+            </w:tcMar>
             <w:vAlign w:val="center"/>
           </w:tcPr>
           <w:p>
@@ -5269,6 +5977,12 @@
               <w:top w:val="single" w:sz="8" w:space="0" w:color="000000"/>
               <w:bottom w:val="single" w:sz="4" w:space="0" w:color="000000"/>
             </w:tcBorders>
+            <w:tcMar>
+              <w:top w:type="dxa" w:w="0"/>
+              <w:bottom w:type="dxa" w:w="0"/>
+              <w:left w:type="dxa" w:w="56"/>
+              <w:right w:type="dxa" w:w="56"/>
+            </w:tcMar>
             <w:vAlign w:val="center"/>
           </w:tcPr>
           <w:p>
@@ -5294,6 +6008,12 @@
               <w:top w:val="single" w:sz="8" w:space="0" w:color="000000"/>
               <w:bottom w:val="single" w:sz="4" w:space="0" w:color="000000"/>
             </w:tcBorders>
+            <w:tcMar>
+              <w:top w:type="dxa" w:w="0"/>
+              <w:bottom w:type="dxa" w:w="0"/>
+              <w:left w:type="dxa" w:w="56"/>
+              <w:right w:type="dxa" w:w="56"/>
+            </w:tcMar>
             <w:vAlign w:val="center"/>
           </w:tcPr>
           <w:p>
@@ -5314,11 +6034,17 @@
         </w:tc>
         <w:tc>
           <w:tcPr>
-            <w:tcW w:type="dxa" w:w="1318"/>
+            <w:tcW w:type="dxa" w:w="1319"/>
             <w:tcBorders>
               <w:top w:val="single" w:sz="8" w:space="0" w:color="000000"/>
               <w:bottom w:val="single" w:sz="4" w:space="0" w:color="000000"/>
             </w:tcBorders>
+            <w:tcMar>
+              <w:top w:type="dxa" w:w="0"/>
+              <w:bottom w:type="dxa" w:w="0"/>
+              <w:left w:type="dxa" w:w="56"/>
+              <w:right w:type="dxa" w:w="56"/>
+            </w:tcMar>
             <w:vAlign w:val="center"/>
           </w:tcPr>
           <w:p>
@@ -5345,6 +6071,12 @@
         <w:tc>
           <w:tcPr>
             <w:tcW w:type="dxa" w:w="3231"/>
+            <w:tcMar>
+              <w:top w:type="dxa" w:w="0"/>
+              <w:bottom w:type="dxa" w:w="0"/>
+              <w:left w:type="dxa" w:w="56"/>
+              <w:right w:type="dxa" w:w="56"/>
+            </w:tcMar>
             <w:vAlign w:val="center"/>
           </w:tcPr>
           <w:p>
@@ -5366,16 +6098,28 @@
         <w:tc>
           <w:tcPr>
             <w:tcW w:type="dxa" w:w="1318"/>
-            <w:vAlign w:val="center"/>
-          </w:tcPr>
-          <w:p>
-            <w:pPr>
-              <w:spacing w:before="0" w:after="0" w:line="240" w:lineRule="exact"/>
-              <w:jc w:val="right"/>
-            </w:pPr>
-            <w:r>
-              <w:rPr>
-                <w:rFonts w:ascii="Times New Roman" w:hAnsi="Times New Roman" w:eastAsia="宋体"/>
+            <w:tcMar>
+              <w:top w:type="dxa" w:w="0"/>
+              <w:bottom w:type="dxa" w:w="0"/>
+              <w:left w:type="dxa" w:w="56"/>
+              <w:right w:type="dxa" w:w="56"/>
+            </w:tcMar>
+          </w:tcPr>
+          <w:p>
+            <w:pPr>
+              <w:spacing w:before="0" w:after="0" w:line="240" w:lineRule="exact"/>
+              <w:ind w:left="0" w:right="0"/>
+              <w:jc w:val="left"/>
+              <w:tabs>
+                <w:tab w:val="decimal" w:pos="541"/>
+              </w:tabs>
+            </w:pPr>
+            <w:r>
+              <w:tab/>
+            </w:r>
+            <w:r>
+              <w:rPr>
+                <w:rFonts w:ascii="Times New Roman" w:hAnsi="Times New Roman" w:eastAsia="Times New Roman"/>
                 <w:b w:val="0"/>
                 <w:i w:val="0"/>
                 <w:sz w:val="18"/>
@@ -5387,16 +6131,28 @@
         <w:tc>
           <w:tcPr>
             <w:tcW w:type="dxa" w:w="1318"/>
-            <w:vAlign w:val="center"/>
-          </w:tcPr>
-          <w:p>
-            <w:pPr>
-              <w:spacing w:before="0" w:after="0" w:line="240" w:lineRule="exact"/>
-              <w:jc w:val="right"/>
-            </w:pPr>
-            <w:r>
-              <w:rPr>
-                <w:rFonts w:ascii="Times New Roman" w:hAnsi="Times New Roman" w:eastAsia="宋体"/>
+            <w:tcMar>
+              <w:top w:type="dxa" w:w="0"/>
+              <w:bottom w:type="dxa" w:w="0"/>
+              <w:left w:type="dxa" w:w="56"/>
+              <w:right w:type="dxa" w:w="56"/>
+            </w:tcMar>
+          </w:tcPr>
+          <w:p>
+            <w:pPr>
+              <w:spacing w:before="0" w:after="0" w:line="240" w:lineRule="exact"/>
+              <w:ind w:left="0" w:right="0"/>
+              <w:jc w:val="left"/>
+              <w:tabs>
+                <w:tab w:val="decimal" w:pos="541"/>
+              </w:tabs>
+            </w:pPr>
+            <w:r>
+              <w:tab/>
+            </w:r>
+            <w:r>
+              <w:rPr>
+                <w:rFonts w:ascii="Times New Roman" w:hAnsi="Times New Roman" w:eastAsia="Times New Roman"/>
                 <w:b w:val="0"/>
                 <w:i w:val="0"/>
                 <w:sz w:val="18"/>
@@ -5408,16 +6164,28 @@
         <w:tc>
           <w:tcPr>
             <w:tcW w:type="dxa" w:w="1318"/>
-            <w:vAlign w:val="center"/>
-          </w:tcPr>
-          <w:p>
-            <w:pPr>
-              <w:spacing w:before="0" w:after="0" w:line="240" w:lineRule="exact"/>
-              <w:jc w:val="right"/>
-            </w:pPr>
-            <w:r>
-              <w:rPr>
-                <w:rFonts w:ascii="Times New Roman" w:hAnsi="Times New Roman" w:eastAsia="宋体"/>
+            <w:tcMar>
+              <w:top w:type="dxa" w:w="0"/>
+              <w:bottom w:type="dxa" w:w="0"/>
+              <w:left w:type="dxa" w:w="56"/>
+              <w:right w:type="dxa" w:w="56"/>
+            </w:tcMar>
+          </w:tcPr>
+          <w:p>
+            <w:pPr>
+              <w:spacing w:before="0" w:after="0" w:line="240" w:lineRule="exact"/>
+              <w:ind w:left="0" w:right="0"/>
+              <w:jc w:val="left"/>
+              <w:tabs>
+                <w:tab w:val="decimal" w:pos="541"/>
+              </w:tabs>
+            </w:pPr>
+            <w:r>
+              <w:tab/>
+            </w:r>
+            <w:r>
+              <w:rPr>
+                <w:rFonts w:ascii="Times New Roman" w:hAnsi="Times New Roman" w:eastAsia="Times New Roman"/>
                 <w:b w:val="0"/>
                 <w:i w:val="0"/>
                 <w:sz w:val="18"/>
@@ -5428,7 +6196,13 @@
         </w:tc>
         <w:tc>
           <w:tcPr>
-            <w:tcW w:type="dxa" w:w="1318"/>
+            <w:tcW w:type="dxa" w:w="1319"/>
+            <w:tcMar>
+              <w:top w:type="dxa" w:w="0"/>
+              <w:bottom w:type="dxa" w:w="0"/>
+              <w:left w:type="dxa" w:w="56"/>
+              <w:right w:type="dxa" w:w="56"/>
+            </w:tcMar>
             <w:vAlign w:val="center"/>
           </w:tcPr>
           <w:p>
@@ -5455,6 +6229,12 @@
         <w:tc>
           <w:tcPr>
             <w:tcW w:type="dxa" w:w="3231"/>
+            <w:tcMar>
+              <w:top w:type="dxa" w:w="0"/>
+              <w:bottom w:type="dxa" w:w="0"/>
+              <w:left w:type="dxa" w:w="56"/>
+              <w:right w:type="dxa" w:w="56"/>
+            </w:tcMar>
             <w:vAlign w:val="center"/>
           </w:tcPr>
           <w:p>
@@ -5476,16 +6256,28 @@
         <w:tc>
           <w:tcPr>
             <w:tcW w:type="dxa" w:w="1318"/>
-            <w:vAlign w:val="center"/>
-          </w:tcPr>
-          <w:p>
-            <w:pPr>
-              <w:spacing w:before="0" w:after="0" w:line="240" w:lineRule="exact"/>
-              <w:jc w:val="right"/>
-            </w:pPr>
-            <w:r>
-              <w:rPr>
-                <w:rFonts w:ascii="Times New Roman" w:hAnsi="Times New Roman" w:eastAsia="宋体"/>
+            <w:tcMar>
+              <w:top w:type="dxa" w:w="0"/>
+              <w:bottom w:type="dxa" w:w="0"/>
+              <w:left w:type="dxa" w:w="56"/>
+              <w:right w:type="dxa" w:w="56"/>
+            </w:tcMar>
+          </w:tcPr>
+          <w:p>
+            <w:pPr>
+              <w:spacing w:before="0" w:after="0" w:line="240" w:lineRule="exact"/>
+              <w:ind w:left="0" w:right="0"/>
+              <w:jc w:val="left"/>
+              <w:tabs>
+                <w:tab w:val="decimal" w:pos="541"/>
+              </w:tabs>
+            </w:pPr>
+            <w:r>
+              <w:tab/>
+            </w:r>
+            <w:r>
+              <w:rPr>
+                <w:rFonts w:ascii="Times New Roman" w:hAnsi="Times New Roman" w:eastAsia="Times New Roman"/>
                 <w:b w:val="0"/>
                 <w:i w:val="0"/>
                 <w:sz w:val="18"/>
@@ -5497,16 +6289,28 @@
         <w:tc>
           <w:tcPr>
             <w:tcW w:type="dxa" w:w="1318"/>
-            <w:vAlign w:val="center"/>
-          </w:tcPr>
-          <w:p>
-            <w:pPr>
-              <w:spacing w:before="0" w:after="0" w:line="240" w:lineRule="exact"/>
-              <w:jc w:val="right"/>
-            </w:pPr>
-            <w:r>
-              <w:rPr>
-                <w:rFonts w:ascii="Times New Roman" w:hAnsi="Times New Roman" w:eastAsia="宋体"/>
+            <w:tcMar>
+              <w:top w:type="dxa" w:w="0"/>
+              <w:bottom w:type="dxa" w:w="0"/>
+              <w:left w:type="dxa" w:w="56"/>
+              <w:right w:type="dxa" w:w="56"/>
+            </w:tcMar>
+          </w:tcPr>
+          <w:p>
+            <w:pPr>
+              <w:spacing w:before="0" w:after="0" w:line="240" w:lineRule="exact"/>
+              <w:ind w:left="0" w:right="0"/>
+              <w:jc w:val="left"/>
+              <w:tabs>
+                <w:tab w:val="decimal" w:pos="541"/>
+              </w:tabs>
+            </w:pPr>
+            <w:r>
+              <w:tab/>
+            </w:r>
+            <w:r>
+              <w:rPr>
+                <w:rFonts w:ascii="Times New Roman" w:hAnsi="Times New Roman" w:eastAsia="Times New Roman"/>
                 <w:b w:val="0"/>
                 <w:i w:val="0"/>
                 <w:sz w:val="18"/>
@@ -5518,6 +6322,12 @@
         <w:tc>
           <w:tcPr>
             <w:tcW w:type="dxa" w:w="1318"/>
+            <w:tcMar>
+              <w:top w:type="dxa" w:w="0"/>
+              <w:bottom w:type="dxa" w:w="0"/>
+              <w:left w:type="dxa" w:w="56"/>
+              <w:right w:type="dxa" w:w="56"/>
+            </w:tcMar>
             <w:vAlign w:val="center"/>
           </w:tcPr>
           <w:p>
@@ -5538,7 +6348,13 @@
         </w:tc>
         <w:tc>
           <w:tcPr>
-            <w:tcW w:type="dxa" w:w="1318"/>
+            <w:tcW w:type="dxa" w:w="1319"/>
+            <w:tcMar>
+              <w:top w:type="dxa" w:w="0"/>
+              <w:bottom w:type="dxa" w:w="0"/>
+              <w:left w:type="dxa" w:w="56"/>
+              <w:right w:type="dxa" w:w="56"/>
+            </w:tcMar>
             <w:vAlign w:val="center"/>
           </w:tcPr>
           <w:p>
@@ -5565,6 +6381,12 @@
         <w:tc>
           <w:tcPr>
             <w:tcW w:type="dxa" w:w="3231"/>
+            <w:tcMar>
+              <w:top w:type="dxa" w:w="0"/>
+              <w:bottom w:type="dxa" w:w="0"/>
+              <w:left w:type="dxa" w:w="56"/>
+              <w:right w:type="dxa" w:w="56"/>
+            </w:tcMar>
             <w:vAlign w:val="center"/>
           </w:tcPr>
           <w:p>
@@ -5586,16 +6408,28 @@
         <w:tc>
           <w:tcPr>
             <w:tcW w:type="dxa" w:w="1318"/>
-            <w:vAlign w:val="center"/>
-          </w:tcPr>
-          <w:p>
-            <w:pPr>
-              <w:spacing w:before="0" w:after="0" w:line="240" w:lineRule="exact"/>
-              <w:jc w:val="right"/>
-            </w:pPr>
-            <w:r>
-              <w:rPr>
-                <w:rFonts w:ascii="Times New Roman" w:hAnsi="Times New Roman" w:eastAsia="宋体"/>
+            <w:tcMar>
+              <w:top w:type="dxa" w:w="0"/>
+              <w:bottom w:type="dxa" w:w="0"/>
+              <w:left w:type="dxa" w:w="56"/>
+              <w:right w:type="dxa" w:w="56"/>
+            </w:tcMar>
+          </w:tcPr>
+          <w:p>
+            <w:pPr>
+              <w:spacing w:before="0" w:after="0" w:line="240" w:lineRule="exact"/>
+              <w:ind w:left="0" w:right="0"/>
+              <w:jc w:val="left"/>
+              <w:tabs>
+                <w:tab w:val="decimal" w:pos="541"/>
+              </w:tabs>
+            </w:pPr>
+            <w:r>
+              <w:tab/>
+            </w:r>
+            <w:r>
+              <w:rPr>
+                <w:rFonts w:ascii="Times New Roman" w:hAnsi="Times New Roman" w:eastAsia="Times New Roman"/>
                 <w:b w:val="0"/>
                 <w:i w:val="0"/>
                 <w:sz w:val="18"/>
@@ -5607,16 +6441,28 @@
         <w:tc>
           <w:tcPr>
             <w:tcW w:type="dxa" w:w="1318"/>
-            <w:vAlign w:val="center"/>
-          </w:tcPr>
-          <w:p>
-            <w:pPr>
-              <w:spacing w:before="0" w:after="0" w:line="240" w:lineRule="exact"/>
-              <w:jc w:val="right"/>
-            </w:pPr>
-            <w:r>
-              <w:rPr>
-                <w:rFonts w:ascii="Times New Roman" w:hAnsi="Times New Roman" w:eastAsia="宋体"/>
+            <w:tcMar>
+              <w:top w:type="dxa" w:w="0"/>
+              <w:bottom w:type="dxa" w:w="0"/>
+              <w:left w:type="dxa" w:w="56"/>
+              <w:right w:type="dxa" w:w="56"/>
+            </w:tcMar>
+          </w:tcPr>
+          <w:p>
+            <w:pPr>
+              <w:spacing w:before="0" w:after="0" w:line="240" w:lineRule="exact"/>
+              <w:ind w:left="0" w:right="0"/>
+              <w:jc w:val="left"/>
+              <w:tabs>
+                <w:tab w:val="decimal" w:pos="541"/>
+              </w:tabs>
+            </w:pPr>
+            <w:r>
+              <w:tab/>
+            </w:r>
+            <w:r>
+              <w:rPr>
+                <w:rFonts w:ascii="Times New Roman" w:hAnsi="Times New Roman" w:eastAsia="Times New Roman"/>
                 <w:b w:val="0"/>
                 <w:i w:val="0"/>
                 <w:sz w:val="18"/>
@@ -5628,6 +6474,12 @@
         <w:tc>
           <w:tcPr>
             <w:tcW w:type="dxa" w:w="1318"/>
+            <w:tcMar>
+              <w:top w:type="dxa" w:w="0"/>
+              <w:bottom w:type="dxa" w:w="0"/>
+              <w:left w:type="dxa" w:w="56"/>
+              <w:right w:type="dxa" w:w="56"/>
+            </w:tcMar>
             <w:vAlign w:val="center"/>
           </w:tcPr>
           <w:p>
@@ -5648,7 +6500,13 @@
         </w:tc>
         <w:tc>
           <w:tcPr>
-            <w:tcW w:type="dxa" w:w="1318"/>
+            <w:tcW w:type="dxa" w:w="1319"/>
+            <w:tcMar>
+              <w:top w:type="dxa" w:w="0"/>
+              <w:bottom w:type="dxa" w:w="0"/>
+              <w:left w:type="dxa" w:w="56"/>
+              <w:right w:type="dxa" w:w="56"/>
+            </w:tcMar>
             <w:vAlign w:val="center"/>
           </w:tcPr>
           <w:p>
@@ -5675,6 +6533,12 @@
         <w:tc>
           <w:tcPr>
             <w:tcW w:type="dxa" w:w="3231"/>
+            <w:tcMar>
+              <w:top w:type="dxa" w:w="0"/>
+              <w:bottom w:type="dxa" w:w="0"/>
+              <w:left w:type="dxa" w:w="56"/>
+              <w:right w:type="dxa" w:w="56"/>
+            </w:tcMar>
             <w:vAlign w:val="center"/>
             <w:tcBorders>
               <w:bottom w:val="single" w:sz="8" w:space="0" w:color="000000"/>
@@ -5699,7 +6563,12 @@
         <w:tc>
           <w:tcPr>
             <w:tcW w:type="dxa" w:w="1318"/>
-            <w:vAlign w:val="center"/>
+            <w:tcMar>
+              <w:top w:type="dxa" w:w="0"/>
+              <w:bottom w:type="dxa" w:w="0"/>
+              <w:left w:type="dxa" w:w="56"/>
+              <w:right w:type="dxa" w:w="56"/>
+            </w:tcMar>
             <w:tcBorders>
               <w:bottom w:val="single" w:sz="8" w:space="0" w:color="000000"/>
             </w:tcBorders>
@@ -5707,11 +6576,18 @@
           <w:p>
             <w:pPr>
               <w:spacing w:before="0" w:after="0" w:line="240" w:lineRule="exact"/>
-              <w:jc w:val="right"/>
-            </w:pPr>
-            <w:r>
-              <w:rPr>
-                <w:rFonts w:ascii="Times New Roman" w:hAnsi="Times New Roman" w:eastAsia="宋体"/>
+              <w:ind w:left="0" w:right="0"/>
+              <w:jc w:val="left"/>
+              <w:tabs>
+                <w:tab w:val="decimal" w:pos="541"/>
+              </w:tabs>
+            </w:pPr>
+            <w:r>
+              <w:tab/>
+            </w:r>
+            <w:r>
+              <w:rPr>
+                <w:rFonts w:ascii="Times New Roman" w:hAnsi="Times New Roman" w:eastAsia="Times New Roman"/>
                 <w:b w:val="0"/>
                 <w:i w:val="0"/>
                 <w:sz w:val="18"/>
@@ -5723,7 +6599,12 @@
         <w:tc>
           <w:tcPr>
             <w:tcW w:type="dxa" w:w="1318"/>
-            <w:vAlign w:val="center"/>
+            <w:tcMar>
+              <w:top w:type="dxa" w:w="0"/>
+              <w:bottom w:type="dxa" w:w="0"/>
+              <w:left w:type="dxa" w:w="56"/>
+              <w:right w:type="dxa" w:w="56"/>
+            </w:tcMar>
             <w:tcBorders>
               <w:bottom w:val="single" w:sz="8" w:space="0" w:color="000000"/>
             </w:tcBorders>
@@ -5731,11 +6612,18 @@
           <w:p>
             <w:pPr>
               <w:spacing w:before="0" w:after="0" w:line="240" w:lineRule="exact"/>
-              <w:jc w:val="right"/>
-            </w:pPr>
-            <w:r>
-              <w:rPr>
-                <w:rFonts w:ascii="Times New Roman" w:hAnsi="Times New Roman" w:eastAsia="宋体"/>
+              <w:ind w:left="0" w:right="0"/>
+              <w:jc w:val="left"/>
+              <w:tabs>
+                <w:tab w:val="decimal" w:pos="541"/>
+              </w:tabs>
+            </w:pPr>
+            <w:r>
+              <w:tab/>
+            </w:r>
+            <w:r>
+              <w:rPr>
+                <w:rFonts w:ascii="Times New Roman" w:hAnsi="Times New Roman" w:eastAsia="Times New Roman"/>
                 <w:b w:val="0"/>
                 <w:i w:val="0"/>
                 <w:sz w:val="18"/>
@@ -5747,6 +6635,12 @@
         <w:tc>
           <w:tcPr>
             <w:tcW w:type="dxa" w:w="1318"/>
+            <w:tcMar>
+              <w:top w:type="dxa" w:w="0"/>
+              <w:bottom w:type="dxa" w:w="0"/>
+              <w:left w:type="dxa" w:w="56"/>
+              <w:right w:type="dxa" w:w="56"/>
+            </w:tcMar>
             <w:vAlign w:val="center"/>
             <w:tcBorders>
               <w:bottom w:val="single" w:sz="8" w:space="0" w:color="000000"/>
@@ -5770,7 +6664,13 @@
         </w:tc>
         <w:tc>
           <w:tcPr>
-            <w:tcW w:type="dxa" w:w="1318"/>
+            <w:tcW w:type="dxa" w:w="1319"/>
+            <w:tcMar>
+              <w:top w:type="dxa" w:w="0"/>
+              <w:bottom w:type="dxa" w:w="0"/>
+              <w:left w:type="dxa" w:w="56"/>
+              <w:right w:type="dxa" w:w="56"/>
+            </w:tcMar>
             <w:vAlign w:val="center"/>
             <w:tcBorders>
               <w:bottom w:val="single" w:sz="8" w:space="0" w:color="000000"/>
@@ -6161,7 +7061,7 @@
     </w:p>
     <w:tbl>
       <w:tblPr>
-        <w:tblW w:type="auto" w:w="0"/>
+        <w:tblW w:type="dxa" w:w="8504"/>
         <w:tblLayout w:type="fixed"/>
         <w:tblLook w:firstColumn="1" w:firstRow="1" w:lastColumn="0" w:lastRow="0" w:noHBand="0" w:noVBand="1" w:val="04A0"/>
         <w:jc w:val="center"/>
@@ -6175,11 +7075,11 @@
         </w:tblBorders>
       </w:tblPr>
       <w:tblGrid>
-        <w:gridCol w:w="1814"/>
-        <w:gridCol w:w="1814"/>
-        <w:gridCol w:w="1814"/>
-        <w:gridCol w:w="1814"/>
-        <w:gridCol w:w="1814"/>
+        <w:gridCol w:w="3231"/>
+        <w:gridCol w:w="850"/>
+        <w:gridCol w:w="1474"/>
+        <w:gridCol w:w="1474"/>
+        <w:gridCol w:w="1475"/>
       </w:tblGrid>
       <w:tr>
         <w:trPr>
@@ -6192,6 +7092,12 @@
               <w:top w:val="single" w:sz="8" w:space="0" w:color="000000"/>
               <w:bottom w:val="single" w:sz="4" w:space="0" w:color="000000"/>
             </w:tcBorders>
+            <w:tcMar>
+              <w:top w:type="dxa" w:w="0"/>
+              <w:bottom w:type="dxa" w:w="0"/>
+              <w:left w:type="dxa" w:w="56"/>
+              <w:right w:type="dxa" w:w="56"/>
+            </w:tcMar>
             <w:vAlign w:val="center"/>
           </w:tcPr>
           <w:p>
@@ -6217,6 +7123,12 @@
               <w:top w:val="single" w:sz="8" w:space="0" w:color="000000"/>
               <w:bottom w:val="single" w:sz="4" w:space="0" w:color="000000"/>
             </w:tcBorders>
+            <w:tcMar>
+              <w:top w:type="dxa" w:w="0"/>
+              <w:bottom w:type="dxa" w:w="0"/>
+              <w:left w:type="dxa" w:w="56"/>
+              <w:right w:type="dxa" w:w="56"/>
+            </w:tcMar>
             <w:vAlign w:val="center"/>
           </w:tcPr>
           <w:p>
@@ -6242,6 +7154,12 @@
               <w:top w:val="single" w:sz="8" w:space="0" w:color="000000"/>
               <w:bottom w:val="single" w:sz="4" w:space="0" w:color="000000"/>
             </w:tcBorders>
+            <w:tcMar>
+              <w:top w:type="dxa" w:w="0"/>
+              <w:bottom w:type="dxa" w:w="0"/>
+              <w:left w:type="dxa" w:w="56"/>
+              <w:right w:type="dxa" w:w="56"/>
+            </w:tcMar>
             <w:vAlign w:val="center"/>
           </w:tcPr>
           <w:p>
@@ -6267,6 +7185,12 @@
               <w:top w:val="single" w:sz="8" w:space="0" w:color="000000"/>
               <w:bottom w:val="single" w:sz="4" w:space="0" w:color="000000"/>
             </w:tcBorders>
+            <w:tcMar>
+              <w:top w:type="dxa" w:w="0"/>
+              <w:bottom w:type="dxa" w:w="0"/>
+              <w:left w:type="dxa" w:w="56"/>
+              <w:right w:type="dxa" w:w="56"/>
+            </w:tcMar>
             <w:vAlign w:val="center"/>
           </w:tcPr>
           <w:p>
@@ -6287,11 +7211,17 @@
         </w:tc>
         <w:tc>
           <w:tcPr>
-            <w:tcW w:type="dxa" w:w="1474"/>
+            <w:tcW w:type="dxa" w:w="1475"/>
             <w:tcBorders>
               <w:top w:val="single" w:sz="8" w:space="0" w:color="000000"/>
               <w:bottom w:val="single" w:sz="4" w:space="0" w:color="000000"/>
             </w:tcBorders>
+            <w:tcMar>
+              <w:top w:type="dxa" w:w="0"/>
+              <w:bottom w:type="dxa" w:w="0"/>
+              <w:left w:type="dxa" w:w="56"/>
+              <w:right w:type="dxa" w:w="56"/>
+            </w:tcMar>
             <w:vAlign w:val="center"/>
           </w:tcPr>
           <w:p>
@@ -6318,6 +7248,12 @@
         <w:tc>
           <w:tcPr>
             <w:tcW w:type="dxa" w:w="3231"/>
+            <w:tcMar>
+              <w:top w:type="dxa" w:w="0"/>
+              <w:bottom w:type="dxa" w:w="0"/>
+              <w:left w:type="dxa" w:w="56"/>
+              <w:right w:type="dxa" w:w="56"/>
+            </w:tcMar>
             <w:vAlign w:val="center"/>
           </w:tcPr>
           <w:p>
@@ -6339,6 +7275,12 @@
         <w:tc>
           <w:tcPr>
             <w:tcW w:type="dxa" w:w="850"/>
+            <w:tcMar>
+              <w:top w:type="dxa" w:w="0"/>
+              <w:bottom w:type="dxa" w:w="0"/>
+              <w:left w:type="dxa" w:w="56"/>
+              <w:right w:type="dxa" w:w="56"/>
+            </w:tcMar>
             <w:vAlign w:val="center"/>
           </w:tcPr>
           <w:p>
@@ -6360,16 +7302,28 @@
         <w:tc>
           <w:tcPr>
             <w:tcW w:type="dxa" w:w="1474"/>
-            <w:vAlign w:val="center"/>
-          </w:tcPr>
-          <w:p>
-            <w:pPr>
-              <w:spacing w:before="0" w:after="0" w:line="240" w:lineRule="exact"/>
-              <w:jc w:val="right"/>
-            </w:pPr>
-            <w:r>
-              <w:rPr>
-                <w:rFonts w:ascii="Times New Roman" w:hAnsi="Times New Roman" w:eastAsia="宋体"/>
+            <w:tcMar>
+              <w:top w:type="dxa" w:w="0"/>
+              <w:bottom w:type="dxa" w:w="0"/>
+              <w:left w:type="dxa" w:w="56"/>
+              <w:right w:type="dxa" w:w="56"/>
+            </w:tcMar>
+          </w:tcPr>
+          <w:p>
+            <w:pPr>
+              <w:spacing w:before="0" w:after="0" w:line="240" w:lineRule="exact"/>
+              <w:ind w:left="0" w:right="0"/>
+              <w:jc w:val="left"/>
+              <w:tabs>
+                <w:tab w:val="decimal" w:pos="612"/>
+              </w:tabs>
+            </w:pPr>
+            <w:r>
+              <w:tab/>
+            </w:r>
+            <w:r>
+              <w:rPr>
+                <w:rFonts w:ascii="Times New Roman" w:hAnsi="Times New Roman" w:eastAsia="Times New Roman"/>
                 <w:b w:val="0"/>
                 <w:i w:val="0"/>
                 <w:sz w:val="18"/>
@@ -6381,16 +7335,28 @@
         <w:tc>
           <w:tcPr>
             <w:tcW w:type="dxa" w:w="1474"/>
-            <w:vAlign w:val="center"/>
-          </w:tcPr>
-          <w:p>
-            <w:pPr>
-              <w:spacing w:before="0" w:after="0" w:line="240" w:lineRule="exact"/>
-              <w:jc w:val="right"/>
-            </w:pPr>
-            <w:r>
-              <w:rPr>
-                <w:rFonts w:ascii="Times New Roman" w:hAnsi="Times New Roman" w:eastAsia="宋体"/>
+            <w:tcMar>
+              <w:top w:type="dxa" w:w="0"/>
+              <w:bottom w:type="dxa" w:w="0"/>
+              <w:left w:type="dxa" w:w="56"/>
+              <w:right w:type="dxa" w:w="56"/>
+            </w:tcMar>
+          </w:tcPr>
+          <w:p>
+            <w:pPr>
+              <w:spacing w:before="0" w:after="0" w:line="240" w:lineRule="exact"/>
+              <w:ind w:left="0" w:right="0"/>
+              <w:jc w:val="left"/>
+              <w:tabs>
+                <w:tab w:val="decimal" w:pos="612"/>
+              </w:tabs>
+            </w:pPr>
+            <w:r>
+              <w:tab/>
+            </w:r>
+            <w:r>
+              <w:rPr>
+                <w:rFonts w:ascii="Times New Roman" w:hAnsi="Times New Roman" w:eastAsia="Times New Roman"/>
                 <w:b w:val="0"/>
                 <w:i w:val="0"/>
                 <w:sz w:val="18"/>
@@ -6401,17 +7367,29 @@
         </w:tc>
         <w:tc>
           <w:tcPr>
-            <w:tcW w:type="dxa" w:w="1474"/>
-            <w:vAlign w:val="center"/>
-          </w:tcPr>
-          <w:p>
-            <w:pPr>
-              <w:spacing w:before="0" w:after="0" w:line="240" w:lineRule="exact"/>
-              <w:jc w:val="right"/>
-            </w:pPr>
-            <w:r>
-              <w:rPr>
-                <w:rFonts w:ascii="Times New Roman" w:hAnsi="Times New Roman" w:eastAsia="宋体"/>
+            <w:tcW w:type="dxa" w:w="1475"/>
+            <w:tcMar>
+              <w:top w:type="dxa" w:w="0"/>
+              <w:bottom w:type="dxa" w:w="0"/>
+              <w:left w:type="dxa" w:w="56"/>
+              <w:right w:type="dxa" w:w="56"/>
+            </w:tcMar>
+          </w:tcPr>
+          <w:p>
+            <w:pPr>
+              <w:spacing w:before="0" w:after="0" w:line="240" w:lineRule="exact"/>
+              <w:ind w:left="0" w:right="0"/>
+              <w:jc w:val="left"/>
+              <w:tabs>
+                <w:tab w:val="decimal" w:pos="612"/>
+              </w:tabs>
+            </w:pPr>
+            <w:r>
+              <w:tab/>
+            </w:r>
+            <w:r>
+              <w:rPr>
+                <w:rFonts w:ascii="Times New Roman" w:hAnsi="Times New Roman" w:eastAsia="Times New Roman"/>
                 <w:b w:val="0"/>
                 <w:i w:val="0"/>
                 <w:sz w:val="18"/>
@@ -6428,6 +7406,12 @@
         <w:tc>
           <w:tcPr>
             <w:tcW w:type="dxa" w:w="3231"/>
+            <w:tcMar>
+              <w:top w:type="dxa" w:w="0"/>
+              <w:bottom w:type="dxa" w:w="0"/>
+              <w:left w:type="dxa" w:w="56"/>
+              <w:right w:type="dxa" w:w="56"/>
+            </w:tcMar>
             <w:vAlign w:val="center"/>
           </w:tcPr>
           <w:p>
@@ -6449,6 +7433,12 @@
         <w:tc>
           <w:tcPr>
             <w:tcW w:type="dxa" w:w="850"/>
+            <w:tcMar>
+              <w:top w:type="dxa" w:w="0"/>
+              <w:bottom w:type="dxa" w:w="0"/>
+              <w:left w:type="dxa" w:w="56"/>
+              <w:right w:type="dxa" w:w="56"/>
+            </w:tcMar>
             <w:vAlign w:val="center"/>
           </w:tcPr>
           <w:p>
@@ -6470,16 +7460,28 @@
         <w:tc>
           <w:tcPr>
             <w:tcW w:type="dxa" w:w="1474"/>
-            <w:vAlign w:val="center"/>
-          </w:tcPr>
-          <w:p>
-            <w:pPr>
-              <w:spacing w:before="0" w:after="0" w:line="240" w:lineRule="exact"/>
-              <w:jc w:val="right"/>
-            </w:pPr>
-            <w:r>
-              <w:rPr>
-                <w:rFonts w:ascii="Times New Roman" w:hAnsi="Times New Roman" w:eastAsia="宋体"/>
+            <w:tcMar>
+              <w:top w:type="dxa" w:w="0"/>
+              <w:bottom w:type="dxa" w:w="0"/>
+              <w:left w:type="dxa" w:w="56"/>
+              <w:right w:type="dxa" w:w="56"/>
+            </w:tcMar>
+          </w:tcPr>
+          <w:p>
+            <w:pPr>
+              <w:spacing w:before="0" w:after="0" w:line="240" w:lineRule="exact"/>
+              <w:ind w:left="0" w:right="0"/>
+              <w:jc w:val="left"/>
+              <w:tabs>
+                <w:tab w:val="decimal" w:pos="612"/>
+              </w:tabs>
+            </w:pPr>
+            <w:r>
+              <w:tab/>
+            </w:r>
+            <w:r>
+              <w:rPr>
+                <w:rFonts w:ascii="Times New Roman" w:hAnsi="Times New Roman" w:eastAsia="Times New Roman"/>
                 <w:b w:val="0"/>
                 <w:i w:val="0"/>
                 <w:sz w:val="18"/>
@@ -6491,16 +7493,28 @@
         <w:tc>
           <w:tcPr>
             <w:tcW w:type="dxa" w:w="1474"/>
-            <w:vAlign w:val="center"/>
-          </w:tcPr>
-          <w:p>
-            <w:pPr>
-              <w:spacing w:before="0" w:after="0" w:line="240" w:lineRule="exact"/>
-              <w:jc w:val="right"/>
-            </w:pPr>
-            <w:r>
-              <w:rPr>
-                <w:rFonts w:ascii="Times New Roman" w:hAnsi="Times New Roman" w:eastAsia="宋体"/>
+            <w:tcMar>
+              <w:top w:type="dxa" w:w="0"/>
+              <w:bottom w:type="dxa" w:w="0"/>
+              <w:left w:type="dxa" w:w="56"/>
+              <w:right w:type="dxa" w:w="56"/>
+            </w:tcMar>
+          </w:tcPr>
+          <w:p>
+            <w:pPr>
+              <w:spacing w:before="0" w:after="0" w:line="240" w:lineRule="exact"/>
+              <w:ind w:left="0" w:right="0"/>
+              <w:jc w:val="left"/>
+              <w:tabs>
+                <w:tab w:val="decimal" w:pos="612"/>
+              </w:tabs>
+            </w:pPr>
+            <w:r>
+              <w:tab/>
+            </w:r>
+            <w:r>
+              <w:rPr>
+                <w:rFonts w:ascii="Times New Roman" w:hAnsi="Times New Roman" w:eastAsia="Times New Roman"/>
                 <w:b w:val="0"/>
                 <w:i w:val="0"/>
                 <w:sz w:val="18"/>
@@ -6511,17 +7525,29 @@
         </w:tc>
         <w:tc>
           <w:tcPr>
-            <w:tcW w:type="dxa" w:w="1474"/>
-            <w:vAlign w:val="center"/>
-          </w:tcPr>
-          <w:p>
-            <w:pPr>
-              <w:spacing w:before="0" w:after="0" w:line="240" w:lineRule="exact"/>
-              <w:jc w:val="right"/>
-            </w:pPr>
-            <w:r>
-              <w:rPr>
-                <w:rFonts w:ascii="Times New Roman" w:hAnsi="Times New Roman" w:eastAsia="宋体"/>
+            <w:tcW w:type="dxa" w:w="1475"/>
+            <w:tcMar>
+              <w:top w:type="dxa" w:w="0"/>
+              <w:bottom w:type="dxa" w:w="0"/>
+              <w:left w:type="dxa" w:w="56"/>
+              <w:right w:type="dxa" w:w="56"/>
+            </w:tcMar>
+          </w:tcPr>
+          <w:p>
+            <w:pPr>
+              <w:spacing w:before="0" w:after="0" w:line="240" w:lineRule="exact"/>
+              <w:ind w:left="0" w:right="0"/>
+              <w:jc w:val="left"/>
+              <w:tabs>
+                <w:tab w:val="decimal" w:pos="612"/>
+              </w:tabs>
+            </w:pPr>
+            <w:r>
+              <w:tab/>
+            </w:r>
+            <w:r>
+              <w:rPr>
+                <w:rFonts w:ascii="Times New Roman" w:hAnsi="Times New Roman" w:eastAsia="Times New Roman"/>
                 <w:b w:val="0"/>
                 <w:i w:val="0"/>
                 <w:sz w:val="18"/>
@@ -6538,6 +7564,12 @@
         <w:tc>
           <w:tcPr>
             <w:tcW w:type="dxa" w:w="3231"/>
+            <w:tcMar>
+              <w:top w:type="dxa" w:w="0"/>
+              <w:bottom w:type="dxa" w:w="0"/>
+              <w:left w:type="dxa" w:w="56"/>
+              <w:right w:type="dxa" w:w="56"/>
+            </w:tcMar>
             <w:vAlign w:val="center"/>
             <w:tcBorders>
               <w:bottom w:val="single" w:sz="4" w:space="0" w:color="000000"/>
@@ -6562,6 +7594,12 @@
         <w:tc>
           <w:tcPr>
             <w:tcW w:type="dxa" w:w="850"/>
+            <w:tcMar>
+              <w:top w:type="dxa" w:w="0"/>
+              <w:bottom w:type="dxa" w:w="0"/>
+              <w:left w:type="dxa" w:w="56"/>
+              <w:right w:type="dxa" w:w="56"/>
+            </w:tcMar>
             <w:vAlign w:val="center"/>
             <w:tcBorders>
               <w:bottom w:val="single" w:sz="4" w:space="0" w:color="000000"/>
@@ -6586,7 +7624,12 @@
         <w:tc>
           <w:tcPr>
             <w:tcW w:type="dxa" w:w="1474"/>
-            <w:vAlign w:val="center"/>
+            <w:tcMar>
+              <w:top w:type="dxa" w:w="0"/>
+              <w:bottom w:type="dxa" w:w="0"/>
+              <w:left w:type="dxa" w:w="56"/>
+              <w:right w:type="dxa" w:w="56"/>
+            </w:tcMar>
             <w:tcBorders>
               <w:bottom w:val="single" w:sz="4" w:space="0" w:color="000000"/>
             </w:tcBorders>
@@ -6594,11 +7637,18 @@
           <w:p>
             <w:pPr>
               <w:spacing w:before="0" w:after="0" w:line="240" w:lineRule="exact"/>
-              <w:jc w:val="right"/>
-            </w:pPr>
-            <w:r>
-              <w:rPr>
-                <w:rFonts w:ascii="Times New Roman" w:hAnsi="Times New Roman" w:eastAsia="宋体"/>
+              <w:ind w:left="0" w:right="0"/>
+              <w:jc w:val="left"/>
+              <w:tabs>
+                <w:tab w:val="decimal" w:pos="612"/>
+              </w:tabs>
+            </w:pPr>
+            <w:r>
+              <w:tab/>
+            </w:r>
+            <w:r>
+              <w:rPr>
+                <w:rFonts w:ascii="Times New Roman" w:hAnsi="Times New Roman" w:eastAsia="Times New Roman"/>
                 <w:b w:val="0"/>
                 <w:i w:val="0"/>
                 <w:sz w:val="18"/>
@@ -6610,7 +7660,12 @@
         <w:tc>
           <w:tcPr>
             <w:tcW w:type="dxa" w:w="1474"/>
-            <w:vAlign w:val="center"/>
+            <w:tcMar>
+              <w:top w:type="dxa" w:w="0"/>
+              <w:bottom w:type="dxa" w:w="0"/>
+              <w:left w:type="dxa" w:w="56"/>
+              <w:right w:type="dxa" w:w="56"/>
+            </w:tcMar>
             <w:tcBorders>
               <w:bottom w:val="single" w:sz="4" w:space="0" w:color="000000"/>
             </w:tcBorders>
@@ -6618,11 +7673,18 @@
           <w:p>
             <w:pPr>
               <w:spacing w:before="0" w:after="0" w:line="240" w:lineRule="exact"/>
-              <w:jc w:val="right"/>
-            </w:pPr>
-            <w:r>
-              <w:rPr>
-                <w:rFonts w:ascii="Times New Roman" w:hAnsi="Times New Roman" w:eastAsia="宋体"/>
+              <w:ind w:left="0" w:right="0"/>
+              <w:jc w:val="left"/>
+              <w:tabs>
+                <w:tab w:val="decimal" w:pos="612"/>
+              </w:tabs>
+            </w:pPr>
+            <w:r>
+              <w:tab/>
+            </w:r>
+            <w:r>
+              <w:rPr>
+                <w:rFonts w:ascii="Times New Roman" w:hAnsi="Times New Roman" w:eastAsia="Times New Roman"/>
                 <w:b w:val="0"/>
                 <w:i w:val="0"/>
                 <w:sz w:val="18"/>
@@ -6633,8 +7695,13 @@
         </w:tc>
         <w:tc>
           <w:tcPr>
-            <w:tcW w:type="dxa" w:w="1474"/>
-            <w:vAlign w:val="center"/>
+            <w:tcW w:type="dxa" w:w="1475"/>
+            <w:tcMar>
+              <w:top w:type="dxa" w:w="0"/>
+              <w:bottom w:type="dxa" w:w="0"/>
+              <w:left w:type="dxa" w:w="56"/>
+              <w:right w:type="dxa" w:w="56"/>
+            </w:tcMar>
             <w:tcBorders>
               <w:bottom w:val="single" w:sz="4" w:space="0" w:color="000000"/>
             </w:tcBorders>
@@ -6642,11 +7709,18 @@
           <w:p>
             <w:pPr>
               <w:spacing w:before="0" w:after="0" w:line="240" w:lineRule="exact"/>
-              <w:jc w:val="right"/>
-            </w:pPr>
-            <w:r>
-              <w:rPr>
-                <w:rFonts w:ascii="Times New Roman" w:hAnsi="Times New Roman" w:eastAsia="宋体"/>
+              <w:ind w:left="0" w:right="0"/>
+              <w:jc w:val="left"/>
+              <w:tabs>
+                <w:tab w:val="decimal" w:pos="612"/>
+              </w:tabs>
+            </w:pPr>
+            <w:r>
+              <w:tab/>
+            </w:r>
+            <w:r>
+              <w:rPr>
+                <w:rFonts w:ascii="Times New Roman" w:hAnsi="Times New Roman" w:eastAsia="Times New Roman"/>
                 <w:b w:val="0"/>
                 <w:i w:val="0"/>
                 <w:sz w:val="18"/>
@@ -6676,7 +7750,7 @@
     </w:p>
     <w:tbl>
       <w:tblPr>
-        <w:tblW w:type="auto" w:w="0"/>
+        <w:tblW w:type="dxa" w:w="8504"/>
         <w:tblLayout w:type="fixed"/>
         <w:tblLook w:firstColumn="1" w:firstRow="1" w:lastColumn="0" w:lastRow="0" w:noHBand="0" w:noVBand="1" w:val="04A0"/>
         <w:jc w:val="center"/>
@@ -6690,12 +7764,12 @@
         </w:tblBorders>
       </w:tblPr>
       <w:tblGrid>
-        <w:gridCol w:w="1512"/>
-        <w:gridCol w:w="1512"/>
-        <w:gridCol w:w="1512"/>
-        <w:gridCol w:w="1512"/>
-        <w:gridCol w:w="1512"/>
-        <w:gridCol w:w="1512"/>
+        <w:gridCol w:w="2211"/>
+        <w:gridCol w:w="850"/>
+        <w:gridCol w:w="935"/>
+        <w:gridCol w:w="1275"/>
+        <w:gridCol w:w="1785"/>
+        <w:gridCol w:w="1448"/>
       </w:tblGrid>
       <w:tr>
         <w:trPr>
@@ -6704,6 +7778,12 @@
         <w:tc>
           <w:tcPr>
             <w:tcW w:type="dxa" w:w="2211"/>
+            <w:tcMar>
+              <w:top w:type="dxa" w:w="0"/>
+              <w:bottom w:type="dxa" w:w="0"/>
+              <w:left w:type="dxa" w:w="56"/>
+              <w:right w:type="dxa" w:w="56"/>
+            </w:tcMar>
             <w:vAlign w:val="center"/>
             <w:tcBorders>
               <w:bottom w:val="single" w:sz="4" w:space="0" w:color="000000"/>
@@ -6728,6 +7808,12 @@
         <w:tc>
           <w:tcPr>
             <w:tcW w:type="dxa" w:w="850"/>
+            <w:tcMar>
+              <w:top w:type="dxa" w:w="0"/>
+              <w:bottom w:type="dxa" w:w="0"/>
+              <w:left w:type="dxa" w:w="56"/>
+              <w:right w:type="dxa" w:w="56"/>
+            </w:tcMar>
             <w:vAlign w:val="center"/>
             <w:tcBorders>
               <w:bottom w:val="single" w:sz="4" w:space="0" w:color="000000"/>
@@ -6752,6 +7838,12 @@
         <w:tc>
           <w:tcPr>
             <w:tcW w:type="dxa" w:w="935"/>
+            <w:tcMar>
+              <w:top w:type="dxa" w:w="0"/>
+              <w:bottom w:type="dxa" w:w="0"/>
+              <w:left w:type="dxa" w:w="56"/>
+              <w:right w:type="dxa" w:w="56"/>
+            </w:tcMar>
             <w:vAlign w:val="center"/>
             <w:tcBorders>
               <w:bottom w:val="single" w:sz="4" w:space="0" w:color="000000"/>
@@ -6775,7 +7867,13 @@
         </w:tc>
         <w:tc>
           <w:tcPr>
-            <w:tcW w:type="dxa" w:w="1276"/>
+            <w:tcW w:type="dxa" w:w="1275"/>
+            <w:tcMar>
+              <w:top w:type="dxa" w:w="0"/>
+              <w:bottom w:type="dxa" w:w="0"/>
+              <w:left w:type="dxa" w:w="56"/>
+              <w:right w:type="dxa" w:w="56"/>
+            </w:tcMar>
             <w:vAlign w:val="center"/>
             <w:tcBorders>
               <w:bottom w:val="single" w:sz="4" w:space="0" w:color="000000"/>
@@ -6799,7 +7897,13 @@
         </w:tc>
         <w:tc>
           <w:tcPr>
-            <w:tcW w:type="dxa" w:w="1786"/>
+            <w:tcW w:type="dxa" w:w="1785"/>
+            <w:tcMar>
+              <w:top w:type="dxa" w:w="0"/>
+              <w:bottom w:type="dxa" w:w="0"/>
+              <w:left w:type="dxa" w:w="56"/>
+              <w:right w:type="dxa" w:w="56"/>
+            </w:tcMar>
             <w:vAlign w:val="center"/>
             <w:tcBorders>
               <w:bottom w:val="single" w:sz="4" w:space="0" w:color="000000"/>
@@ -6823,7 +7927,13 @@
         </w:tc>
         <w:tc>
           <w:tcPr>
-            <w:tcW w:type="dxa" w:w="1446"/>
+            <w:tcW w:type="dxa" w:w="1448"/>
+            <w:tcMar>
+              <w:top w:type="dxa" w:w="0"/>
+              <w:bottom w:type="dxa" w:w="0"/>
+              <w:left w:type="dxa" w:w="56"/>
+              <w:right w:type="dxa" w:w="56"/>
+            </w:tcMar>
             <w:vAlign w:val="center"/>
             <w:tcBorders>
               <w:bottom w:val="single" w:sz="4" w:space="0" w:color="000000"/>
@@ -6853,6 +7963,12 @@
         <w:tc>
           <w:tcPr>
             <w:tcW w:type="dxa" w:w="2211"/>
+            <w:tcMar>
+              <w:top w:type="dxa" w:w="0"/>
+              <w:bottom w:type="dxa" w:w="0"/>
+              <w:left w:type="dxa" w:w="56"/>
+              <w:right w:type="dxa" w:w="56"/>
+            </w:tcMar>
             <w:vAlign w:val="center"/>
           </w:tcPr>
           <w:p>
@@ -6874,6 +7990,12 @@
         <w:tc>
           <w:tcPr>
             <w:tcW w:type="dxa" w:w="850"/>
+            <w:tcMar>
+              <w:top w:type="dxa" w:w="0"/>
+              <w:bottom w:type="dxa" w:w="0"/>
+              <w:left w:type="dxa" w:w="56"/>
+              <w:right w:type="dxa" w:w="56"/>
+            </w:tcMar>
             <w:vAlign w:val="center"/>
           </w:tcPr>
           <w:p>
@@ -6895,16 +8017,28 @@
         <w:tc>
           <w:tcPr>
             <w:tcW w:type="dxa" w:w="935"/>
-            <w:vAlign w:val="center"/>
-          </w:tcPr>
-          <w:p>
-            <w:pPr>
-              <w:spacing w:before="0" w:after="0" w:line="240" w:lineRule="exact"/>
-              <w:jc w:val="right"/>
-            </w:pPr>
-            <w:r>
-              <w:rPr>
-                <w:rFonts w:ascii="Times New Roman" w:hAnsi="Times New Roman" w:eastAsia="宋体"/>
+            <w:tcMar>
+              <w:top w:type="dxa" w:w="0"/>
+              <w:bottom w:type="dxa" w:w="0"/>
+              <w:left w:type="dxa" w:w="56"/>
+              <w:right w:type="dxa" w:w="56"/>
+            </w:tcMar>
+          </w:tcPr>
+          <w:p>
+            <w:pPr>
+              <w:spacing w:before="0" w:after="0" w:line="240" w:lineRule="exact"/>
+              <w:ind w:left="0" w:right="0"/>
+              <w:jc w:val="left"/>
+              <w:tabs>
+                <w:tab w:val="decimal" w:pos="369"/>
+              </w:tabs>
+            </w:pPr>
+            <w:r>
+              <w:tab/>
+            </w:r>
+            <w:r>
+              <w:rPr>
+                <w:rFonts w:ascii="Times New Roman" w:hAnsi="Times New Roman" w:eastAsia="Times New Roman"/>
                 <w:b w:val="0"/>
                 <w:i w:val="0"/>
                 <w:sz w:val="18"/>
@@ -6915,17 +8049,29 @@
         </w:tc>
         <w:tc>
           <w:tcPr>
-            <w:tcW w:type="dxa" w:w="1276"/>
-            <w:vAlign w:val="center"/>
-          </w:tcPr>
-          <w:p>
-            <w:pPr>
-              <w:spacing w:before="0" w:after="0" w:line="240" w:lineRule="exact"/>
-              <w:jc w:val="right"/>
-            </w:pPr>
-            <w:r>
-              <w:rPr>
-                <w:rFonts w:ascii="Times New Roman" w:hAnsi="Times New Roman" w:eastAsia="宋体"/>
+            <w:tcW w:type="dxa" w:w="1275"/>
+            <w:tcMar>
+              <w:top w:type="dxa" w:w="0"/>
+              <w:bottom w:type="dxa" w:w="0"/>
+              <w:left w:type="dxa" w:w="56"/>
+              <w:right w:type="dxa" w:w="56"/>
+            </w:tcMar>
+          </w:tcPr>
+          <w:p>
+            <w:pPr>
+              <w:spacing w:before="0" w:after="0" w:line="240" w:lineRule="exact"/>
+              <w:ind w:left="0" w:right="0"/>
+              <w:jc w:val="left"/>
+              <w:tabs>
+                <w:tab w:val="decimal" w:pos="522"/>
+              </w:tabs>
+            </w:pPr>
+            <w:r>
+              <w:tab/>
+            </w:r>
+            <w:r>
+              <w:rPr>
+                <w:rFonts w:ascii="Times New Roman" w:hAnsi="Times New Roman" w:eastAsia="Times New Roman"/>
                 <w:b w:val="0"/>
                 <w:i w:val="0"/>
                 <w:sz w:val="18"/>
@@ -6936,17 +8082,29 @@
         </w:tc>
         <w:tc>
           <w:tcPr>
-            <w:tcW w:type="dxa" w:w="1786"/>
-            <w:vAlign w:val="center"/>
-          </w:tcPr>
-          <w:p>
-            <w:pPr>
-              <w:spacing w:before="0" w:after="0" w:line="240" w:lineRule="exact"/>
-              <w:jc w:val="right"/>
-            </w:pPr>
-            <w:r>
-              <w:rPr>
-                <w:rFonts w:ascii="Times New Roman" w:hAnsi="Times New Roman" w:eastAsia="宋体"/>
+            <w:tcW w:type="dxa" w:w="1785"/>
+            <w:tcMar>
+              <w:top w:type="dxa" w:w="0"/>
+              <w:bottom w:type="dxa" w:w="0"/>
+              <w:left w:type="dxa" w:w="56"/>
+              <w:right w:type="dxa" w:w="56"/>
+            </w:tcMar>
+          </w:tcPr>
+          <w:p>
+            <w:pPr>
+              <w:spacing w:before="0" w:after="0" w:line="240" w:lineRule="exact"/>
+              <w:ind w:left="0" w:right="0"/>
+              <w:jc w:val="left"/>
+              <w:tabs>
+                <w:tab w:val="decimal" w:pos="751"/>
+              </w:tabs>
+            </w:pPr>
+            <w:r>
+              <w:tab/>
+            </w:r>
+            <w:r>
+              <w:rPr>
+                <w:rFonts w:ascii="Times New Roman" w:hAnsi="Times New Roman" w:eastAsia="Times New Roman"/>
                 <w:b w:val="0"/>
                 <w:i w:val="0"/>
                 <w:sz w:val="18"/>
@@ -6957,17 +8115,29 @@
         </w:tc>
         <w:tc>
           <w:tcPr>
-            <w:tcW w:type="dxa" w:w="1446"/>
-            <w:vAlign w:val="center"/>
-          </w:tcPr>
-          <w:p>
-            <w:pPr>
-              <w:spacing w:before="0" w:after="0" w:line="240" w:lineRule="exact"/>
-              <w:jc w:val="right"/>
-            </w:pPr>
-            <w:r>
-              <w:rPr>
-                <w:rFonts w:ascii="Times New Roman" w:hAnsi="Times New Roman" w:eastAsia="宋体"/>
+            <w:tcW w:type="dxa" w:w="1448"/>
+            <w:tcMar>
+              <w:top w:type="dxa" w:w="0"/>
+              <w:bottom w:type="dxa" w:w="0"/>
+              <w:left w:type="dxa" w:w="56"/>
+              <w:right w:type="dxa" w:w="56"/>
+            </w:tcMar>
+          </w:tcPr>
+          <w:p>
+            <w:pPr>
+              <w:spacing w:before="0" w:after="0" w:line="240" w:lineRule="exact"/>
+              <w:ind w:left="0" w:right="0"/>
+              <w:jc w:val="left"/>
+              <w:tabs>
+                <w:tab w:val="decimal" w:pos="598"/>
+              </w:tabs>
+            </w:pPr>
+            <w:r>
+              <w:tab/>
+            </w:r>
+            <w:r>
+              <w:rPr>
+                <w:rFonts w:ascii="Times New Roman" w:hAnsi="Times New Roman" w:eastAsia="Times New Roman"/>
                 <w:b w:val="0"/>
                 <w:i w:val="0"/>
                 <w:sz w:val="18"/>
@@ -6984,6 +8154,12 @@
         <w:tc>
           <w:tcPr>
             <w:tcW w:type="dxa" w:w="2211"/>
+            <w:tcMar>
+              <w:top w:type="dxa" w:w="0"/>
+              <w:bottom w:type="dxa" w:w="0"/>
+              <w:left w:type="dxa" w:w="56"/>
+              <w:right w:type="dxa" w:w="56"/>
+            </w:tcMar>
             <w:vAlign w:val="center"/>
           </w:tcPr>
           <w:p>
@@ -7005,6 +8181,12 @@
         <w:tc>
           <w:tcPr>
             <w:tcW w:type="dxa" w:w="850"/>
+            <w:tcMar>
+              <w:top w:type="dxa" w:w="0"/>
+              <w:bottom w:type="dxa" w:w="0"/>
+              <w:left w:type="dxa" w:w="56"/>
+              <w:right w:type="dxa" w:w="56"/>
+            </w:tcMar>
             <w:vAlign w:val="center"/>
           </w:tcPr>
           <w:p>
@@ -7026,16 +8208,28 @@
         <w:tc>
           <w:tcPr>
             <w:tcW w:type="dxa" w:w="935"/>
-            <w:vAlign w:val="center"/>
-          </w:tcPr>
-          <w:p>
-            <w:pPr>
-              <w:spacing w:before="0" w:after="0" w:line="240" w:lineRule="exact"/>
-              <w:jc w:val="right"/>
-            </w:pPr>
-            <w:r>
-              <w:rPr>
-                <w:rFonts w:ascii="Times New Roman" w:hAnsi="Times New Roman" w:eastAsia="宋体"/>
+            <w:tcMar>
+              <w:top w:type="dxa" w:w="0"/>
+              <w:bottom w:type="dxa" w:w="0"/>
+              <w:left w:type="dxa" w:w="56"/>
+              <w:right w:type="dxa" w:w="56"/>
+            </w:tcMar>
+          </w:tcPr>
+          <w:p>
+            <w:pPr>
+              <w:spacing w:before="0" w:after="0" w:line="240" w:lineRule="exact"/>
+              <w:ind w:left="0" w:right="0"/>
+              <w:jc w:val="left"/>
+              <w:tabs>
+                <w:tab w:val="decimal" w:pos="369"/>
+              </w:tabs>
+            </w:pPr>
+            <w:r>
+              <w:tab/>
+            </w:r>
+            <w:r>
+              <w:rPr>
+                <w:rFonts w:ascii="Times New Roman" w:hAnsi="Times New Roman" w:eastAsia="Times New Roman"/>
                 <w:b w:val="0"/>
                 <w:i w:val="0"/>
                 <w:sz w:val="18"/>
@@ -7046,17 +8240,29 @@
         </w:tc>
         <w:tc>
           <w:tcPr>
-            <w:tcW w:type="dxa" w:w="1276"/>
-            <w:vAlign w:val="center"/>
-          </w:tcPr>
-          <w:p>
-            <w:pPr>
-              <w:spacing w:before="0" w:after="0" w:line="240" w:lineRule="exact"/>
-              <w:jc w:val="right"/>
-            </w:pPr>
-            <w:r>
-              <w:rPr>
-                <w:rFonts w:ascii="Times New Roman" w:hAnsi="Times New Roman" w:eastAsia="宋体"/>
+            <w:tcW w:type="dxa" w:w="1275"/>
+            <w:tcMar>
+              <w:top w:type="dxa" w:w="0"/>
+              <w:bottom w:type="dxa" w:w="0"/>
+              <w:left w:type="dxa" w:w="56"/>
+              <w:right w:type="dxa" w:w="56"/>
+            </w:tcMar>
+          </w:tcPr>
+          <w:p>
+            <w:pPr>
+              <w:spacing w:before="0" w:after="0" w:line="240" w:lineRule="exact"/>
+              <w:ind w:left="0" w:right="0"/>
+              <w:jc w:val="left"/>
+              <w:tabs>
+                <w:tab w:val="decimal" w:pos="522"/>
+              </w:tabs>
+            </w:pPr>
+            <w:r>
+              <w:tab/>
+            </w:r>
+            <w:r>
+              <w:rPr>
+                <w:rFonts w:ascii="Times New Roman" w:hAnsi="Times New Roman" w:eastAsia="Times New Roman"/>
                 <w:b w:val="0"/>
                 <w:i w:val="0"/>
                 <w:sz w:val="18"/>
@@ -7067,17 +8273,29 @@
         </w:tc>
         <w:tc>
           <w:tcPr>
-            <w:tcW w:type="dxa" w:w="1786"/>
-            <w:vAlign w:val="center"/>
-          </w:tcPr>
-          <w:p>
-            <w:pPr>
-              <w:spacing w:before="0" w:after="0" w:line="240" w:lineRule="exact"/>
-              <w:jc w:val="right"/>
-            </w:pPr>
-            <w:r>
-              <w:rPr>
-                <w:rFonts w:ascii="Times New Roman" w:hAnsi="Times New Roman" w:eastAsia="宋体"/>
+            <w:tcW w:type="dxa" w:w="1785"/>
+            <w:tcMar>
+              <w:top w:type="dxa" w:w="0"/>
+              <w:bottom w:type="dxa" w:w="0"/>
+              <w:left w:type="dxa" w:w="56"/>
+              <w:right w:type="dxa" w:w="56"/>
+            </w:tcMar>
+          </w:tcPr>
+          <w:p>
+            <w:pPr>
+              <w:spacing w:before="0" w:after="0" w:line="240" w:lineRule="exact"/>
+              <w:ind w:left="0" w:right="0"/>
+              <w:jc w:val="left"/>
+              <w:tabs>
+                <w:tab w:val="decimal" w:pos="751"/>
+              </w:tabs>
+            </w:pPr>
+            <w:r>
+              <w:tab/>
+            </w:r>
+            <w:r>
+              <w:rPr>
+                <w:rFonts w:ascii="Times New Roman" w:hAnsi="Times New Roman" w:eastAsia="Times New Roman"/>
                 <w:b w:val="0"/>
                 <w:i w:val="0"/>
                 <w:sz w:val="18"/>
@@ -7088,17 +8306,29 @@
         </w:tc>
         <w:tc>
           <w:tcPr>
-            <w:tcW w:type="dxa" w:w="1446"/>
-            <w:vAlign w:val="center"/>
-          </w:tcPr>
-          <w:p>
-            <w:pPr>
-              <w:spacing w:before="0" w:after="0" w:line="240" w:lineRule="exact"/>
-              <w:jc w:val="right"/>
-            </w:pPr>
-            <w:r>
-              <w:rPr>
-                <w:rFonts w:ascii="Times New Roman" w:hAnsi="Times New Roman" w:eastAsia="宋体"/>
+            <w:tcW w:type="dxa" w:w="1448"/>
+            <w:tcMar>
+              <w:top w:type="dxa" w:w="0"/>
+              <w:bottom w:type="dxa" w:w="0"/>
+              <w:left w:type="dxa" w:w="56"/>
+              <w:right w:type="dxa" w:w="56"/>
+            </w:tcMar>
+          </w:tcPr>
+          <w:p>
+            <w:pPr>
+              <w:spacing w:before="0" w:after="0" w:line="240" w:lineRule="exact"/>
+              <w:ind w:left="0" w:right="0"/>
+              <w:jc w:val="left"/>
+              <w:tabs>
+                <w:tab w:val="decimal" w:pos="598"/>
+              </w:tabs>
+            </w:pPr>
+            <w:r>
+              <w:tab/>
+            </w:r>
+            <w:r>
+              <w:rPr>
+                <w:rFonts w:ascii="Times New Roman" w:hAnsi="Times New Roman" w:eastAsia="Times New Roman"/>
                 <w:b w:val="0"/>
                 <w:i w:val="0"/>
                 <w:sz w:val="18"/>
@@ -7115,6 +8345,12 @@
         <w:tc>
           <w:tcPr>
             <w:tcW w:type="dxa" w:w="2211"/>
+            <w:tcMar>
+              <w:top w:type="dxa" w:w="0"/>
+              <w:bottom w:type="dxa" w:w="0"/>
+              <w:left w:type="dxa" w:w="56"/>
+              <w:right w:type="dxa" w:w="56"/>
+            </w:tcMar>
             <w:vAlign w:val="center"/>
             <w:tcBorders>
               <w:bottom w:val="single" w:sz="8" w:space="0" w:color="000000"/>
@@ -7139,6 +8375,12 @@
         <w:tc>
           <w:tcPr>
             <w:tcW w:type="dxa" w:w="850"/>
+            <w:tcMar>
+              <w:top w:type="dxa" w:w="0"/>
+              <w:bottom w:type="dxa" w:w="0"/>
+              <w:left w:type="dxa" w:w="56"/>
+              <w:right w:type="dxa" w:w="56"/>
+            </w:tcMar>
             <w:vAlign w:val="center"/>
             <w:tcBorders>
               <w:bottom w:val="single" w:sz="8" w:space="0" w:color="000000"/>
@@ -7163,7 +8405,12 @@
         <w:tc>
           <w:tcPr>
             <w:tcW w:type="dxa" w:w="935"/>
-            <w:vAlign w:val="center"/>
+            <w:tcMar>
+              <w:top w:type="dxa" w:w="0"/>
+              <w:bottom w:type="dxa" w:w="0"/>
+              <w:left w:type="dxa" w:w="56"/>
+              <w:right w:type="dxa" w:w="56"/>
+            </w:tcMar>
             <w:tcBorders>
               <w:bottom w:val="single" w:sz="8" w:space="0" w:color="000000"/>
             </w:tcBorders>
@@ -7171,11 +8418,18 @@
           <w:p>
             <w:pPr>
               <w:spacing w:before="0" w:after="0" w:line="240" w:lineRule="exact"/>
-              <w:jc w:val="right"/>
-            </w:pPr>
-            <w:r>
-              <w:rPr>
-                <w:rFonts w:ascii="Times New Roman" w:hAnsi="Times New Roman" w:eastAsia="宋体"/>
+              <w:ind w:left="0" w:right="0"/>
+              <w:jc w:val="left"/>
+              <w:tabs>
+                <w:tab w:val="decimal" w:pos="369"/>
+              </w:tabs>
+            </w:pPr>
+            <w:r>
+              <w:tab/>
+            </w:r>
+            <w:r>
+              <w:rPr>
+                <w:rFonts w:ascii="Times New Roman" w:hAnsi="Times New Roman" w:eastAsia="Times New Roman"/>
                 <w:b w:val="0"/>
                 <w:i w:val="0"/>
                 <w:sz w:val="18"/>
@@ -7186,8 +8440,13 @@
         </w:tc>
         <w:tc>
           <w:tcPr>
-            <w:tcW w:type="dxa" w:w="1276"/>
-            <w:vAlign w:val="center"/>
+            <w:tcW w:type="dxa" w:w="1275"/>
+            <w:tcMar>
+              <w:top w:type="dxa" w:w="0"/>
+              <w:bottom w:type="dxa" w:w="0"/>
+              <w:left w:type="dxa" w:w="56"/>
+              <w:right w:type="dxa" w:w="56"/>
+            </w:tcMar>
             <w:tcBorders>
               <w:bottom w:val="single" w:sz="8" w:space="0" w:color="000000"/>
             </w:tcBorders>
@@ -7195,11 +8454,18 @@
           <w:p>
             <w:pPr>
               <w:spacing w:before="0" w:after="0" w:line="240" w:lineRule="exact"/>
-              <w:jc w:val="right"/>
-            </w:pPr>
-            <w:r>
-              <w:rPr>
-                <w:rFonts w:ascii="Times New Roman" w:hAnsi="Times New Roman" w:eastAsia="宋体"/>
+              <w:ind w:left="0" w:right="0"/>
+              <w:jc w:val="left"/>
+              <w:tabs>
+                <w:tab w:val="decimal" w:pos="522"/>
+              </w:tabs>
+            </w:pPr>
+            <w:r>
+              <w:tab/>
+            </w:r>
+            <w:r>
+              <w:rPr>
+                <w:rFonts w:ascii="Times New Roman" w:hAnsi="Times New Roman" w:eastAsia="Times New Roman"/>
                 <w:b w:val="0"/>
                 <w:i w:val="0"/>
                 <w:sz w:val="18"/>
@@ -7210,8 +8476,13 @@
         </w:tc>
         <w:tc>
           <w:tcPr>
-            <w:tcW w:type="dxa" w:w="1786"/>
-            <w:vAlign w:val="center"/>
+            <w:tcW w:type="dxa" w:w="1785"/>
+            <w:tcMar>
+              <w:top w:type="dxa" w:w="0"/>
+              <w:bottom w:type="dxa" w:w="0"/>
+              <w:left w:type="dxa" w:w="56"/>
+              <w:right w:type="dxa" w:w="56"/>
+            </w:tcMar>
             <w:tcBorders>
               <w:bottom w:val="single" w:sz="8" w:space="0" w:color="000000"/>
             </w:tcBorders>
@@ -7219,11 +8490,18 @@
           <w:p>
             <w:pPr>
               <w:spacing w:before="0" w:after="0" w:line="240" w:lineRule="exact"/>
-              <w:jc w:val="right"/>
-            </w:pPr>
-            <w:r>
-              <w:rPr>
-                <w:rFonts w:ascii="Times New Roman" w:hAnsi="Times New Roman" w:eastAsia="宋体"/>
+              <w:ind w:left="0" w:right="0"/>
+              <w:jc w:val="left"/>
+              <w:tabs>
+                <w:tab w:val="decimal" w:pos="751"/>
+              </w:tabs>
+            </w:pPr>
+            <w:r>
+              <w:tab/>
+            </w:r>
+            <w:r>
+              <w:rPr>
+                <w:rFonts w:ascii="Times New Roman" w:hAnsi="Times New Roman" w:eastAsia="Times New Roman"/>
                 <w:b w:val="0"/>
                 <w:i w:val="0"/>
                 <w:sz w:val="18"/>
@@ -7234,8 +8512,13 @@
         </w:tc>
         <w:tc>
           <w:tcPr>
-            <w:tcW w:type="dxa" w:w="1446"/>
-            <w:vAlign w:val="center"/>
+            <w:tcW w:type="dxa" w:w="1448"/>
+            <w:tcMar>
+              <w:top w:type="dxa" w:w="0"/>
+              <w:bottom w:type="dxa" w:w="0"/>
+              <w:left w:type="dxa" w:w="56"/>
+              <w:right w:type="dxa" w:w="56"/>
+            </w:tcMar>
             <w:tcBorders>
               <w:bottom w:val="single" w:sz="8" w:space="0" w:color="000000"/>
             </w:tcBorders>
@@ -7243,11 +8526,18 @@
           <w:p>
             <w:pPr>
               <w:spacing w:before="0" w:after="0" w:line="240" w:lineRule="exact"/>
-              <w:jc w:val="right"/>
-            </w:pPr>
-            <w:r>
-              <w:rPr>
-                <w:rFonts w:ascii="Times New Roman" w:hAnsi="Times New Roman" w:eastAsia="宋体"/>
+              <w:ind w:left="0" w:right="0"/>
+              <w:jc w:val="left"/>
+              <w:tabs>
+                <w:tab w:val="decimal" w:pos="598"/>
+              </w:tabs>
+            </w:pPr>
+            <w:r>
+              <w:tab/>
+            </w:r>
+            <w:r>
+              <w:rPr>
+                <w:rFonts w:ascii="Times New Roman" w:hAnsi="Times New Roman" w:eastAsia="Times New Roman"/>
                 <w:b w:val="0"/>
                 <w:i w:val="0"/>
                 <w:sz w:val="18"/>

</xml_diff>

<commit_message>
add JournalPaperBuilder class for automating research paper report generation
</commit_message>
<xml_diff>
--- a/paper/课程论文_提交版.docx
+++ b/paper/课程论文_提交版.docx
@@ -3673,22 +3673,16 @@
               <w:left w:type="dxa" w:w="56"/>
               <w:right w:type="dxa" w:w="56"/>
             </w:tcMar>
-          </w:tcPr>
-          <w:p>
-            <w:pPr>
-              <w:spacing w:before="0" w:after="0" w:line="240" w:lineRule="exact"/>
-              <w:ind w:left="0" w:right="0"/>
-              <w:jc w:val="left"/>
-              <w:tabs>
-                <w:tab w:val="decimal" w:pos="598"/>
-              </w:tabs>
-            </w:pPr>
-            <w:r>
-              <w:tab/>
-            </w:r>
-            <w:r>
-              <w:rPr>
-                <w:rFonts w:ascii="Times New Roman" w:hAnsi="Times New Roman" w:eastAsia="Times New Roman"/>
+            <w:vAlign w:val="center"/>
+          </w:tcPr>
+          <w:p>
+            <w:pPr>
+              <w:spacing w:before="0" w:after="0" w:line="240" w:lineRule="exact"/>
+              <w:jc w:val="right"/>
+            </w:pPr>
+            <w:r>
+              <w:rPr>
+                <w:rFonts w:ascii="Times New Roman" w:hAnsi="Times New Roman" w:eastAsia="宋体"/>
                 <w:b w:val="0"/>
                 <w:i w:val="0"/>
                 <w:sz w:val="18"/>
@@ -3733,22 +3727,16 @@
               <w:left w:type="dxa" w:w="56"/>
               <w:right w:type="dxa" w:w="56"/>
             </w:tcMar>
-          </w:tcPr>
-          <w:p>
-            <w:pPr>
-              <w:spacing w:before="0" w:after="0" w:line="240" w:lineRule="exact"/>
-              <w:ind w:left="0" w:right="0"/>
-              <w:jc w:val="left"/>
-              <w:tabs>
-                <w:tab w:val="decimal" w:pos="598"/>
-              </w:tabs>
-            </w:pPr>
-            <w:r>
-              <w:tab/>
-            </w:r>
-            <w:r>
-              <w:rPr>
-                <w:rFonts w:ascii="Times New Roman" w:hAnsi="Times New Roman" w:eastAsia="Times New Roman"/>
+            <w:vAlign w:val="center"/>
+          </w:tcPr>
+          <w:p>
+            <w:pPr>
+              <w:spacing w:before="0" w:after="0" w:line="240" w:lineRule="exact"/>
+              <w:jc w:val="right"/>
+            </w:pPr>
+            <w:r>
+              <w:rPr>
+                <w:rFonts w:ascii="Times New Roman" w:hAnsi="Times New Roman" w:eastAsia="宋体"/>
                 <w:b w:val="0"/>
                 <w:i w:val="0"/>
                 <w:sz w:val="18"/>
@@ -3828,6 +3816,7 @@
               <w:left w:type="dxa" w:w="56"/>
               <w:right w:type="dxa" w:w="56"/>
             </w:tcMar>
+            <w:vAlign w:val="center"/>
             <w:tcBorders>
               <w:bottom w:val="single" w:sz="4" w:space="0" w:color="000000"/>
             </w:tcBorders>
@@ -3835,18 +3824,11 @@
           <w:p>
             <w:pPr>
               <w:spacing w:before="0" w:after="0" w:line="240" w:lineRule="exact"/>
-              <w:ind w:left="0" w:right="0"/>
-              <w:jc w:val="left"/>
-              <w:tabs>
-                <w:tab w:val="decimal" w:pos="598"/>
-              </w:tabs>
-            </w:pPr>
-            <w:r>
-              <w:tab/>
-            </w:r>
-            <w:r>
-              <w:rPr>
-                <w:rFonts w:ascii="Times New Roman" w:hAnsi="Times New Roman" w:eastAsia="Times New Roman"/>
+              <w:jc w:val="right"/>
+            </w:pPr>
+            <w:r>
+              <w:rPr>
+                <w:rFonts w:ascii="Times New Roman" w:hAnsi="Times New Roman" w:eastAsia="宋体"/>
                 <w:b w:val="0"/>
                 <w:i w:val="0"/>
                 <w:sz w:val="18"/>
@@ -3864,6 +3846,7 @@
               <w:left w:type="dxa" w:w="56"/>
               <w:right w:type="dxa" w:w="56"/>
             </w:tcMar>
+            <w:vAlign w:val="center"/>
             <w:tcBorders>
               <w:bottom w:val="single" w:sz="4" w:space="0" w:color="000000"/>
             </w:tcBorders>
@@ -3871,18 +3854,11 @@
           <w:p>
             <w:pPr>
               <w:spacing w:before="0" w:after="0" w:line="240" w:lineRule="exact"/>
-              <w:ind w:left="0" w:right="0"/>
-              <w:jc w:val="left"/>
-              <w:tabs>
-                <w:tab w:val="decimal" w:pos="598"/>
-              </w:tabs>
-            </w:pPr>
-            <w:r>
-              <w:tab/>
-            </w:r>
-            <w:r>
-              <w:rPr>
-                <w:rFonts w:ascii="Times New Roman" w:hAnsi="Times New Roman" w:eastAsia="Times New Roman"/>
+              <w:jc w:val="right"/>
+            </w:pPr>
+            <w:r>
+              <w:rPr>
+                <w:rFonts w:ascii="Times New Roman" w:hAnsi="Times New Roman" w:eastAsia="宋体"/>
                 <w:b w:val="0"/>
                 <w:i w:val="0"/>
                 <w:sz w:val="18"/>
@@ -3900,6 +3876,7 @@
               <w:left w:type="dxa" w:w="56"/>
               <w:right w:type="dxa" w:w="56"/>
             </w:tcMar>
+            <w:vAlign w:val="center"/>
             <w:tcBorders>
               <w:bottom w:val="single" w:sz="4" w:space="0" w:color="000000"/>
             </w:tcBorders>
@@ -3907,18 +3884,11 @@
           <w:p>
             <w:pPr>
               <w:spacing w:before="0" w:after="0" w:line="240" w:lineRule="exact"/>
-              <w:ind w:left="0" w:right="0"/>
-              <w:jc w:val="left"/>
-              <w:tabs>
-                <w:tab w:val="decimal" w:pos="598"/>
-              </w:tabs>
-            </w:pPr>
-            <w:r>
-              <w:tab/>
-            </w:r>
-            <w:r>
-              <w:rPr>
-                <w:rFonts w:ascii="Times New Roman" w:hAnsi="Times New Roman" w:eastAsia="Times New Roman"/>
+              <w:jc w:val="right"/>
+            </w:pPr>
+            <w:r>
+              <w:rPr>
+                <w:rFonts w:ascii="Times New Roman" w:hAnsi="Times New Roman" w:eastAsia="宋体"/>
                 <w:b w:val="0"/>
                 <w:i w:val="0"/>
                 <w:sz w:val="18"/>
@@ -3936,6 +3906,7 @@
               <w:left w:type="dxa" w:w="56"/>
               <w:right w:type="dxa" w:w="56"/>
             </w:tcMar>
+            <w:vAlign w:val="center"/>
             <w:tcBorders>
               <w:bottom w:val="single" w:sz="4" w:space="0" w:color="000000"/>
             </w:tcBorders>
@@ -3943,18 +3914,11 @@
           <w:p>
             <w:pPr>
               <w:spacing w:before="0" w:after="0" w:line="240" w:lineRule="exact"/>
-              <w:ind w:left="0" w:right="0"/>
-              <w:jc w:val="left"/>
-              <w:tabs>
-                <w:tab w:val="decimal" w:pos="598"/>
-              </w:tabs>
-            </w:pPr>
-            <w:r>
-              <w:tab/>
-            </w:r>
-            <w:r>
-              <w:rPr>
-                <w:rFonts w:ascii="Times New Roman" w:hAnsi="Times New Roman" w:eastAsia="Times New Roman"/>
+              <w:jc w:val="right"/>
+            </w:pPr>
+            <w:r>
+              <w:rPr>
+                <w:rFonts w:ascii="Times New Roman" w:hAnsi="Times New Roman" w:eastAsia="宋体"/>
                 <w:b w:val="0"/>
                 <w:i w:val="0"/>
                 <w:sz w:val="18"/>
@@ -4223,22 +4187,16 @@
               <w:left w:type="dxa" w:w="56"/>
               <w:right w:type="dxa" w:w="56"/>
             </w:tcMar>
-          </w:tcPr>
-          <w:p>
-            <w:pPr>
-              <w:spacing w:before="0" w:after="0" w:line="240" w:lineRule="exact"/>
-              <w:ind w:left="0" w:right="0"/>
-              <w:jc w:val="left"/>
-              <w:tabs>
-                <w:tab w:val="decimal" w:pos="1249"/>
-              </w:tabs>
-            </w:pPr>
-            <w:r>
-              <w:tab/>
-            </w:r>
-            <w:r>
-              <w:rPr>
-                <w:rFonts w:ascii="Times New Roman" w:hAnsi="Times New Roman" w:eastAsia="Times New Roman"/>
+            <w:vAlign w:val="center"/>
+          </w:tcPr>
+          <w:p>
+            <w:pPr>
+              <w:spacing w:before="0" w:after="0" w:line="240" w:lineRule="exact"/>
+              <w:jc w:val="right"/>
+            </w:pPr>
+            <w:r>
+              <w:rPr>
+                <w:rFonts w:ascii="Times New Roman" w:hAnsi="Times New Roman" w:eastAsia="宋体"/>
                 <w:b w:val="0"/>
                 <w:i w:val="0"/>
                 <w:sz w:val="18"/>
@@ -4318,6 +4276,7 @@
               <w:left w:type="dxa" w:w="56"/>
               <w:right w:type="dxa" w:w="56"/>
             </w:tcMar>
+            <w:vAlign w:val="center"/>
             <w:tcBorders>
               <w:bottom w:val="single" w:sz="8" w:space="0" w:color="000000"/>
             </w:tcBorders>
@@ -4325,18 +4284,11 @@
           <w:p>
             <w:pPr>
               <w:spacing w:before="0" w:after="0" w:line="240" w:lineRule="exact"/>
-              <w:ind w:left="0" w:right="0"/>
-              <w:jc w:val="left"/>
-              <w:tabs>
-                <w:tab w:val="decimal" w:pos="1249"/>
-              </w:tabs>
-            </w:pPr>
-            <w:r>
-              <w:tab/>
-            </w:r>
-            <w:r>
-              <w:rPr>
-                <w:rFonts w:ascii="Times New Roman" w:hAnsi="Times New Roman" w:eastAsia="Times New Roman"/>
+              <w:jc w:val="right"/>
+            </w:pPr>
+            <w:r>
+              <w:rPr>
+                <w:rFonts w:ascii="Times New Roman" w:hAnsi="Times New Roman" w:eastAsia="宋体"/>
                 <w:b w:val="0"/>
                 <w:i w:val="0"/>
                 <w:sz w:val="18"/>
@@ -4354,6 +4306,7 @@
               <w:left w:type="dxa" w:w="56"/>
               <w:right w:type="dxa" w:w="56"/>
             </w:tcMar>
+            <w:vAlign w:val="center"/>
             <w:tcBorders>
               <w:bottom w:val="single" w:sz="8" w:space="0" w:color="000000"/>
             </w:tcBorders>
@@ -4361,18 +4314,11 @@
           <w:p>
             <w:pPr>
               <w:spacing w:before="0" w:after="0" w:line="240" w:lineRule="exact"/>
-              <w:ind w:left="0" w:right="0"/>
-              <w:jc w:val="left"/>
-              <w:tabs>
-                <w:tab w:val="decimal" w:pos="1249"/>
-              </w:tabs>
-            </w:pPr>
-            <w:r>
-              <w:tab/>
-            </w:r>
-            <w:r>
-              <w:rPr>
-                <w:rFonts w:ascii="Times New Roman" w:hAnsi="Times New Roman" w:eastAsia="Times New Roman"/>
+              <w:jc w:val="right"/>
+            </w:pPr>
+            <w:r>
+              <w:rPr>
+                <w:rFonts w:ascii="Times New Roman" w:hAnsi="Times New Roman" w:eastAsia="宋体"/>
                 <w:b w:val="0"/>
                 <w:i w:val="0"/>
                 <w:sz w:val="18"/>
@@ -4806,22 +4752,16 @@
               <w:left w:type="dxa" w:w="56"/>
               <w:right w:type="dxa" w:w="56"/>
             </w:tcMar>
-          </w:tcPr>
-          <w:p>
-            <w:pPr>
-              <w:spacing w:before="0" w:after="0" w:line="240" w:lineRule="exact"/>
-              <w:ind w:left="0" w:right="0"/>
-              <w:jc w:val="left"/>
-              <w:tabs>
-                <w:tab w:val="decimal" w:pos="612"/>
-              </w:tabs>
-            </w:pPr>
-            <w:r>
-              <w:tab/>
-            </w:r>
-            <w:r>
-              <w:rPr>
-                <w:rFonts w:ascii="Times New Roman" w:hAnsi="Times New Roman" w:eastAsia="Times New Roman"/>
+            <w:vAlign w:val="center"/>
+          </w:tcPr>
+          <w:p>
+            <w:pPr>
+              <w:spacing w:before="0" w:after="0" w:line="240" w:lineRule="exact"/>
+              <w:jc w:val="right"/>
+            </w:pPr>
+            <w:r>
+              <w:rPr>
+                <w:rFonts w:ascii="Times New Roman" w:hAnsi="Times New Roman" w:eastAsia="宋体"/>
                 <w:b w:val="0"/>
                 <w:i w:val="0"/>
                 <w:sz w:val="18"/>
@@ -4839,22 +4779,16 @@
               <w:left w:type="dxa" w:w="56"/>
               <w:right w:type="dxa" w:w="56"/>
             </w:tcMar>
-          </w:tcPr>
-          <w:p>
-            <w:pPr>
-              <w:spacing w:before="0" w:after="0" w:line="240" w:lineRule="exact"/>
-              <w:ind w:left="0" w:right="0"/>
-              <w:jc w:val="left"/>
-              <w:tabs>
-                <w:tab w:val="decimal" w:pos="612"/>
-              </w:tabs>
-            </w:pPr>
-            <w:r>
-              <w:tab/>
-            </w:r>
-            <w:r>
-              <w:rPr>
-                <w:rFonts w:ascii="Times New Roman" w:hAnsi="Times New Roman" w:eastAsia="Times New Roman"/>
+            <w:vAlign w:val="center"/>
+          </w:tcPr>
+          <w:p>
+            <w:pPr>
+              <w:spacing w:before="0" w:after="0" w:line="240" w:lineRule="exact"/>
+              <w:jc w:val="right"/>
+            </w:pPr>
+            <w:r>
+              <w:rPr>
+                <w:rFonts w:ascii="Times New Roman" w:hAnsi="Times New Roman" w:eastAsia="宋体"/>
                 <w:b w:val="0"/>
                 <w:i w:val="0"/>
                 <w:sz w:val="18"/>
@@ -4872,22 +4806,16 @@
               <w:left w:type="dxa" w:w="56"/>
               <w:right w:type="dxa" w:w="56"/>
             </w:tcMar>
-          </w:tcPr>
-          <w:p>
-            <w:pPr>
-              <w:spacing w:before="0" w:after="0" w:line="240" w:lineRule="exact"/>
-              <w:ind w:left="0" w:right="0"/>
-              <w:jc w:val="left"/>
-              <w:tabs>
-                <w:tab w:val="decimal" w:pos="612"/>
-              </w:tabs>
-            </w:pPr>
-            <w:r>
-              <w:tab/>
-            </w:r>
-            <w:r>
-              <w:rPr>
-                <w:rFonts w:ascii="Times New Roman" w:hAnsi="Times New Roman" w:eastAsia="Times New Roman"/>
+            <w:vAlign w:val="center"/>
+          </w:tcPr>
+          <w:p>
+            <w:pPr>
+              <w:spacing w:before="0" w:after="0" w:line="240" w:lineRule="exact"/>
+              <w:jc w:val="right"/>
+            </w:pPr>
+            <w:r>
+              <w:rPr>
+                <w:rFonts w:ascii="Times New Roman" w:hAnsi="Times New Roman" w:eastAsia="宋体"/>
                 <w:b w:val="0"/>
                 <w:i w:val="0"/>
                 <w:sz w:val="18"/>
@@ -4964,22 +4892,16 @@
               <w:left w:type="dxa" w:w="56"/>
               <w:right w:type="dxa" w:w="56"/>
             </w:tcMar>
-          </w:tcPr>
-          <w:p>
-            <w:pPr>
-              <w:spacing w:before="0" w:after="0" w:line="240" w:lineRule="exact"/>
-              <w:ind w:left="0" w:right="0"/>
-              <w:jc w:val="left"/>
-              <w:tabs>
-                <w:tab w:val="decimal" w:pos="612"/>
-              </w:tabs>
-            </w:pPr>
-            <w:r>
-              <w:tab/>
-            </w:r>
-            <w:r>
-              <w:rPr>
-                <w:rFonts w:ascii="Times New Roman" w:hAnsi="Times New Roman" w:eastAsia="Times New Roman"/>
+            <w:vAlign w:val="center"/>
+          </w:tcPr>
+          <w:p>
+            <w:pPr>
+              <w:spacing w:before="0" w:after="0" w:line="240" w:lineRule="exact"/>
+              <w:jc w:val="right"/>
+            </w:pPr>
+            <w:r>
+              <w:rPr>
+                <w:rFonts w:ascii="Times New Roman" w:hAnsi="Times New Roman" w:eastAsia="宋体"/>
                 <w:b w:val="0"/>
                 <w:i w:val="0"/>
                 <w:sz w:val="18"/>
@@ -4997,22 +4919,16 @@
               <w:left w:type="dxa" w:w="56"/>
               <w:right w:type="dxa" w:w="56"/>
             </w:tcMar>
-          </w:tcPr>
-          <w:p>
-            <w:pPr>
-              <w:spacing w:before="0" w:after="0" w:line="240" w:lineRule="exact"/>
-              <w:ind w:left="0" w:right="0"/>
-              <w:jc w:val="left"/>
-              <w:tabs>
-                <w:tab w:val="decimal" w:pos="612"/>
-              </w:tabs>
-            </w:pPr>
-            <w:r>
-              <w:tab/>
-            </w:r>
-            <w:r>
-              <w:rPr>
-                <w:rFonts w:ascii="Times New Roman" w:hAnsi="Times New Roman" w:eastAsia="Times New Roman"/>
+            <w:vAlign w:val="center"/>
+          </w:tcPr>
+          <w:p>
+            <w:pPr>
+              <w:spacing w:before="0" w:after="0" w:line="240" w:lineRule="exact"/>
+              <w:jc w:val="right"/>
+            </w:pPr>
+            <w:r>
+              <w:rPr>
+                <w:rFonts w:ascii="Times New Roman" w:hAnsi="Times New Roman" w:eastAsia="宋体"/>
                 <w:b w:val="0"/>
                 <w:i w:val="0"/>
                 <w:sz w:val="18"/>
@@ -5030,22 +4946,16 @@
               <w:left w:type="dxa" w:w="56"/>
               <w:right w:type="dxa" w:w="56"/>
             </w:tcMar>
-          </w:tcPr>
-          <w:p>
-            <w:pPr>
-              <w:spacing w:before="0" w:after="0" w:line="240" w:lineRule="exact"/>
-              <w:ind w:left="0" w:right="0"/>
-              <w:jc w:val="left"/>
-              <w:tabs>
-                <w:tab w:val="decimal" w:pos="612"/>
-              </w:tabs>
-            </w:pPr>
-            <w:r>
-              <w:tab/>
-            </w:r>
-            <w:r>
-              <w:rPr>
-                <w:rFonts w:ascii="Times New Roman" w:hAnsi="Times New Roman" w:eastAsia="Times New Roman"/>
+            <w:vAlign w:val="center"/>
+          </w:tcPr>
+          <w:p>
+            <w:pPr>
+              <w:spacing w:before="0" w:after="0" w:line="240" w:lineRule="exact"/>
+              <w:jc w:val="right"/>
+            </w:pPr>
+            <w:r>
+              <w:rPr>
+                <w:rFonts w:ascii="Times New Roman" w:hAnsi="Times New Roman" w:eastAsia="宋体"/>
                 <w:b w:val="0"/>
                 <w:i w:val="0"/>
                 <w:sz w:val="18"/>
@@ -5122,22 +5032,16 @@
               <w:left w:type="dxa" w:w="56"/>
               <w:right w:type="dxa" w:w="56"/>
             </w:tcMar>
-          </w:tcPr>
-          <w:p>
-            <w:pPr>
-              <w:spacing w:before="0" w:after="0" w:line="240" w:lineRule="exact"/>
-              <w:ind w:left="0" w:right="0"/>
-              <w:jc w:val="left"/>
-              <w:tabs>
-                <w:tab w:val="decimal" w:pos="612"/>
-              </w:tabs>
-            </w:pPr>
-            <w:r>
-              <w:tab/>
-            </w:r>
-            <w:r>
-              <w:rPr>
-                <w:rFonts w:ascii="Times New Roman" w:hAnsi="Times New Roman" w:eastAsia="Times New Roman"/>
+            <w:vAlign w:val="center"/>
+          </w:tcPr>
+          <w:p>
+            <w:pPr>
+              <w:spacing w:before="0" w:after="0" w:line="240" w:lineRule="exact"/>
+              <w:jc w:val="right"/>
+            </w:pPr>
+            <w:r>
+              <w:rPr>
+                <w:rFonts w:ascii="Times New Roman" w:hAnsi="Times New Roman" w:eastAsia="宋体"/>
                 <w:b w:val="0"/>
                 <w:i w:val="0"/>
                 <w:sz w:val="18"/>
@@ -5155,22 +5059,16 @@
               <w:left w:type="dxa" w:w="56"/>
               <w:right w:type="dxa" w:w="56"/>
             </w:tcMar>
-          </w:tcPr>
-          <w:p>
-            <w:pPr>
-              <w:spacing w:before="0" w:after="0" w:line="240" w:lineRule="exact"/>
-              <w:ind w:left="0" w:right="0"/>
-              <w:jc w:val="left"/>
-              <w:tabs>
-                <w:tab w:val="decimal" w:pos="612"/>
-              </w:tabs>
-            </w:pPr>
-            <w:r>
-              <w:tab/>
-            </w:r>
-            <w:r>
-              <w:rPr>
-                <w:rFonts w:ascii="Times New Roman" w:hAnsi="Times New Roman" w:eastAsia="Times New Roman"/>
+            <w:vAlign w:val="center"/>
+          </w:tcPr>
+          <w:p>
+            <w:pPr>
+              <w:spacing w:before="0" w:after="0" w:line="240" w:lineRule="exact"/>
+              <w:jc w:val="right"/>
+            </w:pPr>
+            <w:r>
+              <w:rPr>
+                <w:rFonts w:ascii="Times New Roman" w:hAnsi="Times New Roman" w:eastAsia="宋体"/>
                 <w:b w:val="0"/>
                 <w:i w:val="0"/>
                 <w:sz w:val="18"/>
@@ -5188,22 +5086,16 @@
               <w:left w:type="dxa" w:w="56"/>
               <w:right w:type="dxa" w:w="56"/>
             </w:tcMar>
-          </w:tcPr>
-          <w:p>
-            <w:pPr>
-              <w:spacing w:before="0" w:after="0" w:line="240" w:lineRule="exact"/>
-              <w:ind w:left="0" w:right="0"/>
-              <w:jc w:val="left"/>
-              <w:tabs>
-                <w:tab w:val="decimal" w:pos="612"/>
-              </w:tabs>
-            </w:pPr>
-            <w:r>
-              <w:tab/>
-            </w:r>
-            <w:r>
-              <w:rPr>
-                <w:rFonts w:ascii="Times New Roman" w:hAnsi="Times New Roman" w:eastAsia="Times New Roman"/>
+            <w:vAlign w:val="center"/>
+          </w:tcPr>
+          <w:p>
+            <w:pPr>
+              <w:spacing w:before="0" w:after="0" w:line="240" w:lineRule="exact"/>
+              <w:jc w:val="right"/>
+            </w:pPr>
+            <w:r>
+              <w:rPr>
+                <w:rFonts w:ascii="Times New Roman" w:hAnsi="Times New Roman" w:eastAsia="宋体"/>
                 <w:b w:val="0"/>
                 <w:i w:val="0"/>
                 <w:sz w:val="18"/>
@@ -5280,22 +5172,16 @@
               <w:left w:type="dxa" w:w="56"/>
               <w:right w:type="dxa" w:w="56"/>
             </w:tcMar>
-          </w:tcPr>
-          <w:p>
-            <w:pPr>
-              <w:spacing w:before="0" w:after="0" w:line="240" w:lineRule="exact"/>
-              <w:ind w:left="0" w:right="0"/>
-              <w:jc w:val="left"/>
-              <w:tabs>
-                <w:tab w:val="decimal" w:pos="612"/>
-              </w:tabs>
-            </w:pPr>
-            <w:r>
-              <w:tab/>
-            </w:r>
-            <w:r>
-              <w:rPr>
-                <w:rFonts w:ascii="Times New Roman" w:hAnsi="Times New Roman" w:eastAsia="Times New Roman"/>
+            <w:vAlign w:val="center"/>
+          </w:tcPr>
+          <w:p>
+            <w:pPr>
+              <w:spacing w:before="0" w:after="0" w:line="240" w:lineRule="exact"/>
+              <w:jc w:val="right"/>
+            </w:pPr>
+            <w:r>
+              <w:rPr>
+                <w:rFonts w:ascii="Times New Roman" w:hAnsi="Times New Roman" w:eastAsia="宋体"/>
                 <w:b w:val="0"/>
                 <w:i w:val="0"/>
                 <w:sz w:val="18"/>
@@ -5313,22 +5199,16 @@
               <w:left w:type="dxa" w:w="56"/>
               <w:right w:type="dxa" w:w="56"/>
             </w:tcMar>
-          </w:tcPr>
-          <w:p>
-            <w:pPr>
-              <w:spacing w:before="0" w:after="0" w:line="240" w:lineRule="exact"/>
-              <w:ind w:left="0" w:right="0"/>
-              <w:jc w:val="left"/>
-              <w:tabs>
-                <w:tab w:val="decimal" w:pos="612"/>
-              </w:tabs>
-            </w:pPr>
-            <w:r>
-              <w:tab/>
-            </w:r>
-            <w:r>
-              <w:rPr>
-                <w:rFonts w:ascii="Times New Roman" w:hAnsi="Times New Roman" w:eastAsia="Times New Roman"/>
+            <w:vAlign w:val="center"/>
+          </w:tcPr>
+          <w:p>
+            <w:pPr>
+              <w:spacing w:before="0" w:after="0" w:line="240" w:lineRule="exact"/>
+              <w:jc w:val="right"/>
+            </w:pPr>
+            <w:r>
+              <w:rPr>
+                <w:rFonts w:ascii="Times New Roman" w:hAnsi="Times New Roman" w:eastAsia="宋体"/>
                 <w:b w:val="0"/>
                 <w:i w:val="0"/>
                 <w:sz w:val="18"/>
@@ -5346,22 +5226,16 @@
               <w:left w:type="dxa" w:w="56"/>
               <w:right w:type="dxa" w:w="56"/>
             </w:tcMar>
-          </w:tcPr>
-          <w:p>
-            <w:pPr>
-              <w:spacing w:before="0" w:after="0" w:line="240" w:lineRule="exact"/>
-              <w:ind w:left="0" w:right="0"/>
-              <w:jc w:val="left"/>
-              <w:tabs>
-                <w:tab w:val="decimal" w:pos="612"/>
-              </w:tabs>
-            </w:pPr>
-            <w:r>
-              <w:tab/>
-            </w:r>
-            <w:r>
-              <w:rPr>
-                <w:rFonts w:ascii="Times New Roman" w:hAnsi="Times New Roman" w:eastAsia="Times New Roman"/>
+            <w:vAlign w:val="center"/>
+          </w:tcPr>
+          <w:p>
+            <w:pPr>
+              <w:spacing w:before="0" w:after="0" w:line="240" w:lineRule="exact"/>
+              <w:jc w:val="right"/>
+            </w:pPr>
+            <w:r>
+              <w:rPr>
+                <w:rFonts w:ascii="Times New Roman" w:hAnsi="Times New Roman" w:eastAsia="宋体"/>
                 <w:b w:val="0"/>
                 <w:i w:val="0"/>
                 <w:sz w:val="18"/>
@@ -5444,6 +5318,7 @@
               <w:left w:type="dxa" w:w="56"/>
               <w:right w:type="dxa" w:w="56"/>
             </w:tcMar>
+            <w:vAlign w:val="center"/>
             <w:tcBorders>
               <w:bottom w:val="single" w:sz="8" w:space="0" w:color="000000"/>
             </w:tcBorders>
@@ -5451,18 +5326,11 @@
           <w:p>
             <w:pPr>
               <w:spacing w:before="0" w:after="0" w:line="240" w:lineRule="exact"/>
-              <w:ind w:left="0" w:right="0"/>
-              <w:jc w:val="left"/>
-              <w:tabs>
-                <w:tab w:val="decimal" w:pos="612"/>
-              </w:tabs>
-            </w:pPr>
-            <w:r>
-              <w:tab/>
-            </w:r>
-            <w:r>
-              <w:rPr>
-                <w:rFonts w:ascii="Times New Roman" w:hAnsi="Times New Roman" w:eastAsia="Times New Roman"/>
+              <w:jc w:val="right"/>
+            </w:pPr>
+            <w:r>
+              <w:rPr>
+                <w:rFonts w:ascii="Times New Roman" w:hAnsi="Times New Roman" w:eastAsia="宋体"/>
                 <w:b w:val="0"/>
                 <w:i w:val="0"/>
                 <w:sz w:val="18"/>
@@ -5480,6 +5348,7 @@
               <w:left w:type="dxa" w:w="56"/>
               <w:right w:type="dxa" w:w="56"/>
             </w:tcMar>
+            <w:vAlign w:val="center"/>
             <w:tcBorders>
               <w:bottom w:val="single" w:sz="8" w:space="0" w:color="000000"/>
             </w:tcBorders>
@@ -5487,18 +5356,11 @@
           <w:p>
             <w:pPr>
               <w:spacing w:before="0" w:after="0" w:line="240" w:lineRule="exact"/>
-              <w:ind w:left="0" w:right="0"/>
-              <w:jc w:val="left"/>
-              <w:tabs>
-                <w:tab w:val="decimal" w:pos="612"/>
-              </w:tabs>
-            </w:pPr>
-            <w:r>
-              <w:tab/>
-            </w:r>
-            <w:r>
-              <w:rPr>
-                <w:rFonts w:ascii="Times New Roman" w:hAnsi="Times New Roman" w:eastAsia="Times New Roman"/>
+              <w:jc w:val="right"/>
+            </w:pPr>
+            <w:r>
+              <w:rPr>
+                <w:rFonts w:ascii="Times New Roman" w:hAnsi="Times New Roman" w:eastAsia="宋体"/>
                 <w:b w:val="0"/>
                 <w:i w:val="0"/>
                 <w:sz w:val="18"/>
@@ -5516,6 +5378,7 @@
               <w:left w:type="dxa" w:w="56"/>
               <w:right w:type="dxa" w:w="56"/>
             </w:tcMar>
+            <w:vAlign w:val="center"/>
             <w:tcBorders>
               <w:bottom w:val="single" w:sz="8" w:space="0" w:color="000000"/>
             </w:tcBorders>
@@ -5523,18 +5386,11 @@
           <w:p>
             <w:pPr>
               <w:spacing w:before="0" w:after="0" w:line="240" w:lineRule="exact"/>
-              <w:ind w:left="0" w:right="0"/>
-              <w:jc w:val="left"/>
-              <w:tabs>
-                <w:tab w:val="decimal" w:pos="612"/>
-              </w:tabs>
-            </w:pPr>
-            <w:r>
-              <w:tab/>
-            </w:r>
-            <w:r>
-              <w:rPr>
-                <w:rFonts w:ascii="Times New Roman" w:hAnsi="Times New Roman" w:eastAsia="Times New Roman"/>
+              <w:jc w:val="right"/>
+            </w:pPr>
+            <w:r>
+              <w:rPr>
+                <w:rFonts w:ascii="Times New Roman" w:hAnsi="Times New Roman" w:eastAsia="宋体"/>
                 <w:b w:val="0"/>
                 <w:i w:val="0"/>
                 <w:sz w:val="18"/>
@@ -6104,22 +5960,16 @@
               <w:left w:type="dxa" w:w="56"/>
               <w:right w:type="dxa" w:w="56"/>
             </w:tcMar>
-          </w:tcPr>
-          <w:p>
-            <w:pPr>
-              <w:spacing w:before="0" w:after="0" w:line="240" w:lineRule="exact"/>
-              <w:ind w:left="0" w:right="0"/>
-              <w:jc w:val="left"/>
-              <w:tabs>
-                <w:tab w:val="decimal" w:pos="541"/>
-              </w:tabs>
-            </w:pPr>
-            <w:r>
-              <w:tab/>
-            </w:r>
-            <w:r>
-              <w:rPr>
-                <w:rFonts w:ascii="Times New Roman" w:hAnsi="Times New Roman" w:eastAsia="Times New Roman"/>
+            <w:vAlign w:val="center"/>
+          </w:tcPr>
+          <w:p>
+            <w:pPr>
+              <w:spacing w:before="0" w:after="0" w:line="240" w:lineRule="exact"/>
+              <w:jc w:val="right"/>
+            </w:pPr>
+            <w:r>
+              <w:rPr>
+                <w:rFonts w:ascii="Times New Roman" w:hAnsi="Times New Roman" w:eastAsia="宋体"/>
                 <w:b w:val="0"/>
                 <w:i w:val="0"/>
                 <w:sz w:val="18"/>
@@ -6137,22 +5987,16 @@
               <w:left w:type="dxa" w:w="56"/>
               <w:right w:type="dxa" w:w="56"/>
             </w:tcMar>
-          </w:tcPr>
-          <w:p>
-            <w:pPr>
-              <w:spacing w:before="0" w:after="0" w:line="240" w:lineRule="exact"/>
-              <w:ind w:left="0" w:right="0"/>
-              <w:jc w:val="left"/>
-              <w:tabs>
-                <w:tab w:val="decimal" w:pos="541"/>
-              </w:tabs>
-            </w:pPr>
-            <w:r>
-              <w:tab/>
-            </w:r>
-            <w:r>
-              <w:rPr>
-                <w:rFonts w:ascii="Times New Roman" w:hAnsi="Times New Roman" w:eastAsia="Times New Roman"/>
+            <w:vAlign w:val="center"/>
+          </w:tcPr>
+          <w:p>
+            <w:pPr>
+              <w:spacing w:before="0" w:after="0" w:line="240" w:lineRule="exact"/>
+              <w:jc w:val="right"/>
+            </w:pPr>
+            <w:r>
+              <w:rPr>
+                <w:rFonts w:ascii="Times New Roman" w:hAnsi="Times New Roman" w:eastAsia="宋体"/>
                 <w:b w:val="0"/>
                 <w:i w:val="0"/>
                 <w:sz w:val="18"/>
@@ -6170,22 +6014,16 @@
               <w:left w:type="dxa" w:w="56"/>
               <w:right w:type="dxa" w:w="56"/>
             </w:tcMar>
-          </w:tcPr>
-          <w:p>
-            <w:pPr>
-              <w:spacing w:before="0" w:after="0" w:line="240" w:lineRule="exact"/>
-              <w:ind w:left="0" w:right="0"/>
-              <w:jc w:val="left"/>
-              <w:tabs>
-                <w:tab w:val="decimal" w:pos="541"/>
-              </w:tabs>
-            </w:pPr>
-            <w:r>
-              <w:tab/>
-            </w:r>
-            <w:r>
-              <w:rPr>
-                <w:rFonts w:ascii="Times New Roman" w:hAnsi="Times New Roman" w:eastAsia="Times New Roman"/>
+            <w:vAlign w:val="center"/>
+          </w:tcPr>
+          <w:p>
+            <w:pPr>
+              <w:spacing w:before="0" w:after="0" w:line="240" w:lineRule="exact"/>
+              <w:jc w:val="right"/>
+            </w:pPr>
+            <w:r>
+              <w:rPr>
+                <w:rFonts w:ascii="Times New Roman" w:hAnsi="Times New Roman" w:eastAsia="宋体"/>
                 <w:b w:val="0"/>
                 <w:i w:val="0"/>
                 <w:sz w:val="18"/>
@@ -6262,22 +6100,16 @@
               <w:left w:type="dxa" w:w="56"/>
               <w:right w:type="dxa" w:w="56"/>
             </w:tcMar>
-          </w:tcPr>
-          <w:p>
-            <w:pPr>
-              <w:spacing w:before="0" w:after="0" w:line="240" w:lineRule="exact"/>
-              <w:ind w:left="0" w:right="0"/>
-              <w:jc w:val="left"/>
-              <w:tabs>
-                <w:tab w:val="decimal" w:pos="541"/>
-              </w:tabs>
-            </w:pPr>
-            <w:r>
-              <w:tab/>
-            </w:r>
-            <w:r>
-              <w:rPr>
-                <w:rFonts w:ascii="Times New Roman" w:hAnsi="Times New Roman" w:eastAsia="Times New Roman"/>
+            <w:vAlign w:val="center"/>
+          </w:tcPr>
+          <w:p>
+            <w:pPr>
+              <w:spacing w:before="0" w:after="0" w:line="240" w:lineRule="exact"/>
+              <w:jc w:val="right"/>
+            </w:pPr>
+            <w:r>
+              <w:rPr>
+                <w:rFonts w:ascii="Times New Roman" w:hAnsi="Times New Roman" w:eastAsia="宋体"/>
                 <w:b w:val="0"/>
                 <w:i w:val="0"/>
                 <w:sz w:val="18"/>
@@ -6295,22 +6127,16 @@
               <w:left w:type="dxa" w:w="56"/>
               <w:right w:type="dxa" w:w="56"/>
             </w:tcMar>
-          </w:tcPr>
-          <w:p>
-            <w:pPr>
-              <w:spacing w:before="0" w:after="0" w:line="240" w:lineRule="exact"/>
-              <w:ind w:left="0" w:right="0"/>
-              <w:jc w:val="left"/>
-              <w:tabs>
-                <w:tab w:val="decimal" w:pos="541"/>
-              </w:tabs>
-            </w:pPr>
-            <w:r>
-              <w:tab/>
-            </w:r>
-            <w:r>
-              <w:rPr>
-                <w:rFonts w:ascii="Times New Roman" w:hAnsi="Times New Roman" w:eastAsia="Times New Roman"/>
+            <w:vAlign w:val="center"/>
+          </w:tcPr>
+          <w:p>
+            <w:pPr>
+              <w:spacing w:before="0" w:after="0" w:line="240" w:lineRule="exact"/>
+              <w:jc w:val="right"/>
+            </w:pPr>
+            <w:r>
+              <w:rPr>
+                <w:rFonts w:ascii="Times New Roman" w:hAnsi="Times New Roman" w:eastAsia="宋体"/>
                 <w:b w:val="0"/>
                 <w:i w:val="0"/>
                 <w:sz w:val="18"/>
@@ -6414,22 +6240,16 @@
               <w:left w:type="dxa" w:w="56"/>
               <w:right w:type="dxa" w:w="56"/>
             </w:tcMar>
-          </w:tcPr>
-          <w:p>
-            <w:pPr>
-              <w:spacing w:before="0" w:after="0" w:line="240" w:lineRule="exact"/>
-              <w:ind w:left="0" w:right="0"/>
-              <w:jc w:val="left"/>
-              <w:tabs>
-                <w:tab w:val="decimal" w:pos="541"/>
-              </w:tabs>
-            </w:pPr>
-            <w:r>
-              <w:tab/>
-            </w:r>
-            <w:r>
-              <w:rPr>
-                <w:rFonts w:ascii="Times New Roman" w:hAnsi="Times New Roman" w:eastAsia="Times New Roman"/>
+            <w:vAlign w:val="center"/>
+          </w:tcPr>
+          <w:p>
+            <w:pPr>
+              <w:spacing w:before="0" w:after="0" w:line="240" w:lineRule="exact"/>
+              <w:jc w:val="right"/>
+            </w:pPr>
+            <w:r>
+              <w:rPr>
+                <w:rFonts w:ascii="Times New Roman" w:hAnsi="Times New Roman" w:eastAsia="宋体"/>
                 <w:b w:val="0"/>
                 <w:i w:val="0"/>
                 <w:sz w:val="18"/>
@@ -6447,22 +6267,16 @@
               <w:left w:type="dxa" w:w="56"/>
               <w:right w:type="dxa" w:w="56"/>
             </w:tcMar>
-          </w:tcPr>
-          <w:p>
-            <w:pPr>
-              <w:spacing w:before="0" w:after="0" w:line="240" w:lineRule="exact"/>
-              <w:ind w:left="0" w:right="0"/>
-              <w:jc w:val="left"/>
-              <w:tabs>
-                <w:tab w:val="decimal" w:pos="541"/>
-              </w:tabs>
-            </w:pPr>
-            <w:r>
-              <w:tab/>
-            </w:r>
-            <w:r>
-              <w:rPr>
-                <w:rFonts w:ascii="Times New Roman" w:hAnsi="Times New Roman" w:eastAsia="Times New Roman"/>
+            <w:vAlign w:val="center"/>
+          </w:tcPr>
+          <w:p>
+            <w:pPr>
+              <w:spacing w:before="0" w:after="0" w:line="240" w:lineRule="exact"/>
+              <w:jc w:val="right"/>
+            </w:pPr>
+            <w:r>
+              <w:rPr>
+                <w:rFonts w:ascii="Times New Roman" w:hAnsi="Times New Roman" w:eastAsia="宋体"/>
                 <w:b w:val="0"/>
                 <w:i w:val="0"/>
                 <w:sz w:val="18"/>
@@ -6569,6 +6383,7 @@
               <w:left w:type="dxa" w:w="56"/>
               <w:right w:type="dxa" w:w="56"/>
             </w:tcMar>
+            <w:vAlign w:val="center"/>
             <w:tcBorders>
               <w:bottom w:val="single" w:sz="8" w:space="0" w:color="000000"/>
             </w:tcBorders>
@@ -6576,18 +6391,11 @@
           <w:p>
             <w:pPr>
               <w:spacing w:before="0" w:after="0" w:line="240" w:lineRule="exact"/>
-              <w:ind w:left="0" w:right="0"/>
-              <w:jc w:val="left"/>
-              <w:tabs>
-                <w:tab w:val="decimal" w:pos="541"/>
-              </w:tabs>
-            </w:pPr>
-            <w:r>
-              <w:tab/>
-            </w:r>
-            <w:r>
-              <w:rPr>
-                <w:rFonts w:ascii="Times New Roman" w:hAnsi="Times New Roman" w:eastAsia="Times New Roman"/>
+              <w:jc w:val="right"/>
+            </w:pPr>
+            <w:r>
+              <w:rPr>
+                <w:rFonts w:ascii="Times New Roman" w:hAnsi="Times New Roman" w:eastAsia="宋体"/>
                 <w:b w:val="0"/>
                 <w:i w:val="0"/>
                 <w:sz w:val="18"/>
@@ -6605,6 +6413,7 @@
               <w:left w:type="dxa" w:w="56"/>
               <w:right w:type="dxa" w:w="56"/>
             </w:tcMar>
+            <w:vAlign w:val="center"/>
             <w:tcBorders>
               <w:bottom w:val="single" w:sz="8" w:space="0" w:color="000000"/>
             </w:tcBorders>
@@ -6612,18 +6421,11 @@
           <w:p>
             <w:pPr>
               <w:spacing w:before="0" w:after="0" w:line="240" w:lineRule="exact"/>
-              <w:ind w:left="0" w:right="0"/>
-              <w:jc w:val="left"/>
-              <w:tabs>
-                <w:tab w:val="decimal" w:pos="541"/>
-              </w:tabs>
-            </w:pPr>
-            <w:r>
-              <w:tab/>
-            </w:r>
-            <w:r>
-              <w:rPr>
-                <w:rFonts w:ascii="Times New Roman" w:hAnsi="Times New Roman" w:eastAsia="Times New Roman"/>
+              <w:jc w:val="right"/>
+            </w:pPr>
+            <w:r>
+              <w:rPr>
+                <w:rFonts w:ascii="Times New Roman" w:hAnsi="Times New Roman" w:eastAsia="宋体"/>
                 <w:b w:val="0"/>
                 <w:i w:val="0"/>
                 <w:sz w:val="18"/>
@@ -7308,22 +7110,16 @@
               <w:left w:type="dxa" w:w="56"/>
               <w:right w:type="dxa" w:w="56"/>
             </w:tcMar>
-          </w:tcPr>
-          <w:p>
-            <w:pPr>
-              <w:spacing w:before="0" w:after="0" w:line="240" w:lineRule="exact"/>
-              <w:ind w:left="0" w:right="0"/>
-              <w:jc w:val="left"/>
-              <w:tabs>
-                <w:tab w:val="decimal" w:pos="612"/>
-              </w:tabs>
-            </w:pPr>
-            <w:r>
-              <w:tab/>
-            </w:r>
-            <w:r>
-              <w:rPr>
-                <w:rFonts w:ascii="Times New Roman" w:hAnsi="Times New Roman" w:eastAsia="Times New Roman"/>
+            <w:vAlign w:val="center"/>
+          </w:tcPr>
+          <w:p>
+            <w:pPr>
+              <w:spacing w:before="0" w:after="0" w:line="240" w:lineRule="exact"/>
+              <w:jc w:val="right"/>
+            </w:pPr>
+            <w:r>
+              <w:rPr>
+                <w:rFonts w:ascii="Times New Roman" w:hAnsi="Times New Roman" w:eastAsia="宋体"/>
                 <w:b w:val="0"/>
                 <w:i w:val="0"/>
                 <w:sz w:val="18"/>
@@ -7341,22 +7137,16 @@
               <w:left w:type="dxa" w:w="56"/>
               <w:right w:type="dxa" w:w="56"/>
             </w:tcMar>
-          </w:tcPr>
-          <w:p>
-            <w:pPr>
-              <w:spacing w:before="0" w:after="0" w:line="240" w:lineRule="exact"/>
-              <w:ind w:left="0" w:right="0"/>
-              <w:jc w:val="left"/>
-              <w:tabs>
-                <w:tab w:val="decimal" w:pos="612"/>
-              </w:tabs>
-            </w:pPr>
-            <w:r>
-              <w:tab/>
-            </w:r>
-            <w:r>
-              <w:rPr>
-                <w:rFonts w:ascii="Times New Roman" w:hAnsi="Times New Roman" w:eastAsia="Times New Roman"/>
+            <w:vAlign w:val="center"/>
+          </w:tcPr>
+          <w:p>
+            <w:pPr>
+              <w:spacing w:before="0" w:after="0" w:line="240" w:lineRule="exact"/>
+              <w:jc w:val="right"/>
+            </w:pPr>
+            <w:r>
+              <w:rPr>
+                <w:rFonts w:ascii="Times New Roman" w:hAnsi="Times New Roman" w:eastAsia="宋体"/>
                 <w:b w:val="0"/>
                 <w:i w:val="0"/>
                 <w:sz w:val="18"/>
@@ -7374,22 +7164,16 @@
               <w:left w:type="dxa" w:w="56"/>
               <w:right w:type="dxa" w:w="56"/>
             </w:tcMar>
-          </w:tcPr>
-          <w:p>
-            <w:pPr>
-              <w:spacing w:before="0" w:after="0" w:line="240" w:lineRule="exact"/>
-              <w:ind w:left="0" w:right="0"/>
-              <w:jc w:val="left"/>
-              <w:tabs>
-                <w:tab w:val="decimal" w:pos="612"/>
-              </w:tabs>
-            </w:pPr>
-            <w:r>
-              <w:tab/>
-            </w:r>
-            <w:r>
-              <w:rPr>
-                <w:rFonts w:ascii="Times New Roman" w:hAnsi="Times New Roman" w:eastAsia="Times New Roman"/>
+            <w:vAlign w:val="center"/>
+          </w:tcPr>
+          <w:p>
+            <w:pPr>
+              <w:spacing w:before="0" w:after="0" w:line="240" w:lineRule="exact"/>
+              <w:jc w:val="right"/>
+            </w:pPr>
+            <w:r>
+              <w:rPr>
+                <w:rFonts w:ascii="Times New Roman" w:hAnsi="Times New Roman" w:eastAsia="宋体"/>
                 <w:b w:val="0"/>
                 <w:i w:val="0"/>
                 <w:sz w:val="18"/>
@@ -7466,22 +7250,16 @@
               <w:left w:type="dxa" w:w="56"/>
               <w:right w:type="dxa" w:w="56"/>
             </w:tcMar>
-          </w:tcPr>
-          <w:p>
-            <w:pPr>
-              <w:spacing w:before="0" w:after="0" w:line="240" w:lineRule="exact"/>
-              <w:ind w:left="0" w:right="0"/>
-              <w:jc w:val="left"/>
-              <w:tabs>
-                <w:tab w:val="decimal" w:pos="612"/>
-              </w:tabs>
-            </w:pPr>
-            <w:r>
-              <w:tab/>
-            </w:r>
-            <w:r>
-              <w:rPr>
-                <w:rFonts w:ascii="Times New Roman" w:hAnsi="Times New Roman" w:eastAsia="Times New Roman"/>
+            <w:vAlign w:val="center"/>
+          </w:tcPr>
+          <w:p>
+            <w:pPr>
+              <w:spacing w:before="0" w:after="0" w:line="240" w:lineRule="exact"/>
+              <w:jc w:val="right"/>
+            </w:pPr>
+            <w:r>
+              <w:rPr>
+                <w:rFonts w:ascii="Times New Roman" w:hAnsi="Times New Roman" w:eastAsia="宋体"/>
                 <w:b w:val="0"/>
                 <w:i w:val="0"/>
                 <w:sz w:val="18"/>
@@ -7499,22 +7277,16 @@
               <w:left w:type="dxa" w:w="56"/>
               <w:right w:type="dxa" w:w="56"/>
             </w:tcMar>
-          </w:tcPr>
-          <w:p>
-            <w:pPr>
-              <w:spacing w:before="0" w:after="0" w:line="240" w:lineRule="exact"/>
-              <w:ind w:left="0" w:right="0"/>
-              <w:jc w:val="left"/>
-              <w:tabs>
-                <w:tab w:val="decimal" w:pos="612"/>
-              </w:tabs>
-            </w:pPr>
-            <w:r>
-              <w:tab/>
-            </w:r>
-            <w:r>
-              <w:rPr>
-                <w:rFonts w:ascii="Times New Roman" w:hAnsi="Times New Roman" w:eastAsia="Times New Roman"/>
+            <w:vAlign w:val="center"/>
+          </w:tcPr>
+          <w:p>
+            <w:pPr>
+              <w:spacing w:before="0" w:after="0" w:line="240" w:lineRule="exact"/>
+              <w:jc w:val="right"/>
+            </w:pPr>
+            <w:r>
+              <w:rPr>
+                <w:rFonts w:ascii="Times New Roman" w:hAnsi="Times New Roman" w:eastAsia="宋体"/>
                 <w:b w:val="0"/>
                 <w:i w:val="0"/>
                 <w:sz w:val="18"/>
@@ -7532,22 +7304,16 @@
               <w:left w:type="dxa" w:w="56"/>
               <w:right w:type="dxa" w:w="56"/>
             </w:tcMar>
-          </w:tcPr>
-          <w:p>
-            <w:pPr>
-              <w:spacing w:before="0" w:after="0" w:line="240" w:lineRule="exact"/>
-              <w:ind w:left="0" w:right="0"/>
-              <w:jc w:val="left"/>
-              <w:tabs>
-                <w:tab w:val="decimal" w:pos="612"/>
-              </w:tabs>
-            </w:pPr>
-            <w:r>
-              <w:tab/>
-            </w:r>
-            <w:r>
-              <w:rPr>
-                <w:rFonts w:ascii="Times New Roman" w:hAnsi="Times New Roman" w:eastAsia="Times New Roman"/>
+            <w:vAlign w:val="center"/>
+          </w:tcPr>
+          <w:p>
+            <w:pPr>
+              <w:spacing w:before="0" w:after="0" w:line="240" w:lineRule="exact"/>
+              <w:jc w:val="right"/>
+            </w:pPr>
+            <w:r>
+              <w:rPr>
+                <w:rFonts w:ascii="Times New Roman" w:hAnsi="Times New Roman" w:eastAsia="宋体"/>
                 <w:b w:val="0"/>
                 <w:i w:val="0"/>
                 <w:sz w:val="18"/>
@@ -7630,6 +7396,7 @@
               <w:left w:type="dxa" w:w="56"/>
               <w:right w:type="dxa" w:w="56"/>
             </w:tcMar>
+            <w:vAlign w:val="center"/>
             <w:tcBorders>
               <w:bottom w:val="single" w:sz="4" w:space="0" w:color="000000"/>
             </w:tcBorders>
@@ -7637,18 +7404,11 @@
           <w:p>
             <w:pPr>
               <w:spacing w:before="0" w:after="0" w:line="240" w:lineRule="exact"/>
-              <w:ind w:left="0" w:right="0"/>
-              <w:jc w:val="left"/>
-              <w:tabs>
-                <w:tab w:val="decimal" w:pos="612"/>
-              </w:tabs>
-            </w:pPr>
-            <w:r>
-              <w:tab/>
-            </w:r>
-            <w:r>
-              <w:rPr>
-                <w:rFonts w:ascii="Times New Roman" w:hAnsi="Times New Roman" w:eastAsia="Times New Roman"/>
+              <w:jc w:val="right"/>
+            </w:pPr>
+            <w:r>
+              <w:rPr>
+                <w:rFonts w:ascii="Times New Roman" w:hAnsi="Times New Roman" w:eastAsia="宋体"/>
                 <w:b w:val="0"/>
                 <w:i w:val="0"/>
                 <w:sz w:val="18"/>
@@ -7666,6 +7426,7 @@
               <w:left w:type="dxa" w:w="56"/>
               <w:right w:type="dxa" w:w="56"/>
             </w:tcMar>
+            <w:vAlign w:val="center"/>
             <w:tcBorders>
               <w:bottom w:val="single" w:sz="4" w:space="0" w:color="000000"/>
             </w:tcBorders>
@@ -7673,18 +7434,11 @@
           <w:p>
             <w:pPr>
               <w:spacing w:before="0" w:after="0" w:line="240" w:lineRule="exact"/>
-              <w:ind w:left="0" w:right="0"/>
-              <w:jc w:val="left"/>
-              <w:tabs>
-                <w:tab w:val="decimal" w:pos="612"/>
-              </w:tabs>
-            </w:pPr>
-            <w:r>
-              <w:tab/>
-            </w:r>
-            <w:r>
-              <w:rPr>
-                <w:rFonts w:ascii="Times New Roman" w:hAnsi="Times New Roman" w:eastAsia="Times New Roman"/>
+              <w:jc w:val="right"/>
+            </w:pPr>
+            <w:r>
+              <w:rPr>
+                <w:rFonts w:ascii="Times New Roman" w:hAnsi="Times New Roman" w:eastAsia="宋体"/>
                 <w:b w:val="0"/>
                 <w:i w:val="0"/>
                 <w:sz w:val="18"/>
@@ -7702,6 +7456,7 @@
               <w:left w:type="dxa" w:w="56"/>
               <w:right w:type="dxa" w:w="56"/>
             </w:tcMar>
+            <w:vAlign w:val="center"/>
             <w:tcBorders>
               <w:bottom w:val="single" w:sz="4" w:space="0" w:color="000000"/>
             </w:tcBorders>
@@ -7709,18 +7464,11 @@
           <w:p>
             <w:pPr>
               <w:spacing w:before="0" w:after="0" w:line="240" w:lineRule="exact"/>
-              <w:ind w:left="0" w:right="0"/>
-              <w:jc w:val="left"/>
-              <w:tabs>
-                <w:tab w:val="decimal" w:pos="612"/>
-              </w:tabs>
-            </w:pPr>
-            <w:r>
-              <w:tab/>
-            </w:r>
-            <w:r>
-              <w:rPr>
-                <w:rFonts w:ascii="Times New Roman" w:hAnsi="Times New Roman" w:eastAsia="Times New Roman"/>
+              <w:jc w:val="right"/>
+            </w:pPr>
+            <w:r>
+              <w:rPr>
+                <w:rFonts w:ascii="Times New Roman" w:hAnsi="Times New Roman" w:eastAsia="宋体"/>
                 <w:b w:val="0"/>
                 <w:i w:val="0"/>
                 <w:sz w:val="18"/>
@@ -8023,22 +7771,16 @@
               <w:left w:type="dxa" w:w="56"/>
               <w:right w:type="dxa" w:w="56"/>
             </w:tcMar>
-          </w:tcPr>
-          <w:p>
-            <w:pPr>
-              <w:spacing w:before="0" w:after="0" w:line="240" w:lineRule="exact"/>
-              <w:ind w:left="0" w:right="0"/>
-              <w:jc w:val="left"/>
-              <w:tabs>
-                <w:tab w:val="decimal" w:pos="369"/>
-              </w:tabs>
-            </w:pPr>
-            <w:r>
-              <w:tab/>
-            </w:r>
-            <w:r>
-              <w:rPr>
-                <w:rFonts w:ascii="Times New Roman" w:hAnsi="Times New Roman" w:eastAsia="Times New Roman"/>
+            <w:vAlign w:val="center"/>
+          </w:tcPr>
+          <w:p>
+            <w:pPr>
+              <w:spacing w:before="0" w:after="0" w:line="240" w:lineRule="exact"/>
+              <w:jc w:val="right"/>
+            </w:pPr>
+            <w:r>
+              <w:rPr>
+                <w:rFonts w:ascii="Times New Roman" w:hAnsi="Times New Roman" w:eastAsia="宋体"/>
                 <w:b w:val="0"/>
                 <w:i w:val="0"/>
                 <w:sz w:val="18"/>
@@ -8056,22 +7798,16 @@
               <w:left w:type="dxa" w:w="56"/>
               <w:right w:type="dxa" w:w="56"/>
             </w:tcMar>
-          </w:tcPr>
-          <w:p>
-            <w:pPr>
-              <w:spacing w:before="0" w:after="0" w:line="240" w:lineRule="exact"/>
-              <w:ind w:left="0" w:right="0"/>
-              <w:jc w:val="left"/>
-              <w:tabs>
-                <w:tab w:val="decimal" w:pos="522"/>
-              </w:tabs>
-            </w:pPr>
-            <w:r>
-              <w:tab/>
-            </w:r>
-            <w:r>
-              <w:rPr>
-                <w:rFonts w:ascii="Times New Roman" w:hAnsi="Times New Roman" w:eastAsia="Times New Roman"/>
+            <w:vAlign w:val="center"/>
+          </w:tcPr>
+          <w:p>
+            <w:pPr>
+              <w:spacing w:before="0" w:after="0" w:line="240" w:lineRule="exact"/>
+              <w:jc w:val="right"/>
+            </w:pPr>
+            <w:r>
+              <w:rPr>
+                <w:rFonts w:ascii="Times New Roman" w:hAnsi="Times New Roman" w:eastAsia="宋体"/>
                 <w:b w:val="0"/>
                 <w:i w:val="0"/>
                 <w:sz w:val="18"/>
@@ -8089,22 +7825,16 @@
               <w:left w:type="dxa" w:w="56"/>
               <w:right w:type="dxa" w:w="56"/>
             </w:tcMar>
-          </w:tcPr>
-          <w:p>
-            <w:pPr>
-              <w:spacing w:before="0" w:after="0" w:line="240" w:lineRule="exact"/>
-              <w:ind w:left="0" w:right="0"/>
-              <w:jc w:val="left"/>
-              <w:tabs>
-                <w:tab w:val="decimal" w:pos="751"/>
-              </w:tabs>
-            </w:pPr>
-            <w:r>
-              <w:tab/>
-            </w:r>
-            <w:r>
-              <w:rPr>
-                <w:rFonts w:ascii="Times New Roman" w:hAnsi="Times New Roman" w:eastAsia="Times New Roman"/>
+            <w:vAlign w:val="center"/>
+          </w:tcPr>
+          <w:p>
+            <w:pPr>
+              <w:spacing w:before="0" w:after="0" w:line="240" w:lineRule="exact"/>
+              <w:jc w:val="right"/>
+            </w:pPr>
+            <w:r>
+              <w:rPr>
+                <w:rFonts w:ascii="Times New Roman" w:hAnsi="Times New Roman" w:eastAsia="宋体"/>
                 <w:b w:val="0"/>
                 <w:i w:val="0"/>
                 <w:sz w:val="18"/>
@@ -8122,22 +7852,16 @@
               <w:left w:type="dxa" w:w="56"/>
               <w:right w:type="dxa" w:w="56"/>
             </w:tcMar>
-          </w:tcPr>
-          <w:p>
-            <w:pPr>
-              <w:spacing w:before="0" w:after="0" w:line="240" w:lineRule="exact"/>
-              <w:ind w:left="0" w:right="0"/>
-              <w:jc w:val="left"/>
-              <w:tabs>
-                <w:tab w:val="decimal" w:pos="598"/>
-              </w:tabs>
-            </w:pPr>
-            <w:r>
-              <w:tab/>
-            </w:r>
-            <w:r>
-              <w:rPr>
-                <w:rFonts w:ascii="Times New Roman" w:hAnsi="Times New Roman" w:eastAsia="Times New Roman"/>
+            <w:vAlign w:val="center"/>
+          </w:tcPr>
+          <w:p>
+            <w:pPr>
+              <w:spacing w:before="0" w:after="0" w:line="240" w:lineRule="exact"/>
+              <w:jc w:val="right"/>
+            </w:pPr>
+            <w:r>
+              <w:rPr>
+                <w:rFonts w:ascii="Times New Roman" w:hAnsi="Times New Roman" w:eastAsia="宋体"/>
                 <w:b w:val="0"/>
                 <w:i w:val="0"/>
                 <w:sz w:val="18"/>
@@ -8214,22 +7938,16 @@
               <w:left w:type="dxa" w:w="56"/>
               <w:right w:type="dxa" w:w="56"/>
             </w:tcMar>
-          </w:tcPr>
-          <w:p>
-            <w:pPr>
-              <w:spacing w:before="0" w:after="0" w:line="240" w:lineRule="exact"/>
-              <w:ind w:left="0" w:right="0"/>
-              <w:jc w:val="left"/>
-              <w:tabs>
-                <w:tab w:val="decimal" w:pos="369"/>
-              </w:tabs>
-            </w:pPr>
-            <w:r>
-              <w:tab/>
-            </w:r>
-            <w:r>
-              <w:rPr>
-                <w:rFonts w:ascii="Times New Roman" w:hAnsi="Times New Roman" w:eastAsia="Times New Roman"/>
+            <w:vAlign w:val="center"/>
+          </w:tcPr>
+          <w:p>
+            <w:pPr>
+              <w:spacing w:before="0" w:after="0" w:line="240" w:lineRule="exact"/>
+              <w:jc w:val="right"/>
+            </w:pPr>
+            <w:r>
+              <w:rPr>
+                <w:rFonts w:ascii="Times New Roman" w:hAnsi="Times New Roman" w:eastAsia="宋体"/>
                 <w:b w:val="0"/>
                 <w:i w:val="0"/>
                 <w:sz w:val="18"/>
@@ -8247,22 +7965,16 @@
               <w:left w:type="dxa" w:w="56"/>
               <w:right w:type="dxa" w:w="56"/>
             </w:tcMar>
-          </w:tcPr>
-          <w:p>
-            <w:pPr>
-              <w:spacing w:before="0" w:after="0" w:line="240" w:lineRule="exact"/>
-              <w:ind w:left="0" w:right="0"/>
-              <w:jc w:val="left"/>
-              <w:tabs>
-                <w:tab w:val="decimal" w:pos="522"/>
-              </w:tabs>
-            </w:pPr>
-            <w:r>
-              <w:tab/>
-            </w:r>
-            <w:r>
-              <w:rPr>
-                <w:rFonts w:ascii="Times New Roman" w:hAnsi="Times New Roman" w:eastAsia="Times New Roman"/>
+            <w:vAlign w:val="center"/>
+          </w:tcPr>
+          <w:p>
+            <w:pPr>
+              <w:spacing w:before="0" w:after="0" w:line="240" w:lineRule="exact"/>
+              <w:jc w:val="right"/>
+            </w:pPr>
+            <w:r>
+              <w:rPr>
+                <w:rFonts w:ascii="Times New Roman" w:hAnsi="Times New Roman" w:eastAsia="宋体"/>
                 <w:b w:val="0"/>
                 <w:i w:val="0"/>
                 <w:sz w:val="18"/>
@@ -8280,22 +7992,16 @@
               <w:left w:type="dxa" w:w="56"/>
               <w:right w:type="dxa" w:w="56"/>
             </w:tcMar>
-          </w:tcPr>
-          <w:p>
-            <w:pPr>
-              <w:spacing w:before="0" w:after="0" w:line="240" w:lineRule="exact"/>
-              <w:ind w:left="0" w:right="0"/>
-              <w:jc w:val="left"/>
-              <w:tabs>
-                <w:tab w:val="decimal" w:pos="751"/>
-              </w:tabs>
-            </w:pPr>
-            <w:r>
-              <w:tab/>
-            </w:r>
-            <w:r>
-              <w:rPr>
-                <w:rFonts w:ascii="Times New Roman" w:hAnsi="Times New Roman" w:eastAsia="Times New Roman"/>
+            <w:vAlign w:val="center"/>
+          </w:tcPr>
+          <w:p>
+            <w:pPr>
+              <w:spacing w:before="0" w:after="0" w:line="240" w:lineRule="exact"/>
+              <w:jc w:val="right"/>
+            </w:pPr>
+            <w:r>
+              <w:rPr>
+                <w:rFonts w:ascii="Times New Roman" w:hAnsi="Times New Roman" w:eastAsia="宋体"/>
                 <w:b w:val="0"/>
                 <w:i w:val="0"/>
                 <w:sz w:val="18"/>
@@ -8313,22 +8019,16 @@
               <w:left w:type="dxa" w:w="56"/>
               <w:right w:type="dxa" w:w="56"/>
             </w:tcMar>
-          </w:tcPr>
-          <w:p>
-            <w:pPr>
-              <w:spacing w:before="0" w:after="0" w:line="240" w:lineRule="exact"/>
-              <w:ind w:left="0" w:right="0"/>
-              <w:jc w:val="left"/>
-              <w:tabs>
-                <w:tab w:val="decimal" w:pos="598"/>
-              </w:tabs>
-            </w:pPr>
-            <w:r>
-              <w:tab/>
-            </w:r>
-            <w:r>
-              <w:rPr>
-                <w:rFonts w:ascii="Times New Roman" w:hAnsi="Times New Roman" w:eastAsia="Times New Roman"/>
+            <w:vAlign w:val="center"/>
+          </w:tcPr>
+          <w:p>
+            <w:pPr>
+              <w:spacing w:before="0" w:after="0" w:line="240" w:lineRule="exact"/>
+              <w:jc w:val="right"/>
+            </w:pPr>
+            <w:r>
+              <w:rPr>
+                <w:rFonts w:ascii="Times New Roman" w:hAnsi="Times New Roman" w:eastAsia="宋体"/>
                 <w:b w:val="0"/>
                 <w:i w:val="0"/>
                 <w:sz w:val="18"/>
@@ -8411,6 +8111,7 @@
               <w:left w:type="dxa" w:w="56"/>
               <w:right w:type="dxa" w:w="56"/>
             </w:tcMar>
+            <w:vAlign w:val="center"/>
             <w:tcBorders>
               <w:bottom w:val="single" w:sz="8" w:space="0" w:color="000000"/>
             </w:tcBorders>
@@ -8418,18 +8119,11 @@
           <w:p>
             <w:pPr>
               <w:spacing w:before="0" w:after="0" w:line="240" w:lineRule="exact"/>
-              <w:ind w:left="0" w:right="0"/>
-              <w:jc w:val="left"/>
-              <w:tabs>
-                <w:tab w:val="decimal" w:pos="369"/>
-              </w:tabs>
-            </w:pPr>
-            <w:r>
-              <w:tab/>
-            </w:r>
-            <w:r>
-              <w:rPr>
-                <w:rFonts w:ascii="Times New Roman" w:hAnsi="Times New Roman" w:eastAsia="Times New Roman"/>
+              <w:jc w:val="right"/>
+            </w:pPr>
+            <w:r>
+              <w:rPr>
+                <w:rFonts w:ascii="Times New Roman" w:hAnsi="Times New Roman" w:eastAsia="宋体"/>
                 <w:b w:val="0"/>
                 <w:i w:val="0"/>
                 <w:sz w:val="18"/>
@@ -8447,6 +8141,7 @@
               <w:left w:type="dxa" w:w="56"/>
               <w:right w:type="dxa" w:w="56"/>
             </w:tcMar>
+            <w:vAlign w:val="center"/>
             <w:tcBorders>
               <w:bottom w:val="single" w:sz="8" w:space="0" w:color="000000"/>
             </w:tcBorders>
@@ -8454,18 +8149,11 @@
           <w:p>
             <w:pPr>
               <w:spacing w:before="0" w:after="0" w:line="240" w:lineRule="exact"/>
-              <w:ind w:left="0" w:right="0"/>
-              <w:jc w:val="left"/>
-              <w:tabs>
-                <w:tab w:val="decimal" w:pos="522"/>
-              </w:tabs>
-            </w:pPr>
-            <w:r>
-              <w:tab/>
-            </w:r>
-            <w:r>
-              <w:rPr>
-                <w:rFonts w:ascii="Times New Roman" w:hAnsi="Times New Roman" w:eastAsia="Times New Roman"/>
+              <w:jc w:val="right"/>
+            </w:pPr>
+            <w:r>
+              <w:rPr>
+                <w:rFonts w:ascii="Times New Roman" w:hAnsi="Times New Roman" w:eastAsia="宋体"/>
                 <w:b w:val="0"/>
                 <w:i w:val="0"/>
                 <w:sz w:val="18"/>
@@ -8483,6 +8171,7 @@
               <w:left w:type="dxa" w:w="56"/>
               <w:right w:type="dxa" w:w="56"/>
             </w:tcMar>
+            <w:vAlign w:val="center"/>
             <w:tcBorders>
               <w:bottom w:val="single" w:sz="8" w:space="0" w:color="000000"/>
             </w:tcBorders>
@@ -8490,18 +8179,11 @@
           <w:p>
             <w:pPr>
               <w:spacing w:before="0" w:after="0" w:line="240" w:lineRule="exact"/>
-              <w:ind w:left="0" w:right="0"/>
-              <w:jc w:val="left"/>
-              <w:tabs>
-                <w:tab w:val="decimal" w:pos="751"/>
-              </w:tabs>
-            </w:pPr>
-            <w:r>
-              <w:tab/>
-            </w:r>
-            <w:r>
-              <w:rPr>
-                <w:rFonts w:ascii="Times New Roman" w:hAnsi="Times New Roman" w:eastAsia="Times New Roman"/>
+              <w:jc w:val="right"/>
+            </w:pPr>
+            <w:r>
+              <w:rPr>
+                <w:rFonts w:ascii="Times New Roman" w:hAnsi="Times New Roman" w:eastAsia="宋体"/>
                 <w:b w:val="0"/>
                 <w:i w:val="0"/>
                 <w:sz w:val="18"/>
@@ -8519,6 +8201,7 @@
               <w:left w:type="dxa" w:w="56"/>
               <w:right w:type="dxa" w:w="56"/>
             </w:tcMar>
+            <w:vAlign w:val="center"/>
             <w:tcBorders>
               <w:bottom w:val="single" w:sz="8" w:space="0" w:color="000000"/>
             </w:tcBorders>
@@ -8526,18 +8209,11 @@
           <w:p>
             <w:pPr>
               <w:spacing w:before="0" w:after="0" w:line="240" w:lineRule="exact"/>
-              <w:ind w:left="0" w:right="0"/>
-              <w:jc w:val="left"/>
-              <w:tabs>
-                <w:tab w:val="decimal" w:pos="598"/>
-              </w:tabs>
-            </w:pPr>
-            <w:r>
-              <w:tab/>
-            </w:r>
-            <w:r>
-              <w:rPr>
-                <w:rFonts w:ascii="Times New Roman" w:hAnsi="Times New Roman" w:eastAsia="Times New Roman"/>
+              <w:jc w:val="right"/>
+            </w:pPr>
+            <w:r>
+              <w:rPr>
+                <w:rFonts w:ascii="Times New Roman" w:hAnsi="Times New Roman" w:eastAsia="宋体"/>
                 <w:b w:val="0"/>
                 <w:i w:val="0"/>
                 <w:sz w:val="18"/>

</xml_diff>